<commit_message>
Registro Rev. 1.1: decisione di passare Vercel e Supabase a piani a pagamento
Co-Authored-By: Claude Opus 5.5 <noreply@anthropic.com>
Claude-Session: https://claude.ai/code/session_01E8XCbEeVHWVP3hntUZ6kZ1
</commit_message>
<xml_diff>
--- a/public/documentazione/Registro_Dev_Deploy_Portale_CWP.docx
+++ b/public/documentazione/Registro_Dev_Deploy_Portale_CWP.docx
@@ -302,7 +302,7 @@
                 <w:sz w:val="20"/>
                 <w:szCs w:val="20"/>
               </w:rPr>
-              <w:t xml:space="preserve">Rev. 1.0</w:t>
+              <w:t xml:space="preserve">Rev. 1.1</w:t>
             </w:r>
           </w:p>
         </w:tc>
@@ -719,6 +719,140 @@
                 <w:sz w:val="18"/>
                 <w:szCs w:val="18"/>
               </w:rPr>
+              <w:t xml:space="preserve">1.1</w:t>
+            </w:r>
+          </w:p>
+        </w:tc>
+        <w:tc>
+          <w:tcPr>
+            <w:tcW w:type="dxa" w:w="1300"/>
+            <w:tcBorders>
+              <w:top w:val="single" w:color="D9D4C5" w:sz="4"/>
+              <w:left w:val="single" w:color="D9D4C5" w:sz="4"/>
+              <w:bottom w:val="single" w:color="D9D4C5" w:sz="4"/>
+              <w:right w:val="single" w:color="D9D4C5" w:sz="4"/>
+            </w:tcBorders>
+            <w:tcMar>
+              <w:top w:type="dxa" w:w="70"/>
+              <w:left w:type="dxa" w:w="110"/>
+              <w:bottom w:type="dxa" w:w="70"/>
+              <w:right w:type="dxa" w:w="110"/>
+            </w:tcMar>
+            <w:vAlign w:val="center"/>
+          </w:tcPr>
+          <w:p>
+            <w:pPr>
+              <w:spacing w:after="0" w:before="0"/>
+            </w:pPr>
+            <w:r>
+              <w:rPr>
+                <w:rFonts w:ascii="Arial" w:cs="Arial" w:eastAsia="Arial" w:hAnsi="Arial"/>
+                <w:color w:val="1B2118"/>
+                <w:sz w:val="18"/>
+                <w:szCs w:val="18"/>
+              </w:rPr>
+              <w:t xml:space="preserve">18/10/2026</w:t>
+            </w:r>
+          </w:p>
+        </w:tc>
+        <w:tc>
+          <w:tcPr>
+            <w:tcW w:type="dxa" w:w="5538"/>
+            <w:tcBorders>
+              <w:top w:val="single" w:color="D9D4C5" w:sz="4"/>
+              <w:left w:val="single" w:color="D9D4C5" w:sz="4"/>
+              <w:bottom w:val="single" w:color="D9D4C5" w:sz="4"/>
+              <w:right w:val="single" w:color="D9D4C5" w:sz="4"/>
+            </w:tcBorders>
+            <w:tcMar>
+              <w:top w:type="dxa" w:w="70"/>
+              <w:left w:type="dxa" w:w="110"/>
+              <w:bottom w:type="dxa" w:w="70"/>
+              <w:right w:type="dxa" w:w="110"/>
+            </w:tcMar>
+            <w:vAlign w:val="center"/>
+          </w:tcPr>
+          <w:p>
+            <w:pPr>
+              <w:spacing w:after="0" w:before="0"/>
+            </w:pPr>
+            <w:r>
+              <w:rPr>
+                <w:rFonts w:ascii="Arial" w:cs="Arial" w:eastAsia="Arial" w:hAnsi="Arial"/>
+                <w:color w:val="1B2118"/>
+                <w:sz w:val="18"/>
+                <w:szCs w:val="18"/>
+              </w:rPr>
+              <w:t xml:space="preserve">Pagina Documentazione; backlog riordinato; decisione di passare Vercel e Supabase a piani a pagamento (punto 29); riservatezza della documentazione (punto 28).</w:t>
+            </w:r>
+          </w:p>
+        </w:tc>
+        <w:tc>
+          <w:tcPr>
+            <w:tcW w:type="dxa" w:w="2000"/>
+            <w:tcBorders>
+              <w:top w:val="single" w:color="D9D4C5" w:sz="4"/>
+              <w:left w:val="single" w:color="D9D4C5" w:sz="4"/>
+              <w:bottom w:val="single" w:color="D9D4C5" w:sz="4"/>
+              <w:right w:val="single" w:color="D9D4C5" w:sz="4"/>
+            </w:tcBorders>
+            <w:tcMar>
+              <w:top w:type="dxa" w:w="70"/>
+              <w:left w:type="dxa" w:w="110"/>
+              <w:bottom w:type="dxa" w:w="70"/>
+              <w:right w:type="dxa" w:w="110"/>
+            </w:tcMar>
+            <w:vAlign w:val="center"/>
+          </w:tcPr>
+          <w:p>
+            <w:pPr>
+              <w:spacing w:after="0" w:before="0"/>
+            </w:pPr>
+            <w:r>
+              <w:rPr>
+                <w:rFonts w:ascii="Arial" w:cs="Arial" w:eastAsia="Arial" w:hAnsi="Arial"/>
+                <w:color w:val="1B2118"/>
+                <w:sz w:val="18"/>
+                <w:szCs w:val="18"/>
+              </w:rPr>
+              <w:t xml:space="preserve">Fondazione Operate</w:t>
+            </w:r>
+          </w:p>
+        </w:tc>
+      </w:tr>
+      <w:tr>
+        <w:trPr>
+          <w:cantSplit/>
+        </w:trPr>
+        <w:tc>
+          <w:tcPr>
+            <w:tcW w:type="dxa" w:w="800"/>
+            <w:tcBorders>
+              <w:top w:val="single" w:color="D9D4C5" w:sz="4"/>
+              <w:left w:val="single" w:color="D9D4C5" w:sz="4"/>
+              <w:bottom w:val="single" w:color="D9D4C5" w:sz="4"/>
+              <w:right w:val="single" w:color="D9D4C5" w:sz="4"/>
+            </w:tcBorders>
+            <w:shd w:fill="F6F4EE" w:color="auto" w:val="clear"/>
+            <w:tcMar>
+              <w:top w:type="dxa" w:w="70"/>
+              <w:left w:type="dxa" w:w="110"/>
+              <w:bottom w:type="dxa" w:w="70"/>
+              <w:right w:type="dxa" w:w="110"/>
+            </w:tcMar>
+            <w:vAlign w:val="center"/>
+          </w:tcPr>
+          <w:p>
+            <w:pPr>
+              <w:spacing w:after="0" w:before="0"/>
+            </w:pPr>
+            <w:r>
+              <w:rPr>
+                <w:rFonts w:ascii="Arial" w:cs="Arial" w:eastAsia="Arial" w:hAnsi="Arial"/>
+                <w:color w:val="1B2118"/>
+                <w:sz w:val="18"/>
+                <w:szCs w:val="18"/>
+              </w:rPr>
               <w:t xml:space="preserve">1.0</w:t>
             </w:r>
           </w:p>
@@ -732,6 +866,7 @@
               <w:bottom w:val="single" w:color="D9D4C5" w:sz="4"/>
               <w:right w:val="single" w:color="D9D4C5" w:sz="4"/>
             </w:tcBorders>
+            <w:shd w:fill="F6F4EE" w:color="auto" w:val="clear"/>
             <w:tcMar>
               <w:top w:type="dxa" w:w="70"/>
               <w:left w:type="dxa" w:w="110"/>
@@ -764,6 +899,7 @@
               <w:bottom w:val="single" w:color="D9D4C5" w:sz="4"/>
               <w:right w:val="single" w:color="D9D4C5" w:sz="4"/>
             </w:tcBorders>
+            <w:shd w:fill="F6F4EE" w:color="auto" w:val="clear"/>
             <w:tcMar>
               <w:top w:type="dxa" w:w="70"/>
               <w:left w:type="dxa" w:w="110"/>
@@ -796,6 +932,7 @@
               <w:bottom w:val="single" w:color="D9D4C5" w:sz="4"/>
               <w:right w:val="single" w:color="D9D4C5" w:sz="4"/>
             </w:tcBorders>
+            <w:shd w:fill="F6F4EE" w:color="auto" w:val="clear"/>
             <w:tcMar>
               <w:top w:type="dxa" w:w="70"/>
               <w:left w:type="dxa" w:w="110"/>
@@ -837,7 +974,7 @@
           <w:sz w:val="20"/>
           <w:szCs w:val="20"/>
         </w:rPr>
-        <w:t xml:space="preserve">Fotografia del registro alla revisione 1.0 del 18/10/2026. Il registro è aggiornato a ogni nuova funzione, servizio o rilascio; la versione corrente si scarica dall'area Documentazione del portale (solo Amministratori).</w:t>
+        <w:t xml:space="preserve">Fotografia del registro alla revisione 1.1 del 18/10/2026. Il registro è aggiornato a ogni nuova funzione, servizio o rilascio; la versione corrente si scarica dall'area Documentazione del portale (solo Amministratori).</w:t>
       </w:r>
     </w:p>
     <w:p>
@@ -3882,6 +4019,36 @@
     </w:p>
     <w:p>
       <w:pPr>
+        <w:pStyle w:val="ListParagraph"/>
+        <w:numPr>
+          <w:ilvl w:val="0"/>
+          <w:numId w:val="3"/>
+        </w:numPr>
+        <w:spacing w:after="70" w:line="290"/>
+      </w:pPr>
+      <w:r>
+        <w:rPr>
+          <w:rFonts w:ascii="Arial" w:cs="Arial" w:eastAsia="Arial" w:hAnsi="Arial"/>
+          <w:b/>
+          <w:bCs/>
+          <w:color w:val="1B2118"/>
+          <w:sz w:val="21"/>
+          <w:szCs w:val="21"/>
+        </w:rPr>
+        <w:t xml:space="preserve">Decisione del 18/10:</w:t>
+      </w:r>
+      <w:r>
+        <w:rPr>
+          <w:rFonts w:ascii="Arial" w:cs="Arial" w:eastAsia="Arial" w:hAnsi="Arial"/>
+          <w:color w:val="1B2118"/>
+          <w:sz w:val="21"/>
+          <w:szCs w:val="21"/>
+        </w:rPr>
+        <w:t xml:space="preserve"> Vercel e Supabase passeranno a piani a pagamento (backlog punto 29). I limiti dei piani gratuiti descritti qui sopra valgono fino ad allora.</w:t>
+      </w:r>
+    </w:p>
+    <w:p>
+      <w:pPr>
         <w:pStyle w:val="Heading1"/>
         <w:pageBreakBefore/>
         <w:pBdr>
@@ -13135,7 +13302,7 @@
               </w:rPr>
               <w:t xml:space="preserve">Claude Doc: </w:t>
             </w:r>
-            <w:hyperlink w:history="1" r:id="rIduvxoypxnm898waedlghf7">
+            <w:hyperlink w:history="1" r:id="rIdvfkaeikvnymhcygn4m6vf">
               <w:r>
                 <w:rPr>
                   <w:rFonts w:ascii="Arial" w:cs="Arial" w:eastAsia="Arial" w:hAnsi="Arial"/>
@@ -13482,7 +13649,7 @@
               </w:rPr>
               <w:t xml:space="preserve">Claude Doc: </w:t>
             </w:r>
-            <w:hyperlink w:history="1" r:id="rIdd8cwour6bhpg8irvt2tip">
+            <w:hyperlink w:history="1" r:id="rIdwfhvxssjjy_rtjmfpfvaq">
               <w:r>
                 <w:rPr>
                   <w:rFonts w:ascii="Arial" w:cs="Arial" w:eastAsia="Arial" w:hAnsi="Arial"/>
@@ -13891,7 +14058,7 @@
               </w:rPr>
               <w:t xml:space="preserve">Claude Doc: </w:t>
             </w:r>
-            <w:hyperlink w:history="1" r:id="rIdavjzseufd1rvjsib7if6r">
+            <w:hyperlink w:history="1" r:id="rIdijvu6q9gtbe7f5t-7utki">
               <w:r>
                 <w:rPr>
                   <w:rFonts w:ascii="Arial" w:cs="Arial" w:eastAsia="Arial" w:hAnsi="Arial"/>
@@ -14434,7 +14601,7 @@
             <w:pPr>
               <w:spacing w:after="0" w:before="0"/>
             </w:pPr>
-            <w:hyperlink w:history="1" r:id="rIds72mspyku2d523rbgwrmr">
+            <w:hyperlink w:history="1" r:id="rId6xklsbazvb6kyqelg2nrc">
               <w:r>
                 <w:rPr>
                   <w:rFonts w:ascii="Arial" w:cs="Arial" w:eastAsia="Arial" w:hAnsi="Arial"/>
@@ -14813,22 +14980,6 @@
     </w:p>
     <w:p>
       <w:pPr>
-        <w:spacing w:after="140" w:line="300"/>
-      </w:pPr>
-      <w:r>
-        <w:rPr>
-          <w:rFonts w:ascii="Arial" w:cs="Arial" w:eastAsia="Arial" w:hAnsi="Arial"/>
-          <w:b/>
-          <w:bCs/>
-          <w:color w:val="1B2118"/>
-          <w:sz w:val="21"/>
-          <w:szCs w:val="21"/>
-        </w:rPr>
-        <w:t xml:space="preserve">Aperte</w:t>
-      </w:r>
-    </w:p>
-    <w:p>
-      <w:pPr>
         <w:pStyle w:val="ListParagraph"/>
         <w:numPr>
           <w:ilvl w:val="0"/>
@@ -14843,7 +14994,43 @@
           <w:sz w:val="21"/>
           <w:szCs w:val="21"/>
         </w:rPr>
-        <w:t xml:space="preserve">A. Una nuova versione di documento durante una fase fa ripartire il termine?</w:t>
+        <w:t xml:space="preserve">18/10 — </w:t>
+      </w:r>
+      <w:r>
+        <w:rPr>
+          <w:rFonts w:ascii="Arial" w:cs="Arial" w:eastAsia="Arial" w:hAnsi="Arial"/>
+          <w:b/>
+          <w:bCs/>
+          <w:color w:val="1B2118"/>
+          <w:sz w:val="21"/>
+          <w:szCs w:val="21"/>
+        </w:rPr>
+        <w:t xml:space="preserve">Vercel e Supabase passeranno a piani a pagamento</w:t>
+      </w:r>
+      <w:r>
+        <w:rPr>
+          <w:rFonts w:ascii="Arial" w:cs="Arial" w:eastAsia="Arial" w:hAnsi="Arial"/>
+          <w:color w:val="1B2118"/>
+          <w:sz w:val="21"/>
+          <w:szCs w:val="21"/>
+        </w:rPr>
+        <w:t xml:space="preserve"> (decisione di Luca). Conseguenze previste, da verificare al momento dell'attivazione: repository GitHub di nuovo privato (il piano gratuito di Vercel lo impedisce), nessuna pausa del database per inattività, backup automatici giornalieri di Supabase, limite per file caricato aumentabile oltre 50 MB.</w:t>
+      </w:r>
+    </w:p>
+    <w:p>
+      <w:pPr>
+        <w:spacing w:after="140" w:line="300"/>
+      </w:pPr>
+      <w:r>
+        <w:rPr>
+          <w:rFonts w:ascii="Arial" w:cs="Arial" w:eastAsia="Arial" w:hAnsi="Arial"/>
+          <w:b/>
+          <w:bCs/>
+          <w:color w:val="1B2118"/>
+          <w:sz w:val="21"/>
+          <w:szCs w:val="21"/>
+        </w:rPr>
+        <w:t xml:space="preserve">Aperte</w:t>
       </w:r>
     </w:p>
     <w:p>
@@ -14862,7 +15049,7 @@
           <w:sz w:val="21"/>
           <w:szCs w:val="21"/>
         </w:rPr>
-        <w:t xml:space="preserve">B. Errata corrige in consultazione: i 30 giorni ripartono?</w:t>
+        <w:t xml:space="preserve">A. Una nuova versione di documento durante una fase fa ripartire il termine?</w:t>
       </w:r>
     </w:p>
     <w:p>
@@ -14881,7 +15068,7 @@
           <w:sz w:val="21"/>
           <w:szCs w:val="21"/>
         </w:rPr>
-        <w:t xml:space="preserve">D. Identificazione dei commentatori esterni.</w:t>
+        <w:t xml:space="preserve">B. Errata corrige in consultazione: i 30 giorni ripartono?</w:t>
       </w:r>
     </w:p>
     <w:p>
@@ -14900,7 +15087,7 @@
           <w:sz w:val="21"/>
           <w:szCs w:val="21"/>
         </w:rPr>
-        <w:t xml:space="preserve">Scelte interpretative del calcolo crediti (soprattutto il segno del riuso, formule 26 e 29).</w:t>
+        <w:t xml:space="preserve">D. Identificazione dei commentatori esterni.</w:t>
       </w:r>
     </w:p>
     <w:p>
@@ -14919,6 +15106,25 @@
           <w:sz w:val="21"/>
           <w:szCs w:val="21"/>
         </w:rPr>
+        <w:t xml:space="preserve">Scelte interpretative del calcolo crediti (soprattutto il segno del riuso, formule 26 e 29).</w:t>
+      </w:r>
+    </w:p>
+    <w:p>
+      <w:pPr>
+        <w:pStyle w:val="ListParagraph"/>
+        <w:numPr>
+          <w:ilvl w:val="0"/>
+          <w:numId w:val="3"/>
+        </w:numPr>
+        <w:spacing w:after="70" w:line="290"/>
+      </w:pPr>
+      <w:r>
+        <w:rPr>
+          <w:rFonts w:ascii="Arial" w:cs="Arial" w:eastAsia="Arial" w:hAnsi="Arial"/>
+          <w:color w:val="1B2118"/>
+          <w:sz w:val="21"/>
+          <w:szCs w:val="21"/>
+        </w:rPr>
         <w:t xml:space="preserve">Antivirus: ClamAV su server proprio o servizio a pagamento.</w:t>
       </w:r>
     </w:p>
@@ -15887,6 +16093,92 @@
           <w:szCs w:val="21"/>
         </w:rPr>
         <w:t xml:space="preserve"> Riservatezza della documentazione: il registro è nel repository pubblico e i suoi file Word/PDF sono raggiungibili da chi conosce l'indirizzo (il portale li mostra solo agli Amministratori). Per renderli davvero riservati: archivio privato su Supabase con accesso solo Admin, o repository privato (oggi incompatibile con il piano gratuito di Vercel).</w:t>
+      </w:r>
+    </w:p>
+    <w:p>
+      <w:pPr>
+        <w:spacing w:after="140" w:line="300"/>
+      </w:pPr>
+      <w:r>
+        <w:rPr>
+          <w:rFonts w:ascii="Arial" w:cs="Arial" w:eastAsia="Arial" w:hAnsi="Arial"/>
+          <w:b/>
+          <w:bCs/>
+          <w:color w:val="1B2118"/>
+          <w:sz w:val="21"/>
+          <w:szCs w:val="21"/>
+        </w:rPr>
+        <w:t xml:space="preserve">Infrastruttura</w:t>
+      </w:r>
+    </w:p>
+    <w:p>
+      <w:pPr>
+        <w:pStyle w:val="ListParagraph"/>
+        <w:numPr>
+          <w:ilvl w:val="0"/>
+          <w:numId w:val="3"/>
+        </w:numPr>
+        <w:spacing w:after="70" w:line="290"/>
+      </w:pPr>
+      <w:r>
+        <w:rPr>
+          <w:rFonts w:ascii="Arial" w:cs="Arial" w:eastAsia="Arial" w:hAnsi="Arial"/>
+          <w:b/>
+          <w:bCs/>
+          <w:color w:val="1B2118"/>
+          <w:sz w:val="21"/>
+          <w:szCs w:val="21"/>
+        </w:rPr>
+        <w:t xml:space="preserve">29.</w:t>
+      </w:r>
+      <w:r>
+        <w:rPr>
+          <w:rFonts w:ascii="Arial" w:cs="Arial" w:eastAsia="Arial" w:hAnsi="Arial"/>
+          <w:color w:val="1B2118"/>
+          <w:sz w:val="21"/>
+          <w:szCs w:val="21"/>
+        </w:rPr>
+        <w:t xml:space="preserve"> Passaggio a piani a pagamento di </w:t>
+      </w:r>
+      <w:r>
+        <w:rPr>
+          <w:rFonts w:ascii="Arial" w:cs="Arial" w:eastAsia="Arial" w:hAnsi="Arial"/>
+          <w:b/>
+          <w:bCs/>
+          <w:color w:val="1B2118"/>
+          <w:sz w:val="21"/>
+          <w:szCs w:val="21"/>
+        </w:rPr>
+        <w:t xml:space="preserve">Vercel</w:t>
+      </w:r>
+      <w:r>
+        <w:rPr>
+          <w:rFonts w:ascii="Arial" w:cs="Arial" w:eastAsia="Arial" w:hAnsi="Arial"/>
+          <w:color w:val="1B2118"/>
+          <w:sz w:val="21"/>
+          <w:szCs w:val="21"/>
+        </w:rPr>
+        <w:t xml:space="preserve"> e </w:t>
+      </w:r>
+      <w:r>
+        <w:rPr>
+          <w:rFonts w:ascii="Arial" w:cs="Arial" w:eastAsia="Arial" w:hAnsi="Arial"/>
+          <w:b/>
+          <w:bCs/>
+          <w:color w:val="1B2118"/>
+          <w:sz w:val="21"/>
+          <w:szCs w:val="21"/>
+        </w:rPr>
+        <w:t xml:space="preserve">Supabase</w:t>
+      </w:r>
+      <w:r>
+        <w:rPr>
+          <w:rFonts w:ascii="Arial" w:cs="Arial" w:eastAsia="Arial" w:hAnsi="Arial"/>
+          <w:color w:val="1B2118"/>
+          <w:sz w:val="21"/>
+          <w:szCs w:val="21"/>
+        </w:rPr>
+        <w:t xml:space="preserve"> (decisione del 18/10). Dopo l'attivazione: rendere privato il repository GitHub e ricollegarlo a Vercel (risolve in buona parte il punto 28); verificare i backup automatici di Supabase e scrivere la procedura di ripristino (punto 18); valutare l'ambiente di prova separato (punto 18); decidere se alzare il limite di 50 MB per file; aggiornare i §2-3 di questo registro con piani, costi e intestatario dei contratti.</w:t>
       </w:r>
     </w:p>
     <w:p>
@@ -16738,7 +17030,7 @@
         <w:szCs w:val="16"/>
       </w:rPr>
       <w:tab/>
-      <w:t xml:space="preserve">Registro sviluppo e deploy · Rev. 1.0 · 18/10/2026</w:t>
+      <w:t xml:space="preserve">Registro sviluppo e deploy · Rev. 1.1 · 18/10/2026</w:t>
     </w:r>
   </w:p>
 </w:hdr>
@@ -16803,7 +17095,7 @@
         <w:szCs w:val="16"/>
       </w:rPr>
       <w:tab/>
-      <w:t xml:space="preserve">Registro sviluppo e deploy · Rev. 1.0 · 18/10/2026</w:t>
+      <w:t xml:space="preserve">Registro sviluppo e deploy · Rev. 1.1 · 18/10/2026</w:t>
     </w:r>
   </w:p>
 </w:hdr>

</xml_diff>

<commit_message>
Password: cambio obbligatorio al primo accesso, cambio, recupero e reimpostazione
Script 15 (password_temporanea, password_cambiata), Edge Function
reimposta-password, pagina CambiaPassword (obbligatorio, volontario,
recupero), Password dimenticata? nel login, Reimposta password in Gestione
utenti, ritorno alla pagina richiesta dopo l'accesso. Manuale Utente Rev.
1.2, registro aggiornato, punto 30 (cyber security) nel backlog.

Co-Authored-By: Claude Opus 5.5 <noreply@anthropic.com>
Claude-Session: https://claude.ai/code/session_01E8XCbEeVHWVP3hntUZ6kZ1
</commit_message>
<xml_diff>
--- a/public/documentazione/Registro_Dev_Deploy_Portale_CWP.docx
+++ b/public/documentazione/Registro_Dev_Deploy_Portale_CWP.docx
@@ -5739,6 +5739,143 @@
           </w:p>
         </w:tc>
       </w:tr>
+      <w:tr>
+        <w:trPr>
+          <w:cantSplit/>
+        </w:trPr>
+        <w:tc>
+          <w:tcPr>
+            <w:tcW w:type="dxa" w:w="3213"/>
+            <w:tcBorders>
+              <w:top w:val="single" w:color="D9D4C5" w:sz="4"/>
+              <w:left w:val="single" w:color="D9D4C5" w:sz="4"/>
+              <w:bottom w:val="single" w:color="D9D4C5" w:sz="4"/>
+              <w:right w:val="single" w:color="D9D4C5" w:sz="4"/>
+            </w:tcBorders>
+            <w:tcMar>
+              <w:top w:type="dxa" w:w="70"/>
+              <w:left w:type="dxa" w:w="110"/>
+              <w:bottom w:type="dxa" w:w="70"/>
+              <w:right w:type="dxa" w:w="110"/>
+            </w:tcMar>
+            <w:vAlign w:val="center"/>
+          </w:tcPr>
+          <w:p>
+            <w:pPr>
+              <w:spacing w:after="0" w:before="0"/>
+            </w:pPr>
+            <w:r>
+              <w:rPr>
+                <w:rFonts w:ascii="Consolas" w:cs="Consolas" w:eastAsia="Consolas" w:hAnsi="Consolas"/>
+                <w:color w:val="2F5D3A"/>
+                <w:sz w:val="18"/>
+                <w:szCs w:val="18"/>
+              </w:rPr>
+              <w:t xml:space="preserve">15_password.sql</w:t>
+            </w:r>
+          </w:p>
+        </w:tc>
+        <w:tc>
+          <w:tcPr>
+            <w:tcW w:type="dxa" w:w="4016"/>
+            <w:tcBorders>
+              <w:top w:val="single" w:color="D9D4C5" w:sz="4"/>
+              <w:left w:val="single" w:color="D9D4C5" w:sz="4"/>
+              <w:bottom w:val="single" w:color="D9D4C5" w:sz="4"/>
+              <w:right w:val="single" w:color="D9D4C5" w:sz="4"/>
+            </w:tcBorders>
+            <w:tcMar>
+              <w:top w:type="dxa" w:w="70"/>
+              <w:left w:type="dxa" w:w="110"/>
+              <w:bottom w:type="dxa" w:w="70"/>
+              <w:right w:type="dxa" w:w="110"/>
+            </w:tcMar>
+            <w:vAlign w:val="center"/>
+          </w:tcPr>
+          <w:p>
+            <w:pPr>
+              <w:spacing w:after="0" w:before="0"/>
+            </w:pPr>
+            <w:r>
+              <w:rPr>
+                <w:rFonts w:ascii="Arial" w:cs="Arial" w:eastAsia="Arial" w:hAnsi="Arial"/>
+                <w:color w:val="1B2118"/>
+                <w:sz w:val="18"/>
+                <w:szCs w:val="18"/>
+              </w:rPr>
+              <w:t xml:space="preserve">Cambio obbligatorio dopo password temporanea (</w:t>
+            </w:r>
+            <w:r>
+              <w:rPr>
+                <w:rFonts w:ascii="Consolas" w:cs="Consolas" w:eastAsia="Consolas" w:hAnsi="Consolas"/>
+                <w:color w:val="2F5D3A"/>
+                <w:sz w:val="18"/>
+                <w:szCs w:val="18"/>
+              </w:rPr>
+              <w:t xml:space="preserve">password_temporanea</w:t>
+            </w:r>
+            <w:r>
+              <w:rPr>
+                <w:rFonts w:ascii="Arial" w:cs="Arial" w:eastAsia="Arial" w:hAnsi="Arial"/>
+                <w:color w:val="1B2118"/>
+                <w:sz w:val="18"/>
+                <w:szCs w:val="18"/>
+              </w:rPr>
+              <w:t xml:space="preserve">), funzione </w:t>
+            </w:r>
+            <w:r>
+              <w:rPr>
+                <w:rFonts w:ascii="Consolas" w:cs="Consolas" w:eastAsia="Consolas" w:hAnsi="Consolas"/>
+                <w:color w:val="2F5D3A"/>
+                <w:sz w:val="18"/>
+                <w:szCs w:val="18"/>
+              </w:rPr>
+              <w:t xml:space="preserve">password_cambiata</w:t>
+            </w:r>
+            <w:r>
+              <w:rPr>
+                <w:rFonts w:ascii="Arial" w:cs="Arial" w:eastAsia="Arial" w:hAnsi="Arial"/>
+                <w:color w:val="1B2118"/>
+                <w:sz w:val="18"/>
+                <w:szCs w:val="18"/>
+              </w:rPr>
+              <w:t xml:space="preserve">, audit dei cambi password</w:t>
+            </w:r>
+          </w:p>
+        </w:tc>
+        <w:tc>
+          <w:tcPr>
+            <w:tcW w:type="dxa" w:w="2409"/>
+            <w:tcBorders>
+              <w:top w:val="single" w:color="D9D4C5" w:sz="4"/>
+              <w:left w:val="single" w:color="D9D4C5" w:sz="4"/>
+              <w:bottom w:val="single" w:color="D9D4C5" w:sz="4"/>
+              <w:right w:val="single" w:color="D9D4C5" w:sz="4"/>
+            </w:tcBorders>
+            <w:tcMar>
+              <w:top w:type="dxa" w:w="70"/>
+              <w:left w:type="dxa" w:w="110"/>
+              <w:bottom w:type="dxa" w:w="70"/>
+              <w:right w:type="dxa" w:w="110"/>
+            </w:tcMar>
+            <w:vAlign w:val="center"/>
+          </w:tcPr>
+          <w:p>
+            <w:pPr>
+              <w:spacing w:after="0" w:before="0"/>
+            </w:pPr>
+            <w:r>
+              <w:rPr>
+                <w:rFonts w:ascii="Arial" w:cs="Arial" w:eastAsia="Arial" w:hAnsi="Arial"/>
+                <w:color w:val="1B2118"/>
+                <w:sz w:val="18"/>
+                <w:szCs w:val="18"/>
+              </w:rPr>
+              <w:t xml:space="preserve">18/10/2026</w:t>
+            </w:r>
+          </w:p>
+        </w:tc>
+      </w:tr>
     </w:tbl>
     <w:p>
       <w:pPr>
@@ -6647,10 +6784,10 @@
         <w:tblLayout w:type="fixed"/>
       </w:tblPr>
       <w:tblGrid>
-        <w:gridCol w:w="2760"/>
-        <w:gridCol w:w="2293"/>
-        <w:gridCol w:w="2293"/>
-        <w:gridCol w:w="2292"/>
+        <w:gridCol w:w="2685"/>
+        <w:gridCol w:w="2318"/>
+        <w:gridCol w:w="2318"/>
+        <w:gridCol w:w="2317"/>
       </w:tblGrid>
       <w:tr>
         <w:trPr>
@@ -6658,7 +6795,7 @@
         </w:trPr>
         <w:tc>
           <w:tcPr>
-            <w:tcW w:type="dxa" w:w="2760"/>
+            <w:tcW w:type="dxa" w:w="2685"/>
             <w:tcBorders>
               <w:top w:val="single" w:color="D9D4C5" w:sz="4"/>
               <w:left w:val="single" w:color="D9D4C5" w:sz="4"/>
@@ -6693,7 +6830,7 @@
         </w:tc>
         <w:tc>
           <w:tcPr>
-            <w:tcW w:type="dxa" w:w="2293"/>
+            <w:tcW w:type="dxa" w:w="2318"/>
             <w:tcBorders>
               <w:top w:val="single" w:color="D9D4C5" w:sz="4"/>
               <w:left w:val="single" w:color="D9D4C5" w:sz="4"/>
@@ -6728,7 +6865,7 @@
         </w:tc>
         <w:tc>
           <w:tcPr>
-            <w:tcW w:type="dxa" w:w="2293"/>
+            <w:tcW w:type="dxa" w:w="2318"/>
             <w:tcBorders>
               <w:top w:val="single" w:color="D9D4C5" w:sz="4"/>
               <w:left w:val="single" w:color="D9D4C5" w:sz="4"/>
@@ -6763,7 +6900,7 @@
         </w:tc>
         <w:tc>
           <w:tcPr>
-            <w:tcW w:type="dxa" w:w="2292"/>
+            <w:tcW w:type="dxa" w:w="2317"/>
             <w:tcBorders>
               <w:top w:val="single" w:color="D9D4C5" w:sz="4"/>
               <w:left w:val="single" w:color="D9D4C5" w:sz="4"/>
@@ -6803,7 +6940,7 @@
         </w:trPr>
         <w:tc>
           <w:tcPr>
-            <w:tcW w:type="dxa" w:w="2760"/>
+            <w:tcW w:type="dxa" w:w="2685"/>
             <w:tcBorders>
               <w:top w:val="single" w:color="D9D4C5" w:sz="4"/>
               <w:left w:val="single" w:color="D9D4C5" w:sz="4"/>
@@ -6835,7 +6972,7 @@
         </w:tc>
         <w:tc>
           <w:tcPr>
-            <w:tcW w:type="dxa" w:w="2293"/>
+            <w:tcW w:type="dxa" w:w="2318"/>
             <w:tcBorders>
               <w:top w:val="single" w:color="D9D4C5" w:sz="4"/>
               <w:left w:val="single" w:color="D9D4C5" w:sz="4"/>
@@ -6867,7 +7004,7 @@
         </w:tc>
         <w:tc>
           <w:tcPr>
-            <w:tcW w:type="dxa" w:w="2293"/>
+            <w:tcW w:type="dxa" w:w="2318"/>
             <w:tcBorders>
               <w:top w:val="single" w:color="D9D4C5" w:sz="4"/>
               <w:left w:val="single" w:color="D9D4C5" w:sz="4"/>
@@ -6917,7 +7054,7 @@
         </w:tc>
         <w:tc>
           <w:tcPr>
-            <w:tcW w:type="dxa" w:w="2292"/>
+            <w:tcW w:type="dxa" w:w="2317"/>
             <w:tcBorders>
               <w:top w:val="single" w:color="D9D4C5" w:sz="4"/>
               <w:left w:val="single" w:color="D9D4C5" w:sz="4"/>
@@ -6954,7 +7091,7 @@
         </w:trPr>
         <w:tc>
           <w:tcPr>
-            <w:tcW w:type="dxa" w:w="2760"/>
+            <w:tcW w:type="dxa" w:w="2685"/>
             <w:tcBorders>
               <w:top w:val="single" w:color="D9D4C5" w:sz="4"/>
               <w:left w:val="single" w:color="D9D4C5" w:sz="4"/>
@@ -6981,20 +7118,173 @@
                 <w:sz w:val="18"/>
                 <w:szCs w:val="18"/>
               </w:rPr>
+              <w:t xml:space="preserve">reimposta-password</w:t>
+            </w:r>
+          </w:p>
+        </w:tc>
+        <w:tc>
+          <w:tcPr>
+            <w:tcW w:type="dxa" w:w="2318"/>
+            <w:tcBorders>
+              <w:top w:val="single" w:color="D9D4C5" w:sz="4"/>
+              <w:left w:val="single" w:color="D9D4C5" w:sz="4"/>
+              <w:bottom w:val="single" w:color="D9D4C5" w:sz="4"/>
+              <w:right w:val="single" w:color="D9D4C5" w:sz="4"/>
+            </w:tcBorders>
+            <w:shd w:fill="F6F4EE" w:color="auto" w:val="clear"/>
+            <w:tcMar>
+              <w:top w:type="dxa" w:w="70"/>
+              <w:left w:type="dxa" w:w="110"/>
+              <w:bottom w:type="dxa" w:w="70"/>
+              <w:right w:type="dxa" w:w="110"/>
+            </w:tcMar>
+            <w:vAlign w:val="center"/>
+          </w:tcPr>
+          <w:p>
+            <w:pPr>
+              <w:spacing w:after="0" w:before="0"/>
+            </w:pPr>
+            <w:r>
+              <w:rPr>
+                <w:rFonts w:ascii="Arial" w:cs="Arial" w:eastAsia="Arial" w:hAnsi="Arial"/>
+                <w:color w:val="1B2118"/>
+                <w:sz w:val="18"/>
+                <w:szCs w:val="18"/>
+              </w:rPr>
+              <w:t xml:space="preserve">L'Amministratore assegna una password temporanea a un Cliente o Operatore; il flag obbliga al cambio al primo accesso; audit</w:t>
+            </w:r>
+          </w:p>
+        </w:tc>
+        <w:tc>
+          <w:tcPr>
+            <w:tcW w:type="dxa" w:w="2318"/>
+            <w:tcBorders>
+              <w:top w:val="single" w:color="D9D4C5" w:sz="4"/>
+              <w:left w:val="single" w:color="D9D4C5" w:sz="4"/>
+              <w:bottom w:val="single" w:color="D9D4C5" w:sz="4"/>
+              <w:right w:val="single" w:color="D9D4C5" w:sz="4"/>
+            </w:tcBorders>
+            <w:shd w:fill="F6F4EE" w:color="auto" w:val="clear"/>
+            <w:tcMar>
+              <w:top w:type="dxa" w:w="70"/>
+              <w:left w:type="dxa" w:w="110"/>
+              <w:bottom w:type="dxa" w:w="70"/>
+              <w:right w:type="dxa" w:w="110"/>
+            </w:tcMar>
+            <w:vAlign w:val="center"/>
+          </w:tcPr>
+          <w:p>
+            <w:pPr>
+              <w:spacing w:after="0" w:before="0"/>
+            </w:pPr>
+            <w:r>
+              <w:rPr>
+                <w:rFonts w:ascii="Arial" w:cs="Arial" w:eastAsia="Arial" w:hAnsi="Arial"/>
+                <w:color w:val="1B2118"/>
+                <w:sz w:val="18"/>
+                <w:szCs w:val="18"/>
+              </w:rPr>
+              <w:t xml:space="preserve">Verifica </w:t>
+            </w:r>
+            <w:r>
+              <w:rPr>
+                <w:rFonts w:ascii="Consolas" w:cs="Consolas" w:eastAsia="Consolas" w:hAnsi="Consolas"/>
+                <w:color w:val="2F5D3A"/>
+                <w:sz w:val="18"/>
+                <w:szCs w:val="18"/>
+              </w:rPr>
+              <w:t xml:space="preserve">sono_admin</w:t>
+            </w:r>
+            <w:r>
+              <w:rPr>
+                <w:rFonts w:ascii="Arial" w:cs="Arial" w:eastAsia="Arial" w:hAnsi="Arial"/>
+                <w:color w:val="1B2118"/>
+                <w:sz w:val="18"/>
+                <w:szCs w:val="18"/>
+              </w:rPr>
+              <w:t xml:space="preserve">; esclusi amministratori e sé stessi</w:t>
+            </w:r>
+          </w:p>
+        </w:tc>
+        <w:tc>
+          <w:tcPr>
+            <w:tcW w:type="dxa" w:w="2317"/>
+            <w:tcBorders>
+              <w:top w:val="single" w:color="D9D4C5" w:sz="4"/>
+              <w:left w:val="single" w:color="D9D4C5" w:sz="4"/>
+              <w:bottom w:val="single" w:color="D9D4C5" w:sz="4"/>
+              <w:right w:val="single" w:color="D9D4C5" w:sz="4"/>
+            </w:tcBorders>
+            <w:shd w:fill="F6F4EE" w:color="auto" w:val="clear"/>
+            <w:tcMar>
+              <w:top w:type="dxa" w:w="70"/>
+              <w:left w:type="dxa" w:w="110"/>
+              <w:bottom w:type="dxa" w:w="70"/>
+              <w:right w:type="dxa" w:w="110"/>
+            </w:tcMar>
+            <w:vAlign w:val="center"/>
+          </w:tcPr>
+          <w:p>
+            <w:pPr>
+              <w:spacing w:after="0" w:before="0"/>
+            </w:pPr>
+            <w:r>
+              <w:rPr>
+                <w:rFonts w:ascii="Arial" w:cs="Arial" w:eastAsia="Arial" w:hAnsi="Arial"/>
+                <w:color w:val="1B2118"/>
+                <w:sz w:val="18"/>
+                <w:szCs w:val="18"/>
+              </w:rPr>
+              <w:t xml:space="preserve">Dashboard Supabase (editor web), 18/10; Verify JWT attivo</w:t>
+            </w:r>
+          </w:p>
+        </w:tc>
+      </w:tr>
+      <w:tr>
+        <w:trPr>
+          <w:cantSplit/>
+        </w:trPr>
+        <w:tc>
+          <w:tcPr>
+            <w:tcW w:type="dxa" w:w="2685"/>
+            <w:tcBorders>
+              <w:top w:val="single" w:color="D9D4C5" w:sz="4"/>
+              <w:left w:val="single" w:color="D9D4C5" w:sz="4"/>
+              <w:bottom w:val="single" w:color="D9D4C5" w:sz="4"/>
+              <w:right w:val="single" w:color="D9D4C5" w:sz="4"/>
+            </w:tcBorders>
+            <w:tcMar>
+              <w:top w:type="dxa" w:w="70"/>
+              <w:left w:type="dxa" w:w="110"/>
+              <w:bottom w:type="dxa" w:w="70"/>
+              <w:right w:type="dxa" w:w="110"/>
+            </w:tcMar>
+            <w:vAlign w:val="center"/>
+          </w:tcPr>
+          <w:p>
+            <w:pPr>
+              <w:spacing w:after="0" w:before="0"/>
+            </w:pPr>
+            <w:r>
+              <w:rPr>
+                <w:rFonts w:ascii="Consolas" w:cs="Consolas" w:eastAsia="Consolas" w:hAnsi="Consolas"/>
+                <w:color w:val="2F5D3A"/>
+                <w:sz w:val="18"/>
+                <w:szCs w:val="18"/>
+              </w:rPr>
               <w:t xml:space="preserve">invia-email-notifica</w:t>
             </w:r>
           </w:p>
         </w:tc>
         <w:tc>
           <w:tcPr>
-            <w:tcW w:type="dxa" w:w="2293"/>
-            <w:tcBorders>
-              <w:top w:val="single" w:color="D9D4C5" w:sz="4"/>
-              <w:left w:val="single" w:color="D9D4C5" w:sz="4"/>
-              <w:bottom w:val="single" w:color="D9D4C5" w:sz="4"/>
-              <w:right w:val="single" w:color="D9D4C5" w:sz="4"/>
-            </w:tcBorders>
-            <w:shd w:fill="F6F4EE" w:color="auto" w:val="clear"/>
+            <w:tcW w:type="dxa" w:w="2318"/>
+            <w:tcBorders>
+              <w:top w:val="single" w:color="D9D4C5" w:sz="4"/>
+              <w:left w:val="single" w:color="D9D4C5" w:sz="4"/>
+              <w:bottom w:val="single" w:color="D9D4C5" w:sz="4"/>
+              <w:right w:val="single" w:color="D9D4C5" w:sz="4"/>
+            </w:tcBorders>
             <w:tcMar>
               <w:top w:type="dxa" w:w="70"/>
               <w:left w:type="dxa" w:w="110"/>
@@ -7020,14 +7310,13 @@
         </w:tc>
         <w:tc>
           <w:tcPr>
-            <w:tcW w:type="dxa" w:w="2293"/>
-            <w:tcBorders>
-              <w:top w:val="single" w:color="D9D4C5" w:sz="4"/>
-              <w:left w:val="single" w:color="D9D4C5" w:sz="4"/>
-              <w:bottom w:val="single" w:color="D9D4C5" w:sz="4"/>
-              <w:right w:val="single" w:color="D9D4C5" w:sz="4"/>
-            </w:tcBorders>
-            <w:shd w:fill="F6F4EE" w:color="auto" w:val="clear"/>
+            <w:tcW w:type="dxa" w:w="2318"/>
+            <w:tcBorders>
+              <w:top w:val="single" w:color="D9D4C5" w:sz="4"/>
+              <w:left w:val="single" w:color="D9D4C5" w:sz="4"/>
+              <w:bottom w:val="single" w:color="D9D4C5" w:sz="4"/>
+              <w:right w:val="single" w:color="D9D4C5" w:sz="4"/>
+            </w:tcBorders>
             <w:tcMar>
               <w:top w:type="dxa" w:w="70"/>
               <w:left w:type="dxa" w:w="110"/>
@@ -7073,14 +7362,13 @@
         </w:tc>
         <w:tc>
           <w:tcPr>
-            <w:tcW w:type="dxa" w:w="2292"/>
-            <w:tcBorders>
-              <w:top w:val="single" w:color="D9D4C5" w:sz="4"/>
-              <w:left w:val="single" w:color="D9D4C5" w:sz="4"/>
-              <w:bottom w:val="single" w:color="D9D4C5" w:sz="4"/>
-              <w:right w:val="single" w:color="D9D4C5" w:sz="4"/>
-            </w:tcBorders>
-            <w:shd w:fill="F6F4EE" w:color="auto" w:val="clear"/>
+            <w:tcW w:type="dxa" w:w="2317"/>
+            <w:tcBorders>
+              <w:top w:val="single" w:color="D9D4C5" w:sz="4"/>
+              <w:left w:val="single" w:color="D9D4C5" w:sz="4"/>
+              <w:bottom w:val="single" w:color="D9D4C5" w:sz="4"/>
+              <w:right w:val="single" w:color="D9D4C5" w:sz="4"/>
+            </w:tcBorders>
             <w:tcMar>
               <w:top w:type="dxa" w:w="70"/>
               <w:left w:type="dxa" w:w="110"/>
@@ -7286,9 +7574,9 @@
         <w:tblLayout w:type="fixed"/>
       </w:tblPr>
       <w:tblGrid>
-        <w:gridCol w:w="2135"/>
-        <w:gridCol w:w="5512"/>
-        <w:gridCol w:w="1991"/>
+        <w:gridCol w:w="2635"/>
+        <w:gridCol w:w="4990"/>
+        <w:gridCol w:w="2013"/>
       </w:tblGrid>
       <w:tr>
         <w:trPr>
@@ -7296,7 +7584,7 @@
         </w:trPr>
         <w:tc>
           <w:tcPr>
-            <w:tcW w:type="dxa" w:w="2135"/>
+            <w:tcW w:type="dxa" w:w="2635"/>
             <w:tcBorders>
               <w:top w:val="single" w:color="D9D4C5" w:sz="4"/>
               <w:left w:val="single" w:color="D9D4C5" w:sz="4"/>
@@ -7331,7 +7619,7 @@
         </w:tc>
         <w:tc>
           <w:tcPr>
-            <w:tcW w:type="dxa" w:w="5512"/>
+            <w:tcW w:type="dxa" w:w="4990"/>
             <w:tcBorders>
               <w:top w:val="single" w:color="D9D4C5" w:sz="4"/>
               <w:left w:val="single" w:color="D9D4C5" w:sz="4"/>
@@ -7366,7 +7654,7 @@
         </w:tc>
         <w:tc>
           <w:tcPr>
-            <w:tcW w:type="dxa" w:w="1991"/>
+            <w:tcW w:type="dxa" w:w="2013"/>
             <w:tcBorders>
               <w:top w:val="single" w:color="D9D4C5" w:sz="4"/>
               <w:left w:val="single" w:color="D9D4C5" w:sz="4"/>
@@ -7406,7 +7694,7 @@
         </w:trPr>
         <w:tc>
           <w:tcPr>
-            <w:tcW w:type="dxa" w:w="2135"/>
+            <w:tcW w:type="dxa" w:w="2635"/>
             <w:tcBorders>
               <w:top w:val="single" w:color="D9D4C5" w:sz="4"/>
               <w:left w:val="single" w:color="D9D4C5" w:sz="4"/>
@@ -7438,39 +7726,39 @@
         </w:tc>
         <w:tc>
           <w:tcPr>
-            <w:tcW w:type="dxa" w:w="5512"/>
-            <w:tcBorders>
-              <w:top w:val="single" w:color="D9D4C5" w:sz="4"/>
-              <w:left w:val="single" w:color="D9D4C5" w:sz="4"/>
-              <w:bottom w:val="single" w:color="D9D4C5" w:sz="4"/>
-              <w:right w:val="single" w:color="D9D4C5" w:sz="4"/>
-            </w:tcBorders>
-            <w:tcMar>
-              <w:top w:type="dxa" w:w="70"/>
-              <w:left w:type="dxa" w:w="110"/>
-              <w:bottom w:type="dxa" w:w="70"/>
-              <w:right w:type="dxa" w:w="110"/>
-            </w:tcMar>
-            <w:vAlign w:val="center"/>
-          </w:tcPr>
-          <w:p>
-            <w:pPr>
-              <w:spacing w:after="0" w:before="0"/>
-            </w:pPr>
-            <w:r>
-              <w:rPr>
-                <w:rFonts w:ascii="Arial" w:cs="Arial" w:eastAsia="Arial" w:hAnsi="Arial"/>
-                <w:color w:val="1B2118"/>
-                <w:sz w:val="18"/>
-                <w:szCs w:val="18"/>
-              </w:rPr>
-              <w:t xml:space="preserve">Accesso</w:t>
-            </w:r>
-          </w:p>
-        </w:tc>
-        <w:tc>
-          <w:tcPr>
-            <w:tcW w:type="dxa" w:w="1991"/>
+            <w:tcW w:type="dxa" w:w="4990"/>
+            <w:tcBorders>
+              <w:top w:val="single" w:color="D9D4C5" w:sz="4"/>
+              <w:left w:val="single" w:color="D9D4C5" w:sz="4"/>
+              <w:bottom w:val="single" w:color="D9D4C5" w:sz="4"/>
+              <w:right w:val="single" w:color="D9D4C5" w:sz="4"/>
+            </w:tcBorders>
+            <w:tcMar>
+              <w:top w:type="dxa" w:w="70"/>
+              <w:left w:type="dxa" w:w="110"/>
+              <w:bottom w:type="dxa" w:w="70"/>
+              <w:right w:type="dxa" w:w="110"/>
+            </w:tcMar>
+            <w:vAlign w:val="center"/>
+          </w:tcPr>
+          <w:p>
+            <w:pPr>
+              <w:spacing w:after="0" w:before="0"/>
+            </w:pPr>
+            <w:r>
+              <w:rPr>
+                <w:rFonts w:ascii="Arial" w:cs="Arial" w:eastAsia="Arial" w:hAnsi="Arial"/>
+                <w:color w:val="1B2118"/>
+                <w:sz w:val="18"/>
+                <w:szCs w:val="18"/>
+              </w:rPr>
+              <w:t xml:space="preserve">Accesso, «Password dimenticata?»</w:t>
+            </w:r>
+          </w:p>
+        </w:tc>
+        <w:tc>
+          <w:tcPr>
+            <w:tcW w:type="dxa" w:w="2013"/>
             <w:tcBorders>
               <w:top w:val="single" w:color="D9D4C5" w:sz="4"/>
               <w:left w:val="single" w:color="D9D4C5" w:sz="4"/>
@@ -7507,7 +7795,7 @@
         </w:trPr>
         <w:tc>
           <w:tcPr>
-            <w:tcW w:type="dxa" w:w="2135"/>
+            <w:tcW w:type="dxa" w:w="2635"/>
             <w:tcBorders>
               <w:top w:val="single" w:color="D9D4C5" w:sz="4"/>
               <w:left w:val="single" w:color="D9D4C5" w:sz="4"/>
@@ -7534,13 +7822,13 @@
                 <w:sz w:val="18"/>
                 <w:szCs w:val="18"/>
               </w:rPr>
-              <w:t xml:space="preserve">/formato-dati</w:t>
-            </w:r>
-          </w:p>
-        </w:tc>
-        <w:tc>
-          <w:tcPr>
-            <w:tcW w:type="dxa" w:w="5512"/>
+              <w:t xml:space="preserve">/reimposta-password</w:t>
+            </w:r>
+          </w:p>
+        </w:tc>
+        <w:tc>
+          <w:tcPr>
+            <w:tcW w:type="dxa" w:w="4990"/>
             <w:tcBorders>
               <w:top w:val="single" w:color="D9D4C5" w:sz="4"/>
               <w:left w:val="single" w:color="D9D4C5" w:sz="4"/>
@@ -7567,13 +7855,13 @@
                 <w:sz w:val="18"/>
                 <w:szCs w:val="18"/>
               </w:rPr>
-              <w:t xml:space="preserve">Formato dei dati per il calcolo crediti, download del tracciato Excel</w:t>
-            </w:r>
-          </w:p>
-        </w:tc>
-        <w:tc>
-          <w:tcPr>
-            <w:tcW w:type="dxa" w:w="1991"/>
+              <w:t xml:space="preserve">Nuova password dal link dell'email di recupero</w:t>
+            </w:r>
+          </w:p>
+        </w:tc>
+        <w:tc>
+          <w:tcPr>
+            <w:tcW w:type="dxa" w:w="2013"/>
             <w:tcBorders>
               <w:top w:val="single" w:color="D9D4C5" w:sz="4"/>
               <w:left w:val="single" w:color="D9D4C5" w:sz="4"/>
@@ -7611,7 +7899,7 @@
                 <w:sz w:val="18"/>
                 <w:szCs w:val="18"/>
               </w:rPr>
-              <w:t xml:space="preserve">, senza login</w:t>
+              <w:t xml:space="preserve"> (sessione di recupero)</w:t>
             </w:r>
           </w:p>
         </w:tc>
@@ -7622,7 +7910,7 @@
         </w:trPr>
         <w:tc>
           <w:tcPr>
-            <w:tcW w:type="dxa" w:w="2135"/>
+            <w:tcW w:type="dxa" w:w="2635"/>
             <w:tcBorders>
               <w:top w:val="single" w:color="D9D4C5" w:sz="4"/>
               <w:left w:val="single" w:color="D9D4C5" w:sz="4"/>
@@ -7648,45 +7936,45 @@
                 <w:sz w:val="18"/>
                 <w:szCs w:val="18"/>
               </w:rPr>
-              <w:t xml:space="preserve">/</w:t>
-            </w:r>
-          </w:p>
-        </w:tc>
-        <w:tc>
-          <w:tcPr>
-            <w:tcW w:type="dxa" w:w="5512"/>
-            <w:tcBorders>
-              <w:top w:val="single" w:color="D9D4C5" w:sz="4"/>
-              <w:left w:val="single" w:color="D9D4C5" w:sz="4"/>
-              <w:bottom w:val="single" w:color="D9D4C5" w:sz="4"/>
-              <w:right w:val="single" w:color="D9D4C5" w:sz="4"/>
-            </w:tcBorders>
-            <w:tcMar>
-              <w:top w:type="dxa" w:w="70"/>
-              <w:left w:type="dxa" w:w="110"/>
-              <w:bottom w:type="dxa" w:w="70"/>
-              <w:right w:type="dxa" w:w="110"/>
-            </w:tcMar>
-            <w:vAlign w:val="center"/>
-          </w:tcPr>
-          <w:p>
-            <w:pPr>
-              <w:spacing w:after="0" w:before="0"/>
-            </w:pPr>
-            <w:r>
-              <w:rPr>
-                <w:rFonts w:ascii="Arial" w:cs="Arial" w:eastAsia="Arial" w:hAnsi="Arial"/>
-                <w:color w:val="1B2118"/>
-                <w:sz w:val="18"/>
-                <w:szCs w:val="18"/>
-              </w:rPr>
-              <w:t xml:space="preserve">Cruscotto (staff) oppure Le mie pratiche (cliente)</w:t>
-            </w:r>
-          </w:p>
-        </w:tc>
-        <w:tc>
-          <w:tcPr>
-            <w:tcW w:type="dxa" w:w="1991"/>
+              <w:t xml:space="preserve">/password</w:t>
+            </w:r>
+          </w:p>
+        </w:tc>
+        <w:tc>
+          <w:tcPr>
+            <w:tcW w:type="dxa" w:w="4990"/>
+            <w:tcBorders>
+              <w:top w:val="single" w:color="D9D4C5" w:sz="4"/>
+              <w:left w:val="single" w:color="D9D4C5" w:sz="4"/>
+              <w:bottom w:val="single" w:color="D9D4C5" w:sz="4"/>
+              <w:right w:val="single" w:color="D9D4C5" w:sz="4"/>
+            </w:tcBorders>
+            <w:tcMar>
+              <w:top w:type="dxa" w:w="70"/>
+              <w:left w:type="dxa" w:w="110"/>
+              <w:bottom w:type="dxa" w:w="70"/>
+              <w:right w:type="dxa" w:w="110"/>
+            </w:tcMar>
+            <w:vAlign w:val="center"/>
+          </w:tcPr>
+          <w:p>
+            <w:pPr>
+              <w:spacing w:after="0" w:before="0"/>
+            </w:pPr>
+            <w:r>
+              <w:rPr>
+                <w:rFonts w:ascii="Arial" w:cs="Arial" w:eastAsia="Arial" w:hAnsi="Arial"/>
+                <w:color w:val="1B2118"/>
+                <w:sz w:val="18"/>
+                <w:szCs w:val="18"/>
+              </w:rPr>
+              <w:t xml:space="preserve">Cambio password volontario</w:t>
+            </w:r>
+          </w:p>
+        </w:tc>
+        <w:tc>
+          <w:tcPr>
+            <w:tcW w:type="dxa" w:w="2013"/>
             <w:tcBorders>
               <w:top w:val="single" w:color="D9D4C5" w:sz="4"/>
               <w:left w:val="single" w:color="D9D4C5" w:sz="4"/>
@@ -7723,7 +8011,7 @@
         </w:trPr>
         <w:tc>
           <w:tcPr>
-            <w:tcW w:type="dxa" w:w="2135"/>
+            <w:tcW w:type="dxa" w:w="2635"/>
             <w:tcBorders>
               <w:top w:val="single" w:color="D9D4C5" w:sz="4"/>
               <w:left w:val="single" w:color="D9D4C5" w:sz="4"/>
@@ -7750,13 +8038,13 @@
                 <w:sz w:val="18"/>
                 <w:szCs w:val="18"/>
               </w:rPr>
-              <w:t xml:space="preserve">/pratiche</w:t>
-            </w:r>
-          </w:p>
-        </w:tc>
-        <w:tc>
-          <w:tcPr>
-            <w:tcW w:type="dxa" w:w="5512"/>
+              <w:t xml:space="preserve">/formato-dati</w:t>
+            </w:r>
+          </w:p>
+        </w:tc>
+        <w:tc>
+          <w:tcPr>
+            <w:tcW w:type="dxa" w:w="4990"/>
             <w:tcBorders>
               <w:top w:val="single" w:color="D9D4C5" w:sz="4"/>
               <w:left w:val="single" w:color="D9D4C5" w:sz="4"/>
@@ -7783,31 +8071,13 @@
                 <w:sz w:val="18"/>
                 <w:szCs w:val="18"/>
               </w:rPr>
-              <w:t xml:space="preserve">Back-office: elenco e dettaglio pratiche (</w:t>
-            </w:r>
-            <w:r>
-              <w:rPr>
-                <w:rFonts w:ascii="Consolas" w:cs="Consolas" w:eastAsia="Consolas" w:hAnsi="Consolas"/>
-                <w:color w:val="2F5D3A"/>
-                <w:sz w:val="18"/>
-                <w:szCs w:val="18"/>
-              </w:rPr>
-              <w:t xml:space="preserve">?id=</w:t>
-            </w:r>
-            <w:r>
-              <w:rPr>
-                <w:rFonts w:ascii="Arial" w:cs="Arial" w:eastAsia="Arial" w:hAnsi="Arial"/>
-                <w:color w:val="1B2118"/>
-                <w:sz w:val="18"/>
-                <w:szCs w:val="18"/>
-              </w:rPr>
-              <w:t xml:space="preserve"> apre una pratica)</w:t>
-            </w:r>
-          </w:p>
-        </w:tc>
-        <w:tc>
-          <w:tcPr>
-            <w:tcW w:type="dxa" w:w="1991"/>
+              <w:t xml:space="preserve">Formato dei dati per il calcolo crediti, download del tracciato Excel</w:t>
+            </w:r>
+          </w:p>
+        </w:tc>
+        <w:tc>
+          <w:tcPr>
+            <w:tcW w:type="dxa" w:w="2013"/>
             <w:tcBorders>
               <w:top w:val="single" w:color="D9D4C5" w:sz="4"/>
               <w:left w:val="single" w:color="D9D4C5" w:sz="4"/>
@@ -7830,11 +8100,22 @@
             <w:r>
               <w:rPr>
                 <w:rFonts w:ascii="Arial" w:cs="Arial" w:eastAsia="Arial" w:hAnsi="Arial"/>
-                <w:color w:val="1B2118"/>
-                <w:sz w:val="18"/>
-                <w:szCs w:val="18"/>
-              </w:rPr>
-              <w:t xml:space="preserve">Operatore, Admin</w:t>
+                <w:b/>
+                <w:bCs/>
+                <w:color w:val="1B2118"/>
+                <w:sz w:val="18"/>
+                <w:szCs w:val="18"/>
+              </w:rPr>
+              <w:t xml:space="preserve">pubblica</w:t>
+            </w:r>
+            <w:r>
+              <w:rPr>
+                <w:rFonts w:ascii="Arial" w:cs="Arial" w:eastAsia="Arial" w:hAnsi="Arial"/>
+                <w:color w:val="1B2118"/>
+                <w:sz w:val="18"/>
+                <w:szCs w:val="18"/>
+              </w:rPr>
+              <w:t xml:space="preserve">, senza login</w:t>
             </w:r>
           </w:p>
         </w:tc>
@@ -7845,7 +8126,7 @@
         </w:trPr>
         <w:tc>
           <w:tcPr>
-            <w:tcW w:type="dxa" w:w="2135"/>
+            <w:tcW w:type="dxa" w:w="2635"/>
             <w:tcBorders>
               <w:top w:val="single" w:color="D9D4C5" w:sz="4"/>
               <w:left w:val="single" w:color="D9D4C5" w:sz="4"/>
@@ -7871,71 +8152,71 @@
                 <w:sz w:val="18"/>
                 <w:szCs w:val="18"/>
               </w:rPr>
-              <w:t xml:space="preserve">/documenti</w:t>
-            </w:r>
-          </w:p>
-        </w:tc>
-        <w:tc>
-          <w:tcPr>
-            <w:tcW w:type="dxa" w:w="5512"/>
-            <w:tcBorders>
-              <w:top w:val="single" w:color="D9D4C5" w:sz="4"/>
-              <w:left w:val="single" w:color="D9D4C5" w:sz="4"/>
-              <w:bottom w:val="single" w:color="D9D4C5" w:sz="4"/>
-              <w:right w:val="single" w:color="D9D4C5" w:sz="4"/>
-            </w:tcBorders>
-            <w:tcMar>
-              <w:top w:type="dxa" w:w="70"/>
-              <w:left w:type="dxa" w:w="110"/>
-              <w:bottom w:type="dxa" w:w="70"/>
-              <w:right w:type="dxa" w:w="110"/>
-            </w:tcMar>
-            <w:vAlign w:val="center"/>
-          </w:tcPr>
-          <w:p>
-            <w:pPr>
-              <w:spacing w:after="0" w:before="0"/>
-            </w:pPr>
-            <w:r>
-              <w:rPr>
-                <w:rFonts w:ascii="Arial" w:cs="Arial" w:eastAsia="Arial" w:hAnsi="Arial"/>
-                <w:color w:val="1B2118"/>
-                <w:sz w:val="18"/>
-                <w:szCs w:val="18"/>
-              </w:rPr>
-              <w:t xml:space="preserve">I tuoi documenti</w:t>
-            </w:r>
-          </w:p>
-        </w:tc>
-        <w:tc>
-          <w:tcPr>
-            <w:tcW w:type="dxa" w:w="1991"/>
-            <w:tcBorders>
-              <w:top w:val="single" w:color="D9D4C5" w:sz="4"/>
-              <w:left w:val="single" w:color="D9D4C5" w:sz="4"/>
-              <w:bottom w:val="single" w:color="D9D4C5" w:sz="4"/>
-              <w:right w:val="single" w:color="D9D4C5" w:sz="4"/>
-            </w:tcBorders>
-            <w:tcMar>
-              <w:top w:type="dxa" w:w="70"/>
-              <w:left w:type="dxa" w:w="110"/>
-              <w:bottom w:type="dxa" w:w="70"/>
-              <w:right w:type="dxa" w:w="110"/>
-            </w:tcMar>
-            <w:vAlign w:val="center"/>
-          </w:tcPr>
-          <w:p>
-            <w:pPr>
-              <w:spacing w:after="0" w:before="0"/>
-            </w:pPr>
-            <w:r>
-              <w:rPr>
-                <w:rFonts w:ascii="Arial" w:cs="Arial" w:eastAsia="Arial" w:hAnsi="Arial"/>
-                <w:color w:val="1B2118"/>
-                <w:sz w:val="18"/>
-                <w:szCs w:val="18"/>
-              </w:rPr>
-              <w:t xml:space="preserve">Cliente</w:t>
+              <w:t xml:space="preserve">/</w:t>
+            </w:r>
+          </w:p>
+        </w:tc>
+        <w:tc>
+          <w:tcPr>
+            <w:tcW w:type="dxa" w:w="4990"/>
+            <w:tcBorders>
+              <w:top w:val="single" w:color="D9D4C5" w:sz="4"/>
+              <w:left w:val="single" w:color="D9D4C5" w:sz="4"/>
+              <w:bottom w:val="single" w:color="D9D4C5" w:sz="4"/>
+              <w:right w:val="single" w:color="D9D4C5" w:sz="4"/>
+            </w:tcBorders>
+            <w:tcMar>
+              <w:top w:type="dxa" w:w="70"/>
+              <w:left w:type="dxa" w:w="110"/>
+              <w:bottom w:type="dxa" w:w="70"/>
+              <w:right w:type="dxa" w:w="110"/>
+            </w:tcMar>
+            <w:vAlign w:val="center"/>
+          </w:tcPr>
+          <w:p>
+            <w:pPr>
+              <w:spacing w:after="0" w:before="0"/>
+            </w:pPr>
+            <w:r>
+              <w:rPr>
+                <w:rFonts w:ascii="Arial" w:cs="Arial" w:eastAsia="Arial" w:hAnsi="Arial"/>
+                <w:color w:val="1B2118"/>
+                <w:sz w:val="18"/>
+                <w:szCs w:val="18"/>
+              </w:rPr>
+              <w:t xml:space="preserve">Cruscotto (staff) oppure Le mie pratiche (cliente)</w:t>
+            </w:r>
+          </w:p>
+        </w:tc>
+        <w:tc>
+          <w:tcPr>
+            <w:tcW w:type="dxa" w:w="2013"/>
+            <w:tcBorders>
+              <w:top w:val="single" w:color="D9D4C5" w:sz="4"/>
+              <w:left w:val="single" w:color="D9D4C5" w:sz="4"/>
+              <w:bottom w:val="single" w:color="D9D4C5" w:sz="4"/>
+              <w:right w:val="single" w:color="D9D4C5" w:sz="4"/>
+            </w:tcBorders>
+            <w:tcMar>
+              <w:top w:type="dxa" w:w="70"/>
+              <w:left w:type="dxa" w:w="110"/>
+              <w:bottom w:type="dxa" w:w="70"/>
+              <w:right w:type="dxa" w:w="110"/>
+            </w:tcMar>
+            <w:vAlign w:val="center"/>
+          </w:tcPr>
+          <w:p>
+            <w:pPr>
+              <w:spacing w:after="0" w:before="0"/>
+            </w:pPr>
+            <w:r>
+              <w:rPr>
+                <w:rFonts w:ascii="Arial" w:cs="Arial" w:eastAsia="Arial" w:hAnsi="Arial"/>
+                <w:color w:val="1B2118"/>
+                <w:sz w:val="18"/>
+                <w:szCs w:val="18"/>
+              </w:rPr>
+              <w:t xml:space="preserve">tutti</w:t>
             </w:r>
           </w:p>
         </w:tc>
@@ -7946,7 +8227,7 @@
         </w:trPr>
         <w:tc>
           <w:tcPr>
-            <w:tcW w:type="dxa" w:w="2135"/>
+            <w:tcW w:type="dxa" w:w="2635"/>
             <w:tcBorders>
               <w:top w:val="single" w:color="D9D4C5" w:sz="4"/>
               <w:left w:val="single" w:color="D9D4C5" w:sz="4"/>
@@ -7973,13 +8254,13 @@
                 <w:sz w:val="18"/>
                 <w:szCs w:val="18"/>
               </w:rPr>
-              <w:t xml:space="preserve">/utenti</w:t>
-            </w:r>
-          </w:p>
-        </w:tc>
-        <w:tc>
-          <w:tcPr>
-            <w:tcW w:type="dxa" w:w="5512"/>
+              <w:t xml:space="preserve">/pratiche</w:t>
+            </w:r>
+          </w:p>
+        </w:tc>
+        <w:tc>
+          <w:tcPr>
+            <w:tcW w:type="dxa" w:w="4990"/>
             <w:tcBorders>
               <w:top w:val="single" w:color="D9D4C5" w:sz="4"/>
               <w:left w:val="single" w:color="D9D4C5" w:sz="4"/>
@@ -8006,13 +8287,31 @@
                 <w:sz w:val="18"/>
                 <w:szCs w:val="18"/>
               </w:rPr>
-              <w:t xml:space="preserve">Gestione utenti</w:t>
-            </w:r>
-          </w:p>
-        </w:tc>
-        <w:tc>
-          <w:tcPr>
-            <w:tcW w:type="dxa" w:w="1991"/>
+              <w:t xml:space="preserve">Back-office: elenco e dettaglio pratiche (</w:t>
+            </w:r>
+            <w:r>
+              <w:rPr>
+                <w:rFonts w:ascii="Consolas" w:cs="Consolas" w:eastAsia="Consolas" w:hAnsi="Consolas"/>
+                <w:color w:val="2F5D3A"/>
+                <w:sz w:val="18"/>
+                <w:szCs w:val="18"/>
+              </w:rPr>
+              <w:t xml:space="preserve">?id=</w:t>
+            </w:r>
+            <w:r>
+              <w:rPr>
+                <w:rFonts w:ascii="Arial" w:cs="Arial" w:eastAsia="Arial" w:hAnsi="Arial"/>
+                <w:color w:val="1B2118"/>
+                <w:sz w:val="18"/>
+                <w:szCs w:val="18"/>
+              </w:rPr>
+              <w:t xml:space="preserve"> apre una pratica)</w:t>
+            </w:r>
+          </w:p>
+        </w:tc>
+        <w:tc>
+          <w:tcPr>
+            <w:tcW w:type="dxa" w:w="2013"/>
             <w:tcBorders>
               <w:top w:val="single" w:color="D9D4C5" w:sz="4"/>
               <w:left w:val="single" w:color="D9D4C5" w:sz="4"/>
@@ -8039,7 +8338,7 @@
                 <w:sz w:val="18"/>
                 <w:szCs w:val="18"/>
               </w:rPr>
-              <w:t xml:space="preserve">Admin</w:t>
+              <w:t xml:space="preserve">Operatore, Admin</w:t>
             </w:r>
           </w:p>
         </w:tc>
@@ -8050,7 +8349,7 @@
         </w:trPr>
         <w:tc>
           <w:tcPr>
-            <w:tcW w:type="dxa" w:w="2135"/>
+            <w:tcW w:type="dxa" w:w="2635"/>
             <w:tcBorders>
               <w:top w:val="single" w:color="D9D4C5" w:sz="4"/>
               <w:left w:val="single" w:color="D9D4C5" w:sz="4"/>
@@ -8076,71 +8375,71 @@
                 <w:sz w:val="18"/>
                 <w:szCs w:val="18"/>
               </w:rPr>
-              <w:t xml:space="preserve">/audit</w:t>
-            </w:r>
-          </w:p>
-        </w:tc>
-        <w:tc>
-          <w:tcPr>
-            <w:tcW w:type="dxa" w:w="5512"/>
-            <w:tcBorders>
-              <w:top w:val="single" w:color="D9D4C5" w:sz="4"/>
-              <w:left w:val="single" w:color="D9D4C5" w:sz="4"/>
-              <w:bottom w:val="single" w:color="D9D4C5" w:sz="4"/>
-              <w:right w:val="single" w:color="D9D4C5" w:sz="4"/>
-            </w:tcBorders>
-            <w:tcMar>
-              <w:top w:type="dxa" w:w="70"/>
-              <w:left w:type="dxa" w:w="110"/>
-              <w:bottom w:type="dxa" w:w="70"/>
-              <w:right w:type="dxa" w:w="110"/>
-            </w:tcMar>
-            <w:vAlign w:val="center"/>
-          </w:tcPr>
-          <w:p>
-            <w:pPr>
-              <w:spacing w:after="0" w:before="0"/>
-            </w:pPr>
-            <w:r>
-              <w:rPr>
-                <w:rFonts w:ascii="Arial" w:cs="Arial" w:eastAsia="Arial" w:hAnsi="Arial"/>
-                <w:color w:val="1B2118"/>
-                <w:sz w:val="18"/>
-                <w:szCs w:val="18"/>
-              </w:rPr>
-              <w:t xml:space="preserve">Audit trail</w:t>
-            </w:r>
-          </w:p>
-        </w:tc>
-        <w:tc>
-          <w:tcPr>
-            <w:tcW w:type="dxa" w:w="1991"/>
-            <w:tcBorders>
-              <w:top w:val="single" w:color="D9D4C5" w:sz="4"/>
-              <w:left w:val="single" w:color="D9D4C5" w:sz="4"/>
-              <w:bottom w:val="single" w:color="D9D4C5" w:sz="4"/>
-              <w:right w:val="single" w:color="D9D4C5" w:sz="4"/>
-            </w:tcBorders>
-            <w:tcMar>
-              <w:top w:type="dxa" w:w="70"/>
-              <w:left w:type="dxa" w:w="110"/>
-              <w:bottom w:type="dxa" w:w="70"/>
-              <w:right w:type="dxa" w:w="110"/>
-            </w:tcMar>
-            <w:vAlign w:val="center"/>
-          </w:tcPr>
-          <w:p>
-            <w:pPr>
-              <w:spacing w:after="0" w:before="0"/>
-            </w:pPr>
-            <w:r>
-              <w:rPr>
-                <w:rFonts w:ascii="Arial" w:cs="Arial" w:eastAsia="Arial" w:hAnsi="Arial"/>
-                <w:color w:val="1B2118"/>
-                <w:sz w:val="18"/>
-                <w:szCs w:val="18"/>
-              </w:rPr>
-              <w:t xml:space="preserve">Admin</w:t>
+              <w:t xml:space="preserve">/documenti</w:t>
+            </w:r>
+          </w:p>
+        </w:tc>
+        <w:tc>
+          <w:tcPr>
+            <w:tcW w:type="dxa" w:w="4990"/>
+            <w:tcBorders>
+              <w:top w:val="single" w:color="D9D4C5" w:sz="4"/>
+              <w:left w:val="single" w:color="D9D4C5" w:sz="4"/>
+              <w:bottom w:val="single" w:color="D9D4C5" w:sz="4"/>
+              <w:right w:val="single" w:color="D9D4C5" w:sz="4"/>
+            </w:tcBorders>
+            <w:tcMar>
+              <w:top w:type="dxa" w:w="70"/>
+              <w:left w:type="dxa" w:w="110"/>
+              <w:bottom w:type="dxa" w:w="70"/>
+              <w:right w:type="dxa" w:w="110"/>
+            </w:tcMar>
+            <w:vAlign w:val="center"/>
+          </w:tcPr>
+          <w:p>
+            <w:pPr>
+              <w:spacing w:after="0" w:before="0"/>
+            </w:pPr>
+            <w:r>
+              <w:rPr>
+                <w:rFonts w:ascii="Arial" w:cs="Arial" w:eastAsia="Arial" w:hAnsi="Arial"/>
+                <w:color w:val="1B2118"/>
+                <w:sz w:val="18"/>
+                <w:szCs w:val="18"/>
+              </w:rPr>
+              <w:t xml:space="preserve">I tuoi documenti</w:t>
+            </w:r>
+          </w:p>
+        </w:tc>
+        <w:tc>
+          <w:tcPr>
+            <w:tcW w:type="dxa" w:w="2013"/>
+            <w:tcBorders>
+              <w:top w:val="single" w:color="D9D4C5" w:sz="4"/>
+              <w:left w:val="single" w:color="D9D4C5" w:sz="4"/>
+              <w:bottom w:val="single" w:color="D9D4C5" w:sz="4"/>
+              <w:right w:val="single" w:color="D9D4C5" w:sz="4"/>
+            </w:tcBorders>
+            <w:tcMar>
+              <w:top w:type="dxa" w:w="70"/>
+              <w:left w:type="dxa" w:w="110"/>
+              <w:bottom w:type="dxa" w:w="70"/>
+              <w:right w:type="dxa" w:w="110"/>
+            </w:tcMar>
+            <w:vAlign w:val="center"/>
+          </w:tcPr>
+          <w:p>
+            <w:pPr>
+              <w:spacing w:after="0" w:before="0"/>
+            </w:pPr>
+            <w:r>
+              <w:rPr>
+                <w:rFonts w:ascii="Arial" w:cs="Arial" w:eastAsia="Arial" w:hAnsi="Arial"/>
+                <w:color w:val="1B2118"/>
+                <w:sz w:val="18"/>
+                <w:szCs w:val="18"/>
+              </w:rPr>
+              <w:t xml:space="preserve">Cliente</w:t>
             </w:r>
           </w:p>
         </w:tc>
@@ -8151,7 +8450,7 @@
         </w:trPr>
         <w:tc>
           <w:tcPr>
-            <w:tcW w:type="dxa" w:w="2135"/>
+            <w:tcW w:type="dxa" w:w="2635"/>
             <w:tcBorders>
               <w:top w:val="single" w:color="D9D4C5" w:sz="4"/>
               <w:left w:val="single" w:color="D9D4C5" w:sz="4"/>
@@ -8178,31 +8477,13 @@
                 <w:sz w:val="18"/>
                 <w:szCs w:val="18"/>
               </w:rPr>
-              <w:t xml:space="preserve">/crediti</w:t>
-            </w:r>
-            <w:r>
-              <w:rPr>
-                <w:rFonts w:ascii="Arial" w:cs="Arial" w:eastAsia="Arial" w:hAnsi="Arial"/>
-                <w:color w:val="1B2118"/>
-                <w:sz w:val="18"/>
-                <w:szCs w:val="18"/>
-              </w:rPr>
-              <w:t xml:space="preserve">, </w:t>
-            </w:r>
-            <w:r>
-              <w:rPr>
-                <w:rFonts w:ascii="Consolas" w:cs="Consolas" w:eastAsia="Consolas" w:hAnsi="Consolas"/>
-                <w:color w:val="2F5D3A"/>
-                <w:sz w:val="18"/>
-                <w:szCs w:val="18"/>
-              </w:rPr>
-              <w:t xml:space="preserve">/crediti/:id</w:t>
-            </w:r>
-          </w:p>
-        </w:tc>
-        <w:tc>
-          <w:tcPr>
-            <w:tcW w:type="dxa" w:w="5512"/>
+              <w:t xml:space="preserve">/utenti</w:t>
+            </w:r>
+          </w:p>
+        </w:tc>
+        <w:tc>
+          <w:tcPr>
+            <w:tcW w:type="dxa" w:w="4990"/>
             <w:tcBorders>
               <w:top w:val="single" w:color="D9D4C5" w:sz="4"/>
               <w:left w:val="single" w:color="D9D4C5" w:sz="4"/>
@@ -8229,13 +8510,13 @@
                 <w:sz w:val="18"/>
                 <w:szCs w:val="18"/>
               </w:rPr>
-              <w:t xml:space="preserve">Calcolo crediti CWP</w:t>
-            </w:r>
-          </w:p>
-        </w:tc>
-        <w:tc>
-          <w:tcPr>
-            <w:tcW w:type="dxa" w:w="1991"/>
+              <w:t xml:space="preserve">Gestione utenti</w:t>
+            </w:r>
+          </w:p>
+        </w:tc>
+        <w:tc>
+          <w:tcPr>
+            <w:tcW w:type="dxa" w:w="2013"/>
             <w:tcBorders>
               <w:top w:val="single" w:color="D9D4C5" w:sz="4"/>
               <w:left w:val="single" w:color="D9D4C5" w:sz="4"/>
@@ -8273,7 +8554,7 @@
         </w:trPr>
         <w:tc>
           <w:tcPr>
-            <w:tcW w:type="dxa" w:w="2135"/>
+            <w:tcW w:type="dxa" w:w="2635"/>
             <w:tcBorders>
               <w:top w:val="single" w:color="D9D4C5" w:sz="4"/>
               <w:left w:val="single" w:color="D9D4C5" w:sz="4"/>
@@ -8299,45 +8580,45 @@
                 <w:sz w:val="18"/>
                 <w:szCs w:val="18"/>
               </w:rPr>
-              <w:t xml:space="preserve">/impostazioni</w:t>
-            </w:r>
-          </w:p>
-        </w:tc>
-        <w:tc>
-          <w:tcPr>
-            <w:tcW w:type="dxa" w:w="5512"/>
-            <w:tcBorders>
-              <w:top w:val="single" w:color="D9D4C5" w:sz="4"/>
-              <w:left w:val="single" w:color="D9D4C5" w:sz="4"/>
-              <w:bottom w:val="single" w:color="D9D4C5" w:sz="4"/>
-              <w:right w:val="single" w:color="D9D4C5" w:sz="4"/>
-            </w:tcBorders>
-            <w:tcMar>
-              <w:top w:type="dxa" w:w="70"/>
-              <w:left w:type="dxa" w:w="110"/>
-              <w:bottom w:type="dxa" w:w="70"/>
-              <w:right w:type="dxa" w:w="110"/>
-            </w:tcMar>
-            <w:vAlign w:val="center"/>
-          </w:tcPr>
-          <w:p>
-            <w:pPr>
-              <w:spacing w:after="0" w:before="0"/>
-            </w:pPr>
-            <w:r>
-              <w:rPr>
-                <w:rFonts w:ascii="Arial" w:cs="Arial" w:eastAsia="Arial" w:hAnsi="Arial"/>
-                <w:color w:val="1B2118"/>
-                <w:sz w:val="18"/>
-                <w:szCs w:val="18"/>
-              </w:rPr>
-              <w:t xml:space="preserve">Durata delle fasi</w:t>
-            </w:r>
-          </w:p>
-        </w:tc>
-        <w:tc>
-          <w:tcPr>
-            <w:tcW w:type="dxa" w:w="1991"/>
+              <w:t xml:space="preserve">/audit</w:t>
+            </w:r>
+          </w:p>
+        </w:tc>
+        <w:tc>
+          <w:tcPr>
+            <w:tcW w:type="dxa" w:w="4990"/>
+            <w:tcBorders>
+              <w:top w:val="single" w:color="D9D4C5" w:sz="4"/>
+              <w:left w:val="single" w:color="D9D4C5" w:sz="4"/>
+              <w:bottom w:val="single" w:color="D9D4C5" w:sz="4"/>
+              <w:right w:val="single" w:color="D9D4C5" w:sz="4"/>
+            </w:tcBorders>
+            <w:tcMar>
+              <w:top w:type="dxa" w:w="70"/>
+              <w:left w:type="dxa" w:w="110"/>
+              <w:bottom w:type="dxa" w:w="70"/>
+              <w:right w:type="dxa" w:w="110"/>
+            </w:tcMar>
+            <w:vAlign w:val="center"/>
+          </w:tcPr>
+          <w:p>
+            <w:pPr>
+              <w:spacing w:after="0" w:before="0"/>
+            </w:pPr>
+            <w:r>
+              <w:rPr>
+                <w:rFonts w:ascii="Arial" w:cs="Arial" w:eastAsia="Arial" w:hAnsi="Arial"/>
+                <w:color w:val="1B2118"/>
+                <w:sz w:val="18"/>
+                <w:szCs w:val="18"/>
+              </w:rPr>
+              <w:t xml:space="preserve">Audit trail</w:t>
+            </w:r>
+          </w:p>
+        </w:tc>
+        <w:tc>
+          <w:tcPr>
+            <w:tcW w:type="dxa" w:w="2013"/>
             <w:tcBorders>
               <w:top w:val="single" w:color="D9D4C5" w:sz="4"/>
               <w:left w:val="single" w:color="D9D4C5" w:sz="4"/>
@@ -8374,7 +8655,7 @@
         </w:trPr>
         <w:tc>
           <w:tcPr>
-            <w:tcW w:type="dxa" w:w="2135"/>
+            <w:tcW w:type="dxa" w:w="2635"/>
             <w:tcBorders>
               <w:top w:val="single" w:color="D9D4C5" w:sz="4"/>
               <w:left w:val="single" w:color="D9D4C5" w:sz="4"/>
@@ -8401,13 +8682,236 @@
                 <w:sz w:val="18"/>
                 <w:szCs w:val="18"/>
               </w:rPr>
+              <w:t xml:space="preserve">/crediti</w:t>
+            </w:r>
+            <w:r>
+              <w:rPr>
+                <w:rFonts w:ascii="Arial" w:cs="Arial" w:eastAsia="Arial" w:hAnsi="Arial"/>
+                <w:color w:val="1B2118"/>
+                <w:sz w:val="18"/>
+                <w:szCs w:val="18"/>
+              </w:rPr>
+              <w:t xml:space="preserve">, </w:t>
+            </w:r>
+            <w:r>
+              <w:rPr>
+                <w:rFonts w:ascii="Consolas" w:cs="Consolas" w:eastAsia="Consolas" w:hAnsi="Consolas"/>
+                <w:color w:val="2F5D3A"/>
+                <w:sz w:val="18"/>
+                <w:szCs w:val="18"/>
+              </w:rPr>
+              <w:t xml:space="preserve">/crediti/:id</w:t>
+            </w:r>
+          </w:p>
+        </w:tc>
+        <w:tc>
+          <w:tcPr>
+            <w:tcW w:type="dxa" w:w="4990"/>
+            <w:tcBorders>
+              <w:top w:val="single" w:color="D9D4C5" w:sz="4"/>
+              <w:left w:val="single" w:color="D9D4C5" w:sz="4"/>
+              <w:bottom w:val="single" w:color="D9D4C5" w:sz="4"/>
+              <w:right w:val="single" w:color="D9D4C5" w:sz="4"/>
+            </w:tcBorders>
+            <w:shd w:fill="F6F4EE" w:color="auto" w:val="clear"/>
+            <w:tcMar>
+              <w:top w:type="dxa" w:w="70"/>
+              <w:left w:type="dxa" w:w="110"/>
+              <w:bottom w:type="dxa" w:w="70"/>
+              <w:right w:type="dxa" w:w="110"/>
+            </w:tcMar>
+            <w:vAlign w:val="center"/>
+          </w:tcPr>
+          <w:p>
+            <w:pPr>
+              <w:spacing w:after="0" w:before="0"/>
+            </w:pPr>
+            <w:r>
+              <w:rPr>
+                <w:rFonts w:ascii="Arial" w:cs="Arial" w:eastAsia="Arial" w:hAnsi="Arial"/>
+                <w:color w:val="1B2118"/>
+                <w:sz w:val="18"/>
+                <w:szCs w:val="18"/>
+              </w:rPr>
+              <w:t xml:space="preserve">Calcolo crediti CWP</w:t>
+            </w:r>
+          </w:p>
+        </w:tc>
+        <w:tc>
+          <w:tcPr>
+            <w:tcW w:type="dxa" w:w="2013"/>
+            <w:tcBorders>
+              <w:top w:val="single" w:color="D9D4C5" w:sz="4"/>
+              <w:left w:val="single" w:color="D9D4C5" w:sz="4"/>
+              <w:bottom w:val="single" w:color="D9D4C5" w:sz="4"/>
+              <w:right w:val="single" w:color="D9D4C5" w:sz="4"/>
+            </w:tcBorders>
+            <w:shd w:fill="F6F4EE" w:color="auto" w:val="clear"/>
+            <w:tcMar>
+              <w:top w:type="dxa" w:w="70"/>
+              <w:left w:type="dxa" w:w="110"/>
+              <w:bottom w:type="dxa" w:w="70"/>
+              <w:right w:type="dxa" w:w="110"/>
+            </w:tcMar>
+            <w:vAlign w:val="center"/>
+          </w:tcPr>
+          <w:p>
+            <w:pPr>
+              <w:spacing w:after="0" w:before="0"/>
+            </w:pPr>
+            <w:r>
+              <w:rPr>
+                <w:rFonts w:ascii="Arial" w:cs="Arial" w:eastAsia="Arial" w:hAnsi="Arial"/>
+                <w:color w:val="1B2118"/>
+                <w:sz w:val="18"/>
+                <w:szCs w:val="18"/>
+              </w:rPr>
+              <w:t xml:space="preserve">Admin</w:t>
+            </w:r>
+          </w:p>
+        </w:tc>
+      </w:tr>
+      <w:tr>
+        <w:trPr>
+          <w:cantSplit/>
+        </w:trPr>
+        <w:tc>
+          <w:tcPr>
+            <w:tcW w:type="dxa" w:w="2635"/>
+            <w:tcBorders>
+              <w:top w:val="single" w:color="D9D4C5" w:sz="4"/>
+              <w:left w:val="single" w:color="D9D4C5" w:sz="4"/>
+              <w:bottom w:val="single" w:color="D9D4C5" w:sz="4"/>
+              <w:right w:val="single" w:color="D9D4C5" w:sz="4"/>
+            </w:tcBorders>
+            <w:tcMar>
+              <w:top w:type="dxa" w:w="70"/>
+              <w:left w:type="dxa" w:w="110"/>
+              <w:bottom w:type="dxa" w:w="70"/>
+              <w:right w:type="dxa" w:w="110"/>
+            </w:tcMar>
+            <w:vAlign w:val="center"/>
+          </w:tcPr>
+          <w:p>
+            <w:pPr>
+              <w:spacing w:after="0" w:before="0"/>
+            </w:pPr>
+            <w:r>
+              <w:rPr>
+                <w:rFonts w:ascii="Consolas" w:cs="Consolas" w:eastAsia="Consolas" w:hAnsi="Consolas"/>
+                <w:color w:val="2F5D3A"/>
+                <w:sz w:val="18"/>
+                <w:szCs w:val="18"/>
+              </w:rPr>
+              <w:t xml:space="preserve">/impostazioni</w:t>
+            </w:r>
+          </w:p>
+        </w:tc>
+        <w:tc>
+          <w:tcPr>
+            <w:tcW w:type="dxa" w:w="4990"/>
+            <w:tcBorders>
+              <w:top w:val="single" w:color="D9D4C5" w:sz="4"/>
+              <w:left w:val="single" w:color="D9D4C5" w:sz="4"/>
+              <w:bottom w:val="single" w:color="D9D4C5" w:sz="4"/>
+              <w:right w:val="single" w:color="D9D4C5" w:sz="4"/>
+            </w:tcBorders>
+            <w:tcMar>
+              <w:top w:type="dxa" w:w="70"/>
+              <w:left w:type="dxa" w:w="110"/>
+              <w:bottom w:type="dxa" w:w="70"/>
+              <w:right w:type="dxa" w:w="110"/>
+            </w:tcMar>
+            <w:vAlign w:val="center"/>
+          </w:tcPr>
+          <w:p>
+            <w:pPr>
+              <w:spacing w:after="0" w:before="0"/>
+            </w:pPr>
+            <w:r>
+              <w:rPr>
+                <w:rFonts w:ascii="Arial" w:cs="Arial" w:eastAsia="Arial" w:hAnsi="Arial"/>
+                <w:color w:val="1B2118"/>
+                <w:sz w:val="18"/>
+                <w:szCs w:val="18"/>
+              </w:rPr>
+              <w:t xml:space="preserve">Durata delle fasi</w:t>
+            </w:r>
+          </w:p>
+        </w:tc>
+        <w:tc>
+          <w:tcPr>
+            <w:tcW w:type="dxa" w:w="2013"/>
+            <w:tcBorders>
+              <w:top w:val="single" w:color="D9D4C5" w:sz="4"/>
+              <w:left w:val="single" w:color="D9D4C5" w:sz="4"/>
+              <w:bottom w:val="single" w:color="D9D4C5" w:sz="4"/>
+              <w:right w:val="single" w:color="D9D4C5" w:sz="4"/>
+            </w:tcBorders>
+            <w:tcMar>
+              <w:top w:type="dxa" w:w="70"/>
+              <w:left w:type="dxa" w:w="110"/>
+              <w:bottom w:type="dxa" w:w="70"/>
+              <w:right w:type="dxa" w:w="110"/>
+            </w:tcMar>
+            <w:vAlign w:val="center"/>
+          </w:tcPr>
+          <w:p>
+            <w:pPr>
+              <w:spacing w:after="0" w:before="0"/>
+            </w:pPr>
+            <w:r>
+              <w:rPr>
+                <w:rFonts w:ascii="Arial" w:cs="Arial" w:eastAsia="Arial" w:hAnsi="Arial"/>
+                <w:color w:val="1B2118"/>
+                <w:sz w:val="18"/>
+                <w:szCs w:val="18"/>
+              </w:rPr>
+              <w:t xml:space="preserve">Admin</w:t>
+            </w:r>
+          </w:p>
+        </w:tc>
+      </w:tr>
+      <w:tr>
+        <w:trPr>
+          <w:cantSplit/>
+        </w:trPr>
+        <w:tc>
+          <w:tcPr>
+            <w:tcW w:type="dxa" w:w="2635"/>
+            <w:tcBorders>
+              <w:top w:val="single" w:color="D9D4C5" w:sz="4"/>
+              <w:left w:val="single" w:color="D9D4C5" w:sz="4"/>
+              <w:bottom w:val="single" w:color="D9D4C5" w:sz="4"/>
+              <w:right w:val="single" w:color="D9D4C5" w:sz="4"/>
+            </w:tcBorders>
+            <w:shd w:fill="F6F4EE" w:color="auto" w:val="clear"/>
+            <w:tcMar>
+              <w:top w:type="dxa" w:w="70"/>
+              <w:left w:type="dxa" w:w="110"/>
+              <w:bottom w:type="dxa" w:w="70"/>
+              <w:right w:type="dxa" w:w="110"/>
+            </w:tcMar>
+            <w:vAlign w:val="center"/>
+          </w:tcPr>
+          <w:p>
+            <w:pPr>
+              <w:spacing w:after="0" w:before="0"/>
+            </w:pPr>
+            <w:r>
+              <w:rPr>
+                <w:rFonts w:ascii="Consolas" w:cs="Consolas" w:eastAsia="Consolas" w:hAnsi="Consolas"/>
+                <w:color w:val="2F5D3A"/>
+                <w:sz w:val="18"/>
+                <w:szCs w:val="18"/>
+              </w:rPr>
               <w:t xml:space="preserve">/documentazione</w:t>
             </w:r>
           </w:p>
         </w:tc>
         <w:tc>
           <w:tcPr>
-            <w:tcW w:type="dxa" w:w="5512"/>
+            <w:tcW w:type="dxa" w:w="4990"/>
             <w:tcBorders>
               <w:top w:val="single" w:color="D9D4C5" w:sz="4"/>
               <w:left w:val="single" w:color="D9D4C5" w:sz="4"/>
@@ -8440,7 +8944,7 @@
         </w:tc>
         <w:tc>
           <w:tcPr>
-            <w:tcW w:type="dxa" w:w="1991"/>
+            <w:tcW w:type="dxa" w:w="2013"/>
             <w:tcBorders>
               <w:top w:val="single" w:color="D9D4C5" w:sz="4"/>
               <w:left w:val="single" w:color="D9D4C5" w:sz="4"/>
@@ -9359,7 +9863,7 @@
                 <w:sz w:val="18"/>
                 <w:szCs w:val="18"/>
               </w:rPr>
-              <w:t xml:space="preserve">Email+password, tre ruoli, utenti multi-organizzazione, disattivazione; MFA pronta ma spenta</w:t>
+              <w:t xml:space="preserve">Email+password, tre ruoli, utenti multi-organizzazione, disattivazione; password temporanea da cambiare al primo accesso, cambio e recupero password, reimpostazione dall'Admin; MFA pronta ma spenta</w:t>
             </w:r>
           </w:p>
         </w:tc>
@@ -11307,6 +11811,200 @@
           <w:szCs w:val="25"/>
         </w:rPr>
         <w:t xml:space="preserve">18 ottobre 2026</w:t>
+      </w:r>
+    </w:p>
+    <w:p>
+      <w:pPr>
+        <w:pStyle w:val="ListParagraph"/>
+        <w:numPr>
+          <w:ilvl w:val="0"/>
+          <w:numId w:val="3"/>
+        </w:numPr>
+        <w:spacing w:after="70" w:line="290"/>
+      </w:pPr>
+      <w:r>
+        <w:rPr>
+          <w:rFonts w:ascii="Arial" w:cs="Arial" w:eastAsia="Arial" w:hAnsi="Arial"/>
+          <w:b/>
+          <w:bCs/>
+          <w:color w:val="1B2118"/>
+          <w:sz w:val="21"/>
+          <w:szCs w:val="21"/>
+        </w:rPr>
+        <w:t xml:space="preserve">Password: primo accesso, cambio, recupero, reimpostazione</w:t>
+      </w:r>
+      <w:r>
+        <w:rPr>
+          <w:rFonts w:ascii="Arial" w:cs="Arial" w:eastAsia="Arial" w:hAnsi="Arial"/>
+          <w:color w:val="1B2118"/>
+          <w:sz w:val="21"/>
+          <w:szCs w:val="21"/>
+        </w:rPr>
+        <w:t xml:space="preserve"> — script </w:t>
+      </w:r>
+      <w:r>
+        <w:rPr>
+          <w:rFonts w:ascii="Consolas" w:cs="Consolas" w:eastAsia="Consolas" w:hAnsi="Consolas"/>
+          <w:color w:val="2F5D3A"/>
+          <w:sz w:val="21"/>
+          <w:szCs w:val="21"/>
+        </w:rPr>
+        <w:t xml:space="preserve">15_password.sql</w:t>
+      </w:r>
+      <w:r>
+        <w:rPr>
+          <w:rFonts w:ascii="Arial" w:cs="Arial" w:eastAsia="Arial" w:hAnsi="Arial"/>
+          <w:color w:val="1B2118"/>
+          <w:sz w:val="21"/>
+          <w:szCs w:val="21"/>
+        </w:rPr>
+        <w:t xml:space="preserve"> (colonna </w:t>
+      </w:r>
+      <w:r>
+        <w:rPr>
+          <w:rFonts w:ascii="Consolas" w:cs="Consolas" w:eastAsia="Consolas" w:hAnsi="Consolas"/>
+          <w:color w:val="2F5D3A"/>
+          <w:sz w:val="21"/>
+          <w:szCs w:val="21"/>
+        </w:rPr>
+        <w:t xml:space="preserve">password_temporanea</w:t>
+      </w:r>
+      <w:r>
+        <w:rPr>
+          <w:rFonts w:ascii="Arial" w:cs="Arial" w:eastAsia="Arial" w:hAnsi="Arial"/>
+          <w:color w:val="1B2118"/>
+          <w:sz w:val="21"/>
+          <w:szCs w:val="21"/>
+        </w:rPr>
+        <w:t xml:space="preserve"> sul profilo, funzione </w:t>
+      </w:r>
+      <w:r>
+        <w:rPr>
+          <w:rFonts w:ascii="Consolas" w:cs="Consolas" w:eastAsia="Consolas" w:hAnsi="Consolas"/>
+          <w:color w:val="2F5D3A"/>
+          <w:sz w:val="21"/>
+          <w:szCs w:val="21"/>
+        </w:rPr>
+        <w:t xml:space="preserve">password_cambiata</w:t>
+      </w:r>
+      <w:r>
+        <w:rPr>
+          <w:rFonts w:ascii="Arial" w:cs="Arial" w:eastAsia="Arial" w:hAnsi="Arial"/>
+          <w:color w:val="1B2118"/>
+          <w:sz w:val="21"/>
+          <w:szCs w:val="21"/>
+        </w:rPr>
+        <w:t xml:space="preserve">, protezione del flag); Edge Function </w:t>
+      </w:r>
+      <w:r>
+        <w:rPr>
+          <w:rFonts w:ascii="Consolas" w:cs="Consolas" w:eastAsia="Consolas" w:hAnsi="Consolas"/>
+          <w:color w:val="2F5D3A"/>
+          <w:sz w:val="21"/>
+          <w:szCs w:val="21"/>
+        </w:rPr>
+        <w:t xml:space="preserve">reimposta-password</w:t>
+      </w:r>
+      <w:r>
+        <w:rPr>
+          <w:rFonts w:ascii="Arial" w:cs="Arial" w:eastAsia="Arial" w:hAnsi="Arial"/>
+          <w:color w:val="1B2118"/>
+          <w:sz w:val="21"/>
+          <w:szCs w:val="21"/>
+        </w:rPr>
+        <w:t xml:space="preserve"> (pubblicata dalla dashboard, Verify JWT attivo); pagina </w:t>
+      </w:r>
+      <w:r>
+        <w:rPr>
+          <w:rFonts w:ascii="Consolas" w:cs="Consolas" w:eastAsia="Consolas" w:hAnsi="Consolas"/>
+          <w:color w:val="2F5D3A"/>
+          <w:sz w:val="21"/>
+          <w:szCs w:val="21"/>
+        </w:rPr>
+        <w:t xml:space="preserve">CambiaPassword</w:t>
+      </w:r>
+      <w:r>
+        <w:rPr>
+          <w:rFonts w:ascii="Arial" w:cs="Arial" w:eastAsia="Arial" w:hAnsi="Arial"/>
+          <w:color w:val="1B2118"/>
+          <w:sz w:val="21"/>
+          <w:szCs w:val="21"/>
+        </w:rPr>
+        <w:t xml:space="preserve"> (cambio obbligatorio dopo password temporanea, cambio volontario su </w:t>
+      </w:r>
+      <w:r>
+        <w:rPr>
+          <w:rFonts w:ascii="Consolas" w:cs="Consolas" w:eastAsia="Consolas" w:hAnsi="Consolas"/>
+          <w:color w:val="2F5D3A"/>
+          <w:sz w:val="21"/>
+          <w:szCs w:val="21"/>
+        </w:rPr>
+        <w:t xml:space="preserve">/password</w:t>
+      </w:r>
+      <w:r>
+        <w:rPr>
+          <w:rFonts w:ascii="Arial" w:cs="Arial" w:eastAsia="Arial" w:hAnsi="Arial"/>
+          <w:color w:val="1B2118"/>
+          <w:sz w:val="21"/>
+          <w:szCs w:val="21"/>
+        </w:rPr>
+        <w:t xml:space="preserve">, recupero su </w:t>
+      </w:r>
+      <w:r>
+        <w:rPr>
+          <w:rFonts w:ascii="Consolas" w:cs="Consolas" w:eastAsia="Consolas" w:hAnsi="Consolas"/>
+          <w:color w:val="2F5D3A"/>
+          <w:sz w:val="21"/>
+          <w:szCs w:val="21"/>
+        </w:rPr>
+        <w:t xml:space="preserve">/reimposta-password</w:t>
+      </w:r>
+      <w:r>
+        <w:rPr>
+          <w:rFonts w:ascii="Arial" w:cs="Arial" w:eastAsia="Arial" w:hAnsi="Arial"/>
+          <w:color w:val="1B2118"/>
+          <w:sz w:val="21"/>
+          <w:szCs w:val="21"/>
+        </w:rPr>
+        <w:t xml:space="preserve">), «Password dimenticata?» nella pagina di accesso, «Cambia password» sotto l'email in alto, «Reimposta password» in Gestione utenti; dopo l'accesso da un link email si torna alla pagina richiesta. Verificato: banco di prova locale (flag, protezione, audit) e controllo in produzione (2 utenti esistenti non obbligati). </w:t>
+      </w:r>
+      <w:r>
+        <w:rPr>
+          <w:rFonts w:ascii="Arial" w:cs="Arial" w:eastAsia="Arial" w:hAnsi="Arial"/>
+          <w:b/>
+          <w:bCs/>
+          <w:color w:val="1B2118"/>
+          <w:sz w:val="21"/>
+          <w:szCs w:val="21"/>
+        </w:rPr>
+        <w:t xml:space="preserve">Da completare in Supabase</w:t>
+      </w:r>
+      <w:r>
+        <w:rPr>
+          <w:rFonts w:ascii="Arial" w:cs="Arial" w:eastAsia="Arial" w:hAnsi="Arial"/>
+          <w:color w:val="1B2118"/>
+          <w:sz w:val="21"/>
+          <w:szCs w:val="21"/>
+        </w:rPr>
+        <w:t xml:space="preserve"> per il recupero via email: Site URL e Redirect URLs (oggi </w:t>
+      </w:r>
+      <w:r>
+        <w:rPr>
+          <w:rFonts w:ascii="Consolas" w:cs="Consolas" w:eastAsia="Consolas" w:hAnsi="Consolas"/>
+          <w:color w:val="2F5D3A"/>
+          <w:sz w:val="21"/>
+          <w:szCs w:val="21"/>
+        </w:rPr>
+        <w:t xml:space="preserve">localhost:3000</w:t>
+      </w:r>
+      <w:r>
+        <w:rPr>
+          <w:rFonts w:ascii="Arial" w:cs="Arial" w:eastAsia="Arial" w:hAnsi="Arial"/>
+          <w:color w:val="1B2118"/>
+          <w:sz w:val="21"/>
+          <w:szCs w:val="21"/>
+        </w:rPr>
+        <w:t xml:space="preserve">) e SMTP personalizzato con Resend.</w:t>
       </w:r>
     </w:p>
     <w:p>
@@ -13302,7 +14000,7 @@
               </w:rPr>
               <w:t xml:space="preserve">Claude Doc: </w:t>
             </w:r>
-            <w:hyperlink w:history="1" r:id="rIdvfkaeikvnymhcygn4m6vf">
+            <w:hyperlink w:history="1" r:id="rIdy-glhnji9nygpwy1obrer">
               <w:r>
                 <w:rPr>
                   <w:rFonts w:ascii="Arial" w:cs="Arial" w:eastAsia="Arial" w:hAnsi="Arial"/>
@@ -13649,7 +14347,7 @@
               </w:rPr>
               <w:t xml:space="preserve">Claude Doc: </w:t>
             </w:r>
-            <w:hyperlink w:history="1" r:id="rIdwfhvxssjjy_rtjmfpfvaq">
+            <w:hyperlink w:history="1" r:id="rId_e6cizuakk8o_pictdw1p">
               <w:r>
                 <w:rPr>
                   <w:rFonts w:ascii="Arial" w:cs="Arial" w:eastAsia="Arial" w:hAnsi="Arial"/>
@@ -14058,7 +14756,7 @@
               </w:rPr>
               <w:t xml:space="preserve">Claude Doc: </w:t>
             </w:r>
-            <w:hyperlink w:history="1" r:id="rIdijvu6q9gtbe7f5t-7utki">
+            <w:hyperlink w:history="1" r:id="rId_xr06phf3lg-iosf89v0g">
               <w:r>
                 <w:rPr>
                   <w:rFonts w:ascii="Arial" w:cs="Arial" w:eastAsia="Arial" w:hAnsi="Arial"/>
@@ -14601,7 +15299,7 @@
             <w:pPr>
               <w:spacing w:after="0" w:before="0"/>
             </w:pPr>
-            <w:hyperlink w:history="1" r:id="rId6xklsbazvb6kyqelg2nrc">
+            <w:hyperlink w:history="1" r:id="rId38h8exrzpl2ckpblx6k4r">
               <w:r>
                 <w:rPr>
                   <w:rFonts w:ascii="Arial" w:cs="Arial" w:eastAsia="Arial" w:hAnsi="Arial"/>
@@ -15897,6 +16595,15 @@
       <w:r>
         <w:rPr>
           <w:rFonts w:ascii="Arial" w:cs="Arial" w:eastAsia="Arial" w:hAnsi="Arial"/>
+          <w:color w:val="1B2118"/>
+          <w:sz w:val="21"/>
+          <w:szCs w:val="21"/>
+        </w:rPr>
+        <w:t xml:space="preserve">~~</w:t>
+      </w:r>
+      <w:r>
+        <w:rPr>
+          <w:rFonts w:ascii="Arial" w:cs="Arial" w:eastAsia="Arial" w:hAnsi="Arial"/>
           <w:b/>
           <w:bCs/>
           <w:color w:val="1B2118"/>
@@ -15912,7 +16619,7 @@
           <w:sz w:val="21"/>
           <w:szCs w:val="21"/>
         </w:rPr>
-        <w:t xml:space="preserve"> Recupero e cambio password per gli utenti (oggi assenti: la password la riassegna la Fondazione) — priorità alta.</w:t>
+        <w:t xml:space="preserve"> Recupero e cambio password per gli utenti~~ — fatto il 18/10 (resta la configurazione di Site URL, Redirect URLs e SMTP in Supabase per l'email di recupero).</w:t>
       </w:r>
     </w:p>
     <w:p>
@@ -15927,6 +16634,15 @@
       <w:r>
         <w:rPr>
           <w:rFonts w:ascii="Arial" w:cs="Arial" w:eastAsia="Arial" w:hAnsi="Arial"/>
+          <w:color w:val="1B2118"/>
+          <w:sz w:val="21"/>
+          <w:szCs w:val="21"/>
+        </w:rPr>
+        <w:t xml:space="preserve">~~</w:t>
+      </w:r>
+      <w:r>
+        <w:rPr>
+          <w:rFonts w:ascii="Arial" w:cs="Arial" w:eastAsia="Arial" w:hAnsi="Arial"/>
           <w:b/>
           <w:bCs/>
           <w:color w:val="1B2118"/>
@@ -15942,7 +16658,7 @@
           <w:sz w:val="21"/>
           <w:szCs w:val="21"/>
         </w:rPr>
-        <w:t xml:space="preserve"> Dopo l'accesso da un link email, riportare l'utente alla pratica del link (oggi va alla pagina iniziale).</w:t>
+        <w:t xml:space="preserve"> Dopo l'accesso da un link email, riportare l'utente alla pratica del link~~ — fatto il 18/10.</w:t>
       </w:r>
     </w:p>
     <w:p>
@@ -16179,6 +16895,282 @@
           <w:szCs w:val="21"/>
         </w:rPr>
         <w:t xml:space="preserve"> (decisione del 18/10). Dopo l'attivazione: rendere privato il repository GitHub e ricollegarlo a Vercel (risolve in buona parte il punto 28); verificare i backup automatici di Supabase e scrivere la procedura di ripristino (punto 18); valutare l'ambiente di prova separato (punto 18); decidere se alzare il limite di 50 MB per file; aggiornare i §2-3 di questo registro con piani, costi e intestatario dei contratti.</w:t>
+      </w:r>
+    </w:p>
+    <w:p>
+      <w:pPr>
+        <w:spacing w:after="140" w:line="300"/>
+      </w:pPr>
+      <w:r>
+        <w:rPr>
+          <w:rFonts w:ascii="Arial" w:cs="Arial" w:eastAsia="Arial" w:hAnsi="Arial"/>
+          <w:b/>
+          <w:bCs/>
+          <w:color w:val="1B2118"/>
+          <w:sz w:val="21"/>
+          <w:szCs w:val="21"/>
+        </w:rPr>
+        <w:t xml:space="preserve">Sicurezza informatica (cyber security) — richiesta di Luca del 18/10</w:t>
+      </w:r>
+    </w:p>
+    <w:p>
+      <w:pPr>
+        <w:pStyle w:val="ListParagraph"/>
+        <w:numPr>
+          <w:ilvl w:val="0"/>
+          <w:numId w:val="3"/>
+        </w:numPr>
+        <w:spacing w:after="70" w:line="290"/>
+      </w:pPr>
+      <w:r>
+        <w:rPr>
+          <w:rFonts w:ascii="Arial" w:cs="Arial" w:eastAsia="Arial" w:hAnsi="Arial"/>
+          <w:b/>
+          <w:bCs/>
+          <w:color w:val="1B2118"/>
+          <w:sz w:val="21"/>
+          <w:szCs w:val="21"/>
+        </w:rPr>
+        <w:t xml:space="preserve">30.</w:t>
+      </w:r>
+      <w:r>
+        <w:rPr>
+          <w:rFonts w:ascii="Arial" w:cs="Arial" w:eastAsia="Arial" w:hAnsi="Arial"/>
+          <w:color w:val="1B2118"/>
+          <w:sz w:val="21"/>
+          <w:szCs w:val="21"/>
+        </w:rPr>
+        <w:t xml:space="preserve"> Protezione dagli attacchi informatici, in un piano unico che riprende anche i punti 14-18. Da fare:</w:t>
+      </w:r>
+    </w:p>
+    <w:p>
+      <w:pPr>
+        <w:pStyle w:val="ListParagraph"/>
+        <w:numPr>
+          <w:ilvl w:val="1"/>
+          <w:numId w:val="3"/>
+        </w:numPr>
+        <w:spacing w:after="70" w:line="290"/>
+      </w:pPr>
+      <w:r>
+        <w:rPr>
+          <w:rFonts w:ascii="Arial" w:cs="Arial" w:eastAsia="Arial" w:hAnsi="Arial"/>
+          <w:b/>
+          <w:bCs/>
+          <w:color w:val="1B2118"/>
+          <w:sz w:val="20"/>
+          <w:szCs w:val="20"/>
+        </w:rPr>
+        <w:t xml:space="preserve">Verifica di sicurezza</w:t>
+      </w:r>
+      <w:r>
+        <w:rPr>
+          <w:rFonts w:ascii="Arial" w:cs="Arial" w:eastAsia="Arial" w:hAnsi="Arial"/>
+          <w:color w:val="1B2118"/>
+          <w:sz w:val="20"/>
+          <w:szCs w:val="20"/>
+        </w:rPr>
+        <w:t xml:space="preserve"> del portale secondo le linee OWASP (accessi, permessi, caricamento file, iniezioni) e controllo automatico delle regole del database con il </w:t>
+      </w:r>
+      <w:r>
+        <w:rPr>
+          <w:rFonts w:ascii="Arial" w:cs="Arial" w:eastAsia="Arial" w:hAnsi="Arial"/>
+          <w:i/>
+          <w:iCs/>
+          <w:color w:val="1B2118"/>
+          <w:sz w:val="20"/>
+          <w:szCs w:val="20"/>
+        </w:rPr>
+        <w:t xml:space="preserve">Security Advisor</w:t>
+      </w:r>
+      <w:r>
+        <w:rPr>
+          <w:rFonts w:ascii="Arial" w:cs="Arial" w:eastAsia="Arial" w:hAnsi="Arial"/>
+          <w:color w:val="1B2118"/>
+          <w:sz w:val="20"/>
+          <w:szCs w:val="20"/>
+        </w:rPr>
+        <w:t xml:space="preserve"> di Supabase; a fine sviluppo, test di intrusione (penetration test) affidato a terzi.</w:t>
+      </w:r>
+    </w:p>
+    <w:p>
+      <w:pPr>
+        <w:pStyle w:val="ListParagraph"/>
+        <w:numPr>
+          <w:ilvl w:val="1"/>
+          <w:numId w:val="3"/>
+        </w:numPr>
+        <w:spacing w:after="70" w:line="290"/>
+      </w:pPr>
+      <w:r>
+        <w:rPr>
+          <w:rFonts w:ascii="Arial" w:cs="Arial" w:eastAsia="Arial" w:hAnsi="Arial"/>
+          <w:b/>
+          <w:bCs/>
+          <w:color w:val="1B2118"/>
+          <w:sz w:val="20"/>
+          <w:szCs w:val="20"/>
+        </w:rPr>
+        <w:t xml:space="preserve">Intestazioni di sicurezza</w:t>
+      </w:r>
+      <w:r>
+        <w:rPr>
+          <w:rFonts w:ascii="Arial" w:cs="Arial" w:eastAsia="Arial" w:hAnsi="Arial"/>
+          <w:color w:val="1B2118"/>
+          <w:sz w:val="20"/>
+          <w:szCs w:val="20"/>
+        </w:rPr>
+        <w:t xml:space="preserve"> del sito (Content-Security-Policy, HSTS, protezione dal clickjacking, nessun riferimento esterno non necessario) configurate su Vercel.</w:t>
+      </w:r>
+    </w:p>
+    <w:p>
+      <w:pPr>
+        <w:pStyle w:val="ListParagraph"/>
+        <w:numPr>
+          <w:ilvl w:val="1"/>
+          <w:numId w:val="3"/>
+        </w:numPr>
+        <w:spacing w:after="70" w:line="290"/>
+      </w:pPr>
+      <w:r>
+        <w:rPr>
+          <w:rFonts w:ascii="Arial" w:cs="Arial" w:eastAsia="Arial" w:hAnsi="Arial"/>
+          <w:b/>
+          <w:bCs/>
+          <w:color w:val="1B2118"/>
+          <w:sz w:val="20"/>
+          <w:szCs w:val="20"/>
+        </w:rPr>
+        <w:t xml:space="preserve">Protezione degli accessi</w:t>
+      </w:r>
+      <w:r>
+        <w:rPr>
+          <w:rFonts w:ascii="Arial" w:cs="Arial" w:eastAsia="Arial" w:hAnsi="Arial"/>
+          <w:color w:val="1B2118"/>
+          <w:sz w:val="20"/>
+          <w:szCs w:val="20"/>
+        </w:rPr>
+        <w:t xml:space="preserve">: limiti ai tentativi di login e di recupero password, CAPTCHA sulle pagine pubbliche, verifica in due passaggi per lo staff (punto 15), regole sulle password, scadenza delle sessioni inattive.</w:t>
+      </w:r>
+    </w:p>
+    <w:p>
+      <w:pPr>
+        <w:pStyle w:val="ListParagraph"/>
+        <w:numPr>
+          <w:ilvl w:val="1"/>
+          <w:numId w:val="3"/>
+        </w:numPr>
+        <w:spacing w:after="70" w:line="290"/>
+      </w:pPr>
+      <w:r>
+        <w:rPr>
+          <w:rFonts w:ascii="Arial" w:cs="Arial" w:eastAsia="Arial" w:hAnsi="Arial"/>
+          <w:b/>
+          <w:bCs/>
+          <w:color w:val="1B2118"/>
+          <w:sz w:val="20"/>
+          <w:szCs w:val="20"/>
+        </w:rPr>
+        <w:t xml:space="preserve">Dipendenze e segreti</w:t>
+      </w:r>
+      <w:r>
+        <w:rPr>
+          <w:rFonts w:ascii="Arial" w:cs="Arial" w:eastAsia="Arial" w:hAnsi="Arial"/>
+          <w:color w:val="1B2118"/>
+          <w:sz w:val="20"/>
+          <w:szCs w:val="20"/>
+        </w:rPr>
+        <w:t xml:space="preserve">: controllo periodico delle librerie vulnerabili (npm audit, avvisi automatici di GitHub), scansione dei segreti nel repository, rotazione delle chiavi.</w:t>
+      </w:r>
+    </w:p>
+    <w:p>
+      <w:pPr>
+        <w:pStyle w:val="ListParagraph"/>
+        <w:numPr>
+          <w:ilvl w:val="1"/>
+          <w:numId w:val="3"/>
+        </w:numPr>
+        <w:spacing w:after="70" w:line="290"/>
+      </w:pPr>
+      <w:r>
+        <w:rPr>
+          <w:rFonts w:ascii="Arial" w:cs="Arial" w:eastAsia="Arial" w:hAnsi="Arial"/>
+          <w:b/>
+          <w:bCs/>
+          <w:color w:val="1B2118"/>
+          <w:sz w:val="20"/>
+          <w:szCs w:val="20"/>
+        </w:rPr>
+        <w:t xml:space="preserve">Monitoraggio e allarmi</w:t>
+      </w:r>
+      <w:r>
+        <w:rPr>
+          <w:rFonts w:ascii="Arial" w:cs="Arial" w:eastAsia="Arial" w:hAnsi="Arial"/>
+          <w:color w:val="1B2118"/>
+          <w:sz w:val="20"/>
+          <w:szCs w:val="20"/>
+        </w:rPr>
+        <w:t xml:space="preserve">: registro di sicurezza (punto 14), avvisi su accessi anomali, errori e indisponibilità del portale.</w:t>
+      </w:r>
+    </w:p>
+    <w:p>
+      <w:pPr>
+        <w:pStyle w:val="ListParagraph"/>
+        <w:numPr>
+          <w:ilvl w:val="1"/>
+          <w:numId w:val="3"/>
+        </w:numPr>
+        <w:spacing w:after="70" w:line="290"/>
+      </w:pPr>
+      <w:r>
+        <w:rPr>
+          <w:rFonts w:ascii="Arial" w:cs="Arial" w:eastAsia="Arial" w:hAnsi="Arial"/>
+          <w:b/>
+          <w:bCs/>
+          <w:color w:val="1B2118"/>
+          <w:sz w:val="20"/>
+          <w:szCs w:val="20"/>
+        </w:rPr>
+        <w:t xml:space="preserve">Continuità</w:t>
+      </w:r>
+      <w:r>
+        <w:rPr>
+          <w:rFonts w:ascii="Arial" w:cs="Arial" w:eastAsia="Arial" w:hAnsi="Arial"/>
+          <w:color w:val="1B2118"/>
+          <w:sz w:val="20"/>
+          <w:szCs w:val="20"/>
+        </w:rPr>
+        <w:t xml:space="preserve">: backup verificati e prova di ripristino (punti 18 e 29), antivirus sui file (punto 16).</w:t>
+      </w:r>
+    </w:p>
+    <w:p>
+      <w:pPr>
+        <w:pStyle w:val="ListParagraph"/>
+        <w:numPr>
+          <w:ilvl w:val="1"/>
+          <w:numId w:val="3"/>
+        </w:numPr>
+        <w:spacing w:after="70" w:line="290"/>
+      </w:pPr>
+      <w:r>
+        <w:rPr>
+          <w:rFonts w:ascii="Arial" w:cs="Arial" w:eastAsia="Arial" w:hAnsi="Arial"/>
+          <w:b/>
+          <w:bCs/>
+          <w:color w:val="1B2118"/>
+          <w:sz w:val="20"/>
+          <w:szCs w:val="20"/>
+        </w:rPr>
+        <w:t xml:space="preserve">Organizzazione e privacy</w:t>
+      </w:r>
+      <w:r>
+        <w:rPr>
+          <w:rFonts w:ascii="Arial" w:cs="Arial" w:eastAsia="Arial" w:hAnsi="Arial"/>
+          <w:color w:val="1B2118"/>
+          <w:sz w:val="20"/>
+          <w:szCs w:val="20"/>
+        </w:rPr>
+        <w:t xml:space="preserve">: procedura di risposta agli incidenti, valutazione d'impatto sulla protezione dei dati (DPIA) e registro dei trattamenti per i dati delle utenze, nomina dei fornitori (Vercel, Supabase, Resend) come responsabili del trattamento.</w:t>
       </w:r>
     </w:p>
     <w:p>
@@ -16785,6 +17777,200 @@
                 <w:szCs w:val="18"/>
               </w:rPr>
               <w:t xml:space="preserve">Verifica del dominio da completare</w:t>
+            </w:r>
+          </w:p>
+        </w:tc>
+      </w:tr>
+      <w:tr>
+        <w:trPr>
+          <w:cantSplit/>
+        </w:trPr>
+        <w:tc>
+          <w:tcPr>
+            <w:tcW w:type="dxa" w:w="4819"/>
+            <w:tcBorders>
+              <w:top w:val="single" w:color="D9D4C5" w:sz="4"/>
+              <w:left w:val="single" w:color="D9D4C5" w:sz="4"/>
+              <w:bottom w:val="single" w:color="D9D4C5" w:sz="4"/>
+              <w:right w:val="single" w:color="D9D4C5" w:sz="4"/>
+            </w:tcBorders>
+            <w:tcMar>
+              <w:top w:type="dxa" w:w="70"/>
+              <w:left w:type="dxa" w:w="110"/>
+              <w:bottom w:type="dxa" w:w="70"/>
+              <w:right w:type="dxa" w:w="110"/>
+            </w:tcMar>
+            <w:vAlign w:val="center"/>
+          </w:tcPr>
+          <w:p>
+            <w:pPr>
+              <w:spacing w:after="0" w:before="0"/>
+            </w:pPr>
+            <w:r>
+              <w:rPr>
+                <w:rFonts w:ascii="Arial" w:cs="Arial" w:eastAsia="Arial" w:hAnsi="Arial"/>
+                <w:color w:val="1B2118"/>
+                <w:sz w:val="18"/>
+                <w:szCs w:val="18"/>
+              </w:rPr>
+              <w:t xml:space="preserve">Site URL di Supabase Auth ancora </w:t>
+            </w:r>
+            <w:r>
+              <w:rPr>
+                <w:rFonts w:ascii="Consolas" w:cs="Consolas" w:eastAsia="Consolas" w:hAnsi="Consolas"/>
+                <w:color w:val="2F5D3A"/>
+                <w:sz w:val="18"/>
+                <w:szCs w:val="18"/>
+              </w:rPr>
+              <w:t xml:space="preserve">http://localhost:3000</w:t>
+            </w:r>
+            <w:r>
+              <w:rPr>
+                <w:rFonts w:ascii="Arial" w:cs="Arial" w:eastAsia="Arial" w:hAnsi="Arial"/>
+                <w:color w:val="1B2118"/>
+                <w:sz w:val="18"/>
+                <w:szCs w:val="18"/>
+              </w:rPr>
+              <w:t xml:space="preserve"> e nessun Redirect URL: i link delle email di Supabase (recupero password) non funzionerebbero</w:t>
+            </w:r>
+          </w:p>
+        </w:tc>
+        <w:tc>
+          <w:tcPr>
+            <w:tcW w:type="dxa" w:w="4819"/>
+            <w:tcBorders>
+              <w:top w:val="single" w:color="D9D4C5" w:sz="4"/>
+              <w:left w:val="single" w:color="D9D4C5" w:sz="4"/>
+              <w:bottom w:val="single" w:color="D9D4C5" w:sz="4"/>
+              <w:right w:val="single" w:color="D9D4C5" w:sz="4"/>
+            </w:tcBorders>
+            <w:tcMar>
+              <w:top w:type="dxa" w:w="70"/>
+              <w:left w:type="dxa" w:w="110"/>
+              <w:bottom w:type="dxa" w:w="70"/>
+              <w:right w:type="dxa" w:w="110"/>
+            </w:tcMar>
+            <w:vAlign w:val="center"/>
+          </w:tcPr>
+          <w:p>
+            <w:pPr>
+              <w:spacing w:after="0" w:before="0"/>
+            </w:pPr>
+            <w:r>
+              <w:rPr>
+                <w:rFonts w:ascii="Arial" w:cs="Arial" w:eastAsia="Arial" w:hAnsi="Arial"/>
+                <w:color w:val="1B2118"/>
+                <w:sz w:val="18"/>
+                <w:szCs w:val="18"/>
+              </w:rPr>
+              <w:t xml:space="preserve">Da impostare </w:t>
+            </w:r>
+            <w:r>
+              <w:rPr>
+                <w:rFonts w:ascii="Consolas" w:cs="Consolas" w:eastAsia="Consolas" w:hAnsi="Consolas"/>
+                <w:color w:val="2F5D3A"/>
+                <w:sz w:val="18"/>
+                <w:szCs w:val="18"/>
+              </w:rPr>
+              <w:t xml:space="preserve">https://portale-cwp.vercel.app</w:t>
+            </w:r>
+            <w:r>
+              <w:rPr>
+                <w:rFonts w:ascii="Arial" w:cs="Arial" w:eastAsia="Arial" w:hAnsi="Arial"/>
+                <w:color w:val="1B2118"/>
+                <w:sz w:val="18"/>
+                <w:szCs w:val="18"/>
+              </w:rPr>
+              <w:t xml:space="preserve"> e </w:t>
+            </w:r>
+            <w:r>
+              <w:rPr>
+                <w:rFonts w:ascii="Consolas" w:cs="Consolas" w:eastAsia="Consolas" w:hAnsi="Consolas"/>
+                <w:color w:val="2F5D3A"/>
+                <w:sz w:val="18"/>
+                <w:szCs w:val="18"/>
+              </w:rPr>
+              <w:t xml:space="preserve">https://portale-cwp.vercel.app/**</w:t>
+            </w:r>
+            <w:r>
+              <w:rPr>
+                <w:rFonts w:ascii="Arial" w:cs="Arial" w:eastAsia="Arial" w:hAnsi="Arial"/>
+                <w:color w:val="1B2118"/>
+                <w:sz w:val="18"/>
+                <w:szCs w:val="18"/>
+              </w:rPr>
+              <w:t xml:space="preserve"> (in attesa di conferma di Luca)</w:t>
+            </w:r>
+          </w:p>
+        </w:tc>
+      </w:tr>
+      <w:tr>
+        <w:trPr>
+          <w:cantSplit/>
+        </w:trPr>
+        <w:tc>
+          <w:tcPr>
+            <w:tcW w:type="dxa" w:w="4819"/>
+            <w:tcBorders>
+              <w:top w:val="single" w:color="D9D4C5" w:sz="4"/>
+              <w:left w:val="single" w:color="D9D4C5" w:sz="4"/>
+              <w:bottom w:val="single" w:color="D9D4C5" w:sz="4"/>
+              <w:right w:val="single" w:color="D9D4C5" w:sz="4"/>
+            </w:tcBorders>
+            <w:shd w:fill="F6F4EE" w:color="auto" w:val="clear"/>
+            <w:tcMar>
+              <w:top w:type="dxa" w:w="70"/>
+              <w:left w:type="dxa" w:w="110"/>
+              <w:bottom w:type="dxa" w:w="70"/>
+              <w:right w:type="dxa" w:w="110"/>
+            </w:tcMar>
+            <w:vAlign w:val="center"/>
+          </w:tcPr>
+          <w:p>
+            <w:pPr>
+              <w:spacing w:after="0" w:before="0"/>
+            </w:pPr>
+            <w:r>
+              <w:rPr>
+                <w:rFonts w:ascii="Arial" w:cs="Arial" w:eastAsia="Arial" w:hAnsi="Arial"/>
+                <w:color w:val="1B2118"/>
+                <w:sz w:val="18"/>
+                <w:szCs w:val="18"/>
+              </w:rPr>
+              <w:t xml:space="preserve">Il servizio email predefinito di Supabase Auth consegna solo ai membri del progetto</w:t>
+            </w:r>
+          </w:p>
+        </w:tc>
+        <w:tc>
+          <w:tcPr>
+            <w:tcW w:type="dxa" w:w="4819"/>
+            <w:tcBorders>
+              <w:top w:val="single" w:color="D9D4C5" w:sz="4"/>
+              <w:left w:val="single" w:color="D9D4C5" w:sz="4"/>
+              <w:bottom w:val="single" w:color="D9D4C5" w:sz="4"/>
+              <w:right w:val="single" w:color="D9D4C5" w:sz="4"/>
+            </w:tcBorders>
+            <w:shd w:fill="F6F4EE" w:color="auto" w:val="clear"/>
+            <w:tcMar>
+              <w:top w:type="dxa" w:w="70"/>
+              <w:left w:type="dxa" w:w="110"/>
+              <w:bottom w:type="dxa" w:w="70"/>
+              <w:right w:type="dxa" w:w="110"/>
+            </w:tcMar>
+            <w:vAlign w:val="center"/>
+          </w:tcPr>
+          <w:p>
+            <w:pPr>
+              <w:spacing w:after="0" w:before="0"/>
+            </w:pPr>
+            <w:r>
+              <w:rPr>
+                <w:rFonts w:ascii="Arial" w:cs="Arial" w:eastAsia="Arial" w:hAnsi="Arial"/>
+                <w:color w:val="1B2118"/>
+                <w:sz w:val="18"/>
+                <w:szCs w:val="18"/>
+              </w:rPr>
+              <w:t xml:space="preserve">Configurare SMTP personalizzato (Resend) in Authentication → Emails</w:t>
             </w:r>
           </w:p>
         </w:tc>
@@ -17196,6 +18382,18 @@
       <w:lvlJc w:val="left"/>
       <w:pPr>
         <w:ind w:left="540" w:hanging="270"/>
+      </w:pPr>
+      <w:rPr>
+        <w:color w:val="2F5D3A"/>
+      </w:rPr>
+    </w:lvl>
+    <w:lvl w:ilvl="1" w15:tentative="1">
+      <w:start w:val="1"/>
+      <w:numFmt w:val="bullet"/>
+      <w:lvlText w:val="–"/>
+      <w:lvlJc w:val="left"/>
+      <w:pPr>
+        <w:ind w:left="1000" w:hanging="270"/>
       </w:pPr>
       <w:rPr>
         <w:color w:val="2F5D3A"/>

</xml_diff>

<commit_message>
PDF impaginati tipograficamente per Manuale Utente e Registro
Copertina a tutta pagina con loghi, scheda e revisioni, sommario con
pagine reali, aperture di capitolo, passi numerati, riquadri, schema
delle fasi; strumenti/impagina_pdf.py (WeasyPrint) chiamato dal
generatore unico. Barrato supportato anche nel Word.

Co-Authored-By: Claude Opus 5.5 <noreply@anthropic.com>
Claude-Session: https://claude.ai/code/session_01E8XCbEeVHWVP3hntUZ6kZ1
</commit_message>
<xml_diff>
--- a/public/documentazione/Registro_Dev_Deploy_Portale_CWP.docx
+++ b/public/documentazione/Registro_Dev_Deploy_Portale_CWP.docx
@@ -1473,7 +1473,7 @@
             <w:szCs w:val="22"/>
           </w:rPr>
           <w:tab/>
-          <w:t xml:space="preserve">15</w:t>
+          <w:t xml:space="preserve">16</w:t>
         </w:r>
       </w:hyperlink>
     </w:p>
@@ -1502,7 +1502,7 @@
             <w:szCs w:val="22"/>
           </w:rPr>
           <w:tab/>
-          <w:t xml:space="preserve">16</w:t>
+          <w:t xml:space="preserve">17</w:t>
         </w:r>
       </w:hyperlink>
     </w:p>
@@ -1531,7 +1531,7 @@
             <w:szCs w:val="22"/>
           </w:rPr>
           <w:tab/>
-          <w:t xml:space="preserve">17</w:t>
+          <w:t xml:space="preserve">18</w:t>
         </w:r>
       </w:hyperlink>
     </w:p>
@@ -1560,7 +1560,7 @@
             <w:szCs w:val="22"/>
           </w:rPr>
           <w:tab/>
-          <w:t xml:space="preserve">19</w:t>
+          <w:t xml:space="preserve">20</w:t>
         </w:r>
       </w:hyperlink>
     </w:p>
@@ -11694,7 +11694,7 @@
           <w:sz w:val="21"/>
           <w:szCs w:val="21"/>
         </w:rPr>
-        <w:t xml:space="preserve"> e LibreOffice) e si pubblica con commit e push. I file vanno in </w:t>
+        <w:t xml:space="preserve">, LibreOffice e, per il PDF impaginato, WeasyPrint) e si pubblica con commit e push. I file vanno in </w:t>
       </w:r>
       <w:r>
         <w:rPr>
@@ -12005,6 +12005,72 @@
           <w:szCs w:val="21"/>
         </w:rPr>
         <w:t xml:space="preserve">) e SMTP personalizzato con Resend.</w:t>
+      </w:r>
+    </w:p>
+    <w:p>
+      <w:pPr>
+        <w:pStyle w:val="ListParagraph"/>
+        <w:numPr>
+          <w:ilvl w:val="0"/>
+          <w:numId w:val="3"/>
+        </w:numPr>
+        <w:spacing w:after="70" w:line="290"/>
+      </w:pPr>
+      <w:r>
+        <w:rPr>
+          <w:rFonts w:ascii="Arial" w:cs="Arial" w:eastAsia="Arial" w:hAnsi="Arial"/>
+          <w:b/>
+          <w:bCs/>
+          <w:color w:val="1B2118"/>
+          <w:sz w:val="21"/>
+          <w:szCs w:val="21"/>
+        </w:rPr>
+        <w:t xml:space="preserve">PDF impaginati tipograficamente</w:t>
+      </w:r>
+      <w:r>
+        <w:rPr>
+          <w:rFonts w:ascii="Arial" w:cs="Arial" w:eastAsia="Arial" w:hAnsi="Arial"/>
+          <w:color w:val="1B2118"/>
+          <w:sz w:val="21"/>
+          <w:szCs w:val="21"/>
+        </w:rPr>
+        <w:t xml:space="preserve"> (Manuale Utente e Registro): copertina a tutta pagina con loghi, scheda del documento e revisioni, sommario con pagine reali, aperture di capitolo numerate, passi numerati, riquadri «Da sapere / Attenzione / Suggerimento», schema delle 7 fasi, intestazioni correnti. Script </w:t>
+      </w:r>
+      <w:r>
+        <w:rPr>
+          <w:rFonts w:ascii="Consolas" w:cs="Consolas" w:eastAsia="Consolas" w:hAnsi="Consolas"/>
+          <w:color w:val="2F5D3A"/>
+          <w:sz w:val="21"/>
+          <w:szCs w:val="21"/>
+        </w:rPr>
+        <w:t xml:space="preserve">strumenti/impagina_pdf.py</w:t>
+      </w:r>
+      <w:r>
+        <w:rPr>
+          <w:rFonts w:ascii="Arial" w:cs="Arial" w:eastAsia="Arial" w:hAnsi="Arial"/>
+          <w:color w:val="1B2118"/>
+          <w:sz w:val="21"/>
+          <w:szCs w:val="21"/>
+        </w:rPr>
+        <w:t xml:space="preserve"> (WeasyPrint), chiamato da </w:t>
+      </w:r>
+      <w:r>
+        <w:rPr>
+          <w:rFonts w:ascii="Consolas" w:cs="Consolas" w:eastAsia="Consolas" w:hAnsi="Consolas"/>
+          <w:color w:val="2F5D3A"/>
+          <w:sz w:val="21"/>
+          <w:szCs w:val="21"/>
+        </w:rPr>
+        <w:t xml:space="preserve">strumenti/genera_documenti.cjs</w:t>
+      </w:r>
+      <w:r>
+        <w:rPr>
+          <w:rFonts w:ascii="Arial" w:cs="Arial" w:eastAsia="Arial" w:hAnsi="Arial"/>
+          <w:color w:val="1B2118"/>
+          <w:sz w:val="21"/>
+          <w:szCs w:val="21"/>
+        </w:rPr>
+        <w:t xml:space="preserve">; il Word resta la versione modificabile.</w:t>
       </w:r>
     </w:p>
     <w:p>
@@ -14000,7 +14066,7 @@
               </w:rPr>
               <w:t xml:space="preserve">Claude Doc: </w:t>
             </w:r>
-            <w:hyperlink w:history="1" r:id="rIdy-glhnji9nygpwy1obrer">
+            <w:hyperlink w:history="1" r:id="rIdvrftwbp-fsadzmvamktd2">
               <w:r>
                 <w:rPr>
                   <w:rFonts w:ascii="Arial" w:cs="Arial" w:eastAsia="Arial" w:hAnsi="Arial"/>
@@ -14347,7 +14413,7 @@
               </w:rPr>
               <w:t xml:space="preserve">Claude Doc: </w:t>
             </w:r>
-            <w:hyperlink w:history="1" r:id="rId_e6cizuakk8o_pictdw1p">
+            <w:hyperlink w:history="1" r:id="rIdiovkj7p5bhids6hb5msh2">
               <w:r>
                 <w:rPr>
                   <w:rFonts w:ascii="Arial" w:cs="Arial" w:eastAsia="Arial" w:hAnsi="Arial"/>
@@ -14756,7 +14822,7 @@
               </w:rPr>
               <w:t xml:space="preserve">Claude Doc: </w:t>
             </w:r>
-            <w:hyperlink w:history="1" r:id="rId_xr06phf3lg-iosf89v0g">
+            <w:hyperlink w:history="1" r:id="rIdxckevbcus5kfmpxqfqovf">
               <w:r>
                 <w:rPr>
                   <w:rFonts w:ascii="Arial" w:cs="Arial" w:eastAsia="Arial" w:hAnsi="Arial"/>
@@ -15299,7 +15365,7 @@
             <w:pPr>
               <w:spacing w:after="0" w:before="0"/>
             </w:pPr>
-            <w:hyperlink w:history="1" r:id="rId38h8exrzpl2ckpblx6k4r">
+            <w:hyperlink w:history="1" r:id="rIdql6zpfphh9jhrkqo8dvxv">
               <w:r>
                 <w:rPr>
                   <w:rFonts w:ascii="Arial" w:cs="Arial" w:eastAsia="Arial" w:hAnsi="Arial"/>
@@ -16595,18 +16661,10 @@
       <w:r>
         <w:rPr>
           <w:rFonts w:ascii="Arial" w:cs="Arial" w:eastAsia="Arial" w:hAnsi="Arial"/>
-          <w:color w:val="1B2118"/>
-          <w:sz w:val="21"/>
-          <w:szCs w:val="21"/>
-        </w:rPr>
-        <w:t xml:space="preserve">~~</w:t>
-      </w:r>
-      <w:r>
-        <w:rPr>
-          <w:rFonts w:ascii="Arial" w:cs="Arial" w:eastAsia="Arial" w:hAnsi="Arial"/>
           <w:b/>
           <w:bCs/>
-          <w:color w:val="1B2118"/>
+          <w:strike/>
+          <w:color w:val="5A5E54"/>
           <w:sz w:val="21"/>
           <w:szCs w:val="21"/>
         </w:rPr>
@@ -16615,11 +16673,21 @@
       <w:r>
         <w:rPr>
           <w:rFonts w:ascii="Arial" w:cs="Arial" w:eastAsia="Arial" w:hAnsi="Arial"/>
-          <w:color w:val="1B2118"/>
-          <w:sz w:val="21"/>
-          <w:szCs w:val="21"/>
-        </w:rPr>
-        <w:t xml:space="preserve"> Recupero e cambio password per gli utenti~~ — fatto il 18/10 (resta la configurazione di Site URL, Redirect URLs e SMTP in Supabase per l'email di recupero).</w:t>
+          <w:strike/>
+          <w:color w:val="5A5E54"/>
+          <w:sz w:val="21"/>
+          <w:szCs w:val="21"/>
+        </w:rPr>
+        <w:t xml:space="preserve"> Recupero e cambio password per gli utenti</w:t>
+      </w:r>
+      <w:r>
+        <w:rPr>
+          <w:rFonts w:ascii="Arial" w:cs="Arial" w:eastAsia="Arial" w:hAnsi="Arial"/>
+          <w:color w:val="1B2118"/>
+          <w:sz w:val="21"/>
+          <w:szCs w:val="21"/>
+        </w:rPr>
+        <w:t xml:space="preserve"> — fatto il 18/10 (resta la configurazione di Site URL, Redirect URLs e SMTP in Supabase per l'email di recupero).</w:t>
       </w:r>
     </w:p>
     <w:p>
@@ -16634,18 +16702,10 @@
       <w:r>
         <w:rPr>
           <w:rFonts w:ascii="Arial" w:cs="Arial" w:eastAsia="Arial" w:hAnsi="Arial"/>
-          <w:color w:val="1B2118"/>
-          <w:sz w:val="21"/>
-          <w:szCs w:val="21"/>
-        </w:rPr>
-        <w:t xml:space="preserve">~~</w:t>
-      </w:r>
-      <w:r>
-        <w:rPr>
-          <w:rFonts w:ascii="Arial" w:cs="Arial" w:eastAsia="Arial" w:hAnsi="Arial"/>
           <w:b/>
           <w:bCs/>
-          <w:color w:val="1B2118"/>
+          <w:strike/>
+          <w:color w:val="5A5E54"/>
           <w:sz w:val="21"/>
           <w:szCs w:val="21"/>
         </w:rPr>
@@ -16654,11 +16714,21 @@
       <w:r>
         <w:rPr>
           <w:rFonts w:ascii="Arial" w:cs="Arial" w:eastAsia="Arial" w:hAnsi="Arial"/>
-          <w:color w:val="1B2118"/>
-          <w:sz w:val="21"/>
-          <w:szCs w:val="21"/>
-        </w:rPr>
-        <w:t xml:space="preserve"> Dopo l'accesso da un link email, riportare l'utente alla pratica del link~~ — fatto il 18/10.</w:t>
+          <w:strike/>
+          <w:color w:val="5A5E54"/>
+          <w:sz w:val="21"/>
+          <w:szCs w:val="21"/>
+        </w:rPr>
+        <w:t xml:space="preserve"> Dopo l'accesso da un link email, riportare l'utente alla pratica del link</w:t>
+      </w:r>
+      <w:r>
+        <w:rPr>
+          <w:rFonts w:ascii="Arial" w:cs="Arial" w:eastAsia="Arial" w:hAnsi="Arial"/>
+          <w:color w:val="1B2118"/>
+          <w:sz w:val="21"/>
+          <w:szCs w:val="21"/>
+        </w:rPr>
+        <w:t xml:space="preserve"> — fatto il 18/10.</w:t>
       </w:r>
     </w:p>
     <w:p>

</xml_diff>

<commit_message>
Pagina Il mio profilo con cambio password e manuali da scaricare
Co-Authored-By: Claude Opus 5.5 <noreply@anthropic.com>
Claude-Session: https://claude.ai/code/session_01E8XCbEeVHWVP3hntUZ6kZ1
</commit_message>
<xml_diff>
--- a/public/documentazione/Registro_Dev_Deploy_Portale_CWP.docx
+++ b/public/documentazione/Registro_Dev_Deploy_Portale_CWP.docx
@@ -2916,10 +2916,10 @@
       </w:tblPr>
       <w:tblGrid>
         <w:gridCol w:w="971"/>
-        <w:gridCol w:w="2276"/>
+        <w:gridCol w:w="2465"/>
         <w:gridCol w:w="1260"/>
-        <w:gridCol w:w="2565"/>
-        <w:gridCol w:w="2566"/>
+        <w:gridCol w:w="2477"/>
+        <w:gridCol w:w="2465"/>
       </w:tblGrid>
       <w:tr>
         <w:trPr>
@@ -2962,7 +2962,7 @@
         </w:tc>
         <w:tc>
           <w:tcPr>
-            <w:tcW w:type="dxa" w:w="2276"/>
+            <w:tcW w:type="dxa" w:w="2465"/>
             <w:tcBorders>
               <w:top w:val="single" w:color="D9D4C5" w:sz="4"/>
               <w:left w:val="single" w:color="D9D4C5" w:sz="4"/>
@@ -3032,7 +3032,7 @@
         </w:tc>
         <w:tc>
           <w:tcPr>
-            <w:tcW w:type="dxa" w:w="2565"/>
+            <w:tcW w:type="dxa" w:w="2477"/>
             <w:tcBorders>
               <w:top w:val="single" w:color="D9D4C5" w:sz="4"/>
               <w:left w:val="single" w:color="D9D4C5" w:sz="4"/>
@@ -3067,7 +3067,7 @@
         </w:tc>
         <w:tc>
           <w:tcPr>
-            <w:tcW w:type="dxa" w:w="2566"/>
+            <w:tcW w:type="dxa" w:w="2465"/>
             <w:tcBorders>
               <w:top w:val="single" w:color="D9D4C5" w:sz="4"/>
               <w:left w:val="single" w:color="D9D4C5" w:sz="4"/>
@@ -3139,7 +3139,7 @@
         </w:tc>
         <w:tc>
           <w:tcPr>
-            <w:tcW w:type="dxa" w:w="2276"/>
+            <w:tcW w:type="dxa" w:w="2465"/>
             <w:tcBorders>
               <w:top w:val="single" w:color="D9D4C5" w:sz="4"/>
               <w:left w:val="single" w:color="D9D4C5" w:sz="4"/>
@@ -3203,7 +3203,7 @@
         </w:tc>
         <w:tc>
           <w:tcPr>
-            <w:tcW w:type="dxa" w:w="2565"/>
+            <w:tcW w:type="dxa" w:w="2477"/>
             <w:tcBorders>
               <w:top w:val="single" w:color="D9D4C5" w:sz="4"/>
               <w:left w:val="single" w:color="D9D4C5" w:sz="4"/>
@@ -3235,7 +3235,7 @@
         </w:tc>
         <w:tc>
           <w:tcPr>
-            <w:tcW w:type="dxa" w:w="2566"/>
+            <w:tcW w:type="dxa" w:w="2465"/>
             <w:tcBorders>
               <w:top w:val="single" w:color="D9D4C5" w:sz="4"/>
               <w:left w:val="single" w:color="D9D4C5" w:sz="4"/>
@@ -3305,7 +3305,7 @@
         </w:tc>
         <w:tc>
           <w:tcPr>
-            <w:tcW w:type="dxa" w:w="2276"/>
+            <w:tcW w:type="dxa" w:w="2465"/>
             <w:tcBorders>
               <w:top w:val="single" w:color="D9D4C5" w:sz="4"/>
               <w:left w:val="single" w:color="D9D4C5" w:sz="4"/>
@@ -3380,7 +3380,7 @@
         </w:tc>
         <w:tc>
           <w:tcPr>
-            <w:tcW w:type="dxa" w:w="2565"/>
+            <w:tcW w:type="dxa" w:w="2477"/>
             <w:tcBorders>
               <w:top w:val="single" w:color="D9D4C5" w:sz="4"/>
               <w:left w:val="single" w:color="D9D4C5" w:sz="4"/>
@@ -3413,7 +3413,7 @@
         </w:tc>
         <w:tc>
           <w:tcPr>
-            <w:tcW w:type="dxa" w:w="2566"/>
+            <w:tcW w:type="dxa" w:w="2465"/>
             <w:tcBorders>
               <w:top w:val="single" w:color="D9D4C5" w:sz="4"/>
               <w:left w:val="single" w:color="D9D4C5" w:sz="4"/>
@@ -3501,7 +3501,7 @@
         </w:tc>
         <w:tc>
           <w:tcPr>
-            <w:tcW w:type="dxa" w:w="2276"/>
+            <w:tcW w:type="dxa" w:w="2465"/>
             <w:tcBorders>
               <w:top w:val="single" w:color="D9D4C5" w:sz="4"/>
               <w:left w:val="single" w:color="D9D4C5" w:sz="4"/>
@@ -3565,7 +3565,7 @@
         </w:tc>
         <w:tc>
           <w:tcPr>
-            <w:tcW w:type="dxa" w:w="2565"/>
+            <w:tcW w:type="dxa" w:w="2477"/>
             <w:tcBorders>
               <w:top w:val="single" w:color="D9D4C5" w:sz="4"/>
               <w:left w:val="single" w:color="D9D4C5" w:sz="4"/>
@@ -3602,11 +3602,47 @@
               </w:rPr>
               <w:t xml:space="preserve">ajxrnofgunynkynozmrn</w:t>
             </w:r>
-          </w:p>
-        </w:tc>
-        <w:tc>
-          <w:tcPr>
-            <w:tcW w:type="dxa" w:w="2566"/>
+            <w:r>
+              <w:rPr>
+                <w:rFonts w:ascii="Arial" w:cs="Arial" w:eastAsia="Arial" w:hAnsi="Arial"/>
+                <w:color w:val="1B2118"/>
+                <w:sz w:val="18"/>
+                <w:szCs w:val="18"/>
+              </w:rPr>
+              <w:t xml:space="preserve">; Auth: Site URL </w:t>
+            </w:r>
+            <w:r>
+              <w:rPr>
+                <w:rFonts w:ascii="Consolas" w:cs="Consolas" w:eastAsia="Consolas" w:hAnsi="Consolas"/>
+                <w:color w:val="2F5D3A"/>
+                <w:sz w:val="18"/>
+                <w:szCs w:val="18"/>
+              </w:rPr>
+              <w:t xml:space="preserve">https://portale-cwp.vercel.app</w:t>
+            </w:r>
+            <w:r>
+              <w:rPr>
+                <w:rFonts w:ascii="Arial" w:cs="Arial" w:eastAsia="Arial" w:hAnsi="Arial"/>
+                <w:color w:val="1B2118"/>
+                <w:sz w:val="18"/>
+                <w:szCs w:val="18"/>
+              </w:rPr>
+              <w:t xml:space="preserve">, Redirect URL </w:t>
+            </w:r>
+            <w:r>
+              <w:rPr>
+                <w:rFonts w:ascii="Consolas" w:cs="Consolas" w:eastAsia="Consolas" w:hAnsi="Consolas"/>
+                <w:color w:val="2F5D3A"/>
+                <w:sz w:val="18"/>
+                <w:szCs w:val="18"/>
+              </w:rPr>
+              <w:t xml:space="preserve">https://portale-cwp.vercel.app/**</w:t>
+            </w:r>
+          </w:p>
+        </w:tc>
+        <w:tc>
+          <w:tcPr>
+            <w:tcW w:type="dxa" w:w="2465"/>
             <w:tcBorders>
               <w:top w:val="single" w:color="D9D4C5" w:sz="4"/>
               <w:left w:val="single" w:color="D9D4C5" w:sz="4"/>
@@ -3730,7 +3766,7 @@
         </w:tc>
         <w:tc>
           <w:tcPr>
-            <w:tcW w:type="dxa" w:w="2276"/>
+            <w:tcW w:type="dxa" w:w="2465"/>
             <w:tcBorders>
               <w:top w:val="single" w:color="D9D4C5" w:sz="4"/>
               <w:left w:val="single" w:color="D9D4C5" w:sz="4"/>
@@ -3757,7 +3793,7 @@
                 <w:sz w:val="18"/>
                 <w:szCs w:val="18"/>
               </w:rPr>
-              <w:t xml:space="preserve">Invio email delle notifiche</w:t>
+              <w:t xml:space="preserve">Invio email delle notifiche (Edge Function) e delle email di autenticazione (SMTP di Supabase Auth)</w:t>
             </w:r>
           </w:p>
         </w:tc>
@@ -3796,7 +3832,7 @@
         </w:tc>
         <w:tc>
           <w:tcPr>
-            <w:tcW w:type="dxa" w:w="2565"/>
+            <w:tcW w:type="dxa" w:w="2477"/>
             <w:tcBorders>
               <w:top w:val="single" w:color="D9D4C5" w:sz="4"/>
               <w:left w:val="single" w:color="D9D4C5" w:sz="4"/>
@@ -3829,7 +3865,7 @@
         </w:tc>
         <w:tc>
           <w:tcPr>
-            <w:tcW w:type="dxa" w:w="2566"/>
+            <w:tcW w:type="dxa" w:w="2465"/>
             <w:tcBorders>
               <w:top w:val="single" w:color="D9D4C5" w:sz="4"/>
               <w:left w:val="single" w:color="D9D4C5" w:sz="4"/>
@@ -3856,7 +3892,7 @@
                 <w:sz w:val="18"/>
                 <w:szCs w:val="18"/>
               </w:rPr>
-              <w:t xml:space="preserve">Chiave API → in Supabase</w:t>
+              <w:t xml:space="preserve">Chiave API → Secrets di Supabase e password SMTP in Authentication → Emails</w:t>
             </w:r>
           </w:p>
         </w:tc>
@@ -7575,8 +7611,8 @@
       </w:tblPr>
       <w:tblGrid>
         <w:gridCol w:w="2635"/>
-        <w:gridCol w:w="4990"/>
-        <w:gridCol w:w="2013"/>
+        <w:gridCol w:w="5135"/>
+        <w:gridCol w:w="1868"/>
       </w:tblGrid>
       <w:tr>
         <w:trPr>
@@ -7619,7 +7655,7 @@
         </w:tc>
         <w:tc>
           <w:tcPr>
-            <w:tcW w:type="dxa" w:w="4990"/>
+            <w:tcW w:type="dxa" w:w="5135"/>
             <w:tcBorders>
               <w:top w:val="single" w:color="D9D4C5" w:sz="4"/>
               <w:left w:val="single" w:color="D9D4C5" w:sz="4"/>
@@ -7654,7 +7690,7 @@
         </w:tc>
         <w:tc>
           <w:tcPr>
-            <w:tcW w:type="dxa" w:w="2013"/>
+            <w:tcW w:type="dxa" w:w="1868"/>
             <w:tcBorders>
               <w:top w:val="single" w:color="D9D4C5" w:sz="4"/>
               <w:left w:val="single" w:color="D9D4C5" w:sz="4"/>
@@ -7726,7 +7762,7 @@
         </w:tc>
         <w:tc>
           <w:tcPr>
-            <w:tcW w:type="dxa" w:w="4990"/>
+            <w:tcW w:type="dxa" w:w="5135"/>
             <w:tcBorders>
               <w:top w:val="single" w:color="D9D4C5" w:sz="4"/>
               <w:left w:val="single" w:color="D9D4C5" w:sz="4"/>
@@ -7758,7 +7794,7 @@
         </w:tc>
         <w:tc>
           <w:tcPr>
-            <w:tcW w:type="dxa" w:w="2013"/>
+            <w:tcW w:type="dxa" w:w="1868"/>
             <w:tcBorders>
               <w:top w:val="single" w:color="D9D4C5" w:sz="4"/>
               <w:left w:val="single" w:color="D9D4C5" w:sz="4"/>
@@ -7828,7 +7864,7 @@
         </w:tc>
         <w:tc>
           <w:tcPr>
-            <w:tcW w:type="dxa" w:w="4990"/>
+            <w:tcW w:type="dxa" w:w="5135"/>
             <w:tcBorders>
               <w:top w:val="single" w:color="D9D4C5" w:sz="4"/>
               <w:left w:val="single" w:color="D9D4C5" w:sz="4"/>
@@ -7861,7 +7897,7 @@
         </w:tc>
         <w:tc>
           <w:tcPr>
-            <w:tcW w:type="dxa" w:w="2013"/>
+            <w:tcW w:type="dxa" w:w="1868"/>
             <w:tcBorders>
               <w:top w:val="single" w:color="D9D4C5" w:sz="4"/>
               <w:left w:val="single" w:color="D9D4C5" w:sz="4"/>
@@ -7936,45 +7972,45 @@
                 <w:sz w:val="18"/>
                 <w:szCs w:val="18"/>
               </w:rPr>
-              <w:t xml:space="preserve">/password</w:t>
-            </w:r>
-          </w:p>
-        </w:tc>
-        <w:tc>
-          <w:tcPr>
-            <w:tcW w:type="dxa" w:w="4990"/>
-            <w:tcBorders>
-              <w:top w:val="single" w:color="D9D4C5" w:sz="4"/>
-              <w:left w:val="single" w:color="D9D4C5" w:sz="4"/>
-              <w:bottom w:val="single" w:color="D9D4C5" w:sz="4"/>
-              <w:right w:val="single" w:color="D9D4C5" w:sz="4"/>
-            </w:tcBorders>
-            <w:tcMar>
-              <w:top w:type="dxa" w:w="70"/>
-              <w:left w:type="dxa" w:w="110"/>
-              <w:bottom w:type="dxa" w:w="70"/>
-              <w:right w:type="dxa" w:w="110"/>
-            </w:tcMar>
-            <w:vAlign w:val="center"/>
-          </w:tcPr>
-          <w:p>
-            <w:pPr>
-              <w:spacing w:after="0" w:before="0"/>
-            </w:pPr>
-            <w:r>
-              <w:rPr>
-                <w:rFonts w:ascii="Arial" w:cs="Arial" w:eastAsia="Arial" w:hAnsi="Arial"/>
-                <w:color w:val="1B2118"/>
-                <w:sz w:val="18"/>
-                <w:szCs w:val="18"/>
-              </w:rPr>
-              <w:t xml:space="preserve">Cambio password volontario</w:t>
-            </w:r>
-          </w:p>
-        </w:tc>
-        <w:tc>
-          <w:tcPr>
-            <w:tcW w:type="dxa" w:w="2013"/>
+              <w:t xml:space="preserve">/profilo</w:t>
+            </w:r>
+          </w:p>
+        </w:tc>
+        <w:tc>
+          <w:tcPr>
+            <w:tcW w:type="dxa" w:w="5135"/>
+            <w:tcBorders>
+              <w:top w:val="single" w:color="D9D4C5" w:sz="4"/>
+              <w:left w:val="single" w:color="D9D4C5" w:sz="4"/>
+              <w:bottom w:val="single" w:color="D9D4C5" w:sz="4"/>
+              <w:right w:val="single" w:color="D9D4C5" w:sz="4"/>
+            </w:tcBorders>
+            <w:tcMar>
+              <w:top w:type="dxa" w:w="70"/>
+              <w:left w:type="dxa" w:w="110"/>
+              <w:bottom w:type="dxa" w:w="70"/>
+              <w:right w:type="dxa" w:w="110"/>
+            </w:tcMar>
+            <w:vAlign w:val="center"/>
+          </w:tcPr>
+          <w:p>
+            <w:pPr>
+              <w:spacing w:after="0" w:before="0"/>
+            </w:pPr>
+            <w:r>
+              <w:rPr>
+                <w:rFonts w:ascii="Arial" w:cs="Arial" w:eastAsia="Arial" w:hAnsi="Arial"/>
+                <w:color w:val="1B2118"/>
+                <w:sz w:val="18"/>
+                <w:szCs w:val="18"/>
+              </w:rPr>
+              <w:t xml:space="preserve">Il mio profilo: account, cambio password, manuali e documentazione per ruolo</w:t>
+            </w:r>
+          </w:p>
+        </w:tc>
+        <w:tc>
+          <w:tcPr>
+            <w:tcW w:type="dxa" w:w="1868"/>
             <w:tcBorders>
               <w:top w:val="single" w:color="D9D4C5" w:sz="4"/>
               <w:left w:val="single" w:color="D9D4C5" w:sz="4"/>
@@ -8038,13 +8074,13 @@
                 <w:sz w:val="18"/>
                 <w:szCs w:val="18"/>
               </w:rPr>
-              <w:t xml:space="preserve">/formato-dati</w:t>
-            </w:r>
-          </w:p>
-        </w:tc>
-        <w:tc>
-          <w:tcPr>
-            <w:tcW w:type="dxa" w:w="4990"/>
+              <w:t xml:space="preserve">/password</w:t>
+            </w:r>
+          </w:p>
+        </w:tc>
+        <w:tc>
+          <w:tcPr>
+            <w:tcW w:type="dxa" w:w="5135"/>
             <w:tcBorders>
               <w:top w:val="single" w:color="D9D4C5" w:sz="4"/>
               <w:left w:val="single" w:color="D9D4C5" w:sz="4"/>
@@ -8071,13 +8107,13 @@
                 <w:sz w:val="18"/>
                 <w:szCs w:val="18"/>
               </w:rPr>
-              <w:t xml:space="preserve">Formato dei dati per il calcolo crediti, download del tracciato Excel</w:t>
-            </w:r>
-          </w:p>
-        </w:tc>
-        <w:tc>
-          <w:tcPr>
-            <w:tcW w:type="dxa" w:w="2013"/>
+              <w:t xml:space="preserve">Cambio password volontario</w:t>
+            </w:r>
+          </w:p>
+        </w:tc>
+        <w:tc>
+          <w:tcPr>
+            <w:tcW w:type="dxa" w:w="1868"/>
             <w:tcBorders>
               <w:top w:val="single" w:color="D9D4C5" w:sz="4"/>
               <w:left w:val="single" w:color="D9D4C5" w:sz="4"/>
@@ -8100,22 +8136,11 @@
             <w:r>
               <w:rPr>
                 <w:rFonts w:ascii="Arial" w:cs="Arial" w:eastAsia="Arial" w:hAnsi="Arial"/>
-                <w:b/>
-                <w:bCs/>
-                <w:color w:val="1B2118"/>
-                <w:sz w:val="18"/>
-                <w:szCs w:val="18"/>
-              </w:rPr>
-              <w:t xml:space="preserve">pubblica</w:t>
-            </w:r>
-            <w:r>
-              <w:rPr>
-                <w:rFonts w:ascii="Arial" w:cs="Arial" w:eastAsia="Arial" w:hAnsi="Arial"/>
-                <w:color w:val="1B2118"/>
-                <w:sz w:val="18"/>
-                <w:szCs w:val="18"/>
-              </w:rPr>
-              <w:t xml:space="preserve">, senza login</w:t>
+                <w:color w:val="1B2118"/>
+                <w:sz w:val="18"/>
+                <w:szCs w:val="18"/>
+              </w:rPr>
+              <w:t xml:space="preserve">tutti</w:t>
             </w:r>
           </w:p>
         </w:tc>
@@ -8152,71 +8177,82 @@
                 <w:sz w:val="18"/>
                 <w:szCs w:val="18"/>
               </w:rPr>
-              <w:t xml:space="preserve">/</w:t>
-            </w:r>
-          </w:p>
-        </w:tc>
-        <w:tc>
-          <w:tcPr>
-            <w:tcW w:type="dxa" w:w="4990"/>
-            <w:tcBorders>
-              <w:top w:val="single" w:color="D9D4C5" w:sz="4"/>
-              <w:left w:val="single" w:color="D9D4C5" w:sz="4"/>
-              <w:bottom w:val="single" w:color="D9D4C5" w:sz="4"/>
-              <w:right w:val="single" w:color="D9D4C5" w:sz="4"/>
-            </w:tcBorders>
-            <w:tcMar>
-              <w:top w:type="dxa" w:w="70"/>
-              <w:left w:type="dxa" w:w="110"/>
-              <w:bottom w:type="dxa" w:w="70"/>
-              <w:right w:type="dxa" w:w="110"/>
-            </w:tcMar>
-            <w:vAlign w:val="center"/>
-          </w:tcPr>
-          <w:p>
-            <w:pPr>
-              <w:spacing w:after="0" w:before="0"/>
-            </w:pPr>
-            <w:r>
-              <w:rPr>
-                <w:rFonts w:ascii="Arial" w:cs="Arial" w:eastAsia="Arial" w:hAnsi="Arial"/>
-                <w:color w:val="1B2118"/>
-                <w:sz w:val="18"/>
-                <w:szCs w:val="18"/>
-              </w:rPr>
-              <w:t xml:space="preserve">Cruscotto (staff) oppure Le mie pratiche (cliente)</w:t>
-            </w:r>
-          </w:p>
-        </w:tc>
-        <w:tc>
-          <w:tcPr>
-            <w:tcW w:type="dxa" w:w="2013"/>
-            <w:tcBorders>
-              <w:top w:val="single" w:color="D9D4C5" w:sz="4"/>
-              <w:left w:val="single" w:color="D9D4C5" w:sz="4"/>
-              <w:bottom w:val="single" w:color="D9D4C5" w:sz="4"/>
-              <w:right w:val="single" w:color="D9D4C5" w:sz="4"/>
-            </w:tcBorders>
-            <w:tcMar>
-              <w:top w:type="dxa" w:w="70"/>
-              <w:left w:type="dxa" w:w="110"/>
-              <w:bottom w:type="dxa" w:w="70"/>
-              <w:right w:type="dxa" w:w="110"/>
-            </w:tcMar>
-            <w:vAlign w:val="center"/>
-          </w:tcPr>
-          <w:p>
-            <w:pPr>
-              <w:spacing w:after="0" w:before="0"/>
-            </w:pPr>
-            <w:r>
-              <w:rPr>
-                <w:rFonts w:ascii="Arial" w:cs="Arial" w:eastAsia="Arial" w:hAnsi="Arial"/>
-                <w:color w:val="1B2118"/>
-                <w:sz w:val="18"/>
-                <w:szCs w:val="18"/>
-              </w:rPr>
-              <w:t xml:space="preserve">tutti</w:t>
+              <w:t xml:space="preserve">/formato-dati</w:t>
+            </w:r>
+          </w:p>
+        </w:tc>
+        <w:tc>
+          <w:tcPr>
+            <w:tcW w:type="dxa" w:w="5135"/>
+            <w:tcBorders>
+              <w:top w:val="single" w:color="D9D4C5" w:sz="4"/>
+              <w:left w:val="single" w:color="D9D4C5" w:sz="4"/>
+              <w:bottom w:val="single" w:color="D9D4C5" w:sz="4"/>
+              <w:right w:val="single" w:color="D9D4C5" w:sz="4"/>
+            </w:tcBorders>
+            <w:tcMar>
+              <w:top w:type="dxa" w:w="70"/>
+              <w:left w:type="dxa" w:w="110"/>
+              <w:bottom w:type="dxa" w:w="70"/>
+              <w:right w:type="dxa" w:w="110"/>
+            </w:tcMar>
+            <w:vAlign w:val="center"/>
+          </w:tcPr>
+          <w:p>
+            <w:pPr>
+              <w:spacing w:after="0" w:before="0"/>
+            </w:pPr>
+            <w:r>
+              <w:rPr>
+                <w:rFonts w:ascii="Arial" w:cs="Arial" w:eastAsia="Arial" w:hAnsi="Arial"/>
+                <w:color w:val="1B2118"/>
+                <w:sz w:val="18"/>
+                <w:szCs w:val="18"/>
+              </w:rPr>
+              <w:t xml:space="preserve">Formato dei dati per il calcolo crediti, download del tracciato Excel</w:t>
+            </w:r>
+          </w:p>
+        </w:tc>
+        <w:tc>
+          <w:tcPr>
+            <w:tcW w:type="dxa" w:w="1868"/>
+            <w:tcBorders>
+              <w:top w:val="single" w:color="D9D4C5" w:sz="4"/>
+              <w:left w:val="single" w:color="D9D4C5" w:sz="4"/>
+              <w:bottom w:val="single" w:color="D9D4C5" w:sz="4"/>
+              <w:right w:val="single" w:color="D9D4C5" w:sz="4"/>
+            </w:tcBorders>
+            <w:tcMar>
+              <w:top w:type="dxa" w:w="70"/>
+              <w:left w:type="dxa" w:w="110"/>
+              <w:bottom w:type="dxa" w:w="70"/>
+              <w:right w:type="dxa" w:w="110"/>
+            </w:tcMar>
+            <w:vAlign w:val="center"/>
+          </w:tcPr>
+          <w:p>
+            <w:pPr>
+              <w:spacing w:after="0" w:before="0"/>
+            </w:pPr>
+            <w:r>
+              <w:rPr>
+                <w:rFonts w:ascii="Arial" w:cs="Arial" w:eastAsia="Arial" w:hAnsi="Arial"/>
+                <w:b/>
+                <w:bCs/>
+                <w:color w:val="1B2118"/>
+                <w:sz w:val="18"/>
+                <w:szCs w:val="18"/>
+              </w:rPr>
+              <w:t xml:space="preserve">pubblica</w:t>
+            </w:r>
+            <w:r>
+              <w:rPr>
+                <w:rFonts w:ascii="Arial" w:cs="Arial" w:eastAsia="Arial" w:hAnsi="Arial"/>
+                <w:color w:val="1B2118"/>
+                <w:sz w:val="18"/>
+                <w:szCs w:val="18"/>
+              </w:rPr>
+              <w:t xml:space="preserve">, senza login</w:t>
             </w:r>
           </w:p>
         </w:tc>
@@ -8254,13 +8290,13 @@
                 <w:sz w:val="18"/>
                 <w:szCs w:val="18"/>
               </w:rPr>
-              <w:t xml:space="preserve">/pratiche</w:t>
-            </w:r>
-          </w:p>
-        </w:tc>
-        <w:tc>
-          <w:tcPr>
-            <w:tcW w:type="dxa" w:w="4990"/>
+              <w:t xml:space="preserve">/</w:t>
+            </w:r>
+          </w:p>
+        </w:tc>
+        <w:tc>
+          <w:tcPr>
+            <w:tcW w:type="dxa" w:w="5135"/>
             <w:tcBorders>
               <w:top w:val="single" w:color="D9D4C5" w:sz="4"/>
               <w:left w:val="single" w:color="D9D4C5" w:sz="4"/>
@@ -8287,31 +8323,13 @@
                 <w:sz w:val="18"/>
                 <w:szCs w:val="18"/>
               </w:rPr>
-              <w:t xml:space="preserve">Back-office: elenco e dettaglio pratiche (</w:t>
-            </w:r>
-            <w:r>
-              <w:rPr>
-                <w:rFonts w:ascii="Consolas" w:cs="Consolas" w:eastAsia="Consolas" w:hAnsi="Consolas"/>
-                <w:color w:val="2F5D3A"/>
-                <w:sz w:val="18"/>
-                <w:szCs w:val="18"/>
-              </w:rPr>
-              <w:t xml:space="preserve">?id=</w:t>
-            </w:r>
-            <w:r>
-              <w:rPr>
-                <w:rFonts w:ascii="Arial" w:cs="Arial" w:eastAsia="Arial" w:hAnsi="Arial"/>
-                <w:color w:val="1B2118"/>
-                <w:sz w:val="18"/>
-                <w:szCs w:val="18"/>
-              </w:rPr>
-              <w:t xml:space="preserve"> apre una pratica)</w:t>
-            </w:r>
-          </w:p>
-        </w:tc>
-        <w:tc>
-          <w:tcPr>
-            <w:tcW w:type="dxa" w:w="2013"/>
+              <w:t xml:space="preserve">Cruscotto (staff) oppure Le mie pratiche (cliente)</w:t>
+            </w:r>
+          </w:p>
+        </w:tc>
+        <w:tc>
+          <w:tcPr>
+            <w:tcW w:type="dxa" w:w="1868"/>
             <w:tcBorders>
               <w:top w:val="single" w:color="D9D4C5" w:sz="4"/>
               <w:left w:val="single" w:color="D9D4C5" w:sz="4"/>
@@ -8338,7 +8356,7 @@
                 <w:sz w:val="18"/>
                 <w:szCs w:val="18"/>
               </w:rPr>
-              <w:t xml:space="preserve">Operatore, Admin</w:t>
+              <w:t xml:space="preserve">tutti</w:t>
             </w:r>
           </w:p>
         </w:tc>
@@ -8375,71 +8393,89 @@
                 <w:sz w:val="18"/>
                 <w:szCs w:val="18"/>
               </w:rPr>
-              <w:t xml:space="preserve">/documenti</w:t>
-            </w:r>
-          </w:p>
-        </w:tc>
-        <w:tc>
-          <w:tcPr>
-            <w:tcW w:type="dxa" w:w="4990"/>
-            <w:tcBorders>
-              <w:top w:val="single" w:color="D9D4C5" w:sz="4"/>
-              <w:left w:val="single" w:color="D9D4C5" w:sz="4"/>
-              <w:bottom w:val="single" w:color="D9D4C5" w:sz="4"/>
-              <w:right w:val="single" w:color="D9D4C5" w:sz="4"/>
-            </w:tcBorders>
-            <w:tcMar>
-              <w:top w:type="dxa" w:w="70"/>
-              <w:left w:type="dxa" w:w="110"/>
-              <w:bottom w:type="dxa" w:w="70"/>
-              <w:right w:type="dxa" w:w="110"/>
-            </w:tcMar>
-            <w:vAlign w:val="center"/>
-          </w:tcPr>
-          <w:p>
-            <w:pPr>
-              <w:spacing w:after="0" w:before="0"/>
-            </w:pPr>
-            <w:r>
-              <w:rPr>
-                <w:rFonts w:ascii="Arial" w:cs="Arial" w:eastAsia="Arial" w:hAnsi="Arial"/>
-                <w:color w:val="1B2118"/>
-                <w:sz w:val="18"/>
-                <w:szCs w:val="18"/>
-              </w:rPr>
-              <w:t xml:space="preserve">I tuoi documenti</w:t>
-            </w:r>
-          </w:p>
-        </w:tc>
-        <w:tc>
-          <w:tcPr>
-            <w:tcW w:type="dxa" w:w="2013"/>
-            <w:tcBorders>
-              <w:top w:val="single" w:color="D9D4C5" w:sz="4"/>
-              <w:left w:val="single" w:color="D9D4C5" w:sz="4"/>
-              <w:bottom w:val="single" w:color="D9D4C5" w:sz="4"/>
-              <w:right w:val="single" w:color="D9D4C5" w:sz="4"/>
-            </w:tcBorders>
-            <w:tcMar>
-              <w:top w:type="dxa" w:w="70"/>
-              <w:left w:type="dxa" w:w="110"/>
-              <w:bottom w:type="dxa" w:w="70"/>
-              <w:right w:type="dxa" w:w="110"/>
-            </w:tcMar>
-            <w:vAlign w:val="center"/>
-          </w:tcPr>
-          <w:p>
-            <w:pPr>
-              <w:spacing w:after="0" w:before="0"/>
-            </w:pPr>
-            <w:r>
-              <w:rPr>
-                <w:rFonts w:ascii="Arial" w:cs="Arial" w:eastAsia="Arial" w:hAnsi="Arial"/>
-                <w:color w:val="1B2118"/>
-                <w:sz w:val="18"/>
-                <w:szCs w:val="18"/>
-              </w:rPr>
-              <w:t xml:space="preserve">Cliente</w:t>
+              <w:t xml:space="preserve">/pratiche</w:t>
+            </w:r>
+          </w:p>
+        </w:tc>
+        <w:tc>
+          <w:tcPr>
+            <w:tcW w:type="dxa" w:w="5135"/>
+            <w:tcBorders>
+              <w:top w:val="single" w:color="D9D4C5" w:sz="4"/>
+              <w:left w:val="single" w:color="D9D4C5" w:sz="4"/>
+              <w:bottom w:val="single" w:color="D9D4C5" w:sz="4"/>
+              <w:right w:val="single" w:color="D9D4C5" w:sz="4"/>
+            </w:tcBorders>
+            <w:tcMar>
+              <w:top w:type="dxa" w:w="70"/>
+              <w:left w:type="dxa" w:w="110"/>
+              <w:bottom w:type="dxa" w:w="70"/>
+              <w:right w:type="dxa" w:w="110"/>
+            </w:tcMar>
+            <w:vAlign w:val="center"/>
+          </w:tcPr>
+          <w:p>
+            <w:pPr>
+              <w:spacing w:after="0" w:before="0"/>
+            </w:pPr>
+            <w:r>
+              <w:rPr>
+                <w:rFonts w:ascii="Arial" w:cs="Arial" w:eastAsia="Arial" w:hAnsi="Arial"/>
+                <w:color w:val="1B2118"/>
+                <w:sz w:val="18"/>
+                <w:szCs w:val="18"/>
+              </w:rPr>
+              <w:t xml:space="preserve">Back-office: elenco e dettaglio pratiche (</w:t>
+            </w:r>
+            <w:r>
+              <w:rPr>
+                <w:rFonts w:ascii="Consolas" w:cs="Consolas" w:eastAsia="Consolas" w:hAnsi="Consolas"/>
+                <w:color w:val="2F5D3A"/>
+                <w:sz w:val="18"/>
+                <w:szCs w:val="18"/>
+              </w:rPr>
+              <w:t xml:space="preserve">?id=</w:t>
+            </w:r>
+            <w:r>
+              <w:rPr>
+                <w:rFonts w:ascii="Arial" w:cs="Arial" w:eastAsia="Arial" w:hAnsi="Arial"/>
+                <w:color w:val="1B2118"/>
+                <w:sz w:val="18"/>
+                <w:szCs w:val="18"/>
+              </w:rPr>
+              <w:t xml:space="preserve"> apre una pratica)</w:t>
+            </w:r>
+          </w:p>
+        </w:tc>
+        <w:tc>
+          <w:tcPr>
+            <w:tcW w:type="dxa" w:w="1868"/>
+            <w:tcBorders>
+              <w:top w:val="single" w:color="D9D4C5" w:sz="4"/>
+              <w:left w:val="single" w:color="D9D4C5" w:sz="4"/>
+              <w:bottom w:val="single" w:color="D9D4C5" w:sz="4"/>
+              <w:right w:val="single" w:color="D9D4C5" w:sz="4"/>
+            </w:tcBorders>
+            <w:tcMar>
+              <w:top w:type="dxa" w:w="70"/>
+              <w:left w:type="dxa" w:w="110"/>
+              <w:bottom w:type="dxa" w:w="70"/>
+              <w:right w:type="dxa" w:w="110"/>
+            </w:tcMar>
+            <w:vAlign w:val="center"/>
+          </w:tcPr>
+          <w:p>
+            <w:pPr>
+              <w:spacing w:after="0" w:before="0"/>
+            </w:pPr>
+            <w:r>
+              <w:rPr>
+                <w:rFonts w:ascii="Arial" w:cs="Arial" w:eastAsia="Arial" w:hAnsi="Arial"/>
+                <w:color w:val="1B2118"/>
+                <w:sz w:val="18"/>
+                <w:szCs w:val="18"/>
+              </w:rPr>
+              <w:t xml:space="preserve">Operatore, Admin</w:t>
             </w:r>
           </w:p>
         </w:tc>
@@ -8477,13 +8513,13 @@
                 <w:sz w:val="18"/>
                 <w:szCs w:val="18"/>
               </w:rPr>
-              <w:t xml:space="preserve">/utenti</w:t>
-            </w:r>
-          </w:p>
-        </w:tc>
-        <w:tc>
-          <w:tcPr>
-            <w:tcW w:type="dxa" w:w="4990"/>
+              <w:t xml:space="preserve">/documenti</w:t>
+            </w:r>
+          </w:p>
+        </w:tc>
+        <w:tc>
+          <w:tcPr>
+            <w:tcW w:type="dxa" w:w="5135"/>
             <w:tcBorders>
               <w:top w:val="single" w:color="D9D4C5" w:sz="4"/>
               <w:left w:val="single" w:color="D9D4C5" w:sz="4"/>
@@ -8510,13 +8546,13 @@
                 <w:sz w:val="18"/>
                 <w:szCs w:val="18"/>
               </w:rPr>
-              <w:t xml:space="preserve">Gestione utenti</w:t>
-            </w:r>
-          </w:p>
-        </w:tc>
-        <w:tc>
-          <w:tcPr>
-            <w:tcW w:type="dxa" w:w="2013"/>
+              <w:t xml:space="preserve">I tuoi documenti</w:t>
+            </w:r>
+          </w:p>
+        </w:tc>
+        <w:tc>
+          <w:tcPr>
+            <w:tcW w:type="dxa" w:w="1868"/>
             <w:tcBorders>
               <w:top w:val="single" w:color="D9D4C5" w:sz="4"/>
               <w:left w:val="single" w:color="D9D4C5" w:sz="4"/>
@@ -8543,7 +8579,7 @@
                 <w:sz w:val="18"/>
                 <w:szCs w:val="18"/>
               </w:rPr>
-              <w:t xml:space="preserve">Admin</w:t>
+              <w:t xml:space="preserve">Cliente</w:t>
             </w:r>
           </w:p>
         </w:tc>
@@ -8580,45 +8616,45 @@
                 <w:sz w:val="18"/>
                 <w:szCs w:val="18"/>
               </w:rPr>
-              <w:t xml:space="preserve">/audit</w:t>
-            </w:r>
-          </w:p>
-        </w:tc>
-        <w:tc>
-          <w:tcPr>
-            <w:tcW w:type="dxa" w:w="4990"/>
-            <w:tcBorders>
-              <w:top w:val="single" w:color="D9D4C5" w:sz="4"/>
-              <w:left w:val="single" w:color="D9D4C5" w:sz="4"/>
-              <w:bottom w:val="single" w:color="D9D4C5" w:sz="4"/>
-              <w:right w:val="single" w:color="D9D4C5" w:sz="4"/>
-            </w:tcBorders>
-            <w:tcMar>
-              <w:top w:type="dxa" w:w="70"/>
-              <w:left w:type="dxa" w:w="110"/>
-              <w:bottom w:type="dxa" w:w="70"/>
-              <w:right w:type="dxa" w:w="110"/>
-            </w:tcMar>
-            <w:vAlign w:val="center"/>
-          </w:tcPr>
-          <w:p>
-            <w:pPr>
-              <w:spacing w:after="0" w:before="0"/>
-            </w:pPr>
-            <w:r>
-              <w:rPr>
-                <w:rFonts w:ascii="Arial" w:cs="Arial" w:eastAsia="Arial" w:hAnsi="Arial"/>
-                <w:color w:val="1B2118"/>
-                <w:sz w:val="18"/>
-                <w:szCs w:val="18"/>
-              </w:rPr>
-              <w:t xml:space="preserve">Audit trail</w:t>
-            </w:r>
-          </w:p>
-        </w:tc>
-        <w:tc>
-          <w:tcPr>
-            <w:tcW w:type="dxa" w:w="2013"/>
+              <w:t xml:space="preserve">/utenti</w:t>
+            </w:r>
+          </w:p>
+        </w:tc>
+        <w:tc>
+          <w:tcPr>
+            <w:tcW w:type="dxa" w:w="5135"/>
+            <w:tcBorders>
+              <w:top w:val="single" w:color="D9D4C5" w:sz="4"/>
+              <w:left w:val="single" w:color="D9D4C5" w:sz="4"/>
+              <w:bottom w:val="single" w:color="D9D4C5" w:sz="4"/>
+              <w:right w:val="single" w:color="D9D4C5" w:sz="4"/>
+            </w:tcBorders>
+            <w:tcMar>
+              <w:top w:type="dxa" w:w="70"/>
+              <w:left w:type="dxa" w:w="110"/>
+              <w:bottom w:type="dxa" w:w="70"/>
+              <w:right w:type="dxa" w:w="110"/>
+            </w:tcMar>
+            <w:vAlign w:val="center"/>
+          </w:tcPr>
+          <w:p>
+            <w:pPr>
+              <w:spacing w:after="0" w:before="0"/>
+            </w:pPr>
+            <w:r>
+              <w:rPr>
+                <w:rFonts w:ascii="Arial" w:cs="Arial" w:eastAsia="Arial" w:hAnsi="Arial"/>
+                <w:color w:val="1B2118"/>
+                <w:sz w:val="18"/>
+                <w:szCs w:val="18"/>
+              </w:rPr>
+              <w:t xml:space="preserve">Gestione utenti</w:t>
+            </w:r>
+          </w:p>
+        </w:tc>
+        <w:tc>
+          <w:tcPr>
+            <w:tcW w:type="dxa" w:w="1868"/>
             <w:tcBorders>
               <w:top w:val="single" w:color="D9D4C5" w:sz="4"/>
               <w:left w:val="single" w:color="D9D4C5" w:sz="4"/>
@@ -8682,31 +8718,13 @@
                 <w:sz w:val="18"/>
                 <w:szCs w:val="18"/>
               </w:rPr>
-              <w:t xml:space="preserve">/crediti</w:t>
-            </w:r>
-            <w:r>
-              <w:rPr>
-                <w:rFonts w:ascii="Arial" w:cs="Arial" w:eastAsia="Arial" w:hAnsi="Arial"/>
-                <w:color w:val="1B2118"/>
-                <w:sz w:val="18"/>
-                <w:szCs w:val="18"/>
-              </w:rPr>
-              <w:t xml:space="preserve">, </w:t>
-            </w:r>
-            <w:r>
-              <w:rPr>
-                <w:rFonts w:ascii="Consolas" w:cs="Consolas" w:eastAsia="Consolas" w:hAnsi="Consolas"/>
-                <w:color w:val="2F5D3A"/>
-                <w:sz w:val="18"/>
-                <w:szCs w:val="18"/>
-              </w:rPr>
-              <w:t xml:space="preserve">/crediti/:id</w:t>
-            </w:r>
-          </w:p>
-        </w:tc>
-        <w:tc>
-          <w:tcPr>
-            <w:tcW w:type="dxa" w:w="4990"/>
+              <w:t xml:space="preserve">/audit</w:t>
+            </w:r>
+          </w:p>
+        </w:tc>
+        <w:tc>
+          <w:tcPr>
+            <w:tcW w:type="dxa" w:w="5135"/>
             <w:tcBorders>
               <w:top w:val="single" w:color="D9D4C5" w:sz="4"/>
               <w:left w:val="single" w:color="D9D4C5" w:sz="4"/>
@@ -8733,13 +8751,13 @@
                 <w:sz w:val="18"/>
                 <w:szCs w:val="18"/>
               </w:rPr>
-              <w:t xml:space="preserve">Calcolo crediti CWP</w:t>
-            </w:r>
-          </w:p>
-        </w:tc>
-        <w:tc>
-          <w:tcPr>
-            <w:tcW w:type="dxa" w:w="2013"/>
+              <w:t xml:space="preserve">Audit trail</w:t>
+            </w:r>
+          </w:p>
+        </w:tc>
+        <w:tc>
+          <w:tcPr>
+            <w:tcW w:type="dxa" w:w="1868"/>
             <w:tcBorders>
               <w:top w:val="single" w:color="D9D4C5" w:sz="4"/>
               <w:left w:val="single" w:color="D9D4C5" w:sz="4"/>
@@ -8803,45 +8821,63 @@
                 <w:sz w:val="18"/>
                 <w:szCs w:val="18"/>
               </w:rPr>
-              <w:t xml:space="preserve">/impostazioni</w:t>
-            </w:r>
-          </w:p>
-        </w:tc>
-        <w:tc>
-          <w:tcPr>
-            <w:tcW w:type="dxa" w:w="4990"/>
-            <w:tcBorders>
-              <w:top w:val="single" w:color="D9D4C5" w:sz="4"/>
-              <w:left w:val="single" w:color="D9D4C5" w:sz="4"/>
-              <w:bottom w:val="single" w:color="D9D4C5" w:sz="4"/>
-              <w:right w:val="single" w:color="D9D4C5" w:sz="4"/>
-            </w:tcBorders>
-            <w:tcMar>
-              <w:top w:type="dxa" w:w="70"/>
-              <w:left w:type="dxa" w:w="110"/>
-              <w:bottom w:type="dxa" w:w="70"/>
-              <w:right w:type="dxa" w:w="110"/>
-            </w:tcMar>
-            <w:vAlign w:val="center"/>
-          </w:tcPr>
-          <w:p>
-            <w:pPr>
-              <w:spacing w:after="0" w:before="0"/>
-            </w:pPr>
-            <w:r>
-              <w:rPr>
-                <w:rFonts w:ascii="Arial" w:cs="Arial" w:eastAsia="Arial" w:hAnsi="Arial"/>
-                <w:color w:val="1B2118"/>
-                <w:sz w:val="18"/>
-                <w:szCs w:val="18"/>
-              </w:rPr>
-              <w:t xml:space="preserve">Durata delle fasi</w:t>
-            </w:r>
-          </w:p>
-        </w:tc>
-        <w:tc>
-          <w:tcPr>
-            <w:tcW w:type="dxa" w:w="2013"/>
+              <w:t xml:space="preserve">/crediti</w:t>
+            </w:r>
+            <w:r>
+              <w:rPr>
+                <w:rFonts w:ascii="Arial" w:cs="Arial" w:eastAsia="Arial" w:hAnsi="Arial"/>
+                <w:color w:val="1B2118"/>
+                <w:sz w:val="18"/>
+                <w:szCs w:val="18"/>
+              </w:rPr>
+              <w:t xml:space="preserve">, </w:t>
+            </w:r>
+            <w:r>
+              <w:rPr>
+                <w:rFonts w:ascii="Consolas" w:cs="Consolas" w:eastAsia="Consolas" w:hAnsi="Consolas"/>
+                <w:color w:val="2F5D3A"/>
+                <w:sz w:val="18"/>
+                <w:szCs w:val="18"/>
+              </w:rPr>
+              <w:t xml:space="preserve">/crediti/:id</w:t>
+            </w:r>
+          </w:p>
+        </w:tc>
+        <w:tc>
+          <w:tcPr>
+            <w:tcW w:type="dxa" w:w="5135"/>
+            <w:tcBorders>
+              <w:top w:val="single" w:color="D9D4C5" w:sz="4"/>
+              <w:left w:val="single" w:color="D9D4C5" w:sz="4"/>
+              <w:bottom w:val="single" w:color="D9D4C5" w:sz="4"/>
+              <w:right w:val="single" w:color="D9D4C5" w:sz="4"/>
+            </w:tcBorders>
+            <w:tcMar>
+              <w:top w:type="dxa" w:w="70"/>
+              <w:left w:type="dxa" w:w="110"/>
+              <w:bottom w:type="dxa" w:w="70"/>
+              <w:right w:type="dxa" w:w="110"/>
+            </w:tcMar>
+            <w:vAlign w:val="center"/>
+          </w:tcPr>
+          <w:p>
+            <w:pPr>
+              <w:spacing w:after="0" w:before="0"/>
+            </w:pPr>
+            <w:r>
+              <w:rPr>
+                <w:rFonts w:ascii="Arial" w:cs="Arial" w:eastAsia="Arial" w:hAnsi="Arial"/>
+                <w:color w:val="1B2118"/>
+                <w:sz w:val="18"/>
+                <w:szCs w:val="18"/>
+              </w:rPr>
+              <w:t xml:space="preserve">Calcolo crediti CWP</w:t>
+            </w:r>
+          </w:p>
+        </w:tc>
+        <w:tc>
+          <w:tcPr>
+            <w:tcW w:type="dxa" w:w="1868"/>
             <w:tcBorders>
               <w:top w:val="single" w:color="D9D4C5" w:sz="4"/>
               <w:left w:val="single" w:color="D9D4C5" w:sz="4"/>
@@ -8905,20 +8941,122 @@
                 <w:sz w:val="18"/>
                 <w:szCs w:val="18"/>
               </w:rPr>
+              <w:t xml:space="preserve">/impostazioni</w:t>
+            </w:r>
+          </w:p>
+        </w:tc>
+        <w:tc>
+          <w:tcPr>
+            <w:tcW w:type="dxa" w:w="5135"/>
+            <w:tcBorders>
+              <w:top w:val="single" w:color="D9D4C5" w:sz="4"/>
+              <w:left w:val="single" w:color="D9D4C5" w:sz="4"/>
+              <w:bottom w:val="single" w:color="D9D4C5" w:sz="4"/>
+              <w:right w:val="single" w:color="D9D4C5" w:sz="4"/>
+            </w:tcBorders>
+            <w:shd w:fill="F6F4EE" w:color="auto" w:val="clear"/>
+            <w:tcMar>
+              <w:top w:type="dxa" w:w="70"/>
+              <w:left w:type="dxa" w:w="110"/>
+              <w:bottom w:type="dxa" w:w="70"/>
+              <w:right w:type="dxa" w:w="110"/>
+            </w:tcMar>
+            <w:vAlign w:val="center"/>
+          </w:tcPr>
+          <w:p>
+            <w:pPr>
+              <w:spacing w:after="0" w:before="0"/>
+            </w:pPr>
+            <w:r>
+              <w:rPr>
+                <w:rFonts w:ascii="Arial" w:cs="Arial" w:eastAsia="Arial" w:hAnsi="Arial"/>
+                <w:color w:val="1B2118"/>
+                <w:sz w:val="18"/>
+                <w:szCs w:val="18"/>
+              </w:rPr>
+              <w:t xml:space="preserve">Durata delle fasi</w:t>
+            </w:r>
+          </w:p>
+        </w:tc>
+        <w:tc>
+          <w:tcPr>
+            <w:tcW w:type="dxa" w:w="1868"/>
+            <w:tcBorders>
+              <w:top w:val="single" w:color="D9D4C5" w:sz="4"/>
+              <w:left w:val="single" w:color="D9D4C5" w:sz="4"/>
+              <w:bottom w:val="single" w:color="D9D4C5" w:sz="4"/>
+              <w:right w:val="single" w:color="D9D4C5" w:sz="4"/>
+            </w:tcBorders>
+            <w:shd w:fill="F6F4EE" w:color="auto" w:val="clear"/>
+            <w:tcMar>
+              <w:top w:type="dxa" w:w="70"/>
+              <w:left w:type="dxa" w:w="110"/>
+              <w:bottom w:type="dxa" w:w="70"/>
+              <w:right w:type="dxa" w:w="110"/>
+            </w:tcMar>
+            <w:vAlign w:val="center"/>
+          </w:tcPr>
+          <w:p>
+            <w:pPr>
+              <w:spacing w:after="0" w:before="0"/>
+            </w:pPr>
+            <w:r>
+              <w:rPr>
+                <w:rFonts w:ascii="Arial" w:cs="Arial" w:eastAsia="Arial" w:hAnsi="Arial"/>
+                <w:color w:val="1B2118"/>
+                <w:sz w:val="18"/>
+                <w:szCs w:val="18"/>
+              </w:rPr>
+              <w:t xml:space="preserve">Admin</w:t>
+            </w:r>
+          </w:p>
+        </w:tc>
+      </w:tr>
+      <w:tr>
+        <w:trPr>
+          <w:cantSplit/>
+        </w:trPr>
+        <w:tc>
+          <w:tcPr>
+            <w:tcW w:type="dxa" w:w="2635"/>
+            <w:tcBorders>
+              <w:top w:val="single" w:color="D9D4C5" w:sz="4"/>
+              <w:left w:val="single" w:color="D9D4C5" w:sz="4"/>
+              <w:bottom w:val="single" w:color="D9D4C5" w:sz="4"/>
+              <w:right w:val="single" w:color="D9D4C5" w:sz="4"/>
+            </w:tcBorders>
+            <w:tcMar>
+              <w:top w:type="dxa" w:w="70"/>
+              <w:left w:type="dxa" w:w="110"/>
+              <w:bottom w:type="dxa" w:w="70"/>
+              <w:right w:type="dxa" w:w="110"/>
+            </w:tcMar>
+            <w:vAlign w:val="center"/>
+          </w:tcPr>
+          <w:p>
+            <w:pPr>
+              <w:spacing w:after="0" w:before="0"/>
+            </w:pPr>
+            <w:r>
+              <w:rPr>
+                <w:rFonts w:ascii="Consolas" w:cs="Consolas" w:eastAsia="Consolas" w:hAnsi="Consolas"/>
+                <w:color w:val="2F5D3A"/>
+                <w:sz w:val="18"/>
+                <w:szCs w:val="18"/>
+              </w:rPr>
               <w:t xml:space="preserve">/documentazione</w:t>
             </w:r>
           </w:p>
         </w:tc>
         <w:tc>
           <w:tcPr>
-            <w:tcW w:type="dxa" w:w="4990"/>
-            <w:tcBorders>
-              <w:top w:val="single" w:color="D9D4C5" w:sz="4"/>
-              <w:left w:val="single" w:color="D9D4C5" w:sz="4"/>
-              <w:bottom w:val="single" w:color="D9D4C5" w:sz="4"/>
-              <w:right w:val="single" w:color="D9D4C5" w:sz="4"/>
-            </w:tcBorders>
-            <w:shd w:fill="F6F4EE" w:color="auto" w:val="clear"/>
+            <w:tcW w:type="dxa" w:w="5135"/>
+            <w:tcBorders>
+              <w:top w:val="single" w:color="D9D4C5" w:sz="4"/>
+              <w:left w:val="single" w:color="D9D4C5" w:sz="4"/>
+              <w:bottom w:val="single" w:color="D9D4C5" w:sz="4"/>
+              <w:right w:val="single" w:color="D9D4C5" w:sz="4"/>
+            </w:tcBorders>
             <w:tcMar>
               <w:top w:type="dxa" w:w="70"/>
               <w:left w:type="dxa" w:w="110"/>
@@ -8944,14 +9082,13 @@
         </w:tc>
         <w:tc>
           <w:tcPr>
-            <w:tcW w:type="dxa" w:w="2013"/>
-            <w:tcBorders>
-              <w:top w:val="single" w:color="D9D4C5" w:sz="4"/>
-              <w:left w:val="single" w:color="D9D4C5" w:sz="4"/>
-              <w:bottom w:val="single" w:color="D9D4C5" w:sz="4"/>
-              <w:right w:val="single" w:color="D9D4C5" w:sz="4"/>
-            </w:tcBorders>
-            <w:shd w:fill="F6F4EE" w:color="auto" w:val="clear"/>
+            <w:tcW w:type="dxa" w:w="1868"/>
+            <w:tcBorders>
+              <w:top w:val="single" w:color="D9D4C5" w:sz="4"/>
+              <w:left w:val="single" w:color="D9D4C5" w:sz="4"/>
+              <w:bottom w:val="single" w:color="D9D4C5" w:sz="4"/>
+              <w:right w:val="single" w:color="D9D4C5" w:sz="4"/>
+            </w:tcBorders>
             <w:tcMar>
               <w:top w:type="dxa" w:w="70"/>
               <w:left w:type="dxa" w:w="110"/>
@@ -11831,16 +11968,16 @@
           <w:sz w:val="21"/>
           <w:szCs w:val="21"/>
         </w:rPr>
-        <w:t xml:space="preserve">Password: primo accesso, cambio, recupero, reimpostazione</w:t>
-      </w:r>
-      <w:r>
-        <w:rPr>
-          <w:rFonts w:ascii="Arial" w:cs="Arial" w:eastAsia="Arial" w:hAnsi="Arial"/>
-          <w:color w:val="1B2118"/>
-          <w:sz w:val="21"/>
-          <w:szCs w:val="21"/>
-        </w:rPr>
-        <w:t xml:space="preserve"> — script </w:t>
+        <w:t xml:space="preserve">Pagina «Il mio profilo»</w:t>
+      </w:r>
+      <w:r>
+        <w:rPr>
+          <w:rFonts w:ascii="Arial" w:cs="Arial" w:eastAsia="Arial" w:hAnsi="Arial"/>
+          <w:color w:val="1B2118"/>
+          <w:sz w:val="21"/>
+          <w:szCs w:val="21"/>
+        </w:rPr>
+        <w:t xml:space="preserve"> (</w:t>
       </w:r>
       <w:r>
         <w:rPr>
@@ -11849,16 +11986,16 @@
           <w:sz w:val="21"/>
           <w:szCs w:val="21"/>
         </w:rPr>
-        <w:t xml:space="preserve">15_password.sql</w:t>
-      </w:r>
-      <w:r>
-        <w:rPr>
-          <w:rFonts w:ascii="Arial" w:cs="Arial" w:eastAsia="Arial" w:hAnsi="Arial"/>
-          <w:color w:val="1B2118"/>
-          <w:sz w:val="21"/>
-          <w:szCs w:val="21"/>
-        </w:rPr>
-        <w:t xml:space="preserve"> (colonna </w:t>
+        <w:t xml:space="preserve">/profilo</w:t>
+      </w:r>
+      <w:r>
+        <w:rPr>
+          <w:rFonts w:ascii="Arial" w:cs="Arial" w:eastAsia="Arial" w:hAnsi="Arial"/>
+          <w:color w:val="1B2118"/>
+          <w:sz w:val="21"/>
+          <w:szCs w:val="21"/>
+        </w:rPr>
+        <w:t xml:space="preserve">, collegamento sotto l'email in alto): dati dell'account, «Cambia password» e documenti da scaricare per il ruolo (Manuale Utente per tutti; Registro sviluppo e deploy solo per gli Amministratori); componente </w:t>
       </w:r>
       <w:r>
         <w:rPr>
@@ -11867,16 +12004,16 @@
           <w:sz w:val="21"/>
           <w:szCs w:val="21"/>
         </w:rPr>
-        <w:t xml:space="preserve">password_temporanea</w:t>
-      </w:r>
-      <w:r>
-        <w:rPr>
-          <w:rFonts w:ascii="Arial" w:cs="Arial" w:eastAsia="Arial" w:hAnsi="Arial"/>
-          <w:color w:val="1B2118"/>
-          <w:sz w:val="21"/>
-          <w:szCs w:val="21"/>
-        </w:rPr>
-        <w:t xml:space="preserve"> sul profilo, funzione </w:t>
+        <w:t xml:space="preserve">ElencoDocumenti</w:t>
+      </w:r>
+      <w:r>
+        <w:rPr>
+          <w:rFonts w:ascii="Arial" w:cs="Arial" w:eastAsia="Arial" w:hAnsi="Arial"/>
+          <w:color w:val="1B2118"/>
+          <w:sz w:val="21"/>
+          <w:szCs w:val="21"/>
+        </w:rPr>
+        <w:t xml:space="preserve"> condiviso con </w:t>
       </w:r>
       <w:r>
         <w:rPr>
@@ -11885,16 +12022,46 @@
           <w:sz w:val="21"/>
           <w:szCs w:val="21"/>
         </w:rPr>
-        <w:t xml:space="preserve">password_cambiata</w:t>
-      </w:r>
-      <w:r>
-        <w:rPr>
-          <w:rFonts w:ascii="Arial" w:cs="Arial" w:eastAsia="Arial" w:hAnsi="Arial"/>
-          <w:color w:val="1B2118"/>
-          <w:sz w:val="21"/>
-          <w:szCs w:val="21"/>
-        </w:rPr>
-        <w:t xml:space="preserve">, protezione del flag); Edge Function </w:t>
+        <w:t xml:space="preserve">/documentazione</w:t>
+      </w:r>
+      <w:r>
+        <w:rPr>
+          <w:rFonts w:ascii="Arial" w:cs="Arial" w:eastAsia="Arial" w:hAnsi="Arial"/>
+          <w:color w:val="1B2118"/>
+          <w:sz w:val="21"/>
+          <w:szCs w:val="21"/>
+        </w:rPr>
+        <w:t xml:space="preserve">. Su segnalazione di Luca, che cercava i PDF nel profilo.</w:t>
+      </w:r>
+    </w:p>
+    <w:p>
+      <w:pPr>
+        <w:pStyle w:val="ListParagraph"/>
+        <w:numPr>
+          <w:ilvl w:val="0"/>
+          <w:numId w:val="3"/>
+        </w:numPr>
+        <w:spacing w:after="70" w:line="290"/>
+      </w:pPr>
+      <w:r>
+        <w:rPr>
+          <w:rFonts w:ascii="Arial" w:cs="Arial" w:eastAsia="Arial" w:hAnsi="Arial"/>
+          <w:b/>
+          <w:bCs/>
+          <w:color w:val="1B2118"/>
+          <w:sz w:val="21"/>
+          <w:szCs w:val="21"/>
+        </w:rPr>
+        <w:t xml:space="preserve">Password: primo accesso, cambio, recupero, reimpostazione</w:t>
+      </w:r>
+      <w:r>
+        <w:rPr>
+          <w:rFonts w:ascii="Arial" w:cs="Arial" w:eastAsia="Arial" w:hAnsi="Arial"/>
+          <w:color w:val="1B2118"/>
+          <w:sz w:val="21"/>
+          <w:szCs w:val="21"/>
+        </w:rPr>
+        <w:t xml:space="preserve"> — script </w:t>
       </w:r>
       <w:r>
         <w:rPr>
@@ -11903,16 +12070,16 @@
           <w:sz w:val="21"/>
           <w:szCs w:val="21"/>
         </w:rPr>
-        <w:t xml:space="preserve">reimposta-password</w:t>
-      </w:r>
-      <w:r>
-        <w:rPr>
-          <w:rFonts w:ascii="Arial" w:cs="Arial" w:eastAsia="Arial" w:hAnsi="Arial"/>
-          <w:color w:val="1B2118"/>
-          <w:sz w:val="21"/>
-          <w:szCs w:val="21"/>
-        </w:rPr>
-        <w:t xml:space="preserve"> (pubblicata dalla dashboard, Verify JWT attivo); pagina </w:t>
+        <w:t xml:space="preserve">15_password.sql</w:t>
+      </w:r>
+      <w:r>
+        <w:rPr>
+          <w:rFonts w:ascii="Arial" w:cs="Arial" w:eastAsia="Arial" w:hAnsi="Arial"/>
+          <w:color w:val="1B2118"/>
+          <w:sz w:val="21"/>
+          <w:szCs w:val="21"/>
+        </w:rPr>
+        <w:t xml:space="preserve"> (colonna </w:t>
       </w:r>
       <w:r>
         <w:rPr>
@@ -11921,16 +12088,16 @@
           <w:sz w:val="21"/>
           <w:szCs w:val="21"/>
         </w:rPr>
-        <w:t xml:space="preserve">CambiaPassword</w:t>
-      </w:r>
-      <w:r>
-        <w:rPr>
-          <w:rFonts w:ascii="Arial" w:cs="Arial" w:eastAsia="Arial" w:hAnsi="Arial"/>
-          <w:color w:val="1B2118"/>
-          <w:sz w:val="21"/>
-          <w:szCs w:val="21"/>
-        </w:rPr>
-        <w:t xml:space="preserve"> (cambio obbligatorio dopo password temporanea, cambio volontario su </w:t>
+        <w:t xml:space="preserve">password_temporanea</w:t>
+      </w:r>
+      <w:r>
+        <w:rPr>
+          <w:rFonts w:ascii="Arial" w:cs="Arial" w:eastAsia="Arial" w:hAnsi="Arial"/>
+          <w:color w:val="1B2118"/>
+          <w:sz w:val="21"/>
+          <w:szCs w:val="21"/>
+        </w:rPr>
+        <w:t xml:space="preserve"> sul profilo, funzione </w:t>
       </w:r>
       <w:r>
         <w:rPr>
@@ -11939,16 +12106,16 @@
           <w:sz w:val="21"/>
           <w:szCs w:val="21"/>
         </w:rPr>
-        <w:t xml:space="preserve">/password</w:t>
-      </w:r>
-      <w:r>
-        <w:rPr>
-          <w:rFonts w:ascii="Arial" w:cs="Arial" w:eastAsia="Arial" w:hAnsi="Arial"/>
-          <w:color w:val="1B2118"/>
-          <w:sz w:val="21"/>
-          <w:szCs w:val="21"/>
-        </w:rPr>
-        <w:t xml:space="preserve">, recupero su </w:t>
+        <w:t xml:space="preserve">password_cambiata</w:t>
+      </w:r>
+      <w:r>
+        <w:rPr>
+          <w:rFonts w:ascii="Arial" w:cs="Arial" w:eastAsia="Arial" w:hAnsi="Arial"/>
+          <w:color w:val="1B2118"/>
+          <w:sz w:val="21"/>
+          <w:szCs w:val="21"/>
+        </w:rPr>
+        <w:t xml:space="preserve">, protezione del flag); Edge Function </w:t>
       </w:r>
       <w:r>
         <w:rPr>
@@ -11957,36 +12124,16 @@
           <w:sz w:val="21"/>
           <w:szCs w:val="21"/>
         </w:rPr>
-        <w:t xml:space="preserve">/reimposta-password</w:t>
-      </w:r>
-      <w:r>
-        <w:rPr>
-          <w:rFonts w:ascii="Arial" w:cs="Arial" w:eastAsia="Arial" w:hAnsi="Arial"/>
-          <w:color w:val="1B2118"/>
-          <w:sz w:val="21"/>
-          <w:szCs w:val="21"/>
-        </w:rPr>
-        <w:t xml:space="preserve">), «Password dimenticata?» nella pagina di accesso, «Cambia password» sotto l'email in alto, «Reimposta password» in Gestione utenti; dopo l'accesso da un link email si torna alla pagina richiesta. Verificato: banco di prova locale (flag, protezione, audit) e controllo in produzione (2 utenti esistenti non obbligati). </w:t>
-      </w:r>
-      <w:r>
-        <w:rPr>
-          <w:rFonts w:ascii="Arial" w:cs="Arial" w:eastAsia="Arial" w:hAnsi="Arial"/>
-          <w:b/>
-          <w:bCs/>
-          <w:color w:val="1B2118"/>
-          <w:sz w:val="21"/>
-          <w:szCs w:val="21"/>
-        </w:rPr>
-        <w:t xml:space="preserve">Da completare in Supabase</w:t>
-      </w:r>
-      <w:r>
-        <w:rPr>
-          <w:rFonts w:ascii="Arial" w:cs="Arial" w:eastAsia="Arial" w:hAnsi="Arial"/>
-          <w:color w:val="1B2118"/>
-          <w:sz w:val="21"/>
-          <w:szCs w:val="21"/>
-        </w:rPr>
-        <w:t xml:space="preserve"> per il recupero via email: Site URL e Redirect URLs (oggi </w:t>
+        <w:t xml:space="preserve">reimposta-password</w:t>
+      </w:r>
+      <w:r>
+        <w:rPr>
+          <w:rFonts w:ascii="Arial" w:cs="Arial" w:eastAsia="Arial" w:hAnsi="Arial"/>
+          <w:color w:val="1B2118"/>
+          <w:sz w:val="21"/>
+          <w:szCs w:val="21"/>
+        </w:rPr>
+        <w:t xml:space="preserve"> (pubblicata dalla dashboard, Verify JWT attivo); pagina </w:t>
       </w:r>
       <w:r>
         <w:rPr>
@@ -11995,16 +12142,160 @@
           <w:sz w:val="21"/>
           <w:szCs w:val="21"/>
         </w:rPr>
-        <w:t xml:space="preserve">localhost:3000</w:t>
-      </w:r>
-      <w:r>
-        <w:rPr>
-          <w:rFonts w:ascii="Arial" w:cs="Arial" w:eastAsia="Arial" w:hAnsi="Arial"/>
-          <w:color w:val="1B2118"/>
-          <w:sz w:val="21"/>
-          <w:szCs w:val="21"/>
-        </w:rPr>
-        <w:t xml:space="preserve">) e SMTP personalizzato con Resend.</w:t>
+        <w:t xml:space="preserve">CambiaPassword</w:t>
+      </w:r>
+      <w:r>
+        <w:rPr>
+          <w:rFonts w:ascii="Arial" w:cs="Arial" w:eastAsia="Arial" w:hAnsi="Arial"/>
+          <w:color w:val="1B2118"/>
+          <w:sz w:val="21"/>
+          <w:szCs w:val="21"/>
+        </w:rPr>
+        <w:t xml:space="preserve"> (cambio obbligatorio dopo password temporanea, cambio volontario su </w:t>
+      </w:r>
+      <w:r>
+        <w:rPr>
+          <w:rFonts w:ascii="Consolas" w:cs="Consolas" w:eastAsia="Consolas" w:hAnsi="Consolas"/>
+          <w:color w:val="2F5D3A"/>
+          <w:sz w:val="21"/>
+          <w:szCs w:val="21"/>
+        </w:rPr>
+        <w:t xml:space="preserve">/password</w:t>
+      </w:r>
+      <w:r>
+        <w:rPr>
+          <w:rFonts w:ascii="Arial" w:cs="Arial" w:eastAsia="Arial" w:hAnsi="Arial"/>
+          <w:color w:val="1B2118"/>
+          <w:sz w:val="21"/>
+          <w:szCs w:val="21"/>
+        </w:rPr>
+        <w:t xml:space="preserve">, recupero su </w:t>
+      </w:r>
+      <w:r>
+        <w:rPr>
+          <w:rFonts w:ascii="Consolas" w:cs="Consolas" w:eastAsia="Consolas" w:hAnsi="Consolas"/>
+          <w:color w:val="2F5D3A"/>
+          <w:sz w:val="21"/>
+          <w:szCs w:val="21"/>
+        </w:rPr>
+        <w:t xml:space="preserve">/reimposta-password</w:t>
+      </w:r>
+      <w:r>
+        <w:rPr>
+          <w:rFonts w:ascii="Arial" w:cs="Arial" w:eastAsia="Arial" w:hAnsi="Arial"/>
+          <w:color w:val="1B2118"/>
+          <w:sz w:val="21"/>
+          <w:szCs w:val="21"/>
+        </w:rPr>
+        <w:t xml:space="preserve">), «Password dimenticata?» nella pagina di accesso, «Cambia password» sotto l'email in alto, «Reimposta password» in Gestione utenti; dopo l'accesso da un link email si torna alla pagina richiesta. Verificato: banco di prova locale (flag, protezione, audit) e controllo in produzione (2 utenti esistenti non obbligati). Supabase Auth → URL Configuration: Site URL </w:t>
+      </w:r>
+      <w:r>
+        <w:rPr>
+          <w:rFonts w:ascii="Consolas" w:cs="Consolas" w:eastAsia="Consolas" w:hAnsi="Consolas"/>
+          <w:color w:val="2F5D3A"/>
+          <w:sz w:val="21"/>
+          <w:szCs w:val="21"/>
+        </w:rPr>
+        <w:t xml:space="preserve">https://portale-cwp.vercel.app</w:t>
+      </w:r>
+      <w:r>
+        <w:rPr>
+          <w:rFonts w:ascii="Arial" w:cs="Arial" w:eastAsia="Arial" w:hAnsi="Arial"/>
+          <w:color w:val="1B2118"/>
+          <w:sz w:val="21"/>
+          <w:szCs w:val="21"/>
+        </w:rPr>
+        <w:t xml:space="preserve"> e Redirect URL </w:t>
+      </w:r>
+      <w:r>
+        <w:rPr>
+          <w:rFonts w:ascii="Consolas" w:cs="Consolas" w:eastAsia="Consolas" w:hAnsi="Consolas"/>
+          <w:color w:val="2F5D3A"/>
+          <w:sz w:val="21"/>
+          <w:szCs w:val="21"/>
+        </w:rPr>
+        <w:t xml:space="preserve">https://portale-cwp.vercel.app/**</w:t>
+      </w:r>
+      <w:r>
+        <w:rPr>
+          <w:rFonts w:ascii="Arial" w:cs="Arial" w:eastAsia="Arial" w:hAnsi="Arial"/>
+          <w:color w:val="1B2118"/>
+          <w:sz w:val="21"/>
+          <w:szCs w:val="21"/>
+        </w:rPr>
+        <w:t xml:space="preserve"> impostati e verificati. SMTP personalizzato attivo (Resend: </w:t>
+      </w:r>
+      <w:r>
+        <w:rPr>
+          <w:rFonts w:ascii="Consolas" w:cs="Consolas" w:eastAsia="Consolas" w:hAnsi="Consolas"/>
+          <w:color w:val="2F5D3A"/>
+          <w:sz w:val="21"/>
+          <w:szCs w:val="21"/>
+        </w:rPr>
+        <w:t xml:space="preserve">smtp.resend.com</w:t>
+      </w:r>
+      <w:r>
+        <w:rPr>
+          <w:rFonts w:ascii="Arial" w:cs="Arial" w:eastAsia="Arial" w:hAnsi="Arial"/>
+          <w:color w:val="1B2118"/>
+          <w:sz w:val="21"/>
+          <w:szCs w:val="21"/>
+        </w:rPr>
+        <w:t xml:space="preserve">, porta 465, utente </w:t>
+      </w:r>
+      <w:r>
+        <w:rPr>
+          <w:rFonts w:ascii="Consolas" w:cs="Consolas" w:eastAsia="Consolas" w:hAnsi="Consolas"/>
+          <w:color w:val="2F5D3A"/>
+          <w:sz w:val="21"/>
+          <w:szCs w:val="21"/>
+        </w:rPr>
+        <w:t xml:space="preserve">resend</w:t>
+      </w:r>
+      <w:r>
+        <w:rPr>
+          <w:rFonts w:ascii="Arial" w:cs="Arial" w:eastAsia="Arial" w:hAnsi="Arial"/>
+          <w:color w:val="1B2118"/>
+          <w:sz w:val="21"/>
+          <w:szCs w:val="21"/>
+        </w:rPr>
+        <w:t xml:space="preserve">, chiave inserita da Luca; mittente provvisorio </w:t>
+      </w:r>
+      <w:r>
+        <w:rPr>
+          <w:rFonts w:ascii="Consolas" w:cs="Consolas" w:eastAsia="Consolas" w:hAnsi="Consolas"/>
+          <w:color w:val="2F5D3A"/>
+          <w:sz w:val="21"/>
+          <w:szCs w:val="21"/>
+        </w:rPr>
+        <w:t xml:space="preserve">onboarding@resend.dev</w:t>
+      </w:r>
+      <w:r>
+        <w:rPr>
+          <w:rFonts w:ascii="Arial" w:cs="Arial" w:eastAsia="Arial" w:hAnsi="Arial"/>
+          <w:color w:val="1B2118"/>
+          <w:sz w:val="21"/>
+          <w:szCs w:val="21"/>
+        </w:rPr>
+        <w:t xml:space="preserve">, nome «Portale CWP»). Email di recupero in italiano (Authentication → Emails → Templates → Reset password; copia in </w:t>
+      </w:r>
+      <w:r>
+        <w:rPr>
+          <w:rFonts w:ascii="Consolas" w:cs="Consolas" w:eastAsia="Consolas" w:hAnsi="Consolas"/>
+          <w:color w:val="2F5D3A"/>
+          <w:sz w:val="21"/>
+          <w:szCs w:val="21"/>
+        </w:rPr>
+        <w:t xml:space="preserve">supabase/email/reset-password.html</w:t>
+      </w:r>
+      <w:r>
+        <w:rPr>
+          <w:rFonts w:ascii="Arial" w:cs="Arial" w:eastAsia="Arial" w:hAnsi="Arial"/>
+          <w:color w:val="1B2118"/>
+          <w:sz w:val="21"/>
+          <w:szCs w:val="21"/>
+        </w:rPr>
+        <w:t xml:space="preserve">; oggetto «Portale Carbon WastePrint (CWP) — Richiesta di reimpostazione della password», testo che dichiara la provenienza dal portale). Prova: richieste di recupero per luca.moretti@operate.it accettate da Supabase (risposta 200) e consegnate; le prime due sono arrivate ancora con il testo inglese predefinito: Supabase applica un modello modificato solo dopo alcuni minuti. Dopo la verifica del dominio: cambiare il mittente SMTP con l'indirizzo del dominio.</w:t>
       </w:r>
     </w:p>
     <w:p>
@@ -14066,7 +14357,7 @@
               </w:rPr>
               <w:t xml:space="preserve">Claude Doc: </w:t>
             </w:r>
-            <w:hyperlink w:history="1" r:id="rIdvrftwbp-fsadzmvamktd2">
+            <w:hyperlink w:history="1" r:id="rIdvlazqbztmly4asi8prfsw">
               <w:r>
                 <w:rPr>
                   <w:rFonts w:ascii="Arial" w:cs="Arial" w:eastAsia="Arial" w:hAnsi="Arial"/>
@@ -14413,7 +14704,7 @@
               </w:rPr>
               <w:t xml:space="preserve">Claude Doc: </w:t>
             </w:r>
-            <w:hyperlink w:history="1" r:id="rIdiovkj7p5bhids6hb5msh2">
+            <w:hyperlink w:history="1" r:id="rIdemnpq6oojb_hhuwxitbqc">
               <w:r>
                 <w:rPr>
                   <w:rFonts w:ascii="Arial" w:cs="Arial" w:eastAsia="Arial" w:hAnsi="Arial"/>
@@ -14822,7 +15113,7 @@
               </w:rPr>
               <w:t xml:space="preserve">Claude Doc: </w:t>
             </w:r>
-            <w:hyperlink w:history="1" r:id="rIdxckevbcus5kfmpxqfqovf">
+            <w:hyperlink w:history="1" r:id="rIdefpg0hl6uwcoztoexqrbr">
               <w:r>
                 <w:rPr>
                   <w:rFonts w:ascii="Arial" w:cs="Arial" w:eastAsia="Arial" w:hAnsi="Arial"/>
@@ -15365,7 +15656,7 @@
             <w:pPr>
               <w:spacing w:after="0" w:before="0"/>
             </w:pPr>
-            <w:hyperlink w:history="1" r:id="rIdql6zpfphh9jhrkqo8dvxv">
+            <w:hyperlink w:history="1" r:id="rIdade59zvhnppl_9ie2wlw5">
               <w:r>
                 <w:rPr>
                   <w:rFonts w:ascii="Arial" w:cs="Arial" w:eastAsia="Arial" w:hAnsi="Arial"/>
@@ -17901,7 +18192,7 @@
                 <w:sz w:val="18"/>
                 <w:szCs w:val="18"/>
               </w:rPr>
-              <w:t xml:space="preserve"> e nessun Redirect URL: i link delle email di Supabase (recupero password) non funzionerebbero</w:t>
+              <w:t xml:space="preserve"> e nessun Redirect URL: i link delle email di Supabase (recupero password) non funzionavano</w:t>
             </w:r>
           </w:p>
         </w:tc>
@@ -17933,7 +18224,7 @@
                 <w:sz w:val="18"/>
                 <w:szCs w:val="18"/>
               </w:rPr>
-              <w:t xml:space="preserve">Da impostare </w:t>
+              <w:t xml:space="preserve">Impostati il 18/10 (autorizzazione di Luca): Site URL </w:t>
             </w:r>
             <w:r>
               <w:rPr>
@@ -17951,7 +18242,7 @@
                 <w:sz w:val="18"/>
                 <w:szCs w:val="18"/>
               </w:rPr>
-              <w:t xml:space="preserve"> e </w:t>
+              <w:t xml:space="preserve">, Redirect URL </w:t>
             </w:r>
             <w:r>
               <w:rPr>
@@ -17961,15 +18252,6 @@
                 <w:szCs w:val="18"/>
               </w:rPr>
               <w:t xml:space="preserve">https://portale-cwp.vercel.app/**</w:t>
-            </w:r>
-            <w:r>
-              <w:rPr>
-                <w:rFonts w:ascii="Arial" w:cs="Arial" w:eastAsia="Arial" w:hAnsi="Arial"/>
-                <w:color w:val="1B2118"/>
-                <w:sz w:val="18"/>
-                <w:szCs w:val="18"/>
-              </w:rPr>
-              <w:t xml:space="preserve"> (in attesa di conferma di Luca)</w:t>
             </w:r>
           </w:p>
         </w:tc>
@@ -18040,7 +18322,7 @@
                 <w:sz w:val="18"/>
                 <w:szCs w:val="18"/>
               </w:rPr>
-              <w:t xml:space="preserve">Configurare SMTP personalizzato (Resend) in Authentication → Emails</w:t>
+              <w:t xml:space="preserve">SMTP personalizzato con Resend attivato il 18/10 (Authentication → Emails → SMTP Settings); limite 30 email di autenticazione all'ora, modificabile in Rate Limits</w:t>
             </w:r>
           </w:p>
         </w:tc>

</xml_diff>

<commit_message>
Registro Rev 1.2 e Manuale Rev 1.4: email di recupero password dal portale
Co-Authored-By: Claude Opus 5.5 <noreply@anthropic.com>
Claude-Session: https://claude.ai/code/session_01E8XCbEeVHWVP3hntUZ6kZ1
</commit_message>
<xml_diff>
--- a/public/documentazione/Registro_Dev_Deploy_Portale_CWP.docx
+++ b/public/documentazione/Registro_Dev_Deploy_Portale_CWP.docx
@@ -302,7 +302,7 @@
                 <w:sz w:val="20"/>
                 <w:szCs w:val="20"/>
               </w:rPr>
-              <w:t xml:space="preserve">Rev. 1.1</w:t>
+              <w:t xml:space="preserve">Rev. 1.2</w:t>
             </w:r>
           </w:p>
         </w:tc>
@@ -719,7 +719,7 @@
                 <w:sz w:val="18"/>
                 <w:szCs w:val="18"/>
               </w:rPr>
-              <w:t xml:space="preserve">1.1</w:t>
+              <w:t xml:space="preserve">1.2</w:t>
             </w:r>
           </w:p>
         </w:tc>
@@ -783,7 +783,7 @@
                 <w:sz w:val="18"/>
                 <w:szCs w:val="18"/>
               </w:rPr>
-              <w:t xml:space="preserve">Pagina Documentazione; backlog riordinato; decisione di passare Vercel e Supabase a piani a pagamento (punto 29); riservatezza della documentazione (punto 28).</w:t>
+              <w:t xml:space="preserve">Pagina «Il mio profilo»; password (script 15 e 16, Edge Functions reimposta-password e recupera-password); SMTP Resend; email di recupero in italiano spedita dal portale.</w:t>
             </w:r>
           </w:p>
         </w:tc>
@@ -853,6 +853,142 @@
                 <w:sz w:val="18"/>
                 <w:szCs w:val="18"/>
               </w:rPr>
+              <w:t xml:space="preserve">1.1</w:t>
+            </w:r>
+          </w:p>
+        </w:tc>
+        <w:tc>
+          <w:tcPr>
+            <w:tcW w:type="dxa" w:w="1300"/>
+            <w:tcBorders>
+              <w:top w:val="single" w:color="D9D4C5" w:sz="4"/>
+              <w:left w:val="single" w:color="D9D4C5" w:sz="4"/>
+              <w:bottom w:val="single" w:color="D9D4C5" w:sz="4"/>
+              <w:right w:val="single" w:color="D9D4C5" w:sz="4"/>
+            </w:tcBorders>
+            <w:shd w:fill="F6F4EE" w:color="auto" w:val="clear"/>
+            <w:tcMar>
+              <w:top w:type="dxa" w:w="70"/>
+              <w:left w:type="dxa" w:w="110"/>
+              <w:bottom w:type="dxa" w:w="70"/>
+              <w:right w:type="dxa" w:w="110"/>
+            </w:tcMar>
+            <w:vAlign w:val="center"/>
+          </w:tcPr>
+          <w:p>
+            <w:pPr>
+              <w:spacing w:after="0" w:before="0"/>
+            </w:pPr>
+            <w:r>
+              <w:rPr>
+                <w:rFonts w:ascii="Arial" w:cs="Arial" w:eastAsia="Arial" w:hAnsi="Arial"/>
+                <w:color w:val="1B2118"/>
+                <w:sz w:val="18"/>
+                <w:szCs w:val="18"/>
+              </w:rPr>
+              <w:t xml:space="preserve">18/10/2026</w:t>
+            </w:r>
+          </w:p>
+        </w:tc>
+        <w:tc>
+          <w:tcPr>
+            <w:tcW w:type="dxa" w:w="5538"/>
+            <w:tcBorders>
+              <w:top w:val="single" w:color="D9D4C5" w:sz="4"/>
+              <w:left w:val="single" w:color="D9D4C5" w:sz="4"/>
+              <w:bottom w:val="single" w:color="D9D4C5" w:sz="4"/>
+              <w:right w:val="single" w:color="D9D4C5" w:sz="4"/>
+            </w:tcBorders>
+            <w:shd w:fill="F6F4EE" w:color="auto" w:val="clear"/>
+            <w:tcMar>
+              <w:top w:type="dxa" w:w="70"/>
+              <w:left w:type="dxa" w:w="110"/>
+              <w:bottom w:type="dxa" w:w="70"/>
+              <w:right w:type="dxa" w:w="110"/>
+            </w:tcMar>
+            <w:vAlign w:val="center"/>
+          </w:tcPr>
+          <w:p>
+            <w:pPr>
+              <w:spacing w:after="0" w:before="0"/>
+            </w:pPr>
+            <w:r>
+              <w:rPr>
+                <w:rFonts w:ascii="Arial" w:cs="Arial" w:eastAsia="Arial" w:hAnsi="Arial"/>
+                <w:color w:val="1B2118"/>
+                <w:sz w:val="18"/>
+                <w:szCs w:val="18"/>
+              </w:rPr>
+              <w:t xml:space="preserve">Pagina Documentazione; backlog riordinato; decisione di passare Vercel e Supabase a piani a pagamento (punto 29); riservatezza della documentazione (punto 28).</w:t>
+            </w:r>
+          </w:p>
+        </w:tc>
+        <w:tc>
+          <w:tcPr>
+            <w:tcW w:type="dxa" w:w="2000"/>
+            <w:tcBorders>
+              <w:top w:val="single" w:color="D9D4C5" w:sz="4"/>
+              <w:left w:val="single" w:color="D9D4C5" w:sz="4"/>
+              <w:bottom w:val="single" w:color="D9D4C5" w:sz="4"/>
+              <w:right w:val="single" w:color="D9D4C5" w:sz="4"/>
+            </w:tcBorders>
+            <w:shd w:fill="F6F4EE" w:color="auto" w:val="clear"/>
+            <w:tcMar>
+              <w:top w:type="dxa" w:w="70"/>
+              <w:left w:type="dxa" w:w="110"/>
+              <w:bottom w:type="dxa" w:w="70"/>
+              <w:right w:type="dxa" w:w="110"/>
+            </w:tcMar>
+            <w:vAlign w:val="center"/>
+          </w:tcPr>
+          <w:p>
+            <w:pPr>
+              <w:spacing w:after="0" w:before="0"/>
+            </w:pPr>
+            <w:r>
+              <w:rPr>
+                <w:rFonts w:ascii="Arial" w:cs="Arial" w:eastAsia="Arial" w:hAnsi="Arial"/>
+                <w:color w:val="1B2118"/>
+                <w:sz w:val="18"/>
+                <w:szCs w:val="18"/>
+              </w:rPr>
+              <w:t xml:space="preserve">Fondazione Operate</w:t>
+            </w:r>
+          </w:p>
+        </w:tc>
+      </w:tr>
+      <w:tr>
+        <w:trPr>
+          <w:cantSplit/>
+        </w:trPr>
+        <w:tc>
+          <w:tcPr>
+            <w:tcW w:type="dxa" w:w="800"/>
+            <w:tcBorders>
+              <w:top w:val="single" w:color="D9D4C5" w:sz="4"/>
+              <w:left w:val="single" w:color="D9D4C5" w:sz="4"/>
+              <w:bottom w:val="single" w:color="D9D4C5" w:sz="4"/>
+              <w:right w:val="single" w:color="D9D4C5" w:sz="4"/>
+            </w:tcBorders>
+            <w:tcMar>
+              <w:top w:type="dxa" w:w="70"/>
+              <w:left w:type="dxa" w:w="110"/>
+              <w:bottom w:type="dxa" w:w="70"/>
+              <w:right w:type="dxa" w:w="110"/>
+            </w:tcMar>
+            <w:vAlign w:val="center"/>
+          </w:tcPr>
+          <w:p>
+            <w:pPr>
+              <w:spacing w:after="0" w:before="0"/>
+            </w:pPr>
+            <w:r>
+              <w:rPr>
+                <w:rFonts w:ascii="Arial" w:cs="Arial" w:eastAsia="Arial" w:hAnsi="Arial"/>
+                <w:color w:val="1B2118"/>
+                <w:sz w:val="18"/>
+                <w:szCs w:val="18"/>
+              </w:rPr>
               <w:t xml:space="preserve">1.0</w:t>
             </w:r>
           </w:p>
@@ -866,7 +1002,6 @@
               <w:bottom w:val="single" w:color="D9D4C5" w:sz="4"/>
               <w:right w:val="single" w:color="D9D4C5" w:sz="4"/>
             </w:tcBorders>
-            <w:shd w:fill="F6F4EE" w:color="auto" w:val="clear"/>
             <w:tcMar>
               <w:top w:type="dxa" w:w="70"/>
               <w:left w:type="dxa" w:w="110"/>
@@ -899,7 +1034,6 @@
               <w:bottom w:val="single" w:color="D9D4C5" w:sz="4"/>
               <w:right w:val="single" w:color="D9D4C5" w:sz="4"/>
             </w:tcBorders>
-            <w:shd w:fill="F6F4EE" w:color="auto" w:val="clear"/>
             <w:tcMar>
               <w:top w:type="dxa" w:w="70"/>
               <w:left w:type="dxa" w:w="110"/>
@@ -932,7 +1066,6 @@
               <w:bottom w:val="single" w:color="D9D4C5" w:sz="4"/>
               <w:right w:val="single" w:color="D9D4C5" w:sz="4"/>
             </w:tcBorders>
-            <w:shd w:fill="F6F4EE" w:color="auto" w:val="clear"/>
             <w:tcMar>
               <w:top w:type="dxa" w:w="70"/>
               <w:left w:type="dxa" w:w="110"/>
@@ -974,7 +1107,7 @@
           <w:sz w:val="20"/>
           <w:szCs w:val="20"/>
         </w:rPr>
-        <w:t xml:space="preserve">Fotografia del registro alla revisione 1.1 del 18/10/2026. Il registro è aggiornato a ogni nuova funzione, servizio o rilascio; la versione corrente si scarica dall'area Documentazione del portale (solo Amministratori).</w:t>
+        <w:t xml:space="preserve">Fotografia del registro alla revisione 1.2 del 18/10/2026. Il registro è aggiornato a ogni nuova funzione, servizio o rilascio; la versione corrente si scarica dall'area Documentazione del portale (solo Amministratori).</w:t>
       </w:r>
     </w:p>
     <w:p>
@@ -5912,6 +6045,146 @@
           </w:p>
         </w:tc>
       </w:tr>
+      <w:tr>
+        <w:trPr>
+          <w:cantSplit/>
+        </w:trPr>
+        <w:tc>
+          <w:tcPr>
+            <w:tcW w:type="dxa" w:w="3213"/>
+            <w:tcBorders>
+              <w:top w:val="single" w:color="D9D4C5" w:sz="4"/>
+              <w:left w:val="single" w:color="D9D4C5" w:sz="4"/>
+              <w:bottom w:val="single" w:color="D9D4C5" w:sz="4"/>
+              <w:right w:val="single" w:color="D9D4C5" w:sz="4"/>
+            </w:tcBorders>
+            <w:shd w:fill="F6F4EE" w:color="auto" w:val="clear"/>
+            <w:tcMar>
+              <w:top w:type="dxa" w:w="70"/>
+              <w:left w:type="dxa" w:w="110"/>
+              <w:bottom w:type="dxa" w:w="70"/>
+              <w:right w:type="dxa" w:w="110"/>
+            </w:tcMar>
+            <w:vAlign w:val="center"/>
+          </w:tcPr>
+          <w:p>
+            <w:pPr>
+              <w:spacing w:after="0" w:before="0"/>
+            </w:pPr>
+            <w:r>
+              <w:rPr>
+                <w:rFonts w:ascii="Consolas" w:cs="Consolas" w:eastAsia="Consolas" w:hAnsi="Consolas"/>
+                <w:color w:val="2F5D3A"/>
+                <w:sz w:val="18"/>
+                <w:szCs w:val="18"/>
+              </w:rPr>
+              <w:t xml:space="preserve">16_recupero_password.sql</w:t>
+            </w:r>
+          </w:p>
+        </w:tc>
+        <w:tc>
+          <w:tcPr>
+            <w:tcW w:type="dxa" w:w="4016"/>
+            <w:tcBorders>
+              <w:top w:val="single" w:color="D9D4C5" w:sz="4"/>
+              <w:left w:val="single" w:color="D9D4C5" w:sz="4"/>
+              <w:bottom w:val="single" w:color="D9D4C5" w:sz="4"/>
+              <w:right w:val="single" w:color="D9D4C5" w:sz="4"/>
+            </w:tcBorders>
+            <w:shd w:fill="F6F4EE" w:color="auto" w:val="clear"/>
+            <w:tcMar>
+              <w:top w:type="dxa" w:w="70"/>
+              <w:left w:type="dxa" w:w="110"/>
+              <w:bottom w:type="dxa" w:w="70"/>
+              <w:right w:type="dxa" w:w="110"/>
+            </w:tcMar>
+            <w:vAlign w:val="center"/>
+          </w:tcPr>
+          <w:p>
+            <w:pPr>
+              <w:spacing w:after="0" w:before="0"/>
+            </w:pPr>
+            <w:r>
+              <w:rPr>
+                <w:rFonts w:ascii="Arial" w:cs="Arial" w:eastAsia="Arial" w:hAnsi="Arial"/>
+                <w:color w:val="1B2118"/>
+                <w:sz w:val="18"/>
+                <w:szCs w:val="18"/>
+              </w:rPr>
+              <w:t xml:space="preserve">Tabella </w:t>
+            </w:r>
+            <w:r>
+              <w:rPr>
+                <w:rFonts w:ascii="Consolas" w:cs="Consolas" w:eastAsia="Consolas" w:hAnsi="Consolas"/>
+                <w:color w:val="2F5D3A"/>
+                <w:sz w:val="18"/>
+                <w:szCs w:val="18"/>
+              </w:rPr>
+              <w:t xml:space="preserve">recupero_password_richiesta</w:t>
+            </w:r>
+            <w:r>
+              <w:rPr>
+                <w:rFonts w:ascii="Arial" w:cs="Arial" w:eastAsia="Arial" w:hAnsi="Arial"/>
+                <w:color w:val="1B2118"/>
+                <w:sz w:val="18"/>
+                <w:szCs w:val="18"/>
+              </w:rPr>
+              <w:t xml:space="preserve"> (ultima richiesta di recupero per indirizzo, nessuna policy: la usa solo la funzione </w:t>
+            </w:r>
+            <w:r>
+              <w:rPr>
+                <w:rFonts w:ascii="Consolas" w:cs="Consolas" w:eastAsia="Consolas" w:hAnsi="Consolas"/>
+                <w:color w:val="2F5D3A"/>
+                <w:sz w:val="18"/>
+                <w:szCs w:val="18"/>
+              </w:rPr>
+              <w:t xml:space="preserve">recupera-password</w:t>
+            </w:r>
+            <w:r>
+              <w:rPr>
+                <w:rFonts w:ascii="Arial" w:cs="Arial" w:eastAsia="Arial" w:hAnsi="Arial"/>
+                <w:color w:val="1B2118"/>
+                <w:sz w:val="18"/>
+                <w:szCs w:val="18"/>
+              </w:rPr>
+              <w:t xml:space="preserve">)</w:t>
+            </w:r>
+          </w:p>
+        </w:tc>
+        <w:tc>
+          <w:tcPr>
+            <w:tcW w:type="dxa" w:w="2409"/>
+            <w:tcBorders>
+              <w:top w:val="single" w:color="D9D4C5" w:sz="4"/>
+              <w:left w:val="single" w:color="D9D4C5" w:sz="4"/>
+              <w:bottom w:val="single" w:color="D9D4C5" w:sz="4"/>
+              <w:right w:val="single" w:color="D9D4C5" w:sz="4"/>
+            </w:tcBorders>
+            <w:shd w:fill="F6F4EE" w:color="auto" w:val="clear"/>
+            <w:tcMar>
+              <w:top w:type="dxa" w:w="70"/>
+              <w:left w:type="dxa" w:w="110"/>
+              <w:bottom w:type="dxa" w:w="70"/>
+              <w:right w:type="dxa" w:w="110"/>
+            </w:tcMar>
+            <w:vAlign w:val="center"/>
+          </w:tcPr>
+          <w:p>
+            <w:pPr>
+              <w:spacing w:after="0" w:before="0"/>
+            </w:pPr>
+            <w:r>
+              <w:rPr>
+                <w:rFonts w:ascii="Arial" w:cs="Arial" w:eastAsia="Arial" w:hAnsi="Arial"/>
+                <w:color w:val="1B2118"/>
+                <w:sz w:val="18"/>
+                <w:szCs w:val="18"/>
+              </w:rPr>
+              <w:t xml:space="preserve">18/10/2026</w:t>
+            </w:r>
+          </w:p>
+        </w:tc>
+      </w:tr>
     </w:tbl>
     <w:p>
       <w:pPr>
@@ -5963,7 +6236,7 @@
           <w:sz w:val="21"/>
           <w:szCs w:val="21"/>
         </w:rPr>
-        <w:t xml:space="preserve">: organizzazione, utente_organizzazione, ente_validazione, profilo, pratica, fase, durata_fase, documento, richiesta_integrazione, consultazione, commento, pagamento, notifica, audit_event, impostazione, calcolo_crediti, calcolo_conferimento, calcolo_riuso.</w:t>
+        <w:t xml:space="preserve">: organizzazione, utente_organizzazione, ente_validazione, profilo, pratica, fase, durata_fase, documento, richiesta_integrazione, consultazione, commento, pagamento, notifica, audit_event, impostazione, calcolo_crediti, calcolo_conferimento, calcolo_riuso, recupero_password_richiesta.</w:t>
       </w:r>
     </w:p>
     <w:p>
@@ -6820,10 +7093,10 @@
         <w:tblLayout w:type="fixed"/>
       </w:tblPr>
       <w:tblGrid>
-        <w:gridCol w:w="2685"/>
-        <w:gridCol w:w="2318"/>
-        <w:gridCol w:w="2318"/>
-        <w:gridCol w:w="2317"/>
+        <w:gridCol w:w="2426"/>
+        <w:gridCol w:w="2824"/>
+        <w:gridCol w:w="2194"/>
+        <w:gridCol w:w="2194"/>
       </w:tblGrid>
       <w:tr>
         <w:trPr>
@@ -6831,7 +7104,7 @@
         </w:trPr>
         <w:tc>
           <w:tcPr>
-            <w:tcW w:type="dxa" w:w="2685"/>
+            <w:tcW w:type="dxa" w:w="2426"/>
             <w:tcBorders>
               <w:top w:val="single" w:color="D9D4C5" w:sz="4"/>
               <w:left w:val="single" w:color="D9D4C5" w:sz="4"/>
@@ -6866,7 +7139,7 @@
         </w:tc>
         <w:tc>
           <w:tcPr>
-            <w:tcW w:type="dxa" w:w="2318"/>
+            <w:tcW w:type="dxa" w:w="2824"/>
             <w:tcBorders>
               <w:top w:val="single" w:color="D9D4C5" w:sz="4"/>
               <w:left w:val="single" w:color="D9D4C5" w:sz="4"/>
@@ -6901,7 +7174,7 @@
         </w:tc>
         <w:tc>
           <w:tcPr>
-            <w:tcW w:type="dxa" w:w="2318"/>
+            <w:tcW w:type="dxa" w:w="2194"/>
             <w:tcBorders>
               <w:top w:val="single" w:color="D9D4C5" w:sz="4"/>
               <w:left w:val="single" w:color="D9D4C5" w:sz="4"/>
@@ -6936,7 +7209,7 @@
         </w:tc>
         <w:tc>
           <w:tcPr>
-            <w:tcW w:type="dxa" w:w="2317"/>
+            <w:tcW w:type="dxa" w:w="2194"/>
             <w:tcBorders>
               <w:top w:val="single" w:color="D9D4C5" w:sz="4"/>
               <w:left w:val="single" w:color="D9D4C5" w:sz="4"/>
@@ -6976,7 +7249,7 @@
         </w:trPr>
         <w:tc>
           <w:tcPr>
-            <w:tcW w:type="dxa" w:w="2685"/>
+            <w:tcW w:type="dxa" w:w="2426"/>
             <w:tcBorders>
               <w:top w:val="single" w:color="D9D4C5" w:sz="4"/>
               <w:left w:val="single" w:color="D9D4C5" w:sz="4"/>
@@ -7008,7 +7281,7 @@
         </w:tc>
         <w:tc>
           <w:tcPr>
-            <w:tcW w:type="dxa" w:w="2318"/>
+            <w:tcW w:type="dxa" w:w="2824"/>
             <w:tcBorders>
               <w:top w:val="single" w:color="D9D4C5" w:sz="4"/>
               <w:left w:val="single" w:color="D9D4C5" w:sz="4"/>
@@ -7040,7 +7313,7 @@
         </w:tc>
         <w:tc>
           <w:tcPr>
-            <w:tcW w:type="dxa" w:w="2318"/>
+            <w:tcW w:type="dxa" w:w="2194"/>
             <w:tcBorders>
               <w:top w:val="single" w:color="D9D4C5" w:sz="4"/>
               <w:left w:val="single" w:color="D9D4C5" w:sz="4"/>
@@ -7090,7 +7363,7 @@
         </w:tc>
         <w:tc>
           <w:tcPr>
-            <w:tcW w:type="dxa" w:w="2317"/>
+            <w:tcW w:type="dxa" w:w="2194"/>
             <w:tcBorders>
               <w:top w:val="single" w:color="D9D4C5" w:sz="4"/>
               <w:left w:val="single" w:color="D9D4C5" w:sz="4"/>
@@ -7127,7 +7400,7 @@
         </w:trPr>
         <w:tc>
           <w:tcPr>
-            <w:tcW w:type="dxa" w:w="2685"/>
+            <w:tcW w:type="dxa" w:w="2426"/>
             <w:tcBorders>
               <w:top w:val="single" w:color="D9D4C5" w:sz="4"/>
               <w:left w:val="single" w:color="D9D4C5" w:sz="4"/>
@@ -7160,7 +7433,7 @@
         </w:tc>
         <w:tc>
           <w:tcPr>
-            <w:tcW w:type="dxa" w:w="2318"/>
+            <w:tcW w:type="dxa" w:w="2824"/>
             <w:tcBorders>
               <w:top w:val="single" w:color="D9D4C5" w:sz="4"/>
               <w:left w:val="single" w:color="D9D4C5" w:sz="4"/>
@@ -7193,7 +7466,7 @@
         </w:tc>
         <w:tc>
           <w:tcPr>
-            <w:tcW w:type="dxa" w:w="2318"/>
+            <w:tcW w:type="dxa" w:w="2194"/>
             <w:tcBorders>
               <w:top w:val="single" w:color="D9D4C5" w:sz="4"/>
               <w:left w:val="single" w:color="D9D4C5" w:sz="4"/>
@@ -7244,7 +7517,7 @@
         </w:tc>
         <w:tc>
           <w:tcPr>
-            <w:tcW w:type="dxa" w:w="2317"/>
+            <w:tcW w:type="dxa" w:w="2194"/>
             <w:tcBorders>
               <w:top w:val="single" w:color="D9D4C5" w:sz="4"/>
               <w:left w:val="single" w:color="D9D4C5" w:sz="4"/>
@@ -7282,7 +7555,7 @@
         </w:trPr>
         <w:tc>
           <w:tcPr>
-            <w:tcW w:type="dxa" w:w="2685"/>
+            <w:tcW w:type="dxa" w:w="2426"/>
             <w:tcBorders>
               <w:top w:val="single" w:color="D9D4C5" w:sz="4"/>
               <w:left w:val="single" w:color="D9D4C5" w:sz="4"/>
@@ -7308,45 +7581,63 @@
                 <w:sz w:val="18"/>
                 <w:szCs w:val="18"/>
               </w:rPr>
-              <w:t xml:space="preserve">invia-email-notifica</w:t>
-            </w:r>
-          </w:p>
-        </w:tc>
-        <w:tc>
-          <w:tcPr>
-            <w:tcW w:type="dxa" w:w="2318"/>
-            <w:tcBorders>
-              <w:top w:val="single" w:color="D9D4C5" w:sz="4"/>
-              <w:left w:val="single" w:color="D9D4C5" w:sz="4"/>
-              <w:bottom w:val="single" w:color="D9D4C5" w:sz="4"/>
-              <w:right w:val="single" w:color="D9D4C5" w:sz="4"/>
-            </w:tcBorders>
-            <w:tcMar>
-              <w:top w:type="dxa" w:w="70"/>
-              <w:left w:type="dxa" w:w="110"/>
-              <w:bottom w:type="dxa" w:w="70"/>
-              <w:right w:type="dxa" w:w="110"/>
-            </w:tcMar>
-            <w:vAlign w:val="center"/>
-          </w:tcPr>
-          <w:p>
-            <w:pPr>
-              <w:spacing w:after="0" w:before="0"/>
-            </w:pPr>
-            <w:r>
-              <w:rPr>
-                <w:rFonts w:ascii="Arial" w:cs="Arial" w:eastAsia="Arial" w:hAnsi="Arial"/>
-                <w:color w:val="1B2118"/>
-                <w:sz w:val="18"/>
-                <w:szCs w:val="18"/>
-              </w:rPr>
-              <w:t xml:space="preserve">Spedisce per email una notifica interna (pulsante "Apri nel portale") tramite Resend</w:t>
-            </w:r>
-          </w:p>
-        </w:tc>
-        <w:tc>
-          <w:tcPr>
-            <w:tcW w:type="dxa" w:w="2318"/>
+              <w:t xml:space="preserve">recupera-password</w:t>
+            </w:r>
+          </w:p>
+        </w:tc>
+        <w:tc>
+          <w:tcPr>
+            <w:tcW w:type="dxa" w:w="2824"/>
+            <w:tcBorders>
+              <w:top w:val="single" w:color="D9D4C5" w:sz="4"/>
+              <w:left w:val="single" w:color="D9D4C5" w:sz="4"/>
+              <w:bottom w:val="single" w:color="D9D4C5" w:sz="4"/>
+              <w:right w:val="single" w:color="D9D4C5" w:sz="4"/>
+            </w:tcBorders>
+            <w:tcMar>
+              <w:top w:type="dxa" w:w="70"/>
+              <w:left w:type="dxa" w:w="110"/>
+              <w:bottom w:type="dxa" w:w="70"/>
+              <w:right w:type="dxa" w:w="110"/>
+            </w:tcMar>
+            <w:vAlign w:val="center"/>
+          </w:tcPr>
+          <w:p>
+            <w:pPr>
+              <w:spacing w:after="0" w:before="0"/>
+            </w:pPr>
+            <w:r>
+              <w:rPr>
+                <w:rFonts w:ascii="Arial" w:cs="Arial" w:eastAsia="Arial" w:hAnsi="Arial"/>
+                <w:color w:val="1B2118"/>
+                <w:sz w:val="18"/>
+                <w:szCs w:val="18"/>
+              </w:rPr>
+              <w:t xml:space="preserve">«Password dimenticata?»: genera il collegamento di recupero (</w:t>
+            </w:r>
+            <w:r>
+              <w:rPr>
+                <w:rFonts w:ascii="Consolas" w:cs="Consolas" w:eastAsia="Consolas" w:hAnsi="Consolas"/>
+                <w:color w:val="2F5D3A"/>
+                <w:sz w:val="18"/>
+                <w:szCs w:val="18"/>
+              </w:rPr>
+              <w:t xml:space="preserve">auth.admin.generateLink</w:t>
+            </w:r>
+            <w:r>
+              <w:rPr>
+                <w:rFonts w:ascii="Arial" w:cs="Arial" w:eastAsia="Arial" w:hAnsi="Arial"/>
+                <w:color w:val="1B2118"/>
+                <w:sz w:val="18"/>
+                <w:szCs w:val="18"/>
+              </w:rPr>
+              <w:t xml:space="preserve">) e spedisce con Resend l'email in italiano «Portale Carbon WastePrint (CWP) — Richiesta di reimpostazione della password», al posto del modello email di Supabase</w:t>
+            </w:r>
+          </w:p>
+        </w:tc>
+        <w:tc>
+          <w:tcPr>
+            <w:tcW w:type="dxa" w:w="2194"/>
             <w:tcBorders>
               <w:top w:val="single" w:color="D9D4C5" w:sz="4"/>
               <w:left w:val="single" w:color="D9D4C5" w:sz="4"/>
@@ -7392,19 +7683,194 @@
                 <w:sz w:val="18"/>
                 <w:szCs w:val="18"/>
               </w:rPr>
+              <w:t xml:space="preserve"> di proposito (la chiama chi non ha fatto l'accesso): risponde sempre </w:t>
+            </w:r>
+            <w:r>
+              <w:rPr>
+                <w:rFonts w:ascii="Consolas" w:cs="Consolas" w:eastAsia="Consolas" w:hAnsi="Consolas"/>
+                <w:color w:val="2F5D3A"/>
+                <w:sz w:val="18"/>
+                <w:szCs w:val="18"/>
+              </w:rPr>
+              <w:t xml:space="preserve">ok</w:t>
+            </w:r>
+            <w:r>
+              <w:rPr>
+                <w:rFonts w:ascii="Arial" w:cs="Arial" w:eastAsia="Arial" w:hAnsi="Arial"/>
+                <w:color w:val="1B2118"/>
+                <w:sz w:val="18"/>
+                <w:szCs w:val="18"/>
+              </w:rPr>
+              <w:t xml:space="preserve"> senza rivelare se l'indirizzo esiste; niente email agli utenti disattivati; massimo una richiesta ogni 2 minuti per indirizzo; il collegamento porta solo al portale</w:t>
+            </w:r>
+          </w:p>
+        </w:tc>
+        <w:tc>
+          <w:tcPr>
+            <w:tcW w:type="dxa" w:w="2194"/>
+            <w:tcBorders>
+              <w:top w:val="single" w:color="D9D4C5" w:sz="4"/>
+              <w:left w:val="single" w:color="D9D4C5" w:sz="4"/>
+              <w:bottom w:val="single" w:color="D9D4C5" w:sz="4"/>
+              <w:right w:val="single" w:color="D9D4C5" w:sz="4"/>
+            </w:tcBorders>
+            <w:tcMar>
+              <w:top w:type="dxa" w:w="70"/>
+              <w:left w:type="dxa" w:w="110"/>
+              <w:bottom w:type="dxa" w:w="70"/>
+              <w:right w:type="dxa" w:w="110"/>
+            </w:tcMar>
+            <w:vAlign w:val="center"/>
+          </w:tcPr>
+          <w:p>
+            <w:pPr>
+              <w:spacing w:after="0" w:before="0"/>
+            </w:pPr>
+            <w:r>
+              <w:rPr>
+                <w:rFonts w:ascii="Arial" w:cs="Arial" w:eastAsia="Arial" w:hAnsi="Arial"/>
+                <w:color w:val="1B2118"/>
+                <w:sz w:val="18"/>
+                <w:szCs w:val="18"/>
+              </w:rPr>
+              <w:t xml:space="preserve">Dashboard Supabase (editor web), 18/10</w:t>
+            </w:r>
+          </w:p>
+        </w:tc>
+      </w:tr>
+      <w:tr>
+        <w:trPr>
+          <w:cantSplit/>
+        </w:trPr>
+        <w:tc>
+          <w:tcPr>
+            <w:tcW w:type="dxa" w:w="2426"/>
+            <w:tcBorders>
+              <w:top w:val="single" w:color="D9D4C5" w:sz="4"/>
+              <w:left w:val="single" w:color="D9D4C5" w:sz="4"/>
+              <w:bottom w:val="single" w:color="D9D4C5" w:sz="4"/>
+              <w:right w:val="single" w:color="D9D4C5" w:sz="4"/>
+            </w:tcBorders>
+            <w:shd w:fill="F6F4EE" w:color="auto" w:val="clear"/>
+            <w:tcMar>
+              <w:top w:type="dxa" w:w="70"/>
+              <w:left w:type="dxa" w:w="110"/>
+              <w:bottom w:type="dxa" w:w="70"/>
+              <w:right w:type="dxa" w:w="110"/>
+            </w:tcMar>
+            <w:vAlign w:val="center"/>
+          </w:tcPr>
+          <w:p>
+            <w:pPr>
+              <w:spacing w:after="0" w:before="0"/>
+            </w:pPr>
+            <w:r>
+              <w:rPr>
+                <w:rFonts w:ascii="Consolas" w:cs="Consolas" w:eastAsia="Consolas" w:hAnsi="Consolas"/>
+                <w:color w:val="2F5D3A"/>
+                <w:sz w:val="18"/>
+                <w:szCs w:val="18"/>
+              </w:rPr>
+              <w:t xml:space="preserve">invia-email-notifica</w:t>
+            </w:r>
+          </w:p>
+        </w:tc>
+        <w:tc>
+          <w:tcPr>
+            <w:tcW w:type="dxa" w:w="2824"/>
+            <w:tcBorders>
+              <w:top w:val="single" w:color="D9D4C5" w:sz="4"/>
+              <w:left w:val="single" w:color="D9D4C5" w:sz="4"/>
+              <w:bottom w:val="single" w:color="D9D4C5" w:sz="4"/>
+              <w:right w:val="single" w:color="D9D4C5" w:sz="4"/>
+            </w:tcBorders>
+            <w:shd w:fill="F6F4EE" w:color="auto" w:val="clear"/>
+            <w:tcMar>
+              <w:top w:type="dxa" w:w="70"/>
+              <w:left w:type="dxa" w:w="110"/>
+              <w:bottom w:type="dxa" w:w="70"/>
+              <w:right w:type="dxa" w:w="110"/>
+            </w:tcMar>
+            <w:vAlign w:val="center"/>
+          </w:tcPr>
+          <w:p>
+            <w:pPr>
+              <w:spacing w:after="0" w:before="0"/>
+            </w:pPr>
+            <w:r>
+              <w:rPr>
+                <w:rFonts w:ascii="Arial" w:cs="Arial" w:eastAsia="Arial" w:hAnsi="Arial"/>
+                <w:color w:val="1B2118"/>
+                <w:sz w:val="18"/>
+                <w:szCs w:val="18"/>
+              </w:rPr>
+              <w:t xml:space="preserve">Spedisce per email una notifica interna (pulsante "Apri nel portale") tramite Resend</w:t>
+            </w:r>
+          </w:p>
+        </w:tc>
+        <w:tc>
+          <w:tcPr>
+            <w:tcW w:type="dxa" w:w="2194"/>
+            <w:tcBorders>
+              <w:top w:val="single" w:color="D9D4C5" w:sz="4"/>
+              <w:left w:val="single" w:color="D9D4C5" w:sz="4"/>
+              <w:bottom w:val="single" w:color="D9D4C5" w:sz="4"/>
+              <w:right w:val="single" w:color="D9D4C5" w:sz="4"/>
+            </w:tcBorders>
+            <w:shd w:fill="F6F4EE" w:color="auto" w:val="clear"/>
+            <w:tcMar>
+              <w:top w:type="dxa" w:w="70"/>
+              <w:left w:type="dxa" w:w="110"/>
+              <w:bottom w:type="dxa" w:w="70"/>
+              <w:right w:type="dxa" w:w="110"/>
+            </w:tcMar>
+            <w:vAlign w:val="center"/>
+          </w:tcPr>
+          <w:p>
+            <w:pPr>
+              <w:spacing w:after="0" w:before="0"/>
+            </w:pPr>
+            <w:r>
+              <w:rPr>
+                <w:rFonts w:ascii="Arial" w:cs="Arial" w:eastAsia="Arial" w:hAnsi="Arial"/>
+                <w:color w:val="1B2118"/>
+                <w:sz w:val="18"/>
+                <w:szCs w:val="18"/>
+              </w:rPr>
+              <w:t xml:space="preserve">Verify JWT </w:t>
+            </w:r>
+            <w:r>
+              <w:rPr>
+                <w:rFonts w:ascii="Arial" w:cs="Arial" w:eastAsia="Arial" w:hAnsi="Arial"/>
+                <w:b/>
+                <w:bCs/>
+                <w:color w:val="1B2118"/>
+                <w:sz w:val="18"/>
+                <w:szCs w:val="18"/>
+              </w:rPr>
+              <w:t xml:space="preserve">disattivato</w:t>
+            </w:r>
+            <w:r>
+              <w:rPr>
+                <w:rFonts w:ascii="Arial" w:cs="Arial" w:eastAsia="Arial" w:hAnsi="Arial"/>
+                <w:color w:val="1B2118"/>
+                <w:sz w:val="18"/>
+                <w:szCs w:val="18"/>
+              </w:rPr>
               <w:t xml:space="preserve"> di proposito: usa solo l'id ricevuto e rilegge tutto dal database; ogni notifica parte una volta sola</w:t>
             </w:r>
           </w:p>
         </w:tc>
         <w:tc>
           <w:tcPr>
-            <w:tcW w:type="dxa" w:w="2317"/>
-            <w:tcBorders>
-              <w:top w:val="single" w:color="D9D4C5" w:sz="4"/>
-              <w:left w:val="single" w:color="D9D4C5" w:sz="4"/>
-              <w:bottom w:val="single" w:color="D9D4C5" w:sz="4"/>
-              <w:right w:val="single" w:color="D9D4C5" w:sz="4"/>
-            </w:tcBorders>
+            <w:tcW w:type="dxa" w:w="2194"/>
+            <w:tcBorders>
+              <w:top w:val="single" w:color="D9D4C5" w:sz="4"/>
+              <w:left w:val="single" w:color="D9D4C5" w:sz="4"/>
+              <w:bottom w:val="single" w:color="D9D4C5" w:sz="4"/>
+              <w:right w:val="single" w:color="D9D4C5" w:sz="4"/>
+            </w:tcBorders>
+            <w:shd w:fill="F6F4EE" w:color="auto" w:val="clear"/>
             <w:tcMar>
               <w:top w:type="dxa" w:w="70"/>
               <w:left w:type="dxa" w:w="110"/>
@@ -11968,6 +12434,126 @@
           <w:sz w:val="21"/>
           <w:szCs w:val="21"/>
         </w:rPr>
+        <w:t xml:space="preserve">Email di recupero password spedita dal portale</w:t>
+      </w:r>
+      <w:r>
+        <w:rPr>
+          <w:rFonts w:ascii="Arial" w:cs="Arial" w:eastAsia="Arial" w:hAnsi="Arial"/>
+          <w:color w:val="1B2118"/>
+          <w:sz w:val="21"/>
+          <w:szCs w:val="21"/>
+        </w:rPr>
+        <w:t xml:space="preserve"> — le email di recupero arrivavano con il testo inglese predefinito di Supabase anche dopo aver salvato il modello italiano (tre prove, anche dopo il riavvio del servizio Auth). Soluzione: nuova Edge Function </w:t>
+      </w:r>
+      <w:r>
+        <w:rPr>
+          <w:rFonts w:ascii="Consolas" w:cs="Consolas" w:eastAsia="Consolas" w:hAnsi="Consolas"/>
+          <w:color w:val="2F5D3A"/>
+          <w:sz w:val="21"/>
+          <w:szCs w:val="21"/>
+        </w:rPr>
+        <w:t xml:space="preserve">recupera-password</w:t>
+      </w:r>
+      <w:r>
+        <w:rPr>
+          <w:rFonts w:ascii="Arial" w:cs="Arial" w:eastAsia="Arial" w:hAnsi="Arial"/>
+          <w:color w:val="1B2118"/>
+          <w:sz w:val="21"/>
+          <w:szCs w:val="21"/>
+        </w:rPr>
+        <w:t xml:space="preserve"> (Verify JWT disattivato) che genera il collegamento di recupero e spedisce con Resend l'email in italiano con la grafica delle notifiche (oggetto «Portale Carbon WastePrint (CWP) — Richiesta di reimpostazione della password», pulsante «Scegli una nuova password →»); script </w:t>
+      </w:r>
+      <w:r>
+        <w:rPr>
+          <w:rFonts w:ascii="Consolas" w:cs="Consolas" w:eastAsia="Consolas" w:hAnsi="Consolas"/>
+          <w:color w:val="2F5D3A"/>
+          <w:sz w:val="21"/>
+          <w:szCs w:val="21"/>
+        </w:rPr>
+        <w:t xml:space="preserve">16_recupero_password.sql</w:t>
+      </w:r>
+      <w:r>
+        <w:rPr>
+          <w:rFonts w:ascii="Arial" w:cs="Arial" w:eastAsia="Arial" w:hAnsi="Arial"/>
+          <w:color w:val="1B2118"/>
+          <w:sz w:val="21"/>
+          <w:szCs w:val="21"/>
+        </w:rPr>
+        <w:t xml:space="preserve"> (limite di una richiesta ogni 2 minuti per indirizzo); </w:t>
+      </w:r>
+      <w:r>
+        <w:rPr>
+          <w:rFonts w:ascii="Consolas" w:cs="Consolas" w:eastAsia="Consolas" w:hAnsi="Consolas"/>
+          <w:color w:val="2F5D3A"/>
+          <w:sz w:val="21"/>
+          <w:szCs w:val="21"/>
+        </w:rPr>
+        <w:t xml:space="preserve">AuthContext.richiediRecuperoPassword</w:t>
+      </w:r>
+      <w:r>
+        <w:rPr>
+          <w:rFonts w:ascii="Arial" w:cs="Arial" w:eastAsia="Arial" w:hAnsi="Arial"/>
+          <w:color w:val="1B2118"/>
+          <w:sz w:val="21"/>
+          <w:szCs w:val="21"/>
+        </w:rPr>
+        <w:t xml:space="preserve"> chiama la funzione invece di </w:t>
+      </w:r>
+      <w:r>
+        <w:rPr>
+          <w:rFonts w:ascii="Consolas" w:cs="Consolas" w:eastAsia="Consolas" w:hAnsi="Consolas"/>
+          <w:color w:val="2F5D3A"/>
+          <w:sz w:val="21"/>
+          <w:szCs w:val="21"/>
+        </w:rPr>
+        <w:t xml:space="preserve">resetPasswordForEmail</w:t>
+      </w:r>
+      <w:r>
+        <w:rPr>
+          <w:rFonts w:ascii="Arial" w:cs="Arial" w:eastAsia="Arial" w:hAnsi="Arial"/>
+          <w:color w:val="1B2118"/>
+          <w:sz w:val="21"/>
+          <w:szCs w:val="21"/>
+        </w:rPr>
+        <w:t xml:space="preserve"> (commit 21306fb). Il modello italiano resta salvato in Supabase ma non è più usato dal portale. Prova in produzione: richiesta per luca.moretti@operate.it accettata, collegamento generato (</w:t>
+      </w:r>
+      <w:r>
+        <w:rPr>
+          <w:rFonts w:ascii="Consolas" w:cs="Consolas" w:eastAsia="Consolas" w:hAnsi="Consolas"/>
+          <w:color w:val="2F5D3A"/>
+          <w:sz w:val="21"/>
+          <w:szCs w:val="21"/>
+        </w:rPr>
+        <w:t xml:space="preserve">recovery_sent_at</w:t>
+      </w:r>
+      <w:r>
+        <w:rPr>
+          <w:rFonts w:ascii="Arial" w:cs="Arial" w:eastAsia="Arial" w:hAnsi="Arial"/>
+          <w:color w:val="1B2118"/>
+          <w:sz w:val="21"/>
+          <w:szCs w:val="21"/>
+        </w:rPr>
+        <w:t xml:space="preserve"> aggiornato), email inviata con Resend.</w:t>
+      </w:r>
+    </w:p>
+    <w:p>
+      <w:pPr>
+        <w:pStyle w:val="ListParagraph"/>
+        <w:numPr>
+          <w:ilvl w:val="0"/>
+          <w:numId w:val="3"/>
+        </w:numPr>
+        <w:spacing w:after="70" w:line="290"/>
+      </w:pPr>
+      <w:r>
+        <w:rPr>
+          <w:rFonts w:ascii="Arial" w:cs="Arial" w:eastAsia="Arial" w:hAnsi="Arial"/>
+          <w:b/>
+          <w:bCs/>
+          <w:color w:val="1B2118"/>
+          <w:sz w:val="21"/>
+          <w:szCs w:val="21"/>
+        </w:rPr>
         <w:t xml:space="preserve">Pagina «Il mio profilo»</w:t>
       </w:r>
       <w:r>
@@ -14357,7 +14943,7 @@
               </w:rPr>
               <w:t xml:space="preserve">Claude Doc: </w:t>
             </w:r>
-            <w:hyperlink w:history="1" r:id="rIdvlazqbztmly4asi8prfsw">
+            <w:hyperlink w:history="1" r:id="rIdpmwlgn8n-lcmxzxhzjx9y">
               <w:r>
                 <w:rPr>
                   <w:rFonts w:ascii="Arial" w:cs="Arial" w:eastAsia="Arial" w:hAnsi="Arial"/>
@@ -14704,7 +15290,7 @@
               </w:rPr>
               <w:t xml:space="preserve">Claude Doc: </w:t>
             </w:r>
-            <w:hyperlink w:history="1" r:id="rIdemnpq6oojb_hhuwxitbqc">
+            <w:hyperlink w:history="1" r:id="rId181zxzmywawbqyx-z0r2i">
               <w:r>
                 <w:rPr>
                   <w:rFonts w:ascii="Arial" w:cs="Arial" w:eastAsia="Arial" w:hAnsi="Arial"/>
@@ -15113,7 +15699,7 @@
               </w:rPr>
               <w:t xml:space="preserve">Claude Doc: </w:t>
             </w:r>
-            <w:hyperlink w:history="1" r:id="rIdefpg0hl6uwcoztoexqrbr">
+            <w:hyperlink w:history="1" r:id="rIdqixg_0kp8rm8atg9anwbf">
               <w:r>
                 <w:rPr>
                   <w:rFonts w:ascii="Arial" w:cs="Arial" w:eastAsia="Arial" w:hAnsi="Arial"/>
@@ -15656,7 +16242,7 @@
             <w:pPr>
               <w:spacing w:after="0" w:before="0"/>
             </w:pPr>
-            <w:hyperlink w:history="1" r:id="rIdade59zvhnppl_9ie2wlw5">
+            <w:hyperlink w:history="1" r:id="rIdmztu44byyqmcbh7h0nwv5">
               <w:r>
                 <w:rPr>
                   <w:rFonts w:ascii="Arial" w:cs="Arial" w:eastAsia="Arial" w:hAnsi="Arial"/>
@@ -18568,7 +19154,7 @@
         <w:szCs w:val="16"/>
       </w:rPr>
       <w:tab/>
-      <w:t xml:space="preserve">Registro sviluppo e deploy · Rev. 1.1 · 18/10/2026</w:t>
+      <w:t xml:space="preserve">Registro sviluppo e deploy · Rev. 1.2 · 18/10/2026</w:t>
     </w:r>
   </w:p>
 </w:hdr>
@@ -18633,7 +19219,7 @@
         <w:szCs w:val="16"/>
       </w:rPr>
       <w:tab/>
-      <w:t xml:space="preserve">Registro sviluppo e deploy · Rev. 1.1 · 18/10/2026</w:t>
+      <w:t xml:space="preserve">Registro sviluppo e deploy · Rev. 1.2 · 18/10/2026</w:t>
     </w:r>
   </w:p>
 </w:hdr>

</xml_diff>

<commit_message>
recupera-password: maiuscola a inizio frase; registro: prova confermata
Co-Authored-By: Claude Opus 5.5 <noreply@anthropic.com>
Claude-Session: https://claude.ai/code/session_01E8XCbEeVHWVP3hntUZ6kZ1
</commit_message>
<xml_diff>
--- a/public/documentazione/Registro_Dev_Deploy_Portale_CWP.docx
+++ b/public/documentazione/Registro_Dev_Deploy_Portale_CWP.docx
@@ -12533,7 +12533,7 @@
           <w:sz w:val="21"/>
           <w:szCs w:val="21"/>
         </w:rPr>
-        <w:t xml:space="preserve"> aggiornato), email inviata con Resend.</w:t>
+        <w:t xml:space="preserve"> aggiornato), email arrivata alle 14:04 in italiano con oggetto, testo e pulsante corretti (confermato da Luca).</w:t>
       </w:r>
     </w:p>
     <w:p>
@@ -14943,7 +14943,7 @@
               </w:rPr>
               <w:t xml:space="preserve">Claude Doc: </w:t>
             </w:r>
-            <w:hyperlink w:history="1" r:id="rIdpmwlgn8n-lcmxzxhzjx9y">
+            <w:hyperlink w:history="1" r:id="rIdsmbng0t3y53etclc7ut9w">
               <w:r>
                 <w:rPr>
                   <w:rFonts w:ascii="Arial" w:cs="Arial" w:eastAsia="Arial" w:hAnsi="Arial"/>
@@ -15290,7 +15290,7 @@
               </w:rPr>
               <w:t xml:space="preserve">Claude Doc: </w:t>
             </w:r>
-            <w:hyperlink w:history="1" r:id="rId181zxzmywawbqyx-z0r2i">
+            <w:hyperlink w:history="1" r:id="rIdqaxuv-xbbynkyf5uqyey1">
               <w:r>
                 <w:rPr>
                   <w:rFonts w:ascii="Arial" w:cs="Arial" w:eastAsia="Arial" w:hAnsi="Arial"/>
@@ -15699,7 +15699,7 @@
               </w:rPr>
               <w:t xml:space="preserve">Claude Doc: </w:t>
             </w:r>
-            <w:hyperlink w:history="1" r:id="rIdqixg_0kp8rm8atg9anwbf">
+            <w:hyperlink w:history="1" r:id="rIdfcfhi-c5xy4-acvyiesqu">
               <w:r>
                 <w:rPr>
                   <w:rFonts w:ascii="Arial" w:cs="Arial" w:eastAsia="Arial" w:hAnsi="Arial"/>
@@ -16242,7 +16242,7 @@
             <w:pPr>
               <w:spacing w:after="0" w:before="0"/>
             </w:pPr>
-            <w:hyperlink w:history="1" r:id="rIdmztu44byyqmcbh7h0nwv5">
+            <w:hyperlink w:history="1" r:id="rIdyrx6lgjpmtt6nbxsi4ept">
               <w:r>
                 <w:rPr>
                   <w:rFonts w:ascii="Arial" w:cs="Arial" w:eastAsia="Arial" w:hAnsi="Arial"/>

</xml_diff>

<commit_message>
Manuale Amministratore in Word/PDF (solo Admin); Manuale Utente solo PDF per gli utenti
Co-Authored-By: Claude Opus 5.5 <noreply@anthropic.com>
Claude-Session: https://claude.ai/code/session_01E8XCbEeVHWVP3hntUZ6kZ1
</commit_message>
<xml_diff>
--- a/public/documentazione/Registro_Dev_Deploy_Portale_CWP.docx
+++ b/public/documentazione/Registro_Dev_Deploy_Portale_CWP.docx
@@ -302,7 +302,7 @@
                 <w:sz w:val="20"/>
                 <w:szCs w:val="20"/>
               </w:rPr>
-              <w:t xml:space="preserve">Rev. 1.2</w:t>
+              <w:t xml:space="preserve">Rev. 1.3</w:t>
             </w:r>
           </w:p>
         </w:tc>
@@ -719,7 +719,7 @@
                 <w:sz w:val="18"/>
                 <w:szCs w:val="18"/>
               </w:rPr>
-              <w:t xml:space="preserve">1.2</w:t>
+              <w:t xml:space="preserve">1.3</w:t>
             </w:r>
           </w:p>
         </w:tc>
@@ -783,7 +783,7 @@
                 <w:sz w:val="18"/>
                 <w:szCs w:val="18"/>
               </w:rPr>
-              <w:t xml:space="preserve">Pagina «Il mio profilo»; password (script 15 e 16, Edge Functions reimposta-password e recupera-password); SMTP Resend; email di recupero in italiano spedita dal portale.</w:t>
+              <w:t xml:space="preserve">Manuale Amministratore in Word/PDF; Manuale Utente solo in PDF per gli utenti e anche in «I tuoi documenti».</w:t>
             </w:r>
           </w:p>
         </w:tc>
@@ -853,7 +853,7 @@
                 <w:sz w:val="18"/>
                 <w:szCs w:val="18"/>
               </w:rPr>
-              <w:t xml:space="preserve">1.1</w:t>
+              <w:t xml:space="preserve">1.2</w:t>
             </w:r>
           </w:p>
         </w:tc>
@@ -919,7 +919,7 @@
                 <w:sz w:val="18"/>
                 <w:szCs w:val="18"/>
               </w:rPr>
-              <w:t xml:space="preserve">Pagina Documentazione; backlog riordinato; decisione di passare Vercel e Supabase a piani a pagamento (punto 29); riservatezza della documentazione (punto 28).</w:t>
+              <w:t xml:space="preserve">Pagina «Il mio profilo»; password (script 15 e 16, Edge Functions reimposta-password e recupera-password); SMTP Resend; email di recupero in italiano spedita dal portale.</w:t>
             </w:r>
           </w:p>
         </w:tc>
@@ -989,6 +989,140 @@
                 <w:sz w:val="18"/>
                 <w:szCs w:val="18"/>
               </w:rPr>
+              <w:t xml:space="preserve">1.1</w:t>
+            </w:r>
+          </w:p>
+        </w:tc>
+        <w:tc>
+          <w:tcPr>
+            <w:tcW w:type="dxa" w:w="1300"/>
+            <w:tcBorders>
+              <w:top w:val="single" w:color="D9D4C5" w:sz="4"/>
+              <w:left w:val="single" w:color="D9D4C5" w:sz="4"/>
+              <w:bottom w:val="single" w:color="D9D4C5" w:sz="4"/>
+              <w:right w:val="single" w:color="D9D4C5" w:sz="4"/>
+            </w:tcBorders>
+            <w:tcMar>
+              <w:top w:type="dxa" w:w="70"/>
+              <w:left w:type="dxa" w:w="110"/>
+              <w:bottom w:type="dxa" w:w="70"/>
+              <w:right w:type="dxa" w:w="110"/>
+            </w:tcMar>
+            <w:vAlign w:val="center"/>
+          </w:tcPr>
+          <w:p>
+            <w:pPr>
+              <w:spacing w:after="0" w:before="0"/>
+            </w:pPr>
+            <w:r>
+              <w:rPr>
+                <w:rFonts w:ascii="Arial" w:cs="Arial" w:eastAsia="Arial" w:hAnsi="Arial"/>
+                <w:color w:val="1B2118"/>
+                <w:sz w:val="18"/>
+                <w:szCs w:val="18"/>
+              </w:rPr>
+              <w:t xml:space="preserve">18/10/2026</w:t>
+            </w:r>
+          </w:p>
+        </w:tc>
+        <w:tc>
+          <w:tcPr>
+            <w:tcW w:type="dxa" w:w="5538"/>
+            <w:tcBorders>
+              <w:top w:val="single" w:color="D9D4C5" w:sz="4"/>
+              <w:left w:val="single" w:color="D9D4C5" w:sz="4"/>
+              <w:bottom w:val="single" w:color="D9D4C5" w:sz="4"/>
+              <w:right w:val="single" w:color="D9D4C5" w:sz="4"/>
+            </w:tcBorders>
+            <w:tcMar>
+              <w:top w:type="dxa" w:w="70"/>
+              <w:left w:type="dxa" w:w="110"/>
+              <w:bottom w:type="dxa" w:w="70"/>
+              <w:right w:type="dxa" w:w="110"/>
+            </w:tcMar>
+            <w:vAlign w:val="center"/>
+          </w:tcPr>
+          <w:p>
+            <w:pPr>
+              <w:spacing w:after="0" w:before="0"/>
+            </w:pPr>
+            <w:r>
+              <w:rPr>
+                <w:rFonts w:ascii="Arial" w:cs="Arial" w:eastAsia="Arial" w:hAnsi="Arial"/>
+                <w:color w:val="1B2118"/>
+                <w:sz w:val="18"/>
+                <w:szCs w:val="18"/>
+              </w:rPr>
+              <w:t xml:space="preserve">Pagina Documentazione; backlog riordinato; decisione di passare Vercel e Supabase a piani a pagamento (punto 29); riservatezza della documentazione (punto 28).</w:t>
+            </w:r>
+          </w:p>
+        </w:tc>
+        <w:tc>
+          <w:tcPr>
+            <w:tcW w:type="dxa" w:w="2000"/>
+            <w:tcBorders>
+              <w:top w:val="single" w:color="D9D4C5" w:sz="4"/>
+              <w:left w:val="single" w:color="D9D4C5" w:sz="4"/>
+              <w:bottom w:val="single" w:color="D9D4C5" w:sz="4"/>
+              <w:right w:val="single" w:color="D9D4C5" w:sz="4"/>
+            </w:tcBorders>
+            <w:tcMar>
+              <w:top w:type="dxa" w:w="70"/>
+              <w:left w:type="dxa" w:w="110"/>
+              <w:bottom w:type="dxa" w:w="70"/>
+              <w:right w:type="dxa" w:w="110"/>
+            </w:tcMar>
+            <w:vAlign w:val="center"/>
+          </w:tcPr>
+          <w:p>
+            <w:pPr>
+              <w:spacing w:after="0" w:before="0"/>
+            </w:pPr>
+            <w:r>
+              <w:rPr>
+                <w:rFonts w:ascii="Arial" w:cs="Arial" w:eastAsia="Arial" w:hAnsi="Arial"/>
+                <w:color w:val="1B2118"/>
+                <w:sz w:val="18"/>
+                <w:szCs w:val="18"/>
+              </w:rPr>
+              <w:t xml:space="preserve">Fondazione Operate</w:t>
+            </w:r>
+          </w:p>
+        </w:tc>
+      </w:tr>
+      <w:tr>
+        <w:trPr>
+          <w:cantSplit/>
+        </w:trPr>
+        <w:tc>
+          <w:tcPr>
+            <w:tcW w:type="dxa" w:w="800"/>
+            <w:tcBorders>
+              <w:top w:val="single" w:color="D9D4C5" w:sz="4"/>
+              <w:left w:val="single" w:color="D9D4C5" w:sz="4"/>
+              <w:bottom w:val="single" w:color="D9D4C5" w:sz="4"/>
+              <w:right w:val="single" w:color="D9D4C5" w:sz="4"/>
+            </w:tcBorders>
+            <w:shd w:fill="F6F4EE" w:color="auto" w:val="clear"/>
+            <w:tcMar>
+              <w:top w:type="dxa" w:w="70"/>
+              <w:left w:type="dxa" w:w="110"/>
+              <w:bottom w:type="dxa" w:w="70"/>
+              <w:right w:type="dxa" w:w="110"/>
+            </w:tcMar>
+            <w:vAlign w:val="center"/>
+          </w:tcPr>
+          <w:p>
+            <w:pPr>
+              <w:spacing w:after="0" w:before="0"/>
+            </w:pPr>
+            <w:r>
+              <w:rPr>
+                <w:rFonts w:ascii="Arial" w:cs="Arial" w:eastAsia="Arial" w:hAnsi="Arial"/>
+                <w:color w:val="1B2118"/>
+                <w:sz w:val="18"/>
+                <w:szCs w:val="18"/>
+              </w:rPr>
               <w:t xml:space="preserve">1.0</w:t>
             </w:r>
           </w:p>
@@ -1002,6 +1136,7 @@
               <w:bottom w:val="single" w:color="D9D4C5" w:sz="4"/>
               <w:right w:val="single" w:color="D9D4C5" w:sz="4"/>
             </w:tcBorders>
+            <w:shd w:fill="F6F4EE" w:color="auto" w:val="clear"/>
             <w:tcMar>
               <w:top w:type="dxa" w:w="70"/>
               <w:left w:type="dxa" w:w="110"/>
@@ -1034,6 +1169,7 @@
               <w:bottom w:val="single" w:color="D9D4C5" w:sz="4"/>
               <w:right w:val="single" w:color="D9D4C5" w:sz="4"/>
             </w:tcBorders>
+            <w:shd w:fill="F6F4EE" w:color="auto" w:val="clear"/>
             <w:tcMar>
               <w:top w:type="dxa" w:w="70"/>
               <w:left w:type="dxa" w:w="110"/>
@@ -1066,6 +1202,7 @@
               <w:bottom w:val="single" w:color="D9D4C5" w:sz="4"/>
               <w:right w:val="single" w:color="D9D4C5" w:sz="4"/>
             </w:tcBorders>
+            <w:shd w:fill="F6F4EE" w:color="auto" w:val="clear"/>
             <w:tcMar>
               <w:top w:type="dxa" w:w="70"/>
               <w:left w:type="dxa" w:w="110"/>
@@ -1107,7 +1244,7 @@
           <w:sz w:val="20"/>
           <w:szCs w:val="20"/>
         </w:rPr>
-        <w:t xml:space="preserve">Fotografia del registro alla revisione 1.2 del 18/10/2026. Il registro è aggiornato a ogni nuova funzione, servizio o rilascio; la versione corrente si scarica dall'area Documentazione del portale (solo Amministratori).</w:t>
+        <w:t xml:space="preserve">Fotografia del registro alla revisione 1.3 del 18/10/2026. Il registro è aggiornato a ogni nuova funzione, servizio o rilascio; la versione corrente si scarica dall'area Documentazione del portale (solo Amministratori).</w:t>
       </w:r>
     </w:p>
     <w:p>
@@ -8077,8 +8214,8 @@
       </w:tblPr>
       <w:tblGrid>
         <w:gridCol w:w="2635"/>
-        <w:gridCol w:w="5135"/>
-        <w:gridCol w:w="1868"/>
+        <w:gridCol w:w="5190"/>
+        <w:gridCol w:w="1813"/>
       </w:tblGrid>
       <w:tr>
         <w:trPr>
@@ -8121,7 +8258,7 @@
         </w:tc>
         <w:tc>
           <w:tcPr>
-            <w:tcW w:type="dxa" w:w="5135"/>
+            <w:tcW w:type="dxa" w:w="5190"/>
             <w:tcBorders>
               <w:top w:val="single" w:color="D9D4C5" w:sz="4"/>
               <w:left w:val="single" w:color="D9D4C5" w:sz="4"/>
@@ -8156,7 +8293,7 @@
         </w:tc>
         <w:tc>
           <w:tcPr>
-            <w:tcW w:type="dxa" w:w="1868"/>
+            <w:tcW w:type="dxa" w:w="1813"/>
             <w:tcBorders>
               <w:top w:val="single" w:color="D9D4C5" w:sz="4"/>
               <w:left w:val="single" w:color="D9D4C5" w:sz="4"/>
@@ -8228,7 +8365,7 @@
         </w:tc>
         <w:tc>
           <w:tcPr>
-            <w:tcW w:type="dxa" w:w="5135"/>
+            <w:tcW w:type="dxa" w:w="5190"/>
             <w:tcBorders>
               <w:top w:val="single" w:color="D9D4C5" w:sz="4"/>
               <w:left w:val="single" w:color="D9D4C5" w:sz="4"/>
@@ -8260,7 +8397,7 @@
         </w:tc>
         <w:tc>
           <w:tcPr>
-            <w:tcW w:type="dxa" w:w="1868"/>
+            <w:tcW w:type="dxa" w:w="1813"/>
             <w:tcBorders>
               <w:top w:val="single" w:color="D9D4C5" w:sz="4"/>
               <w:left w:val="single" w:color="D9D4C5" w:sz="4"/>
@@ -8330,7 +8467,7 @@
         </w:tc>
         <w:tc>
           <w:tcPr>
-            <w:tcW w:type="dxa" w:w="5135"/>
+            <w:tcW w:type="dxa" w:w="5190"/>
             <w:tcBorders>
               <w:top w:val="single" w:color="D9D4C5" w:sz="4"/>
               <w:left w:val="single" w:color="D9D4C5" w:sz="4"/>
@@ -8363,7 +8500,7 @@
         </w:tc>
         <w:tc>
           <w:tcPr>
-            <w:tcW w:type="dxa" w:w="1868"/>
+            <w:tcW w:type="dxa" w:w="1813"/>
             <w:tcBorders>
               <w:top w:val="single" w:color="D9D4C5" w:sz="4"/>
               <w:left w:val="single" w:color="D9D4C5" w:sz="4"/>
@@ -8444,7 +8581,7 @@
         </w:tc>
         <w:tc>
           <w:tcPr>
-            <w:tcW w:type="dxa" w:w="5135"/>
+            <w:tcW w:type="dxa" w:w="5190"/>
             <w:tcBorders>
               <w:top w:val="single" w:color="D9D4C5" w:sz="4"/>
               <w:left w:val="single" w:color="D9D4C5" w:sz="4"/>
@@ -8476,7 +8613,7 @@
         </w:tc>
         <w:tc>
           <w:tcPr>
-            <w:tcW w:type="dxa" w:w="1868"/>
+            <w:tcW w:type="dxa" w:w="1813"/>
             <w:tcBorders>
               <w:top w:val="single" w:color="D9D4C5" w:sz="4"/>
               <w:left w:val="single" w:color="D9D4C5" w:sz="4"/>
@@ -8546,7 +8683,7 @@
         </w:tc>
         <w:tc>
           <w:tcPr>
-            <w:tcW w:type="dxa" w:w="5135"/>
+            <w:tcW w:type="dxa" w:w="5190"/>
             <w:tcBorders>
               <w:top w:val="single" w:color="D9D4C5" w:sz="4"/>
               <w:left w:val="single" w:color="D9D4C5" w:sz="4"/>
@@ -8579,7 +8716,7 @@
         </w:tc>
         <w:tc>
           <w:tcPr>
-            <w:tcW w:type="dxa" w:w="1868"/>
+            <w:tcW w:type="dxa" w:w="1813"/>
             <w:tcBorders>
               <w:top w:val="single" w:color="D9D4C5" w:sz="4"/>
               <w:left w:val="single" w:color="D9D4C5" w:sz="4"/>
@@ -8649,7 +8786,7 @@
         </w:tc>
         <w:tc>
           <w:tcPr>
-            <w:tcW w:type="dxa" w:w="5135"/>
+            <w:tcW w:type="dxa" w:w="5190"/>
             <w:tcBorders>
               <w:top w:val="single" w:color="D9D4C5" w:sz="4"/>
               <w:left w:val="single" w:color="D9D4C5" w:sz="4"/>
@@ -8681,7 +8818,7 @@
         </w:tc>
         <w:tc>
           <w:tcPr>
-            <w:tcW w:type="dxa" w:w="1868"/>
+            <w:tcW w:type="dxa" w:w="1813"/>
             <w:tcBorders>
               <w:top w:val="single" w:color="D9D4C5" w:sz="4"/>
               <w:left w:val="single" w:color="D9D4C5" w:sz="4"/>
@@ -8762,7 +8899,7 @@
         </w:tc>
         <w:tc>
           <w:tcPr>
-            <w:tcW w:type="dxa" w:w="5135"/>
+            <w:tcW w:type="dxa" w:w="5190"/>
             <w:tcBorders>
               <w:top w:val="single" w:color="D9D4C5" w:sz="4"/>
               <w:left w:val="single" w:color="D9D4C5" w:sz="4"/>
@@ -8795,7 +8932,7 @@
         </w:tc>
         <w:tc>
           <w:tcPr>
-            <w:tcW w:type="dxa" w:w="1868"/>
+            <w:tcW w:type="dxa" w:w="1813"/>
             <w:tcBorders>
               <w:top w:val="single" w:color="D9D4C5" w:sz="4"/>
               <w:left w:val="single" w:color="D9D4C5" w:sz="4"/>
@@ -8865,7 +9002,7 @@
         </w:tc>
         <w:tc>
           <w:tcPr>
-            <w:tcW w:type="dxa" w:w="5135"/>
+            <w:tcW w:type="dxa" w:w="5190"/>
             <w:tcBorders>
               <w:top w:val="single" w:color="D9D4C5" w:sz="4"/>
               <w:left w:val="single" w:color="D9D4C5" w:sz="4"/>
@@ -8915,7 +9052,7 @@
         </w:tc>
         <w:tc>
           <w:tcPr>
-            <w:tcW w:type="dxa" w:w="1868"/>
+            <w:tcW w:type="dxa" w:w="1813"/>
             <w:tcBorders>
               <w:top w:val="single" w:color="D9D4C5" w:sz="4"/>
               <w:left w:val="single" w:color="D9D4C5" w:sz="4"/>
@@ -8985,7 +9122,7 @@
         </w:tc>
         <w:tc>
           <w:tcPr>
-            <w:tcW w:type="dxa" w:w="5135"/>
+            <w:tcW w:type="dxa" w:w="5190"/>
             <w:tcBorders>
               <w:top w:val="single" w:color="D9D4C5" w:sz="4"/>
               <w:left w:val="single" w:color="D9D4C5" w:sz="4"/>
@@ -9018,7 +9155,7 @@
         </w:tc>
         <w:tc>
           <w:tcPr>
-            <w:tcW w:type="dxa" w:w="1868"/>
+            <w:tcW w:type="dxa" w:w="1813"/>
             <w:tcBorders>
               <w:top w:val="single" w:color="D9D4C5" w:sz="4"/>
               <w:left w:val="single" w:color="D9D4C5" w:sz="4"/>
@@ -9088,7 +9225,7 @@
         </w:tc>
         <w:tc>
           <w:tcPr>
-            <w:tcW w:type="dxa" w:w="5135"/>
+            <w:tcW w:type="dxa" w:w="5190"/>
             <w:tcBorders>
               <w:top w:val="single" w:color="D9D4C5" w:sz="4"/>
               <w:left w:val="single" w:color="D9D4C5" w:sz="4"/>
@@ -9120,7 +9257,7 @@
         </w:tc>
         <w:tc>
           <w:tcPr>
-            <w:tcW w:type="dxa" w:w="1868"/>
+            <w:tcW w:type="dxa" w:w="1813"/>
             <w:tcBorders>
               <w:top w:val="single" w:color="D9D4C5" w:sz="4"/>
               <w:left w:val="single" w:color="D9D4C5" w:sz="4"/>
@@ -9190,7 +9327,7 @@
         </w:tc>
         <w:tc>
           <w:tcPr>
-            <w:tcW w:type="dxa" w:w="5135"/>
+            <w:tcW w:type="dxa" w:w="5190"/>
             <w:tcBorders>
               <w:top w:val="single" w:color="D9D4C5" w:sz="4"/>
               <w:left w:val="single" w:color="D9D4C5" w:sz="4"/>
@@ -9223,7 +9360,7 @@
         </w:tc>
         <w:tc>
           <w:tcPr>
-            <w:tcW w:type="dxa" w:w="1868"/>
+            <w:tcW w:type="dxa" w:w="1813"/>
             <w:tcBorders>
               <w:top w:val="single" w:color="D9D4C5" w:sz="4"/>
               <w:left w:val="single" w:color="D9D4C5" w:sz="4"/>
@@ -9311,7 +9448,7 @@
         </w:tc>
         <w:tc>
           <w:tcPr>
-            <w:tcW w:type="dxa" w:w="5135"/>
+            <w:tcW w:type="dxa" w:w="5190"/>
             <w:tcBorders>
               <w:top w:val="single" w:color="D9D4C5" w:sz="4"/>
               <w:left w:val="single" w:color="D9D4C5" w:sz="4"/>
@@ -9343,7 +9480,7 @@
         </w:tc>
         <w:tc>
           <w:tcPr>
-            <w:tcW w:type="dxa" w:w="1868"/>
+            <w:tcW w:type="dxa" w:w="1813"/>
             <w:tcBorders>
               <w:top w:val="single" w:color="D9D4C5" w:sz="4"/>
               <w:left w:val="single" w:color="D9D4C5" w:sz="4"/>
@@ -9413,7 +9550,7 @@
         </w:tc>
         <w:tc>
           <w:tcPr>
-            <w:tcW w:type="dxa" w:w="5135"/>
+            <w:tcW w:type="dxa" w:w="5190"/>
             <w:tcBorders>
               <w:top w:val="single" w:color="D9D4C5" w:sz="4"/>
               <w:left w:val="single" w:color="D9D4C5" w:sz="4"/>
@@ -9446,7 +9583,7 @@
         </w:tc>
         <w:tc>
           <w:tcPr>
-            <w:tcW w:type="dxa" w:w="1868"/>
+            <w:tcW w:type="dxa" w:w="1813"/>
             <w:tcBorders>
               <w:top w:val="single" w:color="D9D4C5" w:sz="4"/>
               <w:left w:val="single" w:color="D9D4C5" w:sz="4"/>
@@ -9516,39 +9653,39 @@
         </w:tc>
         <w:tc>
           <w:tcPr>
-            <w:tcW w:type="dxa" w:w="5135"/>
-            <w:tcBorders>
-              <w:top w:val="single" w:color="D9D4C5" w:sz="4"/>
-              <w:left w:val="single" w:color="D9D4C5" w:sz="4"/>
-              <w:bottom w:val="single" w:color="D9D4C5" w:sz="4"/>
-              <w:right w:val="single" w:color="D9D4C5" w:sz="4"/>
-            </w:tcBorders>
-            <w:tcMar>
-              <w:top w:type="dxa" w:w="70"/>
-              <w:left w:type="dxa" w:w="110"/>
-              <w:bottom w:type="dxa" w:w="70"/>
-              <w:right w:type="dxa" w:w="110"/>
-            </w:tcMar>
-            <w:vAlign w:val="center"/>
-          </w:tcPr>
-          <w:p>
-            <w:pPr>
-              <w:spacing w:after="0" w:before="0"/>
-            </w:pPr>
-            <w:r>
-              <w:rPr>
-                <w:rFonts w:ascii="Arial" w:cs="Arial" w:eastAsia="Arial" w:hAnsi="Arial"/>
-                <w:color w:val="1B2118"/>
-                <w:sz w:val="18"/>
-                <w:szCs w:val="18"/>
-              </w:rPr>
-              <w:t xml:space="preserve">Documentazione: Registro (solo Admin) e Manuale Utente, in Word e PDF</w:t>
-            </w:r>
-          </w:p>
-        </w:tc>
-        <w:tc>
-          <w:tcPr>
-            <w:tcW w:type="dxa" w:w="1868"/>
+            <w:tcW w:type="dxa" w:w="5190"/>
+            <w:tcBorders>
+              <w:top w:val="single" w:color="D9D4C5" w:sz="4"/>
+              <w:left w:val="single" w:color="D9D4C5" w:sz="4"/>
+              <w:bottom w:val="single" w:color="D9D4C5" w:sz="4"/>
+              <w:right w:val="single" w:color="D9D4C5" w:sz="4"/>
+            </w:tcBorders>
+            <w:tcMar>
+              <w:top w:type="dxa" w:w="70"/>
+              <w:left w:type="dxa" w:w="110"/>
+              <w:bottom w:type="dxa" w:w="70"/>
+              <w:right w:type="dxa" w:w="110"/>
+            </w:tcMar>
+            <w:vAlign w:val="center"/>
+          </w:tcPr>
+          <w:p>
+            <w:pPr>
+              <w:spacing w:after="0" w:before="0"/>
+            </w:pPr>
+            <w:r>
+              <w:rPr>
+                <w:rFonts w:ascii="Arial" w:cs="Arial" w:eastAsia="Arial" w:hAnsi="Arial"/>
+                <w:color w:val="1B2118"/>
+                <w:sz w:val="18"/>
+                <w:szCs w:val="18"/>
+              </w:rPr>
+              <w:t xml:space="preserve">Documentazione: Manuale Utente (PDF; Word solo Admin), Manuale Amministratore e Registro (solo Admin)</w:t>
+            </w:r>
+          </w:p>
+        </w:tc>
+        <w:tc>
+          <w:tcPr>
+            <w:tcW w:type="dxa" w:w="1813"/>
             <w:tcBorders>
               <w:top w:val="single" w:color="D9D4C5" w:sz="4"/>
               <w:left w:val="single" w:color="D9D4C5" w:sz="4"/>
@@ -12198,7 +12335,7 @@
           <w:sz w:val="21"/>
           <w:szCs w:val="21"/>
         </w:rPr>
-        <w:t xml:space="preserve">Documenti in Word/PDF (Manuale Utente e questo Registro)</w:t>
+        <w:t xml:space="preserve">Documenti in Word/PDF (Manuale Utente, Manuale Amministratore e questo Registro)</w:t>
       </w:r>
       <w:r>
         <w:rPr>
@@ -12217,6 +12354,24 @@
           <w:szCs w:val="21"/>
         </w:rPr>
         <w:t xml:space="preserve">docs/manuale-utente.md</w:t>
+      </w:r>
+      <w:r>
+        <w:rPr>
+          <w:rFonts w:ascii="Arial" w:cs="Arial" w:eastAsia="Arial" w:hAnsi="Arial"/>
+          <w:color w:val="1B2118"/>
+          <w:sz w:val="21"/>
+          <w:szCs w:val="21"/>
+        </w:rPr>
+        <w:t xml:space="preserve"> o </w:t>
+      </w:r>
+      <w:r>
+        <w:rPr>
+          <w:rFonts w:ascii="Consolas" w:cs="Consolas" w:eastAsia="Consolas" w:hAnsi="Consolas"/>
+          <w:color w:val="2F5D3A"/>
+          <w:sz w:val="21"/>
+          <w:szCs w:val="21"/>
+        </w:rPr>
+        <w:t xml:space="preserve">docs/manuale-amministratore.md</w:t>
       </w:r>
       <w:r>
         <w:rPr>
@@ -12414,6 +12569,242 @@
           <w:szCs w:val="25"/>
         </w:rPr>
         <w:t xml:space="preserve">18 ottobre 2026</w:t>
+      </w:r>
+    </w:p>
+    <w:p>
+      <w:pPr>
+        <w:pStyle w:val="ListParagraph"/>
+        <w:numPr>
+          <w:ilvl w:val="0"/>
+          <w:numId w:val="3"/>
+        </w:numPr>
+        <w:spacing w:after="70" w:line="290"/>
+      </w:pPr>
+      <w:r>
+        <w:rPr>
+          <w:rFonts w:ascii="Arial" w:cs="Arial" w:eastAsia="Arial" w:hAnsi="Arial"/>
+          <w:b/>
+          <w:bCs/>
+          <w:color w:val="1B2118"/>
+          <w:sz w:val="21"/>
+          <w:szCs w:val="21"/>
+        </w:rPr>
+        <w:t xml:space="preserve">Manuale Amministratore in Word e PDF</w:t>
+      </w:r>
+      <w:r>
+        <w:rPr>
+          <w:rFonts w:ascii="Arial" w:cs="Arial" w:eastAsia="Arial" w:hAnsi="Arial"/>
+          <w:color w:val="1B2118"/>
+          <w:sz w:val="21"/>
+          <w:szCs w:val="21"/>
+        </w:rPr>
+        <w:t xml:space="preserve"> (richiesta di Luca) — terzo documento, riservato agli Amministratori: funzioni della Fondazione (back-office, utenti, audit, impostazioni, notifiche, documentazione, manutenzione) e capitolo dettagliato sul </w:t>
+      </w:r>
+      <w:r>
+        <w:rPr>
+          <w:rFonts w:ascii="Arial" w:cs="Arial" w:eastAsia="Arial" w:hAnsi="Arial"/>
+          <w:b/>
+          <w:bCs/>
+          <w:color w:val="1B2118"/>
+          <w:sz w:val="21"/>
+          <w:szCs w:val="21"/>
+        </w:rPr>
+        <w:t xml:space="preserve">calcolo dei crediti CWP</w:t>
+      </w:r>
+      <w:r>
+        <w:rPr>
+          <w:rFonts w:ascii="Arial" w:cs="Arial" w:eastAsia="Arial" w:hAnsi="Arial"/>
+          <w:color w:val="1B2118"/>
+          <w:sz w:val="21"/>
+          <w:szCs w:val="21"/>
+        </w:rPr>
+        <w:t xml:space="preserve"> (concetti, preparazione dei dati dal tracciato, sette passi, lettura dei risultati, conferma e nuove versioni, scelte da confermare). Sorgente </w:t>
+      </w:r>
+      <w:r>
+        <w:rPr>
+          <w:rFonts w:ascii="Consolas" w:cs="Consolas" w:eastAsia="Consolas" w:hAnsi="Consolas"/>
+          <w:color w:val="2F5D3A"/>
+          <w:sz w:val="21"/>
+          <w:szCs w:val="21"/>
+        </w:rPr>
+        <w:t xml:space="preserve">docs/manuale-amministratore.md</w:t>
+      </w:r>
+      <w:r>
+        <w:rPr>
+          <w:rFonts w:ascii="Arial" w:cs="Arial" w:eastAsia="Arial" w:hAnsi="Arial"/>
+          <w:color w:val="1B2118"/>
+          <w:sz w:val="21"/>
+          <w:szCs w:val="21"/>
+        </w:rPr>
+        <w:t xml:space="preserve">, generato da </w:t>
+      </w:r>
+      <w:r>
+        <w:rPr>
+          <w:rFonts w:ascii="Consolas" w:cs="Consolas" w:eastAsia="Consolas" w:hAnsi="Consolas"/>
+          <w:color w:val="2F5D3A"/>
+          <w:sz w:val="21"/>
+          <w:szCs w:val="21"/>
+        </w:rPr>
+        <w:t xml:space="preserve">strumenti/genera_documenti.cjs</w:t>
+      </w:r>
+      <w:r>
+        <w:rPr>
+          <w:rFonts w:ascii="Arial" w:cs="Arial" w:eastAsia="Arial" w:hAnsi="Arial"/>
+          <w:color w:val="1B2118"/>
+          <w:sz w:val="21"/>
+          <w:szCs w:val="21"/>
+        </w:rPr>
+        <w:t xml:space="preserve"> e </w:t>
+      </w:r>
+      <w:r>
+        <w:rPr>
+          <w:rFonts w:ascii="Consolas" w:cs="Consolas" w:eastAsia="Consolas" w:hAnsi="Consolas"/>
+          <w:color w:val="2F5D3A"/>
+          <w:sz w:val="21"/>
+          <w:szCs w:val="21"/>
+        </w:rPr>
+        <w:t xml:space="preserve">strumenti/impagina_pdf.py</w:t>
+      </w:r>
+      <w:r>
+        <w:rPr>
+          <w:rFonts w:ascii="Arial" w:cs="Arial" w:eastAsia="Arial" w:hAnsi="Arial"/>
+          <w:color w:val="1B2118"/>
+          <w:sz w:val="21"/>
+          <w:szCs w:val="21"/>
+        </w:rPr>
+        <w:t xml:space="preserve"> (chiave </w:t>
+      </w:r>
+      <w:r>
+        <w:rPr>
+          <w:rFonts w:ascii="Consolas" w:cs="Consolas" w:eastAsia="Consolas" w:hAnsi="Consolas"/>
+          <w:color w:val="2F5D3A"/>
+          <w:sz w:val="21"/>
+          <w:szCs w:val="21"/>
+        </w:rPr>
+        <w:t xml:space="preserve">amministratore</w:t>
+      </w:r>
+      <w:r>
+        <w:rPr>
+          <w:rFonts w:ascii="Arial" w:cs="Arial" w:eastAsia="Arial" w:hAnsi="Arial"/>
+          <w:color w:val="1B2118"/>
+          <w:sz w:val="21"/>
+          <w:szCs w:val="21"/>
+        </w:rPr>
+        <w:t xml:space="preserve">), file in </w:t>
+      </w:r>
+      <w:r>
+        <w:rPr>
+          <w:rFonts w:ascii="Consolas" w:cs="Consolas" w:eastAsia="Consolas" w:hAnsi="Consolas"/>
+          <w:color w:val="2F5D3A"/>
+          <w:sz w:val="21"/>
+          <w:szCs w:val="21"/>
+        </w:rPr>
+        <w:t xml:space="preserve">public/documentazione/Manuale_Amministratore_Portale_CWP.{docx,pdf}</w:t>
+      </w:r>
+      <w:r>
+        <w:rPr>
+          <w:rFonts w:ascii="Arial" w:cs="Arial" w:eastAsia="Arial" w:hAnsi="Arial"/>
+          <w:color w:val="1B2118"/>
+          <w:sz w:val="21"/>
+          <w:szCs w:val="21"/>
+        </w:rPr>
+        <w:t xml:space="preserve">; scaricabile da Documentazione e dal profilo (solo Admin). Rev. 1.0.</w:t>
+      </w:r>
+    </w:p>
+    <w:p>
+      <w:pPr>
+        <w:pStyle w:val="ListParagraph"/>
+        <w:numPr>
+          <w:ilvl w:val="0"/>
+          <w:numId w:val="3"/>
+        </w:numPr>
+        <w:spacing w:after="70" w:line="290"/>
+      </w:pPr>
+      <w:r>
+        <w:rPr>
+          <w:rFonts w:ascii="Arial" w:cs="Arial" w:eastAsia="Arial" w:hAnsi="Arial"/>
+          <w:b/>
+          <w:bCs/>
+          <w:color w:val="1B2118"/>
+          <w:sz w:val="21"/>
+          <w:szCs w:val="21"/>
+        </w:rPr>
+        <w:t xml:space="preserve">Manuale Utente solo in PDF per gli utenti</w:t>
+      </w:r>
+      <w:r>
+        <w:rPr>
+          <w:rFonts w:ascii="Arial" w:cs="Arial" w:eastAsia="Arial" w:hAnsi="Arial"/>
+          <w:color w:val="1B2118"/>
+          <w:sz w:val="21"/>
+          <w:szCs w:val="21"/>
+        </w:rPr>
+        <w:t xml:space="preserve"> (richiesta di Luca): il pulsante «Scarica Word» resta solo agli Amministratori; tolto il link Word da «Le mie pratiche».</w:t>
+      </w:r>
+    </w:p>
+    <w:p>
+      <w:pPr>
+        <w:pStyle w:val="ListParagraph"/>
+        <w:numPr>
+          <w:ilvl w:val="0"/>
+          <w:numId w:val="3"/>
+        </w:numPr>
+        <w:spacing w:after="70" w:line="290"/>
+      </w:pPr>
+      <w:r>
+        <w:rPr>
+          <w:rFonts w:ascii="Arial" w:cs="Arial" w:eastAsia="Arial" w:hAnsi="Arial"/>
+          <w:b/>
+          <w:bCs/>
+          <w:color w:val="1B2118"/>
+          <w:sz w:val="21"/>
+          <w:szCs w:val="21"/>
+        </w:rPr>
+        <w:t xml:space="preserve">Manuale anche in «I tuoi documenti»</w:t>
+      </w:r>
+      <w:r>
+        <w:rPr>
+          <w:rFonts w:ascii="Arial" w:cs="Arial" w:eastAsia="Arial" w:hAnsi="Arial"/>
+          <w:color w:val="1B2118"/>
+          <w:sz w:val="21"/>
+          <w:szCs w:val="21"/>
+        </w:rPr>
+        <w:t xml:space="preserve"> — su segnalazione di Luca (prova come referente): riquadro «Manuale del portale» in fondo alla pagina </w:t>
+      </w:r>
+      <w:r>
+        <w:rPr>
+          <w:rFonts w:ascii="Consolas" w:cs="Consolas" w:eastAsia="Consolas" w:hAnsi="Consolas"/>
+          <w:color w:val="2F5D3A"/>
+          <w:sz w:val="21"/>
+          <w:szCs w:val="21"/>
+        </w:rPr>
+        <w:t xml:space="preserve">/documenti</w:t>
+      </w:r>
+      <w:r>
+        <w:rPr>
+          <w:rFonts w:ascii="Arial" w:cs="Arial" w:eastAsia="Arial" w:hAnsi="Arial"/>
+          <w:color w:val="1B2118"/>
+          <w:sz w:val="21"/>
+          <w:szCs w:val="21"/>
+        </w:rPr>
+        <w:t xml:space="preserve"> (componente </w:t>
+      </w:r>
+      <w:r>
+        <w:rPr>
+          <w:rFonts w:ascii="Consolas" w:cs="Consolas" w:eastAsia="Consolas" w:hAnsi="Consolas"/>
+          <w:color w:val="2F5D3A"/>
+          <w:sz w:val="21"/>
+          <w:szCs w:val="21"/>
+        </w:rPr>
+        <w:t xml:space="preserve">ElencoDocumenti</w:t>
+      </w:r>
+      <w:r>
+        <w:rPr>
+          <w:rFonts w:ascii="Arial" w:cs="Arial" w:eastAsia="Arial" w:hAnsi="Arial"/>
+          <w:color w:val="1B2118"/>
+          <w:sz w:val="21"/>
+          <w:szCs w:val="21"/>
+        </w:rPr>
+        <w:t xml:space="preserve">). Manuale Utente Rev. 1.5.</w:t>
       </w:r>
     </w:p>
     <w:p>
@@ -14763,9 +15154,9 @@
         <w:tblLayout w:type="fixed"/>
       </w:tblPr>
       <w:tblGrid>
-        <w:gridCol w:w="2827"/>
-        <w:gridCol w:w="3565"/>
-        <w:gridCol w:w="3246"/>
+        <w:gridCol w:w="2834"/>
+        <w:gridCol w:w="3543"/>
+        <w:gridCol w:w="3261"/>
       </w:tblGrid>
       <w:tr>
         <w:trPr>
@@ -14773,7 +15164,7 @@
         </w:trPr>
         <w:tc>
           <w:tcPr>
-            <w:tcW w:type="dxa" w:w="2827"/>
+            <w:tcW w:type="dxa" w:w="2834"/>
             <w:tcBorders>
               <w:top w:val="single" w:color="D9D4C5" w:sz="4"/>
               <w:left w:val="single" w:color="D9D4C5" w:sz="4"/>
@@ -14808,7 +15199,7 @@
         </w:tc>
         <w:tc>
           <w:tcPr>
-            <w:tcW w:type="dxa" w:w="3565"/>
+            <w:tcW w:type="dxa" w:w="3543"/>
             <w:tcBorders>
               <w:top w:val="single" w:color="D9D4C5" w:sz="4"/>
               <w:left w:val="single" w:color="D9D4C5" w:sz="4"/>
@@ -14843,7 +15234,7 @@
         </w:tc>
         <w:tc>
           <w:tcPr>
-            <w:tcW w:type="dxa" w:w="3246"/>
+            <w:tcW w:type="dxa" w:w="3261"/>
             <w:tcBorders>
               <w:top w:val="single" w:color="D9D4C5" w:sz="4"/>
               <w:left w:val="single" w:color="D9D4C5" w:sz="4"/>
@@ -14883,7 +15274,7 @@
         </w:trPr>
         <w:tc>
           <w:tcPr>
-            <w:tcW w:type="dxa" w:w="2827"/>
+            <w:tcW w:type="dxa" w:w="2834"/>
             <w:tcBorders>
               <w:top w:val="single" w:color="D9D4C5" w:sz="4"/>
               <w:left w:val="single" w:color="D9D4C5" w:sz="4"/>
@@ -14915,7 +15306,7 @@
         </w:tc>
         <w:tc>
           <w:tcPr>
-            <w:tcW w:type="dxa" w:w="3565"/>
+            <w:tcW w:type="dxa" w:w="3543"/>
             <w:tcBorders>
               <w:top w:val="single" w:color="D9D4C5" w:sz="4"/>
               <w:left w:val="single" w:color="D9D4C5" w:sz="4"/>
@@ -14943,7 +15334,7 @@
               </w:rPr>
               <w:t xml:space="preserve">Claude Doc: </w:t>
             </w:r>
-            <w:hyperlink w:history="1" r:id="rIdsmbng0t3y53etclc7ut9w">
+            <w:hyperlink w:history="1" r:id="rIdrrep3paupvvisxwlk-p2u">
               <w:r>
                 <w:rPr>
                   <w:rFonts w:ascii="Arial" w:cs="Arial" w:eastAsia="Arial" w:hAnsi="Arial"/>
@@ -14959,7 +15350,7 @@
         </w:tc>
         <w:tc>
           <w:tcPr>
-            <w:tcW w:type="dxa" w:w="3246"/>
+            <w:tcW w:type="dxa" w:w="3261"/>
             <w:tcBorders>
               <w:top w:val="single" w:color="D9D4C5" w:sz="4"/>
               <w:left w:val="single" w:color="D9D4C5" w:sz="4"/>
@@ -14996,7 +15387,7 @@
         </w:trPr>
         <w:tc>
           <w:tcPr>
-            <w:tcW w:type="dxa" w:w="2827"/>
+            <w:tcW w:type="dxa" w:w="2834"/>
             <w:tcBorders>
               <w:top w:val="single" w:color="D9D4C5" w:sz="4"/>
               <w:left w:val="single" w:color="D9D4C5" w:sz="4"/>
@@ -15029,7 +15420,7 @@
         </w:tc>
         <w:tc>
           <w:tcPr>
-            <w:tcW w:type="dxa" w:w="3565"/>
+            <w:tcW w:type="dxa" w:w="3543"/>
             <w:tcBorders>
               <w:top w:val="single" w:color="D9D4C5" w:sz="4"/>
               <w:left w:val="single" w:color="D9D4C5" w:sz="4"/>
@@ -15071,7 +15462,7 @@
         </w:tc>
         <w:tc>
           <w:tcPr>
-            <w:tcW w:type="dxa" w:w="3246"/>
+            <w:tcW w:type="dxa" w:w="3261"/>
             <w:tcBorders>
               <w:top w:val="single" w:color="D9D4C5" w:sz="4"/>
               <w:left w:val="single" w:color="D9D4C5" w:sz="4"/>
@@ -15109,7 +15500,7 @@
         </w:trPr>
         <w:tc>
           <w:tcPr>
-            <w:tcW w:type="dxa" w:w="2827"/>
+            <w:tcW w:type="dxa" w:w="2834"/>
             <w:tcBorders>
               <w:top w:val="single" w:color="D9D4C5" w:sz="4"/>
               <w:left w:val="single" w:color="D9D4C5" w:sz="4"/>
@@ -15141,7 +15532,7 @@
         </w:tc>
         <w:tc>
           <w:tcPr>
-            <w:tcW w:type="dxa" w:w="3565"/>
+            <w:tcW w:type="dxa" w:w="3543"/>
             <w:tcBorders>
               <w:top w:val="single" w:color="D9D4C5" w:sz="4"/>
               <w:left w:val="single" w:color="D9D4C5" w:sz="4"/>
@@ -15191,7 +15582,7 @@
         </w:tc>
         <w:tc>
           <w:tcPr>
-            <w:tcW w:type="dxa" w:w="3246"/>
+            <w:tcW w:type="dxa" w:w="3261"/>
             <w:tcBorders>
               <w:top w:val="single" w:color="D9D4C5" w:sz="4"/>
               <w:left w:val="single" w:color="D9D4C5" w:sz="4"/>
@@ -15228,7 +15619,7 @@
         </w:trPr>
         <w:tc>
           <w:tcPr>
-            <w:tcW w:type="dxa" w:w="2827"/>
+            <w:tcW w:type="dxa" w:w="2834"/>
             <w:tcBorders>
               <w:top w:val="single" w:color="D9D4C5" w:sz="4"/>
               <w:left w:val="single" w:color="D9D4C5" w:sz="4"/>
@@ -15261,7 +15652,7 @@
         </w:tc>
         <w:tc>
           <w:tcPr>
-            <w:tcW w:type="dxa" w:w="3565"/>
+            <w:tcW w:type="dxa" w:w="3543"/>
             <w:tcBorders>
               <w:top w:val="single" w:color="D9D4C5" w:sz="4"/>
               <w:left w:val="single" w:color="D9D4C5" w:sz="4"/>
@@ -15290,7 +15681,7 @@
               </w:rPr>
               <w:t xml:space="preserve">Claude Doc: </w:t>
             </w:r>
-            <w:hyperlink w:history="1" r:id="rIdqaxuv-xbbynkyf5uqyey1">
+            <w:hyperlink w:history="1" r:id="rIdqebwppijnbsbqnhheeszv">
               <w:r>
                 <w:rPr>
                   <w:rFonts w:ascii="Arial" w:cs="Arial" w:eastAsia="Arial" w:hAnsi="Arial"/>
@@ -15315,7 +15706,7 @@
         </w:tc>
         <w:tc>
           <w:tcPr>
-            <w:tcW w:type="dxa" w:w="3246"/>
+            <w:tcW w:type="dxa" w:w="3261"/>
             <w:tcBorders>
               <w:top w:val="single" w:color="D9D4C5" w:sz="4"/>
               <w:left w:val="single" w:color="D9D4C5" w:sz="4"/>
@@ -15353,7 +15744,7 @@
         </w:trPr>
         <w:tc>
           <w:tcPr>
-            <w:tcW w:type="dxa" w:w="2827"/>
+            <w:tcW w:type="dxa" w:w="2834"/>
             <w:tcBorders>
               <w:top w:val="single" w:color="D9D4C5" w:sz="4"/>
               <w:left w:val="single" w:color="D9D4C5" w:sz="4"/>
@@ -15385,7 +15776,7 @@
         </w:tc>
         <w:tc>
           <w:tcPr>
-            <w:tcW w:type="dxa" w:w="3565"/>
+            <w:tcW w:type="dxa" w:w="3543"/>
             <w:tcBorders>
               <w:top w:val="single" w:color="D9D4C5" w:sz="4"/>
               <w:left w:val="single" w:color="D9D4C5" w:sz="4"/>
@@ -15453,7 +15844,7 @@
         </w:tc>
         <w:tc>
           <w:tcPr>
-            <w:tcW w:type="dxa" w:w="3246"/>
+            <w:tcW w:type="dxa" w:w="3261"/>
             <w:tcBorders>
               <w:top w:val="single" w:color="D9D4C5" w:sz="4"/>
               <w:left w:val="single" w:color="D9D4C5" w:sz="4"/>
@@ -15490,7 +15881,7 @@
         </w:trPr>
         <w:tc>
           <w:tcPr>
-            <w:tcW w:type="dxa" w:w="2827"/>
+            <w:tcW w:type="dxa" w:w="2834"/>
             <w:tcBorders>
               <w:top w:val="single" w:color="D9D4C5" w:sz="4"/>
               <w:left w:val="single" w:color="D9D4C5" w:sz="4"/>
@@ -15523,7 +15914,7 @@
         </w:tc>
         <w:tc>
           <w:tcPr>
-            <w:tcW w:type="dxa" w:w="3565"/>
+            <w:tcW w:type="dxa" w:w="3543"/>
             <w:tcBorders>
               <w:top w:val="single" w:color="D9D4C5" w:sz="4"/>
               <w:left w:val="single" w:color="D9D4C5" w:sz="4"/>
@@ -15601,7 +15992,7 @@
         </w:tc>
         <w:tc>
           <w:tcPr>
-            <w:tcW w:type="dxa" w:w="3246"/>
+            <w:tcW w:type="dxa" w:w="3261"/>
             <w:tcBorders>
               <w:top w:val="single" w:color="D9D4C5" w:sz="4"/>
               <w:left w:val="single" w:color="D9D4C5" w:sz="4"/>
@@ -15639,45 +16030,211 @@
         </w:trPr>
         <w:tc>
           <w:tcPr>
-            <w:tcW w:type="dxa" w:w="2827"/>
-            <w:tcBorders>
-              <w:top w:val="single" w:color="D9D4C5" w:sz="4"/>
-              <w:left w:val="single" w:color="D9D4C5" w:sz="4"/>
-              <w:bottom w:val="single" w:color="D9D4C5" w:sz="4"/>
-              <w:right w:val="single" w:color="D9D4C5" w:sz="4"/>
-            </w:tcBorders>
-            <w:tcMar>
-              <w:top w:type="dxa" w:w="70"/>
-              <w:left w:type="dxa" w:w="110"/>
-              <w:bottom w:type="dxa" w:w="70"/>
-              <w:right w:type="dxa" w:w="110"/>
-            </w:tcMar>
-            <w:vAlign w:val="center"/>
-          </w:tcPr>
-          <w:p>
-            <w:pPr>
-              <w:spacing w:after="0" w:before="0"/>
-            </w:pPr>
-            <w:r>
-              <w:rPr>
-                <w:rFonts w:ascii="Arial" w:cs="Arial" w:eastAsia="Arial" w:hAnsi="Arial"/>
-                <w:color w:val="1B2118"/>
-                <w:sz w:val="18"/>
-                <w:szCs w:val="18"/>
-              </w:rPr>
-              <w:t xml:space="preserve">Manuale Amministratore</w:t>
-            </w:r>
-          </w:p>
-        </w:tc>
-        <w:tc>
-          <w:tcPr>
-            <w:tcW w:type="dxa" w:w="3565"/>
-            <w:tcBorders>
-              <w:top w:val="single" w:color="D9D4C5" w:sz="4"/>
-              <w:left w:val="single" w:color="D9D4C5" w:sz="4"/>
-              <w:bottom w:val="single" w:color="D9D4C5" w:sz="4"/>
-              <w:right w:val="single" w:color="D9D4C5" w:sz="4"/>
-            </w:tcBorders>
+            <w:tcW w:type="dxa" w:w="2834"/>
+            <w:tcBorders>
+              <w:top w:val="single" w:color="D9D4C5" w:sz="4"/>
+              <w:left w:val="single" w:color="D9D4C5" w:sz="4"/>
+              <w:bottom w:val="single" w:color="D9D4C5" w:sz="4"/>
+              <w:right w:val="single" w:color="D9D4C5" w:sz="4"/>
+            </w:tcBorders>
+            <w:tcMar>
+              <w:top w:type="dxa" w:w="70"/>
+              <w:left w:type="dxa" w:w="110"/>
+              <w:bottom w:type="dxa" w:w="70"/>
+              <w:right w:type="dxa" w:w="110"/>
+            </w:tcMar>
+            <w:vAlign w:val="center"/>
+          </w:tcPr>
+          <w:p>
+            <w:pPr>
+              <w:spacing w:after="0" w:before="0"/>
+            </w:pPr>
+            <w:r>
+              <w:rPr>
+                <w:rFonts w:ascii="Arial" w:cs="Arial" w:eastAsia="Arial" w:hAnsi="Arial"/>
+                <w:color w:val="1B2118"/>
+                <w:sz w:val="18"/>
+                <w:szCs w:val="18"/>
+              </w:rPr>
+              <w:t xml:space="preserve">Manuale Amministratore in Word/PDF</w:t>
+            </w:r>
+          </w:p>
+        </w:tc>
+        <w:tc>
+          <w:tcPr>
+            <w:tcW w:type="dxa" w:w="3543"/>
+            <w:tcBorders>
+              <w:top w:val="single" w:color="D9D4C5" w:sz="4"/>
+              <w:left w:val="single" w:color="D9D4C5" w:sz="4"/>
+              <w:bottom w:val="single" w:color="D9D4C5" w:sz="4"/>
+              <w:right w:val="single" w:color="D9D4C5" w:sz="4"/>
+            </w:tcBorders>
+            <w:tcMar>
+              <w:top w:type="dxa" w:w="70"/>
+              <w:left w:type="dxa" w:w="110"/>
+              <w:bottom w:type="dxa" w:w="70"/>
+              <w:right w:type="dxa" w:w="110"/>
+            </w:tcMar>
+            <w:vAlign w:val="center"/>
+          </w:tcPr>
+          <w:p>
+            <w:pPr>
+              <w:spacing w:after="0" w:before="0"/>
+            </w:pPr>
+            <w:r>
+              <w:rPr>
+                <w:rFonts w:ascii="Consolas" w:cs="Consolas" w:eastAsia="Consolas" w:hAnsi="Consolas"/>
+                <w:color w:val="2F5D3A"/>
+                <w:sz w:val="18"/>
+                <w:szCs w:val="18"/>
+              </w:rPr>
+              <w:t xml:space="preserve">docs/manuale-amministratore.md</w:t>
+            </w:r>
+            <w:r>
+              <w:rPr>
+                <w:rFonts w:ascii="Arial" w:cs="Arial" w:eastAsia="Arial" w:hAnsi="Arial"/>
+                <w:color w:val="1B2118"/>
+                <w:sz w:val="18"/>
+                <w:szCs w:val="18"/>
+              </w:rPr>
+              <w:t xml:space="preserve"> → </w:t>
+            </w:r>
+            <w:r>
+              <w:rPr>
+                <w:rFonts w:ascii="Consolas" w:cs="Consolas" w:eastAsia="Consolas" w:hAnsi="Consolas"/>
+                <w:color w:val="2F5D3A"/>
+                <w:sz w:val="18"/>
+                <w:szCs w:val="18"/>
+              </w:rPr>
+              <w:t xml:space="preserve">public/documentazione/Manuale_Amministratore_Portale_CWP.docx</w:t>
+            </w:r>
+            <w:r>
+              <w:rPr>
+                <w:rFonts w:ascii="Arial" w:cs="Arial" w:eastAsia="Arial" w:hAnsi="Arial"/>
+                <w:color w:val="1B2118"/>
+                <w:sz w:val="18"/>
+                <w:szCs w:val="18"/>
+              </w:rPr>
+              <w:t xml:space="preserve"> e </w:t>
+            </w:r>
+            <w:r>
+              <w:rPr>
+                <w:rFonts w:ascii="Consolas" w:cs="Consolas" w:eastAsia="Consolas" w:hAnsi="Consolas"/>
+                <w:color w:val="2F5D3A"/>
+                <w:sz w:val="18"/>
+                <w:szCs w:val="18"/>
+              </w:rPr>
+              <w:t xml:space="preserve">.pdf</w:t>
+            </w:r>
+            <w:r>
+              <w:rPr>
+                <w:rFonts w:ascii="Arial" w:cs="Arial" w:eastAsia="Arial" w:hAnsi="Arial"/>
+                <w:color w:val="1B2118"/>
+                <w:sz w:val="18"/>
+                <w:szCs w:val="18"/>
+              </w:rPr>
+              <w:t xml:space="preserve">, scaricabile da </w:t>
+            </w:r>
+            <w:r>
+              <w:rPr>
+                <w:rFonts w:ascii="Consolas" w:cs="Consolas" w:eastAsia="Consolas" w:hAnsi="Consolas"/>
+                <w:color w:val="2F5D3A"/>
+                <w:sz w:val="18"/>
+                <w:szCs w:val="18"/>
+              </w:rPr>
+              <w:t xml:space="preserve">/documentazione</w:t>
+            </w:r>
+            <w:r>
+              <w:rPr>
+                <w:rFonts w:ascii="Arial" w:cs="Arial" w:eastAsia="Arial" w:hAnsi="Arial"/>
+                <w:color w:val="1B2118"/>
+                <w:sz w:val="18"/>
+                <w:szCs w:val="18"/>
+              </w:rPr>
+              <w:t xml:space="preserve"> (Admin)</w:t>
+            </w:r>
+          </w:p>
+        </w:tc>
+        <w:tc>
+          <w:tcPr>
+            <w:tcW w:type="dxa" w:w="3261"/>
+            <w:tcBorders>
+              <w:top w:val="single" w:color="D9D4C5" w:sz="4"/>
+              <w:left w:val="single" w:color="D9D4C5" w:sz="4"/>
+              <w:bottom w:val="single" w:color="D9D4C5" w:sz="4"/>
+              <w:right w:val="single" w:color="D9D4C5" w:sz="4"/>
+            </w:tcBorders>
+            <w:tcMar>
+              <w:top w:type="dxa" w:w="70"/>
+              <w:left w:type="dxa" w:w="110"/>
+              <w:bottom w:type="dxa" w:w="70"/>
+              <w:right w:type="dxa" w:w="110"/>
+            </w:tcMar>
+            <w:vAlign w:val="center"/>
+          </w:tcPr>
+          <w:p>
+            <w:pPr>
+              <w:spacing w:after="0" w:before="0"/>
+            </w:pPr>
+            <w:r>
+              <w:rPr>
+                <w:rFonts w:ascii="Arial" w:cs="Arial" w:eastAsia="Arial" w:hAnsi="Arial"/>
+                <w:color w:val="1B2118"/>
+                <w:sz w:val="18"/>
+                <w:szCs w:val="18"/>
+              </w:rPr>
+              <w:t xml:space="preserve">Versione impaginata e riservata del manuale per la Fondazione</w:t>
+            </w:r>
+          </w:p>
+        </w:tc>
+      </w:tr>
+      <w:tr>
+        <w:trPr>
+          <w:cantSplit/>
+        </w:trPr>
+        <w:tc>
+          <w:tcPr>
+            <w:tcW w:type="dxa" w:w="2834"/>
+            <w:tcBorders>
+              <w:top w:val="single" w:color="D9D4C5" w:sz="4"/>
+              <w:left w:val="single" w:color="D9D4C5" w:sz="4"/>
+              <w:bottom w:val="single" w:color="D9D4C5" w:sz="4"/>
+              <w:right w:val="single" w:color="D9D4C5" w:sz="4"/>
+            </w:tcBorders>
+            <w:shd w:fill="F6F4EE" w:color="auto" w:val="clear"/>
+            <w:tcMar>
+              <w:top w:type="dxa" w:w="70"/>
+              <w:left w:type="dxa" w:w="110"/>
+              <w:bottom w:type="dxa" w:w="70"/>
+              <w:right w:type="dxa" w:w="110"/>
+            </w:tcMar>
+            <w:vAlign w:val="center"/>
+          </w:tcPr>
+          <w:p>
+            <w:pPr>
+              <w:spacing w:after="0" w:before="0"/>
+            </w:pPr>
+            <w:r>
+              <w:rPr>
+                <w:rFonts w:ascii="Arial" w:cs="Arial" w:eastAsia="Arial" w:hAnsi="Arial"/>
+                <w:color w:val="1B2118"/>
+                <w:sz w:val="18"/>
+                <w:szCs w:val="18"/>
+              </w:rPr>
+              <w:t xml:space="preserve">Manuale Amministratore online</w:t>
+            </w:r>
+          </w:p>
+        </w:tc>
+        <w:tc>
+          <w:tcPr>
+            <w:tcW w:type="dxa" w:w="3543"/>
+            <w:tcBorders>
+              <w:top w:val="single" w:color="D9D4C5" w:sz="4"/>
+              <w:left w:val="single" w:color="D9D4C5" w:sz="4"/>
+              <w:bottom w:val="single" w:color="D9D4C5" w:sz="4"/>
+              <w:right w:val="single" w:color="D9D4C5" w:sz="4"/>
+            </w:tcBorders>
+            <w:shd w:fill="F6F4EE" w:color="auto" w:val="clear"/>
             <w:tcMar>
               <w:top w:type="dxa" w:w="70"/>
               <w:left w:type="dxa" w:w="110"/>
@@ -15699,7 +16256,7 @@
               </w:rPr>
               <w:t xml:space="preserve">Claude Doc: </w:t>
             </w:r>
-            <w:hyperlink w:history="1" r:id="rIdfcfhi-c5xy4-acvyiesqu">
+            <w:hyperlink w:history="1" r:id="rIdkdxfk6waupujjpv2vzm4b">
               <w:r>
                 <w:rPr>
                   <w:rFonts w:ascii="Arial" w:cs="Arial" w:eastAsia="Arial" w:hAnsi="Arial"/>
@@ -15724,13 +16281,14 @@
         </w:tc>
         <w:tc>
           <w:tcPr>
-            <w:tcW w:type="dxa" w:w="3246"/>
-            <w:tcBorders>
-              <w:top w:val="single" w:color="D9D4C5" w:sz="4"/>
-              <w:left w:val="single" w:color="D9D4C5" w:sz="4"/>
-              <w:bottom w:val="single" w:color="D9D4C5" w:sz="4"/>
-              <w:right w:val="single" w:color="D9D4C5" w:sz="4"/>
-            </w:tcBorders>
+            <w:tcW w:type="dxa" w:w="3261"/>
+            <w:tcBorders>
+              <w:top w:val="single" w:color="D9D4C5" w:sz="4"/>
+              <w:left w:val="single" w:color="D9D4C5" w:sz="4"/>
+              <w:bottom w:val="single" w:color="D9D4C5" w:sz="4"/>
+              <w:right w:val="single" w:color="D9D4C5" w:sz="4"/>
+            </w:tcBorders>
+            <w:shd w:fill="F6F4EE" w:color="auto" w:val="clear"/>
             <w:tcMar>
               <w:top w:type="dxa" w:w="70"/>
               <w:left w:type="dxa" w:w="110"/>
@@ -15761,14 +16319,13 @@
         </w:trPr>
         <w:tc>
           <w:tcPr>
-            <w:tcW w:type="dxa" w:w="2827"/>
-            <w:tcBorders>
-              <w:top w:val="single" w:color="D9D4C5" w:sz="4"/>
-              <w:left w:val="single" w:color="D9D4C5" w:sz="4"/>
-              <w:bottom w:val="single" w:color="D9D4C5" w:sz="4"/>
-              <w:right w:val="single" w:color="D9D4C5" w:sz="4"/>
-            </w:tcBorders>
-            <w:shd w:fill="F6F4EE" w:color="auto" w:val="clear"/>
+            <w:tcW w:type="dxa" w:w="2834"/>
+            <w:tcBorders>
+              <w:top w:val="single" w:color="D9D4C5" w:sz="4"/>
+              <w:left w:val="single" w:color="D9D4C5" w:sz="4"/>
+              <w:bottom w:val="single" w:color="D9D4C5" w:sz="4"/>
+              <w:right w:val="single" w:color="D9D4C5" w:sz="4"/>
+            </w:tcBorders>
             <w:tcMar>
               <w:top w:type="dxa" w:w="70"/>
               <w:left w:type="dxa" w:w="110"/>
@@ -15794,14 +16351,13 @@
         </w:tc>
         <w:tc>
           <w:tcPr>
-            <w:tcW w:type="dxa" w:w="3565"/>
-            <w:tcBorders>
-              <w:top w:val="single" w:color="D9D4C5" w:sz="4"/>
-              <w:left w:val="single" w:color="D9D4C5" w:sz="4"/>
-              <w:bottom w:val="single" w:color="D9D4C5" w:sz="4"/>
-              <w:right w:val="single" w:color="D9D4C5" w:sz="4"/>
-            </w:tcBorders>
-            <w:shd w:fill="F6F4EE" w:color="auto" w:val="clear"/>
+            <w:tcW w:type="dxa" w:w="3543"/>
+            <w:tcBorders>
+              <w:top w:val="single" w:color="D9D4C5" w:sz="4"/>
+              <w:left w:val="single" w:color="D9D4C5" w:sz="4"/>
+              <w:bottom w:val="single" w:color="D9D4C5" w:sz="4"/>
+              <w:right w:val="single" w:color="D9D4C5" w:sz="4"/>
+            </w:tcBorders>
             <w:tcMar>
               <w:top w:type="dxa" w:w="70"/>
               <w:left w:type="dxa" w:w="110"/>
@@ -15845,14 +16401,13 @@
         </w:tc>
         <w:tc>
           <w:tcPr>
-            <w:tcW w:type="dxa" w:w="3246"/>
-            <w:tcBorders>
-              <w:top w:val="single" w:color="D9D4C5" w:sz="4"/>
-              <w:left w:val="single" w:color="D9D4C5" w:sz="4"/>
-              <w:bottom w:val="single" w:color="D9D4C5" w:sz="4"/>
-              <w:right w:val="single" w:color="D9D4C5" w:sz="4"/>
-            </w:tcBorders>
-            <w:shd w:fill="F6F4EE" w:color="auto" w:val="clear"/>
+            <w:tcW w:type="dxa" w:w="3261"/>
+            <w:tcBorders>
+              <w:top w:val="single" w:color="D9D4C5" w:sz="4"/>
+              <w:left w:val="single" w:color="D9D4C5" w:sz="4"/>
+              <w:bottom w:val="single" w:color="D9D4C5" w:sz="4"/>
+              <w:right w:val="single" w:color="D9D4C5" w:sz="4"/>
+            </w:tcBorders>
             <w:tcMar>
               <w:top w:type="dxa" w:w="70"/>
               <w:left w:type="dxa" w:w="110"/>
@@ -15883,13 +16438,14 @@
         </w:trPr>
         <w:tc>
           <w:tcPr>
-            <w:tcW w:type="dxa" w:w="2827"/>
-            <w:tcBorders>
-              <w:top w:val="single" w:color="D9D4C5" w:sz="4"/>
-              <w:left w:val="single" w:color="D9D4C5" w:sz="4"/>
-              <w:bottom w:val="single" w:color="D9D4C5" w:sz="4"/>
-              <w:right w:val="single" w:color="D9D4C5" w:sz="4"/>
-            </w:tcBorders>
+            <w:tcW w:type="dxa" w:w="2834"/>
+            <w:tcBorders>
+              <w:top w:val="single" w:color="D9D4C5" w:sz="4"/>
+              <w:left w:val="single" w:color="D9D4C5" w:sz="4"/>
+              <w:bottom w:val="single" w:color="D9D4C5" w:sz="4"/>
+              <w:right w:val="single" w:color="D9D4C5" w:sz="4"/>
+            </w:tcBorders>
+            <w:shd w:fill="F6F4EE" w:color="auto" w:val="clear"/>
             <w:tcMar>
               <w:top w:type="dxa" w:w="70"/>
               <w:left w:type="dxa" w:w="110"/>
@@ -15915,13 +16471,14 @@
         </w:tc>
         <w:tc>
           <w:tcPr>
-            <w:tcW w:type="dxa" w:w="3565"/>
-            <w:tcBorders>
-              <w:top w:val="single" w:color="D9D4C5" w:sz="4"/>
-              <w:left w:val="single" w:color="D9D4C5" w:sz="4"/>
-              <w:bottom w:val="single" w:color="D9D4C5" w:sz="4"/>
-              <w:right w:val="single" w:color="D9D4C5" w:sz="4"/>
-            </w:tcBorders>
+            <w:tcW w:type="dxa" w:w="3543"/>
+            <w:tcBorders>
+              <w:top w:val="single" w:color="D9D4C5" w:sz="4"/>
+              <w:left w:val="single" w:color="D9D4C5" w:sz="4"/>
+              <w:bottom w:val="single" w:color="D9D4C5" w:sz="4"/>
+              <w:right w:val="single" w:color="D9D4C5" w:sz="4"/>
+            </w:tcBorders>
+            <w:shd w:fill="F6F4EE" w:color="auto" w:val="clear"/>
             <w:tcMar>
               <w:top w:type="dxa" w:w="70"/>
               <w:left w:type="dxa" w:w="110"/>
@@ -15947,13 +16504,14 @@
         </w:tc>
         <w:tc>
           <w:tcPr>
-            <w:tcW w:type="dxa" w:w="3246"/>
-            <w:tcBorders>
-              <w:top w:val="single" w:color="D9D4C5" w:sz="4"/>
-              <w:left w:val="single" w:color="D9D4C5" w:sz="4"/>
-              <w:bottom w:val="single" w:color="D9D4C5" w:sz="4"/>
-              <w:right w:val="single" w:color="D9D4C5" w:sz="4"/>
-            </w:tcBorders>
+            <w:tcW w:type="dxa" w:w="3261"/>
+            <w:tcBorders>
+              <w:top w:val="single" w:color="D9D4C5" w:sz="4"/>
+              <w:left w:val="single" w:color="D9D4C5" w:sz="4"/>
+              <w:bottom w:val="single" w:color="D9D4C5" w:sz="4"/>
+              <w:right w:val="single" w:color="D9D4C5" w:sz="4"/>
+            </w:tcBorders>
+            <w:shd w:fill="F6F4EE" w:color="auto" w:val="clear"/>
             <w:tcMar>
               <w:top w:type="dxa" w:w="70"/>
               <w:left w:type="dxa" w:w="110"/>
@@ -15984,14 +16542,13 @@
         </w:trPr>
         <w:tc>
           <w:tcPr>
-            <w:tcW w:type="dxa" w:w="2827"/>
-            <w:tcBorders>
-              <w:top w:val="single" w:color="D9D4C5" w:sz="4"/>
-              <w:left w:val="single" w:color="D9D4C5" w:sz="4"/>
-              <w:bottom w:val="single" w:color="D9D4C5" w:sz="4"/>
-              <w:right w:val="single" w:color="D9D4C5" w:sz="4"/>
-            </w:tcBorders>
-            <w:shd w:fill="F6F4EE" w:color="auto" w:val="clear"/>
+            <w:tcW w:type="dxa" w:w="2834"/>
+            <w:tcBorders>
+              <w:top w:val="single" w:color="D9D4C5" w:sz="4"/>
+              <w:left w:val="single" w:color="D9D4C5" w:sz="4"/>
+              <w:bottom w:val="single" w:color="D9D4C5" w:sz="4"/>
+              <w:right w:val="single" w:color="D9D4C5" w:sz="4"/>
+            </w:tcBorders>
             <w:tcMar>
               <w:top w:type="dxa" w:w="70"/>
               <w:left w:type="dxa" w:w="110"/>
@@ -16017,14 +16574,13 @@
         </w:tc>
         <w:tc>
           <w:tcPr>
-            <w:tcW w:type="dxa" w:w="3565"/>
-            <w:tcBorders>
-              <w:top w:val="single" w:color="D9D4C5" w:sz="4"/>
-              <w:left w:val="single" w:color="D9D4C5" w:sz="4"/>
-              <w:bottom w:val="single" w:color="D9D4C5" w:sz="4"/>
-              <w:right w:val="single" w:color="D9D4C5" w:sz="4"/>
-            </w:tcBorders>
-            <w:shd w:fill="F6F4EE" w:color="auto" w:val="clear"/>
+            <w:tcW w:type="dxa" w:w="3543"/>
+            <w:tcBorders>
+              <w:top w:val="single" w:color="D9D4C5" w:sz="4"/>
+              <w:left w:val="single" w:color="D9D4C5" w:sz="4"/>
+              <w:bottom w:val="single" w:color="D9D4C5" w:sz="4"/>
+              <w:right w:val="single" w:color="D9D4C5" w:sz="4"/>
+            </w:tcBorders>
             <w:tcMar>
               <w:top w:type="dxa" w:w="70"/>
               <w:left w:type="dxa" w:w="110"/>
@@ -16050,14 +16606,13 @@
         </w:tc>
         <w:tc>
           <w:tcPr>
-            <w:tcW w:type="dxa" w:w="3246"/>
-            <w:tcBorders>
-              <w:top w:val="single" w:color="D9D4C5" w:sz="4"/>
-              <w:left w:val="single" w:color="D9D4C5" w:sz="4"/>
-              <w:bottom w:val="single" w:color="D9D4C5" w:sz="4"/>
-              <w:right w:val="single" w:color="D9D4C5" w:sz="4"/>
-            </w:tcBorders>
-            <w:shd w:fill="F6F4EE" w:color="auto" w:val="clear"/>
+            <w:tcW w:type="dxa" w:w="3261"/>
+            <w:tcBorders>
+              <w:top w:val="single" w:color="D9D4C5" w:sz="4"/>
+              <w:left w:val="single" w:color="D9D4C5" w:sz="4"/>
+              <w:bottom w:val="single" w:color="D9D4C5" w:sz="4"/>
+              <w:right w:val="single" w:color="D9D4C5" w:sz="4"/>
+            </w:tcBorders>
             <w:tcMar>
               <w:top w:type="dxa" w:w="70"/>
               <w:left w:type="dxa" w:w="110"/>
@@ -16088,13 +16643,14 @@
         </w:trPr>
         <w:tc>
           <w:tcPr>
-            <w:tcW w:type="dxa" w:w="2827"/>
-            <w:tcBorders>
-              <w:top w:val="single" w:color="D9D4C5" w:sz="4"/>
-              <w:left w:val="single" w:color="D9D4C5" w:sz="4"/>
-              <w:bottom w:val="single" w:color="D9D4C5" w:sz="4"/>
-              <w:right w:val="single" w:color="D9D4C5" w:sz="4"/>
-            </w:tcBorders>
+            <w:tcW w:type="dxa" w:w="2834"/>
+            <w:tcBorders>
+              <w:top w:val="single" w:color="D9D4C5" w:sz="4"/>
+              <w:left w:val="single" w:color="D9D4C5" w:sz="4"/>
+              <w:bottom w:val="single" w:color="D9D4C5" w:sz="4"/>
+              <w:right w:val="single" w:color="D9D4C5" w:sz="4"/>
+            </w:tcBorders>
+            <w:shd w:fill="F6F4EE" w:color="auto" w:val="clear"/>
             <w:tcMar>
               <w:top w:type="dxa" w:w="70"/>
               <w:left w:type="dxa" w:w="110"/>
@@ -16120,13 +16676,14 @@
         </w:tc>
         <w:tc>
           <w:tcPr>
-            <w:tcW w:type="dxa" w:w="3565"/>
-            <w:tcBorders>
-              <w:top w:val="single" w:color="D9D4C5" w:sz="4"/>
-              <w:left w:val="single" w:color="D9D4C5" w:sz="4"/>
-              <w:bottom w:val="single" w:color="D9D4C5" w:sz="4"/>
-              <w:right w:val="single" w:color="D9D4C5" w:sz="4"/>
-            </w:tcBorders>
+            <w:tcW w:type="dxa" w:w="3543"/>
+            <w:tcBorders>
+              <w:top w:val="single" w:color="D9D4C5" w:sz="4"/>
+              <w:left w:val="single" w:color="D9D4C5" w:sz="4"/>
+              <w:bottom w:val="single" w:color="D9D4C5" w:sz="4"/>
+              <w:right w:val="single" w:color="D9D4C5" w:sz="4"/>
+            </w:tcBorders>
+            <w:shd w:fill="F6F4EE" w:color="auto" w:val="clear"/>
             <w:tcMar>
               <w:top w:type="dxa" w:w="70"/>
               <w:left w:type="dxa" w:w="110"/>
@@ -16152,13 +16709,14 @@
         </w:tc>
         <w:tc>
           <w:tcPr>
-            <w:tcW w:type="dxa" w:w="3246"/>
-            <w:tcBorders>
-              <w:top w:val="single" w:color="D9D4C5" w:sz="4"/>
-              <w:left w:val="single" w:color="D9D4C5" w:sz="4"/>
-              <w:bottom w:val="single" w:color="D9D4C5" w:sz="4"/>
-              <w:right w:val="single" w:color="D9D4C5" w:sz="4"/>
-            </w:tcBorders>
+            <w:tcW w:type="dxa" w:w="3261"/>
+            <w:tcBorders>
+              <w:top w:val="single" w:color="D9D4C5" w:sz="4"/>
+              <w:left w:val="single" w:color="D9D4C5" w:sz="4"/>
+              <w:bottom w:val="single" w:color="D9D4C5" w:sz="4"/>
+              <w:right w:val="single" w:color="D9D4C5" w:sz="4"/>
+            </w:tcBorders>
+            <w:shd w:fill="F6F4EE" w:color="auto" w:val="clear"/>
             <w:tcMar>
               <w:top w:type="dxa" w:w="70"/>
               <w:left w:type="dxa" w:w="110"/>
@@ -16189,14 +16747,13 @@
         </w:trPr>
         <w:tc>
           <w:tcPr>
-            <w:tcW w:type="dxa" w:w="2827"/>
-            <w:tcBorders>
-              <w:top w:val="single" w:color="D9D4C5" w:sz="4"/>
-              <w:left w:val="single" w:color="D9D4C5" w:sz="4"/>
-              <w:bottom w:val="single" w:color="D9D4C5" w:sz="4"/>
-              <w:right w:val="single" w:color="D9D4C5" w:sz="4"/>
-            </w:tcBorders>
-            <w:shd w:fill="F6F4EE" w:color="auto" w:val="clear"/>
+            <w:tcW w:type="dxa" w:w="2834"/>
+            <w:tcBorders>
+              <w:top w:val="single" w:color="D9D4C5" w:sz="4"/>
+              <w:left w:val="single" w:color="D9D4C5" w:sz="4"/>
+              <w:bottom w:val="single" w:color="D9D4C5" w:sz="4"/>
+              <w:right w:val="single" w:color="D9D4C5" w:sz="4"/>
+            </w:tcBorders>
             <w:tcMar>
               <w:top w:type="dxa" w:w="70"/>
               <w:left w:type="dxa" w:w="110"/>
@@ -16222,27 +16779,26 @@
         </w:tc>
         <w:tc>
           <w:tcPr>
-            <w:tcW w:type="dxa" w:w="3565"/>
-            <w:tcBorders>
-              <w:top w:val="single" w:color="D9D4C5" w:sz="4"/>
-              <w:left w:val="single" w:color="D9D4C5" w:sz="4"/>
-              <w:bottom w:val="single" w:color="D9D4C5" w:sz="4"/>
-              <w:right w:val="single" w:color="D9D4C5" w:sz="4"/>
-            </w:tcBorders>
-            <w:shd w:fill="F6F4EE" w:color="auto" w:val="clear"/>
-            <w:tcMar>
-              <w:top w:type="dxa" w:w="70"/>
-              <w:left w:type="dxa" w:w="110"/>
-              <w:bottom w:type="dxa" w:w="70"/>
-              <w:right w:type="dxa" w:w="110"/>
-            </w:tcMar>
-            <w:vAlign w:val="center"/>
-          </w:tcPr>
-          <w:p>
-            <w:pPr>
-              <w:spacing w:after="0" w:before="0"/>
-            </w:pPr>
-            <w:hyperlink w:history="1" r:id="rIdyrx6lgjpmtt6nbxsi4ept">
+            <w:tcW w:type="dxa" w:w="3543"/>
+            <w:tcBorders>
+              <w:top w:val="single" w:color="D9D4C5" w:sz="4"/>
+              <w:left w:val="single" w:color="D9D4C5" w:sz="4"/>
+              <w:bottom w:val="single" w:color="D9D4C5" w:sz="4"/>
+              <w:right w:val="single" w:color="D9D4C5" w:sz="4"/>
+            </w:tcBorders>
+            <w:tcMar>
+              <w:top w:type="dxa" w:w="70"/>
+              <w:left w:type="dxa" w:w="110"/>
+              <w:bottom w:type="dxa" w:w="70"/>
+              <w:right w:type="dxa" w:w="110"/>
+            </w:tcMar>
+            <w:vAlign w:val="center"/>
+          </w:tcPr>
+          <w:p>
+            <w:pPr>
+              <w:spacing w:after="0" w:before="0"/>
+            </w:pPr>
+            <w:hyperlink w:history="1" r:id="rIdpmg5jdenao3eccock6b3a">
               <w:r>
                 <w:rPr>
                   <w:rFonts w:ascii="Arial" w:cs="Arial" w:eastAsia="Arial" w:hAnsi="Arial"/>
@@ -16267,14 +16823,13 @@
         </w:tc>
         <w:tc>
           <w:tcPr>
-            <w:tcW w:type="dxa" w:w="3246"/>
-            <w:tcBorders>
-              <w:top w:val="single" w:color="D9D4C5" w:sz="4"/>
-              <w:left w:val="single" w:color="D9D4C5" w:sz="4"/>
-              <w:bottom w:val="single" w:color="D9D4C5" w:sz="4"/>
-              <w:right w:val="single" w:color="D9D4C5" w:sz="4"/>
-            </w:tcBorders>
-            <w:shd w:fill="F6F4EE" w:color="auto" w:val="clear"/>
+            <w:tcW w:type="dxa" w:w="3261"/>
+            <w:tcBorders>
+              <w:top w:val="single" w:color="D9D4C5" w:sz="4"/>
+              <w:left w:val="single" w:color="D9D4C5" w:sz="4"/>
+              <w:bottom w:val="single" w:color="D9D4C5" w:sz="4"/>
+              <w:right w:val="single" w:color="D9D4C5" w:sz="4"/>
+            </w:tcBorders>
             <w:tcMar>
               <w:top w:type="dxa" w:w="70"/>
               <w:left w:type="dxa" w:w="110"/>
@@ -16305,13 +16860,14 @@
         </w:trPr>
         <w:tc>
           <w:tcPr>
-            <w:tcW w:type="dxa" w:w="2827"/>
-            <w:tcBorders>
-              <w:top w:val="single" w:color="D9D4C5" w:sz="4"/>
-              <w:left w:val="single" w:color="D9D4C5" w:sz="4"/>
-              <w:bottom w:val="single" w:color="D9D4C5" w:sz="4"/>
-              <w:right w:val="single" w:color="D9D4C5" w:sz="4"/>
-            </w:tcBorders>
+            <w:tcW w:type="dxa" w:w="2834"/>
+            <w:tcBorders>
+              <w:top w:val="single" w:color="D9D4C5" w:sz="4"/>
+              <w:left w:val="single" w:color="D9D4C5" w:sz="4"/>
+              <w:bottom w:val="single" w:color="D9D4C5" w:sz="4"/>
+              <w:right w:val="single" w:color="D9D4C5" w:sz="4"/>
+            </w:tcBorders>
+            <w:shd w:fill="F6F4EE" w:color="auto" w:val="clear"/>
             <w:tcMar>
               <w:top w:type="dxa" w:w="70"/>
               <w:left w:type="dxa" w:w="110"/>
@@ -16337,13 +16893,14 @@
         </w:tc>
         <w:tc>
           <w:tcPr>
-            <w:tcW w:type="dxa" w:w="3565"/>
-            <w:tcBorders>
-              <w:top w:val="single" w:color="D9D4C5" w:sz="4"/>
-              <w:left w:val="single" w:color="D9D4C5" w:sz="4"/>
-              <w:bottom w:val="single" w:color="D9D4C5" w:sz="4"/>
-              <w:right w:val="single" w:color="D9D4C5" w:sz="4"/>
-            </w:tcBorders>
+            <w:tcW w:type="dxa" w:w="3543"/>
+            <w:tcBorders>
+              <w:top w:val="single" w:color="D9D4C5" w:sz="4"/>
+              <w:left w:val="single" w:color="D9D4C5" w:sz="4"/>
+              <w:bottom w:val="single" w:color="D9D4C5" w:sz="4"/>
+              <w:right w:val="single" w:color="D9D4C5" w:sz="4"/>
+            </w:tcBorders>
+            <w:shd w:fill="F6F4EE" w:color="auto" w:val="clear"/>
             <w:tcMar>
               <w:top w:type="dxa" w:w="70"/>
               <w:left w:type="dxa" w:w="110"/>
@@ -16369,13 +16926,14 @@
         </w:tc>
         <w:tc>
           <w:tcPr>
-            <w:tcW w:type="dxa" w:w="3246"/>
-            <w:tcBorders>
-              <w:top w:val="single" w:color="D9D4C5" w:sz="4"/>
-              <w:left w:val="single" w:color="D9D4C5" w:sz="4"/>
-              <w:bottom w:val="single" w:color="D9D4C5" w:sz="4"/>
-              <w:right w:val="single" w:color="D9D4C5" w:sz="4"/>
-            </w:tcBorders>
+            <w:tcW w:type="dxa" w:w="3261"/>
+            <w:tcBorders>
+              <w:top w:val="single" w:color="D9D4C5" w:sz="4"/>
+              <w:left w:val="single" w:color="D9D4C5" w:sz="4"/>
+              <w:bottom w:val="single" w:color="D9D4C5" w:sz="4"/>
+              <w:right w:val="single" w:color="D9D4C5" w:sz="4"/>
+            </w:tcBorders>
+            <w:shd w:fill="F6F4EE" w:color="auto" w:val="clear"/>
             <w:tcMar>
               <w:top w:type="dxa" w:w="70"/>
               <w:left w:type="dxa" w:w="110"/>
@@ -19154,7 +19712,7 @@
         <w:szCs w:val="16"/>
       </w:rPr>
       <w:tab/>
-      <w:t xml:space="preserve">Registro sviluppo e deploy · Rev. 1.2 · 18/10/2026</w:t>
+      <w:t xml:space="preserve">Registro sviluppo e deploy · Rev. 1.3 · 18/10/2026</w:t>
     </w:r>
   </w:p>
 </w:hdr>
@@ -19219,7 +19777,7 @@
         <w:szCs w:val="16"/>
       </w:rPr>
       <w:tab/>
-      <w:t xml:space="preserve">Registro sviluppo e deploy · Rev. 1.2 · 18/10/2026</w:t>
+      <w:t xml:space="preserve">Registro sviluppo e deploy · Rev. 1.3 · 18/10/2026</w:t>
     </w:r>
   </w:p>
 </w:hdr>

</xml_diff>

<commit_message>
Manuale Test (test-user) in Word/PDF, solo Admin; regole di lavoro e backlog 31-32 nel registro
Co-Authored-By: Claude Opus 5.5 <noreply@anthropic.com>
Claude-Session: https://claude.ai/code/session_01E8XCbEeVHWVP3hntUZ6kZ1
</commit_message>
<xml_diff>
--- a/public/documentazione/Registro_Dev_Deploy_Portale_CWP.docx
+++ b/public/documentazione/Registro_Dev_Deploy_Portale_CWP.docx
@@ -302,7 +302,7 @@
                 <w:sz w:val="20"/>
                 <w:szCs w:val="20"/>
               </w:rPr>
-              <w:t xml:space="preserve">Rev. 1.3</w:t>
+              <w:t xml:space="preserve">Rev. 1.4</w:t>
             </w:r>
           </w:p>
         </w:tc>
@@ -719,7 +719,7 @@
                 <w:sz w:val="18"/>
                 <w:szCs w:val="18"/>
               </w:rPr>
-              <w:t xml:space="preserve">1.3</w:t>
+              <w:t xml:space="preserve">1.4</w:t>
             </w:r>
           </w:p>
         </w:tc>
@@ -783,7 +783,7 @@
                 <w:sz w:val="18"/>
                 <w:szCs w:val="18"/>
               </w:rPr>
-              <w:t xml:space="preserve">Manuale Amministratore in Word/PDF; Manuale Utente solo in PDF per gli utenti e anche in «I tuoi documenti».</w:t>
+              <w:t xml:space="preserve">Manuale Test; regole di lavoro (quattro documenti aggiornati insieme, codice commentato); backlog 31 e 32.</w:t>
             </w:r>
           </w:p>
         </w:tc>
@@ -853,7 +853,7 @@
                 <w:sz w:val="18"/>
                 <w:szCs w:val="18"/>
               </w:rPr>
-              <w:t xml:space="preserve">1.2</w:t>
+              <w:t xml:space="preserve">1.3</w:t>
             </w:r>
           </w:p>
         </w:tc>
@@ -919,7 +919,7 @@
                 <w:sz w:val="18"/>
                 <w:szCs w:val="18"/>
               </w:rPr>
-              <w:t xml:space="preserve">Pagina «Il mio profilo»; password (script 15 e 16, Edge Functions reimposta-password e recupera-password); SMTP Resend; email di recupero in italiano spedita dal portale.</w:t>
+              <w:t xml:space="preserve">Manuale Amministratore in Word/PDF; Manuale Utente solo in PDF per gli utenti e anche in «I tuoi documenti».</w:t>
             </w:r>
           </w:p>
         </w:tc>
@@ -989,7 +989,7 @@
                 <w:sz w:val="18"/>
                 <w:szCs w:val="18"/>
               </w:rPr>
-              <w:t xml:space="preserve">1.1</w:t>
+              <w:t xml:space="preserve">1.2</w:t>
             </w:r>
           </w:p>
         </w:tc>
@@ -1053,7 +1053,7 @@
                 <w:sz w:val="18"/>
                 <w:szCs w:val="18"/>
               </w:rPr>
-              <w:t xml:space="preserve">Pagina Documentazione; backlog riordinato; decisione di passare Vercel e Supabase a piani a pagamento (punto 29); riservatezza della documentazione (punto 28).</w:t>
+              <w:t xml:space="preserve">Pagina «Il mio profilo»; password (script 15 e 16, Edge Functions reimposta-password e recupera-password); SMTP Resend; email di recupero in italiano spedita dal portale.</w:t>
             </w:r>
           </w:p>
         </w:tc>
@@ -1123,6 +1123,142 @@
                 <w:sz w:val="18"/>
                 <w:szCs w:val="18"/>
               </w:rPr>
+              <w:t xml:space="preserve">1.1</w:t>
+            </w:r>
+          </w:p>
+        </w:tc>
+        <w:tc>
+          <w:tcPr>
+            <w:tcW w:type="dxa" w:w="1300"/>
+            <w:tcBorders>
+              <w:top w:val="single" w:color="D9D4C5" w:sz="4"/>
+              <w:left w:val="single" w:color="D9D4C5" w:sz="4"/>
+              <w:bottom w:val="single" w:color="D9D4C5" w:sz="4"/>
+              <w:right w:val="single" w:color="D9D4C5" w:sz="4"/>
+            </w:tcBorders>
+            <w:shd w:fill="F6F4EE" w:color="auto" w:val="clear"/>
+            <w:tcMar>
+              <w:top w:type="dxa" w:w="70"/>
+              <w:left w:type="dxa" w:w="110"/>
+              <w:bottom w:type="dxa" w:w="70"/>
+              <w:right w:type="dxa" w:w="110"/>
+            </w:tcMar>
+            <w:vAlign w:val="center"/>
+          </w:tcPr>
+          <w:p>
+            <w:pPr>
+              <w:spacing w:after="0" w:before="0"/>
+            </w:pPr>
+            <w:r>
+              <w:rPr>
+                <w:rFonts w:ascii="Arial" w:cs="Arial" w:eastAsia="Arial" w:hAnsi="Arial"/>
+                <w:color w:val="1B2118"/>
+                <w:sz w:val="18"/>
+                <w:szCs w:val="18"/>
+              </w:rPr>
+              <w:t xml:space="preserve">18/10/2026</w:t>
+            </w:r>
+          </w:p>
+        </w:tc>
+        <w:tc>
+          <w:tcPr>
+            <w:tcW w:type="dxa" w:w="5538"/>
+            <w:tcBorders>
+              <w:top w:val="single" w:color="D9D4C5" w:sz="4"/>
+              <w:left w:val="single" w:color="D9D4C5" w:sz="4"/>
+              <w:bottom w:val="single" w:color="D9D4C5" w:sz="4"/>
+              <w:right w:val="single" w:color="D9D4C5" w:sz="4"/>
+            </w:tcBorders>
+            <w:shd w:fill="F6F4EE" w:color="auto" w:val="clear"/>
+            <w:tcMar>
+              <w:top w:type="dxa" w:w="70"/>
+              <w:left w:type="dxa" w:w="110"/>
+              <w:bottom w:type="dxa" w:w="70"/>
+              <w:right w:type="dxa" w:w="110"/>
+            </w:tcMar>
+            <w:vAlign w:val="center"/>
+          </w:tcPr>
+          <w:p>
+            <w:pPr>
+              <w:spacing w:after="0" w:before="0"/>
+            </w:pPr>
+            <w:r>
+              <w:rPr>
+                <w:rFonts w:ascii="Arial" w:cs="Arial" w:eastAsia="Arial" w:hAnsi="Arial"/>
+                <w:color w:val="1B2118"/>
+                <w:sz w:val="18"/>
+                <w:szCs w:val="18"/>
+              </w:rPr>
+              <w:t xml:space="preserve">Pagina Documentazione; backlog riordinato; decisione di passare Vercel e Supabase a piani a pagamento (punto 29); riservatezza della documentazione (punto 28).</w:t>
+            </w:r>
+          </w:p>
+        </w:tc>
+        <w:tc>
+          <w:tcPr>
+            <w:tcW w:type="dxa" w:w="2000"/>
+            <w:tcBorders>
+              <w:top w:val="single" w:color="D9D4C5" w:sz="4"/>
+              <w:left w:val="single" w:color="D9D4C5" w:sz="4"/>
+              <w:bottom w:val="single" w:color="D9D4C5" w:sz="4"/>
+              <w:right w:val="single" w:color="D9D4C5" w:sz="4"/>
+            </w:tcBorders>
+            <w:shd w:fill="F6F4EE" w:color="auto" w:val="clear"/>
+            <w:tcMar>
+              <w:top w:type="dxa" w:w="70"/>
+              <w:left w:type="dxa" w:w="110"/>
+              <w:bottom w:type="dxa" w:w="70"/>
+              <w:right w:type="dxa" w:w="110"/>
+            </w:tcMar>
+            <w:vAlign w:val="center"/>
+          </w:tcPr>
+          <w:p>
+            <w:pPr>
+              <w:spacing w:after="0" w:before="0"/>
+            </w:pPr>
+            <w:r>
+              <w:rPr>
+                <w:rFonts w:ascii="Arial" w:cs="Arial" w:eastAsia="Arial" w:hAnsi="Arial"/>
+                <w:color w:val="1B2118"/>
+                <w:sz w:val="18"/>
+                <w:szCs w:val="18"/>
+              </w:rPr>
+              <w:t xml:space="preserve">Fondazione Operate</w:t>
+            </w:r>
+          </w:p>
+        </w:tc>
+      </w:tr>
+      <w:tr>
+        <w:trPr>
+          <w:cantSplit/>
+        </w:trPr>
+        <w:tc>
+          <w:tcPr>
+            <w:tcW w:type="dxa" w:w="800"/>
+            <w:tcBorders>
+              <w:top w:val="single" w:color="D9D4C5" w:sz="4"/>
+              <w:left w:val="single" w:color="D9D4C5" w:sz="4"/>
+              <w:bottom w:val="single" w:color="D9D4C5" w:sz="4"/>
+              <w:right w:val="single" w:color="D9D4C5" w:sz="4"/>
+            </w:tcBorders>
+            <w:tcMar>
+              <w:top w:type="dxa" w:w="70"/>
+              <w:left w:type="dxa" w:w="110"/>
+              <w:bottom w:type="dxa" w:w="70"/>
+              <w:right w:type="dxa" w:w="110"/>
+            </w:tcMar>
+            <w:vAlign w:val="center"/>
+          </w:tcPr>
+          <w:p>
+            <w:pPr>
+              <w:spacing w:after="0" w:before="0"/>
+            </w:pPr>
+            <w:r>
+              <w:rPr>
+                <w:rFonts w:ascii="Arial" w:cs="Arial" w:eastAsia="Arial" w:hAnsi="Arial"/>
+                <w:color w:val="1B2118"/>
+                <w:sz w:val="18"/>
+                <w:szCs w:val="18"/>
+              </w:rPr>
               <w:t xml:space="preserve">1.0</w:t>
             </w:r>
           </w:p>
@@ -1136,7 +1272,6 @@
               <w:bottom w:val="single" w:color="D9D4C5" w:sz="4"/>
               <w:right w:val="single" w:color="D9D4C5" w:sz="4"/>
             </w:tcBorders>
-            <w:shd w:fill="F6F4EE" w:color="auto" w:val="clear"/>
             <w:tcMar>
               <w:top w:type="dxa" w:w="70"/>
               <w:left w:type="dxa" w:w="110"/>
@@ -1169,7 +1304,6 @@
               <w:bottom w:val="single" w:color="D9D4C5" w:sz="4"/>
               <w:right w:val="single" w:color="D9D4C5" w:sz="4"/>
             </w:tcBorders>
-            <w:shd w:fill="F6F4EE" w:color="auto" w:val="clear"/>
             <w:tcMar>
               <w:top w:type="dxa" w:w="70"/>
               <w:left w:type="dxa" w:w="110"/>
@@ -1202,7 +1336,6 @@
               <w:bottom w:val="single" w:color="D9D4C5" w:sz="4"/>
               <w:right w:val="single" w:color="D9D4C5" w:sz="4"/>
             </w:tcBorders>
-            <w:shd w:fill="F6F4EE" w:color="auto" w:val="clear"/>
             <w:tcMar>
               <w:top w:type="dxa" w:w="70"/>
               <w:left w:type="dxa" w:w="110"/>
@@ -1244,7 +1377,7 @@
           <w:sz w:val="20"/>
           <w:szCs w:val="20"/>
         </w:rPr>
-        <w:t xml:space="preserve">Fotografia del registro alla revisione 1.3 del 18/10/2026. Il registro è aggiornato a ogni nuova funzione, servizio o rilascio; la versione corrente si scarica dall'area Documentazione del portale (solo Amministratori).</w:t>
+        <w:t xml:space="preserve">Fotografia del registro alla revisione 1.4 del 18/10/2026. Il registro è aggiornato a ogni nuova funzione, servizio o rilascio; la versione corrente si scarica dall'area Documentazione del portale (solo Amministratori).</w:t>
       </w:r>
     </w:p>
     <w:p>
@@ -1743,7 +1876,7 @@
             <w:szCs w:val="22"/>
           </w:rPr>
           <w:tab/>
-          <w:t xml:space="preserve">16</w:t>
+          <w:t xml:space="preserve">17</w:t>
         </w:r>
       </w:hyperlink>
     </w:p>
@@ -1772,7 +1905,7 @@
             <w:szCs w:val="22"/>
           </w:rPr>
           <w:tab/>
-          <w:t xml:space="preserve">17</w:t>
+          <w:t xml:space="preserve">18</w:t>
         </w:r>
       </w:hyperlink>
     </w:p>
@@ -1801,7 +1934,7 @@
             <w:szCs w:val="22"/>
           </w:rPr>
           <w:tab/>
-          <w:t xml:space="preserve">18</w:t>
+          <w:t xml:space="preserve">19</w:t>
         </w:r>
       </w:hyperlink>
     </w:p>
@@ -1830,7 +1963,7 @@
             <w:szCs w:val="22"/>
           </w:rPr>
           <w:tab/>
-          <w:t xml:space="preserve">20</w:t>
+          <w:t xml:space="preserve">21</w:t>
         </w:r>
       </w:hyperlink>
     </w:p>
@@ -12504,6 +12637,78 @@
           <w:sz w:val="21"/>
           <w:szCs w:val="21"/>
         </w:rPr>
+        <w:t xml:space="preserve">Regole di lavoro (richieste di Luca del 18/10)</w:t>
+      </w:r>
+    </w:p>
+    <w:p>
+      <w:pPr>
+        <w:pStyle w:val="ListParagraph"/>
+        <w:numPr>
+          <w:ilvl w:val="0"/>
+          <w:numId w:val="3"/>
+        </w:numPr>
+        <w:spacing w:after="70" w:line="290"/>
+      </w:pPr>
+      <w:r>
+        <w:rPr>
+          <w:rFonts w:ascii="Arial" w:cs="Arial" w:eastAsia="Arial" w:hAnsi="Arial"/>
+          <w:color w:val="1B2118"/>
+          <w:sz w:val="21"/>
+          <w:szCs w:val="21"/>
+        </w:rPr>
+        <w:t xml:space="preserve">A ogni rilascio si aggiornano insieme quattro documenti: questo Registro, il Manuale Utente, il Manuale Amministratore e il Manuale Test (</w:t>
+      </w:r>
+      <w:r>
+        <w:rPr>
+          <w:rFonts w:ascii="Consolas" w:cs="Consolas" w:eastAsia="Consolas" w:hAnsi="Consolas"/>
+          <w:color w:val="2F5D3A"/>
+          <w:sz w:val="21"/>
+          <w:szCs w:val="21"/>
+        </w:rPr>
+        <w:t xml:space="preserve">docs/manuale-test.md</w:t>
+      </w:r>
+      <w:r>
+        <w:rPr>
+          <w:rFonts w:ascii="Arial" w:cs="Arial" w:eastAsia="Arial" w:hAnsi="Arial"/>
+          <w:color w:val="1B2118"/>
+          <w:sz w:val="21"/>
+          <w:szCs w:val="21"/>
+        </w:rPr>
+        <w:t xml:space="preserve">, sintetico, per i collaudatori).</w:t>
+      </w:r>
+    </w:p>
+    <w:p>
+      <w:pPr>
+        <w:pStyle w:val="ListParagraph"/>
+        <w:numPr>
+          <w:ilvl w:val="0"/>
+          <w:numId w:val="3"/>
+        </w:numPr>
+        <w:spacing w:after="70" w:line="290"/>
+      </w:pPr>
+      <w:r>
+        <w:rPr>
+          <w:rFonts w:ascii="Arial" w:cs="Arial" w:eastAsia="Arial" w:hAnsi="Arial"/>
+          <w:color w:val="1B2118"/>
+          <w:sz w:val="21"/>
+          <w:szCs w:val="21"/>
+        </w:rPr>
+        <w:t xml:space="preserve">Il codice si commenta in italiano mentre si scrive: in testa a ogni file lo scopo e il capitolo del registro di riferimento; sopra ogni funzione cosa fa; nel corpo le regole di sicurezza e i passaggi non ovvi (punto 31).</w:t>
+      </w:r>
+    </w:p>
+    <w:p>
+      <w:pPr>
+        <w:spacing w:after="140" w:line="300"/>
+      </w:pPr>
+      <w:r>
+        <w:rPr>
+          <w:rFonts w:ascii="Arial" w:cs="Arial" w:eastAsia="Arial" w:hAnsi="Arial"/>
+          <w:b/>
+          <w:bCs/>
+          <w:color w:val="1B2118"/>
+          <w:sz w:val="21"/>
+          <w:szCs w:val="21"/>
+        </w:rPr>
         <w:t xml:space="preserve">Segreti</w:t>
       </w:r>
       <w:r>
@@ -12569,6 +12774,72 @@
           <w:szCs w:val="25"/>
         </w:rPr>
         <w:t xml:space="preserve">18 ottobre 2026</w:t>
+      </w:r>
+    </w:p>
+    <w:p>
+      <w:pPr>
+        <w:pStyle w:val="ListParagraph"/>
+        <w:numPr>
+          <w:ilvl w:val="0"/>
+          <w:numId w:val="3"/>
+        </w:numPr>
+        <w:spacing w:after="70" w:line="290"/>
+      </w:pPr>
+      <w:r>
+        <w:rPr>
+          <w:rFonts w:ascii="Arial" w:cs="Arial" w:eastAsia="Arial" w:hAnsi="Arial"/>
+          <w:b/>
+          <w:bCs/>
+          <w:color w:val="1B2118"/>
+          <w:sz w:val="21"/>
+          <w:szCs w:val="21"/>
+        </w:rPr>
+        <w:t xml:space="preserve">Manuale Test (test-user)</w:t>
+      </w:r>
+      <w:r>
+        <w:rPr>
+          <w:rFonts w:ascii="Arial" w:cs="Arial" w:eastAsia="Arial" w:hAnsi="Arial"/>
+          <w:color w:val="1B2118"/>
+          <w:sz w:val="21"/>
+          <w:szCs w:val="21"/>
+        </w:rPr>
+        <w:t xml:space="preserve"> — richiesta di Luca: guida sintetica per chi collauda il portale senza conoscere il Programma (metodo CWP in breve, ruolo del portale, percorso di prova in 8 blocchi dalla fase 1 al calcolo dei crediti con i risultati attesi, limiti noti). Sorgente </w:t>
+      </w:r>
+      <w:r>
+        <w:rPr>
+          <w:rFonts w:ascii="Consolas" w:cs="Consolas" w:eastAsia="Consolas" w:hAnsi="Consolas"/>
+          <w:color w:val="2F5D3A"/>
+          <w:sz w:val="21"/>
+          <w:szCs w:val="21"/>
+        </w:rPr>
+        <w:t xml:space="preserve">docs/manuale-test.md</w:t>
+      </w:r>
+      <w:r>
+        <w:rPr>
+          <w:rFonts w:ascii="Arial" w:cs="Arial" w:eastAsia="Arial" w:hAnsi="Arial"/>
+          <w:color w:val="1B2118"/>
+          <w:sz w:val="21"/>
+          <w:szCs w:val="21"/>
+        </w:rPr>
+        <w:t xml:space="preserve">, file </w:t>
+      </w:r>
+      <w:r>
+        <w:rPr>
+          <w:rFonts w:ascii="Consolas" w:cs="Consolas" w:eastAsia="Consolas" w:hAnsi="Consolas"/>
+          <w:color w:val="2F5D3A"/>
+          <w:sz w:val="21"/>
+          <w:szCs w:val="21"/>
+        </w:rPr>
+        <w:t xml:space="preserve">public/documentazione/Manuale_Test_Portale_CWP.{docx,pdf}</w:t>
+      </w:r>
+      <w:r>
+        <w:rPr>
+          <w:rFonts w:ascii="Arial" w:cs="Arial" w:eastAsia="Arial" w:hAnsi="Arial"/>
+          <w:color w:val="1B2118"/>
+          <w:sz w:val="21"/>
+          <w:szCs w:val="21"/>
+        </w:rPr>
+        <w:t xml:space="preserve">, scaricabile da Documentazione e dal profilo (solo Admin). Rev. 1.0. Aggiunti al backlog i punti 31 (codice commentato) e 32.</w:t>
       </w:r>
     </w:p>
     <w:p>
@@ -15334,7 +15605,7 @@
               </w:rPr>
               <w:t xml:space="preserve">Claude Doc: </w:t>
             </w:r>
-            <w:hyperlink w:history="1" r:id="rIdrrep3paupvvisxwlk-p2u">
+            <w:hyperlink w:history="1" r:id="rIdgilsn8rdsxbxq1a7b_8d5">
               <w:r>
                 <w:rPr>
                   <w:rFonts w:ascii="Arial" w:cs="Arial" w:eastAsia="Arial" w:hAnsi="Arial"/>
@@ -15681,7 +15952,7 @@
               </w:rPr>
               <w:t xml:space="preserve">Claude Doc: </w:t>
             </w:r>
-            <w:hyperlink w:history="1" r:id="rIdqebwppijnbsbqnhheeszv">
+            <w:hyperlink w:history="1" r:id="rIdd2y92fmzqye9qqkvw6y-e">
               <w:r>
                 <w:rPr>
                   <w:rFonts w:ascii="Arial" w:cs="Arial" w:eastAsia="Arial" w:hAnsi="Arial"/>
@@ -16256,7 +16527,7 @@
               </w:rPr>
               <w:t xml:space="preserve">Claude Doc: </w:t>
             </w:r>
-            <w:hyperlink w:history="1" r:id="rIdkdxfk6waupujjpv2vzm4b">
+            <w:hyperlink w:history="1" r:id="rIdqfmef7xdc_gtdf0jhcx0u">
               <w:r>
                 <w:rPr>
                   <w:rFonts w:ascii="Arial" w:cs="Arial" w:eastAsia="Arial" w:hAnsi="Arial"/>
@@ -16798,7 +17069,7 @@
             <w:pPr>
               <w:spacing w:after="0" w:before="0"/>
             </w:pPr>
-            <w:hyperlink w:history="1" r:id="rIdpmg5jdenao3eccock6b3a">
+            <w:hyperlink w:history="1" r:id="rIdtwoojn9mebopjhhiwacai">
               <w:r>
                 <w:rPr>
                   <w:rFonts w:ascii="Arial" w:cs="Arial" w:eastAsia="Arial" w:hAnsi="Arial"/>
@@ -18676,6 +18947,82 @@
           <w:szCs w:val="20"/>
         </w:rPr>
         <w:t xml:space="preserve">: procedura di risposta agli incidenti, valutazione d'impatto sulla protezione dei dati (DPIA) e registro dei trattamenti per i dati delle utenze, nomina dei fornitori (Vercel, Supabase, Resend) come responsabili del trattamento.</w:t>
+      </w:r>
+    </w:p>
+    <w:p>
+      <w:pPr>
+        <w:spacing w:after="140" w:line="300"/>
+      </w:pPr>
+      <w:r>
+        <w:rPr>
+          <w:rFonts w:ascii="Arial" w:cs="Arial" w:eastAsia="Arial" w:hAnsi="Arial"/>
+          <w:b/>
+          <w:bCs/>
+          <w:color w:val="1B2118"/>
+          <w:sz w:val="21"/>
+          <w:szCs w:val="21"/>
+        </w:rPr>
+        <w:t xml:space="preserve">Codice e documentazione — richieste di Luca del 18/10</w:t>
+      </w:r>
+    </w:p>
+    <w:p>
+      <w:pPr>
+        <w:pStyle w:val="ListParagraph"/>
+        <w:numPr>
+          <w:ilvl w:val="0"/>
+          <w:numId w:val="3"/>
+        </w:numPr>
+        <w:spacing w:after="70" w:line="290"/>
+      </w:pPr>
+      <w:r>
+        <w:rPr>
+          <w:rFonts w:ascii="Arial" w:cs="Arial" w:eastAsia="Arial" w:hAnsi="Arial"/>
+          <w:b/>
+          <w:bCs/>
+          <w:color w:val="1B2118"/>
+          <w:sz w:val="21"/>
+          <w:szCs w:val="21"/>
+        </w:rPr>
+        <w:t xml:space="preserve">31.</w:t>
+      </w:r>
+      <w:r>
+        <w:rPr>
+          <w:rFonts w:ascii="Arial" w:cs="Arial" w:eastAsia="Arial" w:hAnsi="Arial"/>
+          <w:color w:val="1B2118"/>
+          <w:sz w:val="21"/>
+          <w:szCs w:val="21"/>
+        </w:rPr>
+        <w:t xml:space="preserve"> Codice sorgente commentato per sviluppatori umani: ogni file (portale, script SQL, Edge Functions, strumenti) deve avere in testa lo scopo e il collegamento al capitolo del registro, e commenti in italiano su funzioni, regole di sicurezza e passaggi non ovvi. Vale anche per tutto il codice nuovo. Da completare con una revisione file per file.</w:t>
+      </w:r>
+    </w:p>
+    <w:p>
+      <w:pPr>
+        <w:pStyle w:val="ListParagraph"/>
+        <w:numPr>
+          <w:ilvl w:val="0"/>
+          <w:numId w:val="3"/>
+        </w:numPr>
+        <w:spacing w:after="70" w:line="290"/>
+      </w:pPr>
+      <w:r>
+        <w:rPr>
+          <w:rFonts w:ascii="Arial" w:cs="Arial" w:eastAsia="Arial" w:hAnsi="Arial"/>
+          <w:b/>
+          <w:bCs/>
+          <w:color w:val="1B2118"/>
+          <w:sz w:val="21"/>
+          <w:szCs w:val="21"/>
+        </w:rPr>
+        <w:t xml:space="preserve">32.</w:t>
+      </w:r>
+      <w:r>
+        <w:rPr>
+          <w:rFonts w:ascii="Arial" w:cs="Arial" w:eastAsia="Arial" w:hAnsi="Arial"/>
+          <w:color w:val="1B2118"/>
+          <w:sz w:val="21"/>
+          <w:szCs w:val="21"/>
+        </w:rPr>
+        <w:t xml:space="preserve"> Manuale Test (test-user): guida sintetica per i collaudatori, riservata agli Amministratori, da aggiornare a ogni rilascio insieme a registro, Manuale Utente e Manuale Amministratore.</w:t>
       </w:r>
     </w:p>
     <w:p>
@@ -19712,7 +20059,7 @@
         <w:szCs w:val="16"/>
       </w:rPr>
       <w:tab/>
-      <w:t xml:space="preserve">Registro sviluppo e deploy · Rev. 1.3 · 18/10/2026</w:t>
+      <w:t xml:space="preserve">Registro sviluppo e deploy · Rev. 1.4 · 18/10/2026</w:t>
     </w:r>
   </w:p>
 </w:hdr>
@@ -19777,7 +20124,7 @@
         <w:szCs w:val="16"/>
       </w:rPr>
       <w:tab/>
-      <w:t xml:space="preserve">Registro sviluppo e deploy · Rev. 1.3 · 18/10/2026</w:t>
+      <w:t xml:space="preserve">Registro sviluppo e deploy · Rev. 1.4 · 18/10/2026</w:t>
     </w:r>
   </w:p>
 </w:hdr>

</xml_diff>

<commit_message>
Registro: inventario del codice riallineato
Co-Authored-By: Claude Opus 5.5 <noreply@anthropic.com>
Claude-Session: https://claude.ai/code/session_01E8XCbEeVHWVP3hntUZ6kZ1
</commit_message>
<xml_diff>
--- a/public/documentazione/Registro_Dev_Deploy_Portale_CWP.docx
+++ b/public/documentazione/Registro_Dev_Deploy_Portale_CWP.docx
@@ -20545,7 +20545,7 @@
               </w:rPr>
               <w:t xml:space="preserve">Claude Doc: </w:t>
             </w:r>
-            <w:hyperlink w:history="1" r:id="rIdavoinxjxe193_pcsn9fas">
+            <w:hyperlink w:history="1" r:id="rIdvu-g-a_nuuwpepadzgroo">
               <w:r>
                 <w:rPr>
                   <w:rFonts w:ascii="Arial" w:cs="Arial" w:eastAsia="Arial" w:hAnsi="Arial"/>
@@ -20892,7 +20892,7 @@
               </w:rPr>
               <w:t xml:space="preserve">Claude Doc: </w:t>
             </w:r>
-            <w:hyperlink w:history="1" r:id="rIdhpajggzjuqid0hab-pjbl">
+            <w:hyperlink w:history="1" r:id="rIdf84lbgbf5cj11wwjjihod">
               <w:r>
                 <w:rPr>
                   <w:rFonts w:ascii="Arial" w:cs="Arial" w:eastAsia="Arial" w:hAnsi="Arial"/>
@@ -21496,7 +21496,7 @@
               </w:rPr>
               <w:t xml:space="preserve">Claude Doc: </w:t>
             </w:r>
-            <w:hyperlink w:history="1" r:id="rIdbeouleqb8txpeenw5p7bz">
+            <w:hyperlink w:history="1" r:id="rIdnzrf1d4ydo7yrmny0ktez">
               <w:r>
                 <w:rPr>
                   <w:rFonts w:ascii="Arial" w:cs="Arial" w:eastAsia="Arial" w:hAnsi="Arial"/>
@@ -22067,7 +22067,7 @@
             <w:pPr>
               <w:spacing w:after="0" w:before="0"/>
             </w:pPr>
-            <w:hyperlink w:history="1" r:id="rId3djjxf0vfiwfwregyelym">
+            <w:hyperlink w:history="1" r:id="rIdsmgy6nfvxxk9qdcvhdv0o">
               <w:r>
                 <w:rPr>
                   <w:rFonts w:ascii="Arial" w:cs="Arial" w:eastAsia="Arial" w:hAnsi="Arial"/>
@@ -32227,7 +32227,7 @@
           <w:sz w:val="21"/>
           <w:szCs w:val="21"/>
         </w:rPr>
-        <w:t xml:space="preserve">: 91 file, 19.494 righe in tutto.</w:t>
+        <w:t xml:space="preserve">: 91 file, 19.500 righe in tutto.</w:t>
       </w:r>
     </w:p>
     <w:p>
@@ -42709,7 +42709,7 @@
                 <w:sz w:val="18"/>
                 <w:szCs w:val="18"/>
               </w:rPr>
-              <w:t xml:space="preserve">160</w:t>
+              <w:t xml:space="preserve">166</w:t>
             </w:r>
           </w:p>
         </w:tc>

</xml_diff>

<commit_message>
Registro: punto 33 chiuso, decisione sull'audit
Co-Authored-By: Claude Opus 5.5 <noreply@anthropic.com>
Claude-Session: https://claude.ai/code/session_01E8XCbEeVHWVP3hntUZ6kZ1
</commit_message>
<xml_diff>
--- a/public/documentazione/Registro_Dev_Deploy_Portale_CWP.docx
+++ b/public/documentazione/Registro_Dev_Deploy_Portale_CWP.docx
@@ -783,7 +783,7 @@
                 <w:sz w:val="18"/>
                 <w:szCs w:val="18"/>
               </w:rPr>
-              <w:t xml:space="preserve">Script 20 (rinforzi di integrità, ora italiana nel database), funzioni crea-utente e consultazione-pubblica ripubblicate, punto 33 quasi completato.</w:t>
+              <w:t xml:space="preserve">Script 20 (rinforzi di integrità, ora italiana nel database), funzioni crea-utente e consultazione-pubblica ripubblicate, punto 33 completato; decisione sull'audit.</w:t>
             </w:r>
           </w:p>
         </w:tc>
@@ -17717,7 +17717,7 @@
           <w:sz w:val="21"/>
           <w:szCs w:val="21"/>
         </w:rPr>
-        <w:t xml:space="preserve"> per cui si potevano salvare dati nuovi e confermare il risultato calcolato su quelli vecchi; ora ogni modifica dei dati o della Banca Dati Utenze azzera il risultato salvato, la conferma richiede che le righe salvate siano quelle usate nel calcolo e la nuova versione si crea nel database in un'unica operazione; (5) chi ha una password temporanea non vede né scrive dati finché non la cambia (prima lo imponeva solo l'interfaccia). Rimossi i componenti del prototipo non usati. Il limite di 10 Rapporti era già garantito dal database (segnalazione del 18/10 errata). Effetto pratico: i calcoli in bozza calcolati prima di oggi vanno ricalcolati («Calcola») prima della conferma.</w:t>
+        <w:t xml:space="preserve"> per cui si potevano salvare dati nuovi e confermare il risultato calcolato su quelli vecchi; ora ogni modifica dei dati o della Banca Dati Utenze azzera il risultato salvato, la conferma richiede che le righe salvate siano quelle usate nel calcolo e la nuova versione si crea nel database in un'unica operazione; (5) chi ha una password temporanea non vede né scrive dati finché non la cambia (prima lo imponeva solo l'interfaccia). Rimossi i componenti del prototipo non usati. Decisione di Luca: l'audit resta leggibile da tutto lo staff. Il limite di 10 Rapporti era già garantito dal database (segnalazione del 18/10 errata). Effetto pratico: i calcoli in bozza calcolati prima di oggi vanno ricalcolati («Calcola») prima della conferma.</w:t>
       </w:r>
     </w:p>
     <w:p>
@@ -21221,7 +21221,7 @@
               </w:rPr>
               <w:t xml:space="preserve">Claude Doc: </w:t>
             </w:r>
-            <w:hyperlink w:history="1" r:id="rIdlavd2pjturlxo4kfcuxtv">
+            <w:hyperlink w:history="1" r:id="rIdndc44vv_3e3f2_66mezcv">
               <w:r>
                 <w:rPr>
                   <w:rFonts w:ascii="Arial" w:cs="Arial" w:eastAsia="Arial" w:hAnsi="Arial"/>
@@ -21568,7 +21568,7 @@
               </w:rPr>
               <w:t xml:space="preserve">Claude Doc: </w:t>
             </w:r>
-            <w:hyperlink w:history="1" r:id="rIdst5jdaz_hmf8v-msp4uu3">
+            <w:hyperlink w:history="1" r:id="rIdqaxcyk9vozky4hxwkczm5">
               <w:r>
                 <w:rPr>
                   <w:rFonts w:ascii="Arial" w:cs="Arial" w:eastAsia="Arial" w:hAnsi="Arial"/>
@@ -22172,7 +22172,7 @@
               </w:rPr>
               <w:t xml:space="preserve">Claude Doc: </w:t>
             </w:r>
-            <w:hyperlink w:history="1" r:id="rIdtn7xv01c68xi-ecw5w93a">
+            <w:hyperlink w:history="1" r:id="rIdeki15ndobmeot6-mxdila">
               <w:r>
                 <w:rPr>
                   <w:rFonts w:ascii="Arial" w:cs="Arial" w:eastAsia="Arial" w:hAnsi="Arial"/>
@@ -22743,7 +22743,7 @@
             <w:pPr>
               <w:spacing w:after="0" w:before="0"/>
             </w:pPr>
-            <w:hyperlink w:history="1" r:id="rIdvkmyhotibftpjwrvvfbwv">
+            <w:hyperlink w:history="1" r:id="rIdpbyu2afkj3emoegjk7zzm">
               <w:r>
                 <w:rPr>
                   <w:rFonts w:ascii="Arial" w:cs="Arial" w:eastAsia="Arial" w:hAnsi="Arial"/>
@@ -23319,6 +23319,25 @@
     </w:p>
     <w:p>
       <w:pPr>
+        <w:pStyle w:val="ListParagraph"/>
+        <w:numPr>
+          <w:ilvl w:val="0"/>
+          <w:numId w:val="3"/>
+        </w:numPr>
+        <w:spacing w:after="70" w:line="290"/>
+      </w:pPr>
+      <w:r>
+        <w:rPr>
+          <w:rFonts w:ascii="Arial" w:cs="Arial" w:eastAsia="Arial" w:hAnsi="Arial"/>
+          <w:color w:val="1B2118"/>
+          <w:sz w:val="21"/>
+          <w:szCs w:val="21"/>
+        </w:rPr>
+        <w:t xml:space="preserve">18/10 — Audit: resta leggibile dal database da tutto lo staff (serve alla cronologia nel fascicolo esportato dagli Operatori); la pagina Audit resta solo per gli Amministratori.</w:t>
+      </w:r>
+    </w:p>
+    <w:p>
+      <w:pPr>
         <w:spacing w:after="140" w:line="300"/>
       </w:pPr>
       <w:r>
@@ -25062,7 +25081,8 @@
           <w:rFonts w:ascii="Arial" w:cs="Arial" w:eastAsia="Arial" w:hAnsi="Arial"/>
           <w:b/>
           <w:bCs/>
-          <w:color w:val="1B2118"/>
+          <w:strike/>
+          <w:color w:val="5A5E54"/>
           <w:sz w:val="21"/>
           <w:szCs w:val="21"/>
         </w:rPr>
@@ -25071,11 +25091,21 @@
       <w:r>
         <w:rPr>
           <w:rFonts w:ascii="Arial" w:cs="Arial" w:eastAsia="Arial" w:hAnsi="Arial"/>
-          <w:color w:val="1B2118"/>
-          <w:sz w:val="21"/>
-          <w:szCs w:val="21"/>
-        </w:rPr>
-        <w:t xml:space="preserve"> Pulizia e rinforzi emersi dalla revisione del codice del 18/10 — in gran parte fatto il 18/10 (script 20):</w:t>
+          <w:strike/>
+          <w:color w:val="5A5E54"/>
+          <w:sz w:val="21"/>
+          <w:szCs w:val="21"/>
+        </w:rPr>
+        <w:t xml:space="preserve"> Pulizia e rinforzi emersi dalla revisione del codice del 18/10</w:t>
+      </w:r>
+      <w:r>
+        <w:rPr>
+          <w:rFonts w:ascii="Arial" w:cs="Arial" w:eastAsia="Arial" w:hAnsi="Arial"/>
+          <w:color w:val="1B2118"/>
+          <w:sz w:val="21"/>
+          <w:szCs w:val="21"/>
+        </w:rPr>
+        <w:t xml:space="preserve"> — fatto il 18/10 (script 20):</w:t>
       </w:r>
     </w:p>
     <w:p>
@@ -25420,13 +25450,12 @@
       <w:r>
         <w:rPr>
           <w:rFonts w:ascii="Arial" w:cs="Arial" w:eastAsia="Arial" w:hAnsi="Arial"/>
-          <w:b/>
-          <w:bCs/>
-          <w:color w:val="1B2118"/>
+          <w:strike/>
+          <w:color w:val="5A5E54"/>
           <w:sz w:val="20"/>
           <w:szCs w:val="20"/>
         </w:rPr>
-        <w:t xml:space="preserve">da decidere (Luca):</w:t>
+        <w:t xml:space="preserve">audit leggibile da tutto lo staff</w:t>
       </w:r>
       <w:r>
         <w:rPr>
@@ -25435,7 +25464,7 @@
           <w:sz w:val="20"/>
           <w:szCs w:val="20"/>
         </w:rPr>
-        <w:t xml:space="preserve"> il registro di audit è leggibile dal database da tutto lo staff (serve all'export del fascicolo degli Operatori), mentre la pagina Audit è solo Admin: lasciarlo così o limitarlo agli Amministratori (in quel caso il fascicolo esportato da un Operatore non conterrebbe più la cronologia).</w:t>
+        <w:t xml:space="preserve"> — decisione di Luca del 18/10: resta così (capitolo Decisioni).</w:t>
       </w:r>
     </w:p>
     <w:p>

</xml_diff>

<commit_message>
Registro: script 24 eseguito e funzione consultazione-pubblica ripubblicata
Co-Authored-By: Claude Opus 5.5 <noreply@anthropic.com>
Claude-Session: https://claude.ai/code/session_01E8XCbEeVHWVP3hntUZ6kZ1
</commit_message>
<xml_diff>
--- a/public/documentazione/Registro_Dev_Deploy_Portale_CWP.docx
+++ b/public/documentazione/Registro_Dev_Deploy_Portale_CWP.docx
@@ -12256,22 +12256,11 @@
             <w:r>
               <w:rPr>
                 <w:rFonts w:ascii="Arial" w:cs="Arial" w:eastAsia="Arial" w:hAnsi="Arial"/>
-                <w:b/>
-                <w:bCs/>
-                <w:color w:val="1B2118"/>
-                <w:sz w:val="18"/>
-                <w:szCs w:val="18"/>
-              </w:rPr>
-              <w:t xml:space="preserve">da eseguire</w:t>
-            </w:r>
-            <w:r>
-              <w:rPr>
-                <w:rFonts w:ascii="Arial" w:cs="Arial" w:eastAsia="Arial" w:hAnsi="Arial"/>
-                <w:color w:val="1B2118"/>
-                <w:sz w:val="18"/>
-                <w:szCs w:val="18"/>
-              </w:rPr>
-              <w:t xml:space="preserve"> (Chrome scollegato la sera del 18/10)</w:t>
+                <w:color w:val="1B2118"/>
+                <w:sz w:val="18"/>
+                <w:szCs w:val="18"/>
+              </w:rPr>
+              <w:t xml:space="preserve">18/10/2026 (sera, verificato)</w:t>
             </w:r>
           </w:p>
         </w:tc>
@@ -14569,27 +14558,7 @@
                 <w:sz w:val="18"/>
                 <w:szCs w:val="18"/>
               </w:rPr>
-              <w:t xml:space="preserve"> per la pagina pubblica /programma, script 24, </w:t>
-            </w:r>
-            <w:r>
-              <w:rPr>
-                <w:rFonts w:ascii="Arial" w:cs="Arial" w:eastAsia="Arial" w:hAnsi="Arial"/>
-                <w:b/>
-                <w:bCs/>
-                <w:color w:val="1B2118"/>
-                <w:sz w:val="18"/>
-                <w:szCs w:val="18"/>
-              </w:rPr>
-              <w:t xml:space="preserve">da ripubblicare</w:t>
-            </w:r>
-            <w:r>
-              <w:rPr>
-                <w:rFonts w:ascii="Arial" w:cs="Arial" w:eastAsia="Arial" w:hAnsi="Arial"/>
-                <w:color w:val="1B2118"/>
-                <w:sz w:val="18"/>
-                <w:szCs w:val="18"/>
-              </w:rPr>
-              <w:t xml:space="preserve">): elenco, dettaglio (documento, errata corrige, osservazioni ammesse), invio di un'osservazione con allegato facoltativo ed email di conferma, conferma dell'email (l'osservazione diventa </w:t>
+              <w:t xml:space="preserve"> per la pagina pubblica /programma, script 24, ripubblicata la sera del 18/10, Verify JWT spento): elenco, dettaglio (documento, errata corrige, osservazioni ammesse), invio di un'osservazione con allegato facoltativo ed email di conferma, conferma dell'email (l'osservazione diventa </w:t>
             </w:r>
             <w:r>
               <w:rPr>
@@ -18130,9 +18099,9 @@
         <w:tblLayout w:type="fixed"/>
       </w:tblPr>
       <w:tblGrid>
-        <w:gridCol w:w="2654"/>
-        <w:gridCol w:w="2245"/>
-        <w:gridCol w:w="4739"/>
+        <w:gridCol w:w="2696"/>
+        <w:gridCol w:w="2128"/>
+        <w:gridCol w:w="4814"/>
       </w:tblGrid>
       <w:tr>
         <w:trPr>
@@ -18140,7 +18109,7 @@
         </w:trPr>
         <w:tc>
           <w:tcPr>
-            <w:tcW w:type="dxa" w:w="2654"/>
+            <w:tcW w:type="dxa" w:w="2696"/>
             <w:tcBorders>
               <w:top w:val="single" w:color="D9D4C5" w:sz="4"/>
               <w:left w:val="single" w:color="D9D4C5" w:sz="4"/>
@@ -18175,7 +18144,7 @@
         </w:tc>
         <w:tc>
           <w:tcPr>
-            <w:tcW w:type="dxa" w:w="2245"/>
+            <w:tcW w:type="dxa" w:w="2128"/>
             <w:tcBorders>
               <w:top w:val="single" w:color="D9D4C5" w:sz="4"/>
               <w:left w:val="single" w:color="D9D4C5" w:sz="4"/>
@@ -18210,7 +18179,7 @@
         </w:tc>
         <w:tc>
           <w:tcPr>
-            <w:tcW w:type="dxa" w:w="4739"/>
+            <w:tcW w:type="dxa" w:w="4814"/>
             <w:tcBorders>
               <w:top w:val="single" w:color="D9D4C5" w:sz="4"/>
               <w:left w:val="single" w:color="D9D4C5" w:sz="4"/>
@@ -18250,7 +18219,7 @@
         </w:trPr>
         <w:tc>
           <w:tcPr>
-            <w:tcW w:type="dxa" w:w="2654"/>
+            <w:tcW w:type="dxa" w:w="2696"/>
             <w:tcBorders>
               <w:top w:val="single" w:color="D9D4C5" w:sz="4"/>
               <w:left w:val="single" w:color="D9D4C5" w:sz="4"/>
@@ -18282,7 +18251,7 @@
         </w:tc>
         <w:tc>
           <w:tcPr>
-            <w:tcW w:type="dxa" w:w="2245"/>
+            <w:tcW w:type="dxa" w:w="2128"/>
             <w:tcBorders>
               <w:top w:val="single" w:color="D9D4C5" w:sz="4"/>
               <w:left w:val="single" w:color="D9D4C5" w:sz="4"/>
@@ -18314,7 +18283,7 @@
         </w:tc>
         <w:tc>
           <w:tcPr>
-            <w:tcW w:type="dxa" w:w="4739"/>
+            <w:tcW w:type="dxa" w:w="4814"/>
             <w:tcBorders>
               <w:top w:val="single" w:color="D9D4C5" w:sz="4"/>
               <w:left w:val="single" w:color="D9D4C5" w:sz="4"/>
@@ -18351,7 +18320,7 @@
         </w:trPr>
         <w:tc>
           <w:tcPr>
-            <w:tcW w:type="dxa" w:w="2654"/>
+            <w:tcW w:type="dxa" w:w="2696"/>
             <w:tcBorders>
               <w:top w:val="single" w:color="D9D4C5" w:sz="4"/>
               <w:left w:val="single" w:color="D9D4C5" w:sz="4"/>
@@ -18384,7 +18353,7 @@
         </w:tc>
         <w:tc>
           <w:tcPr>
-            <w:tcW w:type="dxa" w:w="2245"/>
+            <w:tcW w:type="dxa" w:w="2128"/>
             <w:tcBorders>
               <w:top w:val="single" w:color="D9D4C5" w:sz="4"/>
               <w:left w:val="single" w:color="D9D4C5" w:sz="4"/>
@@ -18417,7 +18386,7 @@
         </w:tc>
         <w:tc>
           <w:tcPr>
-            <w:tcW w:type="dxa" w:w="4739"/>
+            <w:tcW w:type="dxa" w:w="4814"/>
             <w:tcBorders>
               <w:top w:val="single" w:color="D9D4C5" w:sz="4"/>
               <w:left w:val="single" w:color="D9D4C5" w:sz="4"/>
@@ -18455,7 +18424,7 @@
         </w:trPr>
         <w:tc>
           <w:tcPr>
-            <w:tcW w:type="dxa" w:w="2654"/>
+            <w:tcW w:type="dxa" w:w="2696"/>
             <w:tcBorders>
               <w:top w:val="single" w:color="D9D4C5" w:sz="4"/>
               <w:left w:val="single" w:color="D9D4C5" w:sz="4"/>
@@ -18487,7 +18456,7 @@
         </w:tc>
         <w:tc>
           <w:tcPr>
-            <w:tcW w:type="dxa" w:w="2245"/>
+            <w:tcW w:type="dxa" w:w="2128"/>
             <w:tcBorders>
               <w:top w:val="single" w:color="D9D4C5" w:sz="4"/>
               <w:left w:val="single" w:color="D9D4C5" w:sz="4"/>
@@ -18519,7 +18488,7 @@
         </w:tc>
         <w:tc>
           <w:tcPr>
-            <w:tcW w:type="dxa" w:w="4739"/>
+            <w:tcW w:type="dxa" w:w="4814"/>
             <w:tcBorders>
               <w:top w:val="single" w:color="D9D4C5" w:sz="4"/>
               <w:left w:val="single" w:color="D9D4C5" w:sz="4"/>
@@ -18556,7 +18525,7 @@
         </w:trPr>
         <w:tc>
           <w:tcPr>
-            <w:tcW w:type="dxa" w:w="2654"/>
+            <w:tcW w:type="dxa" w:w="2696"/>
             <w:tcBorders>
               <w:top w:val="single" w:color="D9D4C5" w:sz="4"/>
               <w:left w:val="single" w:color="D9D4C5" w:sz="4"/>
@@ -18589,7 +18558,7 @@
         </w:tc>
         <w:tc>
           <w:tcPr>
-            <w:tcW w:type="dxa" w:w="2245"/>
+            <w:tcW w:type="dxa" w:w="2128"/>
             <w:tcBorders>
               <w:top w:val="single" w:color="D9D4C5" w:sz="4"/>
               <w:left w:val="single" w:color="D9D4C5" w:sz="4"/>
@@ -18622,7 +18591,7 @@
         </w:tc>
         <w:tc>
           <w:tcPr>
-            <w:tcW w:type="dxa" w:w="4739"/>
+            <w:tcW w:type="dxa" w:w="4814"/>
             <w:tcBorders>
               <w:top w:val="single" w:color="D9D4C5" w:sz="4"/>
               <w:left w:val="single" w:color="D9D4C5" w:sz="4"/>
@@ -18660,7 +18629,7 @@
         </w:trPr>
         <w:tc>
           <w:tcPr>
-            <w:tcW w:type="dxa" w:w="2654"/>
+            <w:tcW w:type="dxa" w:w="2696"/>
             <w:tcBorders>
               <w:top w:val="single" w:color="D9D4C5" w:sz="4"/>
               <w:left w:val="single" w:color="D9D4C5" w:sz="4"/>
@@ -18692,7 +18661,7 @@
         </w:tc>
         <w:tc>
           <w:tcPr>
-            <w:tcW w:type="dxa" w:w="2245"/>
+            <w:tcW w:type="dxa" w:w="2128"/>
             <w:tcBorders>
               <w:top w:val="single" w:color="D9D4C5" w:sz="4"/>
               <w:left w:val="single" w:color="D9D4C5" w:sz="4"/>
@@ -18724,7 +18693,7 @@
         </w:tc>
         <w:tc>
           <w:tcPr>
-            <w:tcW w:type="dxa" w:w="4739"/>
+            <w:tcW w:type="dxa" w:w="4814"/>
             <w:tcBorders>
               <w:top w:val="single" w:color="D9D4C5" w:sz="4"/>
               <w:left w:val="single" w:color="D9D4C5" w:sz="4"/>
@@ -18761,7 +18730,7 @@
         </w:trPr>
         <w:tc>
           <w:tcPr>
-            <w:tcW w:type="dxa" w:w="2654"/>
+            <w:tcW w:type="dxa" w:w="2696"/>
             <w:tcBorders>
               <w:top w:val="single" w:color="D9D4C5" w:sz="4"/>
               <w:left w:val="single" w:color="D9D4C5" w:sz="4"/>
@@ -18794,7 +18763,7 @@
         </w:tc>
         <w:tc>
           <w:tcPr>
-            <w:tcW w:type="dxa" w:w="2245"/>
+            <w:tcW w:type="dxa" w:w="2128"/>
             <w:tcBorders>
               <w:top w:val="single" w:color="D9D4C5" w:sz="4"/>
               <w:left w:val="single" w:color="D9D4C5" w:sz="4"/>
@@ -18827,7 +18796,7 @@
         </w:tc>
         <w:tc>
           <w:tcPr>
-            <w:tcW w:type="dxa" w:w="4739"/>
+            <w:tcW w:type="dxa" w:w="4814"/>
             <w:tcBorders>
               <w:top w:val="single" w:color="D9D4C5" w:sz="4"/>
               <w:left w:val="single" w:color="D9D4C5" w:sz="4"/>
@@ -18865,7 +18834,7 @@
         </w:trPr>
         <w:tc>
           <w:tcPr>
-            <w:tcW w:type="dxa" w:w="2654"/>
+            <w:tcW w:type="dxa" w:w="2696"/>
             <w:tcBorders>
               <w:top w:val="single" w:color="D9D4C5" w:sz="4"/>
               <w:left w:val="single" w:color="D9D4C5" w:sz="4"/>
@@ -18897,7 +18866,7 @@
         </w:tc>
         <w:tc>
           <w:tcPr>
-            <w:tcW w:type="dxa" w:w="2245"/>
+            <w:tcW w:type="dxa" w:w="2128"/>
             <w:tcBorders>
               <w:top w:val="single" w:color="D9D4C5" w:sz="4"/>
               <w:left w:val="single" w:color="D9D4C5" w:sz="4"/>
@@ -18929,7 +18898,7 @@
         </w:tc>
         <w:tc>
           <w:tcPr>
-            <w:tcW w:type="dxa" w:w="4739"/>
+            <w:tcW w:type="dxa" w:w="4814"/>
             <w:tcBorders>
               <w:top w:val="single" w:color="D9D4C5" w:sz="4"/>
               <w:left w:val="single" w:color="D9D4C5" w:sz="4"/>
@@ -18966,7 +18935,7 @@
         </w:trPr>
         <w:tc>
           <w:tcPr>
-            <w:tcW w:type="dxa" w:w="2654"/>
+            <w:tcW w:type="dxa" w:w="2696"/>
             <w:tcBorders>
               <w:top w:val="single" w:color="D9D4C5" w:sz="4"/>
               <w:left w:val="single" w:color="D9D4C5" w:sz="4"/>
@@ -18999,7 +18968,7 @@
         </w:tc>
         <w:tc>
           <w:tcPr>
-            <w:tcW w:type="dxa" w:w="2245"/>
+            <w:tcW w:type="dxa" w:w="2128"/>
             <w:tcBorders>
               <w:top w:val="single" w:color="D9D4C5" w:sz="4"/>
               <w:left w:val="single" w:color="D9D4C5" w:sz="4"/>
@@ -19032,7 +19001,7 @@
         </w:tc>
         <w:tc>
           <w:tcPr>
-            <w:tcW w:type="dxa" w:w="4739"/>
+            <w:tcW w:type="dxa" w:w="4814"/>
             <w:tcBorders>
               <w:top w:val="single" w:color="D9D4C5" w:sz="4"/>
               <w:left w:val="single" w:color="D9D4C5" w:sz="4"/>
@@ -19070,7 +19039,7 @@
         </w:trPr>
         <w:tc>
           <w:tcPr>
-            <w:tcW w:type="dxa" w:w="2654"/>
+            <w:tcW w:type="dxa" w:w="2696"/>
             <w:tcBorders>
               <w:top w:val="single" w:color="D9D4C5" w:sz="4"/>
               <w:left w:val="single" w:color="D9D4C5" w:sz="4"/>
@@ -19102,7 +19071,7 @@
         </w:tc>
         <w:tc>
           <w:tcPr>
-            <w:tcW w:type="dxa" w:w="2245"/>
+            <w:tcW w:type="dxa" w:w="2128"/>
             <w:tcBorders>
               <w:top w:val="single" w:color="D9D4C5" w:sz="4"/>
               <w:left w:val="single" w:color="D9D4C5" w:sz="4"/>
@@ -19134,7 +19103,7 @@
         </w:tc>
         <w:tc>
           <w:tcPr>
-            <w:tcW w:type="dxa" w:w="4739"/>
+            <w:tcW w:type="dxa" w:w="4814"/>
             <w:tcBorders>
               <w:top w:val="single" w:color="D9D4C5" w:sz="4"/>
               <w:left w:val="single" w:color="D9D4C5" w:sz="4"/>
@@ -19171,7 +19140,7 @@
         </w:trPr>
         <w:tc>
           <w:tcPr>
-            <w:tcW w:type="dxa" w:w="2654"/>
+            <w:tcW w:type="dxa" w:w="2696"/>
             <w:tcBorders>
               <w:top w:val="single" w:color="D9D4C5" w:sz="4"/>
               <w:left w:val="single" w:color="D9D4C5" w:sz="4"/>
@@ -19204,7 +19173,7 @@
         </w:tc>
         <w:tc>
           <w:tcPr>
-            <w:tcW w:type="dxa" w:w="2245"/>
+            <w:tcW w:type="dxa" w:w="2128"/>
             <w:tcBorders>
               <w:top w:val="single" w:color="D9D4C5" w:sz="4"/>
               <w:left w:val="single" w:color="D9D4C5" w:sz="4"/>
@@ -19237,7 +19206,7 @@
         </w:tc>
         <w:tc>
           <w:tcPr>
-            <w:tcW w:type="dxa" w:w="4739"/>
+            <w:tcW w:type="dxa" w:w="4814"/>
             <w:tcBorders>
               <w:top w:val="single" w:color="D9D4C5" w:sz="4"/>
               <w:left w:val="single" w:color="D9D4C5" w:sz="4"/>
@@ -19275,7 +19244,7 @@
         </w:trPr>
         <w:tc>
           <w:tcPr>
-            <w:tcW w:type="dxa" w:w="2654"/>
+            <w:tcW w:type="dxa" w:w="2696"/>
             <w:tcBorders>
               <w:top w:val="single" w:color="D9D4C5" w:sz="4"/>
               <w:left w:val="single" w:color="D9D4C5" w:sz="4"/>
@@ -19307,7 +19276,7 @@
         </w:tc>
         <w:tc>
           <w:tcPr>
-            <w:tcW w:type="dxa" w:w="2245"/>
+            <w:tcW w:type="dxa" w:w="2128"/>
             <w:tcBorders>
               <w:top w:val="single" w:color="D9D4C5" w:sz="4"/>
               <w:left w:val="single" w:color="D9D4C5" w:sz="4"/>
@@ -19339,7 +19308,7 @@
         </w:tc>
         <w:tc>
           <w:tcPr>
-            <w:tcW w:type="dxa" w:w="4739"/>
+            <w:tcW w:type="dxa" w:w="4814"/>
             <w:tcBorders>
               <w:top w:val="single" w:color="D9D4C5" w:sz="4"/>
               <w:left w:val="single" w:color="D9D4C5" w:sz="4"/>
@@ -19376,7 +19345,7 @@
         </w:trPr>
         <w:tc>
           <w:tcPr>
-            <w:tcW w:type="dxa" w:w="2654"/>
+            <w:tcW w:type="dxa" w:w="2696"/>
             <w:tcBorders>
               <w:top w:val="single" w:color="D9D4C5" w:sz="4"/>
               <w:left w:val="single" w:color="D9D4C5" w:sz="4"/>
@@ -19409,7 +19378,7 @@
         </w:tc>
         <w:tc>
           <w:tcPr>
-            <w:tcW w:type="dxa" w:w="2245"/>
+            <w:tcW w:type="dxa" w:w="2128"/>
             <w:tcBorders>
               <w:top w:val="single" w:color="D9D4C5" w:sz="4"/>
               <w:left w:val="single" w:color="D9D4C5" w:sz="4"/>
@@ -19442,7 +19411,7 @@
         </w:tc>
         <w:tc>
           <w:tcPr>
-            <w:tcW w:type="dxa" w:w="4739"/>
+            <w:tcW w:type="dxa" w:w="4814"/>
             <w:tcBorders>
               <w:top w:val="single" w:color="D9D4C5" w:sz="4"/>
               <w:left w:val="single" w:color="D9D4C5" w:sz="4"/>
@@ -19480,7 +19449,7 @@
         </w:trPr>
         <w:tc>
           <w:tcPr>
-            <w:tcW w:type="dxa" w:w="2654"/>
+            <w:tcW w:type="dxa" w:w="2696"/>
             <w:tcBorders>
               <w:top w:val="single" w:color="D9D4C5" w:sz="4"/>
               <w:left w:val="single" w:color="D9D4C5" w:sz="4"/>
@@ -19512,7 +19481,7 @@
         </w:tc>
         <w:tc>
           <w:tcPr>
-            <w:tcW w:type="dxa" w:w="2245"/>
+            <w:tcW w:type="dxa" w:w="2128"/>
             <w:tcBorders>
               <w:top w:val="single" w:color="D9D4C5" w:sz="4"/>
               <w:left w:val="single" w:color="D9D4C5" w:sz="4"/>
@@ -19544,7 +19513,7 @@
         </w:tc>
         <w:tc>
           <w:tcPr>
-            <w:tcW w:type="dxa" w:w="4739"/>
+            <w:tcW w:type="dxa" w:w="4814"/>
             <w:tcBorders>
               <w:top w:val="single" w:color="D9D4C5" w:sz="4"/>
               <w:left w:val="single" w:color="D9D4C5" w:sz="4"/>
@@ -19581,7 +19550,7 @@
         </w:trPr>
         <w:tc>
           <w:tcPr>
-            <w:tcW w:type="dxa" w:w="2654"/>
+            <w:tcW w:type="dxa" w:w="2696"/>
             <w:tcBorders>
               <w:top w:val="single" w:color="D9D4C5" w:sz="4"/>
               <w:left w:val="single" w:color="D9D4C5" w:sz="4"/>
@@ -19614,7 +19583,7 @@
         </w:tc>
         <w:tc>
           <w:tcPr>
-            <w:tcW w:type="dxa" w:w="2245"/>
+            <w:tcW w:type="dxa" w:w="2128"/>
             <w:tcBorders>
               <w:top w:val="single" w:color="D9D4C5" w:sz="4"/>
               <w:left w:val="single" w:color="D9D4C5" w:sz="4"/>
@@ -19641,13 +19610,13 @@
                 <w:sz w:val="18"/>
                 <w:szCs w:val="18"/>
               </w:rPr>
-              <w:t xml:space="preserve">Fatto (script 24 da eseguire)</w:t>
-            </w:r>
-          </w:p>
-        </w:tc>
-        <w:tc>
-          <w:tcPr>
-            <w:tcW w:type="dxa" w:w="4739"/>
+              <w:t xml:space="preserve">Fatto</w:t>
+            </w:r>
+          </w:p>
+        </w:tc>
+        <w:tc>
+          <w:tcPr>
+            <w:tcW w:type="dxa" w:w="4814"/>
             <w:tcBorders>
               <w:top w:val="single" w:color="D9D4C5" w:sz="4"/>
               <w:left w:val="single" w:color="D9D4C5" w:sz="4"/>
@@ -19685,7 +19654,7 @@
         </w:trPr>
         <w:tc>
           <w:tcPr>
-            <w:tcW w:type="dxa" w:w="2654"/>
+            <w:tcW w:type="dxa" w:w="2696"/>
             <w:tcBorders>
               <w:top w:val="single" w:color="D9D4C5" w:sz="4"/>
               <w:left w:val="single" w:color="D9D4C5" w:sz="4"/>
@@ -19717,39 +19686,39 @@
         </w:tc>
         <w:tc>
           <w:tcPr>
-            <w:tcW w:type="dxa" w:w="2245"/>
-            <w:tcBorders>
-              <w:top w:val="single" w:color="D9D4C5" w:sz="4"/>
-              <w:left w:val="single" w:color="D9D4C5" w:sz="4"/>
-              <w:bottom w:val="single" w:color="D9D4C5" w:sz="4"/>
-              <w:right w:val="single" w:color="D9D4C5" w:sz="4"/>
-            </w:tcBorders>
-            <w:tcMar>
-              <w:top w:type="dxa" w:w="70"/>
-              <w:left w:type="dxa" w:w="110"/>
-              <w:bottom w:type="dxa" w:w="70"/>
-              <w:right w:type="dxa" w:w="110"/>
-            </w:tcMar>
-            <w:vAlign w:val="center"/>
-          </w:tcPr>
-          <w:p>
-            <w:pPr>
-              <w:spacing w:after="0" w:before="0"/>
-            </w:pPr>
-            <w:r>
-              <w:rPr>
-                <w:rFonts w:ascii="Arial" w:cs="Arial" w:eastAsia="Arial" w:hAnsi="Arial"/>
-                <w:color w:val="1B2118"/>
-                <w:sz w:val="18"/>
-                <w:szCs w:val="18"/>
-              </w:rPr>
-              <w:t xml:space="preserve">Fatto (script 24 da eseguire)</w:t>
-            </w:r>
-          </w:p>
-        </w:tc>
-        <w:tc>
-          <w:tcPr>
-            <w:tcW w:type="dxa" w:w="4739"/>
+            <w:tcW w:type="dxa" w:w="2128"/>
+            <w:tcBorders>
+              <w:top w:val="single" w:color="D9D4C5" w:sz="4"/>
+              <w:left w:val="single" w:color="D9D4C5" w:sz="4"/>
+              <w:bottom w:val="single" w:color="D9D4C5" w:sz="4"/>
+              <w:right w:val="single" w:color="D9D4C5" w:sz="4"/>
+            </w:tcBorders>
+            <w:tcMar>
+              <w:top w:type="dxa" w:w="70"/>
+              <w:left w:type="dxa" w:w="110"/>
+              <w:bottom w:type="dxa" w:w="70"/>
+              <w:right w:type="dxa" w:w="110"/>
+            </w:tcMar>
+            <w:vAlign w:val="center"/>
+          </w:tcPr>
+          <w:p>
+            <w:pPr>
+              <w:spacing w:after="0" w:before="0"/>
+            </w:pPr>
+            <w:r>
+              <w:rPr>
+                <w:rFonts w:ascii="Arial" w:cs="Arial" w:eastAsia="Arial" w:hAnsi="Arial"/>
+                <w:color w:val="1B2118"/>
+                <w:sz w:val="18"/>
+                <w:szCs w:val="18"/>
+              </w:rPr>
+              <w:t xml:space="preserve">Fatto</w:t>
+            </w:r>
+          </w:p>
+        </w:tc>
+        <w:tc>
+          <w:tcPr>
+            <w:tcW w:type="dxa" w:w="4814"/>
             <w:tcBorders>
               <w:top w:val="single" w:color="D9D4C5" w:sz="4"/>
               <w:left w:val="single" w:color="D9D4C5" w:sz="4"/>
@@ -19786,7 +19755,7 @@
         </w:trPr>
         <w:tc>
           <w:tcPr>
-            <w:tcW w:type="dxa" w:w="2654"/>
+            <w:tcW w:type="dxa" w:w="2696"/>
             <w:tcBorders>
               <w:top w:val="single" w:color="D9D4C5" w:sz="4"/>
               <w:left w:val="single" w:color="D9D4C5" w:sz="4"/>
@@ -19819,7 +19788,7 @@
         </w:tc>
         <w:tc>
           <w:tcPr>
-            <w:tcW w:type="dxa" w:w="2245"/>
+            <w:tcW w:type="dxa" w:w="2128"/>
             <w:tcBorders>
               <w:top w:val="single" w:color="D9D4C5" w:sz="4"/>
               <w:left w:val="single" w:color="D9D4C5" w:sz="4"/>
@@ -19846,13 +19815,13 @@
                 <w:sz w:val="18"/>
                 <w:szCs w:val="18"/>
               </w:rPr>
-              <w:t xml:space="preserve">Fatto (script 24 da eseguire)</w:t>
-            </w:r>
-          </w:p>
-        </w:tc>
-        <w:tc>
-          <w:tcPr>
-            <w:tcW w:type="dxa" w:w="4739"/>
+              <w:t xml:space="preserve">Fatto</w:t>
+            </w:r>
+          </w:p>
+        </w:tc>
+        <w:tc>
+          <w:tcPr>
+            <w:tcW w:type="dxa" w:w="4814"/>
             <w:tcBorders>
               <w:top w:val="single" w:color="D9D4C5" w:sz="4"/>
               <w:left w:val="single" w:color="D9D4C5" w:sz="4"/>
@@ -19890,7 +19859,7 @@
         </w:trPr>
         <w:tc>
           <w:tcPr>
-            <w:tcW w:type="dxa" w:w="2654"/>
+            <w:tcW w:type="dxa" w:w="2696"/>
             <w:tcBorders>
               <w:top w:val="single" w:color="D9D4C5" w:sz="4"/>
               <w:left w:val="single" w:color="D9D4C5" w:sz="4"/>
@@ -19922,7 +19891,7 @@
         </w:tc>
         <w:tc>
           <w:tcPr>
-            <w:tcW w:type="dxa" w:w="2245"/>
+            <w:tcW w:type="dxa" w:w="2128"/>
             <w:tcBorders>
               <w:top w:val="single" w:color="D9D4C5" w:sz="4"/>
               <w:left w:val="single" w:color="D9D4C5" w:sz="4"/>
@@ -19954,7 +19923,7 @@
         </w:tc>
         <w:tc>
           <w:tcPr>
-            <w:tcW w:type="dxa" w:w="4739"/>
+            <w:tcW w:type="dxa" w:w="4814"/>
             <w:tcBorders>
               <w:top w:val="single" w:color="D9D4C5" w:sz="4"/>
               <w:left w:val="single" w:color="D9D4C5" w:sz="4"/>
@@ -19991,7 +19960,7 @@
         </w:trPr>
         <w:tc>
           <w:tcPr>
-            <w:tcW w:type="dxa" w:w="2654"/>
+            <w:tcW w:type="dxa" w:w="2696"/>
             <w:tcBorders>
               <w:top w:val="single" w:color="D9D4C5" w:sz="4"/>
               <w:left w:val="single" w:color="D9D4C5" w:sz="4"/>
@@ -20024,7 +19993,7 @@
         </w:tc>
         <w:tc>
           <w:tcPr>
-            <w:tcW w:type="dxa" w:w="2245"/>
+            <w:tcW w:type="dxa" w:w="2128"/>
             <w:tcBorders>
               <w:top w:val="single" w:color="D9D4C5" w:sz="4"/>
               <w:left w:val="single" w:color="D9D4C5" w:sz="4"/>
@@ -20057,7 +20026,7 @@
         </w:tc>
         <w:tc>
           <w:tcPr>
-            <w:tcW w:type="dxa" w:w="4739"/>
+            <w:tcW w:type="dxa" w:w="4814"/>
             <w:tcBorders>
               <w:top w:val="single" w:color="D9D4C5" w:sz="4"/>
               <w:left w:val="single" w:color="D9D4C5" w:sz="4"/>
@@ -20095,7 +20064,7 @@
         </w:trPr>
         <w:tc>
           <w:tcPr>
-            <w:tcW w:type="dxa" w:w="2654"/>
+            <w:tcW w:type="dxa" w:w="2696"/>
             <w:tcBorders>
               <w:top w:val="single" w:color="D9D4C5" w:sz="4"/>
               <w:left w:val="single" w:color="D9D4C5" w:sz="4"/>
@@ -20127,7 +20096,7 @@
         </w:tc>
         <w:tc>
           <w:tcPr>
-            <w:tcW w:type="dxa" w:w="2245"/>
+            <w:tcW w:type="dxa" w:w="2128"/>
             <w:tcBorders>
               <w:top w:val="single" w:color="D9D4C5" w:sz="4"/>
               <w:left w:val="single" w:color="D9D4C5" w:sz="4"/>
@@ -20159,7 +20128,7 @@
         </w:tc>
         <w:tc>
           <w:tcPr>
-            <w:tcW w:type="dxa" w:w="4739"/>
+            <w:tcW w:type="dxa" w:w="4814"/>
             <w:tcBorders>
               <w:top w:val="single" w:color="D9D4C5" w:sz="4"/>
               <w:left w:val="single" w:color="D9D4C5" w:sz="4"/>
@@ -21026,27 +20995,7 @@
           <w:sz w:val="21"/>
           <w:szCs w:val="21"/>
         </w:rPr>
-        <w:t xml:space="preserve">: </w:t>
-      </w:r>
-      <w:r>
-        <w:rPr>
-          <w:rFonts w:ascii="Arial" w:cs="Arial" w:eastAsia="Arial" w:hAnsi="Arial"/>
-          <w:b/>
-          <w:bCs/>
-          <w:color w:val="1B2118"/>
-          <w:sz w:val="21"/>
-          <w:szCs w:val="21"/>
-        </w:rPr>
-        <w:t xml:space="preserve">da eseguire in produzione</w:t>
-      </w:r>
-      <w:r>
-        <w:rPr>
-          <w:rFonts w:ascii="Arial" w:cs="Arial" w:eastAsia="Arial" w:hAnsi="Arial"/>
-          <w:color w:val="1B2118"/>
-          <w:sz w:val="21"/>
-          <w:szCs w:val="21"/>
-        </w:rPr>
-        <w:t xml:space="preserve"> e da portare su main (il collegamento a Chrome si è interrotto). (3) Controlli della Gestione qualità dei dati nel calcolo crediti (</w:t>
+        <w:t xml:space="preserve">: eseguito e verificato in produzione alle 22:30 (tabelle, funzioni, permessi negati ad anon, lavoro pg_cron), funzione ripubblicata, ramo portato su main. (3) Controlli della Gestione qualità dei dati nel calcolo crediti (</w:t>
       </w:r>
       <w:r>
         <w:rPr>
@@ -24860,7 +24809,7 @@
               </w:rPr>
               <w:t xml:space="preserve">Claude Doc: </w:t>
             </w:r>
-            <w:hyperlink w:history="1" r:id="rIdya66-hfz6bw7ceanw1wgk">
+            <w:hyperlink w:history="1" r:id="rIdol0-ck1_xpsrbpmkcqs1t">
               <w:r>
                 <w:rPr>
                   <w:rFonts w:ascii="Arial" w:cs="Arial" w:eastAsia="Arial" w:hAnsi="Arial"/>
@@ -25207,7 +25156,7 @@
               </w:rPr>
               <w:t xml:space="preserve">Claude Doc: </w:t>
             </w:r>
-            <w:hyperlink w:history="1" r:id="rIdevlnw9xc__oeota92cvzz">
+            <w:hyperlink w:history="1" r:id="rIde2wjz0zxpvkuc3eifsz-z">
               <w:r>
                 <w:rPr>
                   <w:rFonts w:ascii="Arial" w:cs="Arial" w:eastAsia="Arial" w:hAnsi="Arial"/>
@@ -25811,7 +25760,7 @@
               </w:rPr>
               <w:t xml:space="preserve">Claude Doc: </w:t>
             </w:r>
-            <w:hyperlink w:history="1" r:id="rIdue-onwfvlo7pqfm-bnslp">
+            <w:hyperlink w:history="1" r:id="rId7k569zcruu2gcekkfvzjj">
               <w:r>
                 <w:rPr>
                   <w:rFonts w:ascii="Arial" w:cs="Arial" w:eastAsia="Arial" w:hAnsi="Arial"/>
@@ -26382,7 +26331,7 @@
             <w:pPr>
               <w:spacing w:after="0" w:before="0"/>
             </w:pPr>
-            <w:hyperlink w:history="1" r:id="rIdxrqmupunxbhtsyvung6fp">
+            <w:hyperlink w:history="1" r:id="rIdrldsyaublxem_fghmhqyo">
               <w:r>
                 <w:rPr>
                   <w:rFonts w:ascii="Arial" w:cs="Arial" w:eastAsia="Arial" w:hAnsi="Arial"/>

</xml_diff>

<commit_message>
Registro: script 25 e documenti del Programma pubblicati
Co-Authored-By: Claude Opus 5.5 <noreply@anthropic.com>
Claude-Session: https://claude.ai/code/session_01E8XCbEeVHWVP3hntUZ6kZ1
</commit_message>
<xml_diff>
--- a/public/documentazione/Registro_Dev_Deploy_Portale_CWP.docx
+++ b/public/documentazione/Registro_Dev_Deploy_Portale_CWP.docx
@@ -8162,8 +8162,8 @@
       </w:tblPr>
       <w:tblGrid>
         <w:gridCol w:w="3213"/>
-        <w:gridCol w:w="4016"/>
-        <w:gridCol w:w="2409"/>
+        <w:gridCol w:w="3954"/>
+        <w:gridCol w:w="2471"/>
       </w:tblGrid>
       <w:tr>
         <w:trPr>
@@ -8206,7 +8206,7 @@
         </w:tc>
         <w:tc>
           <w:tcPr>
-            <w:tcW w:type="dxa" w:w="4016"/>
+            <w:tcW w:type="dxa" w:w="3954"/>
             <w:tcBorders>
               <w:top w:val="single" w:color="D9D4C5" w:sz="4"/>
               <w:left w:val="single" w:color="D9D4C5" w:sz="4"/>
@@ -8241,7 +8241,7 @@
         </w:tc>
         <w:tc>
           <w:tcPr>
-            <w:tcW w:type="dxa" w:w="2409"/>
+            <w:tcW w:type="dxa" w:w="2471"/>
             <w:tcBorders>
               <w:top w:val="single" w:color="D9D4C5" w:sz="4"/>
               <w:left w:val="single" w:color="D9D4C5" w:sz="4"/>
@@ -8313,7 +8313,7 @@
         </w:tc>
         <w:tc>
           <w:tcPr>
-            <w:tcW w:type="dxa" w:w="4016"/>
+            <w:tcW w:type="dxa" w:w="3954"/>
             <w:tcBorders>
               <w:top w:val="single" w:color="D9D4C5" w:sz="4"/>
               <w:left w:val="single" w:color="D9D4C5" w:sz="4"/>
@@ -8345,7 +8345,7 @@
         </w:tc>
         <w:tc>
           <w:tcPr>
-            <w:tcW w:type="dxa" w:w="2409"/>
+            <w:tcW w:type="dxa" w:w="2471"/>
             <w:tcBorders>
               <w:top w:val="single" w:color="D9D4C5" w:sz="4"/>
               <w:left w:val="single" w:color="D9D4C5" w:sz="4"/>
@@ -8415,7 +8415,7 @@
         </w:tc>
         <w:tc>
           <w:tcPr>
-            <w:tcW w:type="dxa" w:w="4016"/>
+            <w:tcW w:type="dxa" w:w="3954"/>
             <w:tcBorders>
               <w:top w:val="single" w:color="D9D4C5" w:sz="4"/>
               <w:left w:val="single" w:color="D9D4C5" w:sz="4"/>
@@ -8448,7 +8448,7 @@
         </w:tc>
         <w:tc>
           <w:tcPr>
-            <w:tcW w:type="dxa" w:w="2409"/>
+            <w:tcW w:type="dxa" w:w="2471"/>
             <w:tcBorders>
               <w:top w:val="single" w:color="D9D4C5" w:sz="4"/>
               <w:left w:val="single" w:color="D9D4C5" w:sz="4"/>
@@ -8518,7 +8518,7 @@
         </w:tc>
         <w:tc>
           <w:tcPr>
-            <w:tcW w:type="dxa" w:w="4016"/>
+            <w:tcW w:type="dxa" w:w="3954"/>
             <w:tcBorders>
               <w:top w:val="single" w:color="D9D4C5" w:sz="4"/>
               <w:left w:val="single" w:color="D9D4C5" w:sz="4"/>
@@ -8550,7 +8550,7 @@
         </w:tc>
         <w:tc>
           <w:tcPr>
-            <w:tcW w:type="dxa" w:w="2409"/>
+            <w:tcW w:type="dxa" w:w="2471"/>
             <w:tcBorders>
               <w:top w:val="single" w:color="D9D4C5" w:sz="4"/>
               <w:left w:val="single" w:color="D9D4C5" w:sz="4"/>
@@ -8620,7 +8620,7 @@
         </w:tc>
         <w:tc>
           <w:tcPr>
-            <w:tcW w:type="dxa" w:w="4016"/>
+            <w:tcW w:type="dxa" w:w="3954"/>
             <w:tcBorders>
               <w:top w:val="single" w:color="D9D4C5" w:sz="4"/>
               <w:left w:val="single" w:color="D9D4C5" w:sz="4"/>
@@ -8671,7 +8671,7 @@
         </w:tc>
         <w:tc>
           <w:tcPr>
-            <w:tcW w:type="dxa" w:w="2409"/>
+            <w:tcW w:type="dxa" w:w="2471"/>
             <w:tcBorders>
               <w:top w:val="single" w:color="D9D4C5" w:sz="4"/>
               <w:left w:val="single" w:color="D9D4C5" w:sz="4"/>
@@ -8741,7 +8741,7 @@
         </w:tc>
         <w:tc>
           <w:tcPr>
-            <w:tcW w:type="dxa" w:w="4016"/>
+            <w:tcW w:type="dxa" w:w="3954"/>
             <w:tcBorders>
               <w:top w:val="single" w:color="D9D4C5" w:sz="4"/>
               <w:left w:val="single" w:color="D9D4C5" w:sz="4"/>
@@ -8773,7 +8773,7 @@
         </w:tc>
         <w:tc>
           <w:tcPr>
-            <w:tcW w:type="dxa" w:w="2409"/>
+            <w:tcW w:type="dxa" w:w="2471"/>
             <w:tcBorders>
               <w:top w:val="single" w:color="D9D4C5" w:sz="4"/>
               <w:left w:val="single" w:color="D9D4C5" w:sz="4"/>
@@ -8843,7 +8843,7 @@
         </w:tc>
         <w:tc>
           <w:tcPr>
-            <w:tcW w:type="dxa" w:w="4016"/>
+            <w:tcW w:type="dxa" w:w="3954"/>
             <w:tcBorders>
               <w:top w:val="single" w:color="D9D4C5" w:sz="4"/>
               <w:left w:val="single" w:color="D9D4C5" w:sz="4"/>
@@ -8876,7 +8876,7 @@
         </w:tc>
         <w:tc>
           <w:tcPr>
-            <w:tcW w:type="dxa" w:w="2409"/>
+            <w:tcW w:type="dxa" w:w="2471"/>
             <w:tcBorders>
               <w:top w:val="single" w:color="D9D4C5" w:sz="4"/>
               <w:left w:val="single" w:color="D9D4C5" w:sz="4"/>
@@ -8946,7 +8946,7 @@
         </w:tc>
         <w:tc>
           <w:tcPr>
-            <w:tcW w:type="dxa" w:w="4016"/>
+            <w:tcW w:type="dxa" w:w="3954"/>
             <w:tcBorders>
               <w:top w:val="single" w:color="D9D4C5" w:sz="4"/>
               <w:left w:val="single" w:color="D9D4C5" w:sz="4"/>
@@ -8978,7 +8978,7 @@
         </w:tc>
         <w:tc>
           <w:tcPr>
-            <w:tcW w:type="dxa" w:w="2409"/>
+            <w:tcW w:type="dxa" w:w="2471"/>
             <w:tcBorders>
               <w:top w:val="single" w:color="D9D4C5" w:sz="4"/>
               <w:left w:val="single" w:color="D9D4C5" w:sz="4"/>
@@ -9048,7 +9048,7 @@
         </w:tc>
         <w:tc>
           <w:tcPr>
-            <w:tcW w:type="dxa" w:w="4016"/>
+            <w:tcW w:type="dxa" w:w="3954"/>
             <w:tcBorders>
               <w:top w:val="single" w:color="D9D4C5" w:sz="4"/>
               <w:left w:val="single" w:color="D9D4C5" w:sz="4"/>
@@ -9081,7 +9081,7 @@
         </w:tc>
         <w:tc>
           <w:tcPr>
-            <w:tcW w:type="dxa" w:w="2409"/>
+            <w:tcW w:type="dxa" w:w="2471"/>
             <w:tcBorders>
               <w:top w:val="single" w:color="D9D4C5" w:sz="4"/>
               <w:left w:val="single" w:color="D9D4C5" w:sz="4"/>
@@ -9151,7 +9151,7 @@
         </w:tc>
         <w:tc>
           <w:tcPr>
-            <w:tcW w:type="dxa" w:w="4016"/>
+            <w:tcW w:type="dxa" w:w="3954"/>
             <w:tcBorders>
               <w:top w:val="single" w:color="D9D4C5" w:sz="4"/>
               <w:left w:val="single" w:color="D9D4C5" w:sz="4"/>
@@ -9183,7 +9183,7 @@
         </w:tc>
         <w:tc>
           <w:tcPr>
-            <w:tcW w:type="dxa" w:w="2409"/>
+            <w:tcW w:type="dxa" w:w="2471"/>
             <w:tcBorders>
               <w:top w:val="single" w:color="D9D4C5" w:sz="4"/>
               <w:left w:val="single" w:color="D9D4C5" w:sz="4"/>
@@ -9253,7 +9253,7 @@
         </w:tc>
         <w:tc>
           <w:tcPr>
-            <w:tcW w:type="dxa" w:w="4016"/>
+            <w:tcW w:type="dxa" w:w="3954"/>
             <w:tcBorders>
               <w:top w:val="single" w:color="D9D4C5" w:sz="4"/>
               <w:left w:val="single" w:color="D9D4C5" w:sz="4"/>
@@ -9322,7 +9322,7 @@
         </w:tc>
         <w:tc>
           <w:tcPr>
-            <w:tcW w:type="dxa" w:w="2409"/>
+            <w:tcW w:type="dxa" w:w="2471"/>
             <w:tcBorders>
               <w:top w:val="single" w:color="D9D4C5" w:sz="4"/>
               <w:left w:val="single" w:color="D9D4C5" w:sz="4"/>
@@ -9392,7 +9392,7 @@
         </w:tc>
         <w:tc>
           <w:tcPr>
-            <w:tcW w:type="dxa" w:w="4016"/>
+            <w:tcW w:type="dxa" w:w="3954"/>
             <w:tcBorders>
               <w:top w:val="single" w:color="D9D4C5" w:sz="4"/>
               <w:left w:val="single" w:color="D9D4C5" w:sz="4"/>
@@ -9424,7 +9424,7 @@
         </w:tc>
         <w:tc>
           <w:tcPr>
-            <w:tcW w:type="dxa" w:w="2409"/>
+            <w:tcW w:type="dxa" w:w="2471"/>
             <w:tcBorders>
               <w:top w:val="single" w:color="D9D4C5" w:sz="4"/>
               <w:left w:val="single" w:color="D9D4C5" w:sz="4"/>
@@ -9494,7 +9494,7 @@
         </w:tc>
         <w:tc>
           <w:tcPr>
-            <w:tcW w:type="dxa" w:w="4016"/>
+            <w:tcW w:type="dxa" w:w="3954"/>
             <w:tcBorders>
               <w:top w:val="single" w:color="D9D4C5" w:sz="4"/>
               <w:left w:val="single" w:color="D9D4C5" w:sz="4"/>
@@ -9527,7 +9527,7 @@
         </w:tc>
         <w:tc>
           <w:tcPr>
-            <w:tcW w:type="dxa" w:w="2409"/>
+            <w:tcW w:type="dxa" w:w="2471"/>
             <w:tcBorders>
               <w:top w:val="single" w:color="D9D4C5" w:sz="4"/>
               <w:left w:val="single" w:color="D9D4C5" w:sz="4"/>
@@ -9597,7 +9597,7 @@
         </w:tc>
         <w:tc>
           <w:tcPr>
-            <w:tcW w:type="dxa" w:w="4016"/>
+            <w:tcW w:type="dxa" w:w="3954"/>
             <w:tcBorders>
               <w:top w:val="single" w:color="D9D4C5" w:sz="4"/>
               <w:left w:val="single" w:color="D9D4C5" w:sz="4"/>
@@ -9629,7 +9629,7 @@
         </w:tc>
         <w:tc>
           <w:tcPr>
-            <w:tcW w:type="dxa" w:w="2409"/>
+            <w:tcW w:type="dxa" w:w="2471"/>
             <w:tcBorders>
               <w:top w:val="single" w:color="D9D4C5" w:sz="4"/>
               <w:left w:val="single" w:color="D9D4C5" w:sz="4"/>
@@ -9699,7 +9699,7 @@
         </w:tc>
         <w:tc>
           <w:tcPr>
-            <w:tcW w:type="dxa" w:w="4016"/>
+            <w:tcW w:type="dxa" w:w="3954"/>
             <w:tcBorders>
               <w:top w:val="single" w:color="D9D4C5" w:sz="4"/>
               <w:left w:val="single" w:color="D9D4C5" w:sz="4"/>
@@ -9732,7 +9732,7 @@
         </w:tc>
         <w:tc>
           <w:tcPr>
-            <w:tcW w:type="dxa" w:w="2409"/>
+            <w:tcW w:type="dxa" w:w="2471"/>
             <w:tcBorders>
               <w:top w:val="single" w:color="D9D4C5" w:sz="4"/>
               <w:left w:val="single" w:color="D9D4C5" w:sz="4"/>
@@ -9802,7 +9802,7 @@
         </w:tc>
         <w:tc>
           <w:tcPr>
-            <w:tcW w:type="dxa" w:w="4016"/>
+            <w:tcW w:type="dxa" w:w="3954"/>
             <w:tcBorders>
               <w:top w:val="single" w:color="D9D4C5" w:sz="4"/>
               <w:left w:val="single" w:color="D9D4C5" w:sz="4"/>
@@ -9870,7 +9870,7 @@
         </w:tc>
         <w:tc>
           <w:tcPr>
-            <w:tcW w:type="dxa" w:w="2409"/>
+            <w:tcW w:type="dxa" w:w="2471"/>
             <w:tcBorders>
               <w:top w:val="single" w:color="D9D4C5" w:sz="4"/>
               <w:left w:val="single" w:color="D9D4C5" w:sz="4"/>
@@ -9940,7 +9940,7 @@
         </w:tc>
         <w:tc>
           <w:tcPr>
-            <w:tcW w:type="dxa" w:w="4016"/>
+            <w:tcW w:type="dxa" w:w="3954"/>
             <w:tcBorders>
               <w:top w:val="single" w:color="D9D4C5" w:sz="4"/>
               <w:left w:val="single" w:color="D9D4C5" w:sz="4"/>
@@ -10009,7 +10009,7 @@
         </w:tc>
         <w:tc>
           <w:tcPr>
-            <w:tcW w:type="dxa" w:w="2409"/>
+            <w:tcW w:type="dxa" w:w="2471"/>
             <w:tcBorders>
               <w:top w:val="single" w:color="D9D4C5" w:sz="4"/>
               <w:left w:val="single" w:color="D9D4C5" w:sz="4"/>
@@ -10079,7 +10079,7 @@
         </w:tc>
         <w:tc>
           <w:tcPr>
-            <w:tcW w:type="dxa" w:w="4016"/>
+            <w:tcW w:type="dxa" w:w="3954"/>
             <w:tcBorders>
               <w:top w:val="single" w:color="D9D4C5" w:sz="4"/>
               <w:left w:val="single" w:color="D9D4C5" w:sz="4"/>
@@ -10291,7 +10291,7 @@
         </w:tc>
         <w:tc>
           <w:tcPr>
-            <w:tcW w:type="dxa" w:w="2409"/>
+            <w:tcW w:type="dxa" w:w="2471"/>
             <w:tcBorders>
               <w:top w:val="single" w:color="D9D4C5" w:sz="4"/>
               <w:left w:val="single" w:color="D9D4C5" w:sz="4"/>
@@ -10361,7 +10361,7 @@
         </w:tc>
         <w:tc>
           <w:tcPr>
-            <w:tcW w:type="dxa" w:w="4016"/>
+            <w:tcW w:type="dxa" w:w="3954"/>
             <w:tcBorders>
               <w:top w:val="single" w:color="D9D4C5" w:sz="4"/>
               <w:left w:val="single" w:color="D9D4C5" w:sz="4"/>
@@ -10484,7 +10484,7 @@
         </w:tc>
         <w:tc>
           <w:tcPr>
-            <w:tcW w:type="dxa" w:w="2409"/>
+            <w:tcW w:type="dxa" w:w="2471"/>
             <w:tcBorders>
               <w:top w:val="single" w:color="D9D4C5" w:sz="4"/>
               <w:left w:val="single" w:color="D9D4C5" w:sz="4"/>
@@ -10554,7 +10554,7 @@
         </w:tc>
         <w:tc>
           <w:tcPr>
-            <w:tcW w:type="dxa" w:w="4016"/>
+            <w:tcW w:type="dxa" w:w="3954"/>
             <w:tcBorders>
               <w:top w:val="single" w:color="D9D4C5" w:sz="4"/>
               <w:left w:val="single" w:color="D9D4C5" w:sz="4"/>
@@ -10622,7 +10622,7 @@
         </w:tc>
         <w:tc>
           <w:tcPr>
-            <w:tcW w:type="dxa" w:w="2409"/>
+            <w:tcW w:type="dxa" w:w="2471"/>
             <w:tcBorders>
               <w:top w:val="single" w:color="D9D4C5" w:sz="4"/>
               <w:left w:val="single" w:color="D9D4C5" w:sz="4"/>
@@ -10692,7 +10692,7 @@
         </w:tc>
         <w:tc>
           <w:tcPr>
-            <w:tcW w:type="dxa" w:w="4016"/>
+            <w:tcW w:type="dxa" w:w="3954"/>
             <w:tcBorders>
               <w:top w:val="single" w:color="D9D4C5" w:sz="4"/>
               <w:left w:val="single" w:color="D9D4C5" w:sz="4"/>
@@ -10887,7 +10887,7 @@
         </w:tc>
         <w:tc>
           <w:tcPr>
-            <w:tcW w:type="dxa" w:w="2409"/>
+            <w:tcW w:type="dxa" w:w="2471"/>
             <w:tcBorders>
               <w:top w:val="single" w:color="D9D4C5" w:sz="4"/>
               <w:left w:val="single" w:color="D9D4C5" w:sz="4"/>
@@ -10957,7 +10957,7 @@
         </w:tc>
         <w:tc>
           <w:tcPr>
-            <w:tcW w:type="dxa" w:w="4016"/>
+            <w:tcW w:type="dxa" w:w="3954"/>
             <w:tcBorders>
               <w:top w:val="single" w:color="D9D4C5" w:sz="4"/>
               <w:left w:val="single" w:color="D9D4C5" w:sz="4"/>
@@ -11259,7 +11259,7 @@
         </w:tc>
         <w:tc>
           <w:tcPr>
-            <w:tcW w:type="dxa" w:w="2409"/>
+            <w:tcW w:type="dxa" w:w="2471"/>
             <w:tcBorders>
               <w:top w:val="single" w:color="D9D4C5" w:sz="4"/>
               <w:left w:val="single" w:color="D9D4C5" w:sz="4"/>
@@ -11329,7 +11329,7 @@
         </w:tc>
         <w:tc>
           <w:tcPr>
-            <w:tcW w:type="dxa" w:w="4016"/>
+            <w:tcW w:type="dxa" w:w="3954"/>
             <w:tcBorders>
               <w:top w:val="single" w:color="D9D4C5" w:sz="4"/>
               <w:left w:val="single" w:color="D9D4C5" w:sz="4"/>
@@ -11380,7 +11380,7 @@
         </w:tc>
         <w:tc>
           <w:tcPr>
-            <w:tcW w:type="dxa" w:w="2409"/>
+            <w:tcW w:type="dxa" w:w="2471"/>
             <w:tcBorders>
               <w:top w:val="single" w:color="D9D4C5" w:sz="4"/>
               <w:left w:val="single" w:color="D9D4C5" w:sz="4"/>
@@ -11450,7 +11450,7 @@
         </w:tc>
         <w:tc>
           <w:tcPr>
-            <w:tcW w:type="dxa" w:w="4016"/>
+            <w:tcW w:type="dxa" w:w="3954"/>
             <w:tcBorders>
               <w:top w:val="single" w:color="D9D4C5" w:sz="4"/>
               <w:left w:val="single" w:color="D9D4C5" w:sz="4"/>
@@ -11770,7 +11770,7 @@
         </w:tc>
         <w:tc>
           <w:tcPr>
-            <w:tcW w:type="dxa" w:w="2409"/>
+            <w:tcW w:type="dxa" w:w="2471"/>
             <w:tcBorders>
               <w:top w:val="single" w:color="D9D4C5" w:sz="4"/>
               <w:left w:val="single" w:color="D9D4C5" w:sz="4"/>
@@ -11840,7 +11840,7 @@
         </w:tc>
         <w:tc>
           <w:tcPr>
-            <w:tcW w:type="dxa" w:w="4016"/>
+            <w:tcW w:type="dxa" w:w="3954"/>
             <w:tcBorders>
               <w:top w:val="single" w:color="D9D4C5" w:sz="4"/>
               <w:left w:val="single" w:color="D9D4C5" w:sz="4"/>
@@ -12233,7 +12233,7 @@
         </w:tc>
         <w:tc>
           <w:tcPr>
-            <w:tcW w:type="dxa" w:w="2409"/>
+            <w:tcW w:type="dxa" w:w="2471"/>
             <w:tcBorders>
               <w:top w:val="single" w:color="D9D4C5" w:sz="4"/>
               <w:left w:val="single" w:color="D9D4C5" w:sz="4"/>
@@ -12261,6 +12261,125 @@
                 <w:szCs w:val="18"/>
               </w:rPr>
               <w:t xml:space="preserve">18/10/2026 (sera, verificato)</w:t>
+            </w:r>
+          </w:p>
+        </w:tc>
+      </w:tr>
+      <w:tr>
+        <w:trPr>
+          <w:cantSplit/>
+        </w:trPr>
+        <w:tc>
+          <w:tcPr>
+            <w:tcW w:type="dxa" w:w="3213"/>
+            <w:tcBorders>
+              <w:top w:val="single" w:color="D9D4C5" w:sz="4"/>
+              <w:left w:val="single" w:color="D9D4C5" w:sz="4"/>
+              <w:bottom w:val="single" w:color="D9D4C5" w:sz="4"/>
+              <w:right w:val="single" w:color="D9D4C5" w:sz="4"/>
+            </w:tcBorders>
+            <w:tcMar>
+              <w:top w:type="dxa" w:w="70"/>
+              <w:left w:type="dxa" w:w="110"/>
+              <w:bottom w:type="dxa" w:w="70"/>
+              <w:right w:type="dxa" w:w="110"/>
+            </w:tcMar>
+            <w:vAlign w:val="center"/>
+          </w:tcPr>
+          <w:p>
+            <w:pPr>
+              <w:spacing w:after="0" w:before="0"/>
+            </w:pPr>
+            <w:r>
+              <w:rPr>
+                <w:rFonts w:ascii="Consolas" w:cs="Consolas" w:eastAsia="Consolas" w:hAnsi="Consolas"/>
+                <w:color w:val="2F5D3A"/>
+                <w:sz w:val="18"/>
+                <w:szCs w:val="18"/>
+              </w:rPr>
+              <w:t xml:space="preserve">25_documenti_programma.sql</w:t>
+            </w:r>
+          </w:p>
+        </w:tc>
+        <w:tc>
+          <w:tcPr>
+            <w:tcW w:type="dxa" w:w="3954"/>
+            <w:tcBorders>
+              <w:top w:val="single" w:color="D9D4C5" w:sz="4"/>
+              <w:left w:val="single" w:color="D9D4C5" w:sz="4"/>
+              <w:bottom w:val="single" w:color="D9D4C5" w:sz="4"/>
+              <w:right w:val="single" w:color="D9D4C5" w:sz="4"/>
+            </w:tcBorders>
+            <w:tcMar>
+              <w:top w:type="dxa" w:w="70"/>
+              <w:left w:type="dxa" w:w="110"/>
+              <w:bottom w:type="dxa" w:w="70"/>
+              <w:right w:type="dxa" w:w="110"/>
+            </w:tcMar>
+            <w:vAlign w:val="center"/>
+          </w:tcPr>
+          <w:p>
+            <w:pPr>
+              <w:spacing w:after="0" w:before="0"/>
+            </w:pPr>
+            <w:r>
+              <w:rPr>
+                <w:rFonts w:ascii="Arial" w:cs="Arial" w:eastAsia="Arial" w:hAnsi="Arial"/>
+                <w:color w:val="1B2118"/>
+                <w:sz w:val="18"/>
+                <w:szCs w:val="18"/>
+              </w:rPr>
+              <w:t xml:space="preserve">Gli otto documenti ufficiali del Programma v1.2 (Guida, Definizioni, Normativa, Standard, Metodologia, Politica di reclamo, Schema tariffario, Gestione qualità dei dati), caricati nella radice dell'archivio </w:t>
+            </w:r>
+            <w:r>
+              <w:rPr>
+                <w:rFonts w:ascii="Consolas" w:cs="Consolas" w:eastAsia="Consolas" w:hAnsi="Consolas"/>
+                <w:color w:val="2F5D3A"/>
+                <w:sz w:val="18"/>
+                <w:szCs w:val="18"/>
+              </w:rPr>
+              <w:t xml:space="preserve">modelli</w:t>
+            </w:r>
+            <w:r>
+              <w:rPr>
+                <w:rFonts w:ascii="Arial" w:cs="Arial" w:eastAsia="Arial" w:hAnsi="Arial"/>
+                <w:color w:val="1B2118"/>
+                <w:sz w:val="18"/>
+                <w:szCs w:val="18"/>
+              </w:rPr>
+              <w:t xml:space="preserve">, registrati come modelli pubblici «Documento del Programma»; PDF della Metodologia collegato alla metodologia approvata</w:t>
+            </w:r>
+          </w:p>
+        </w:tc>
+        <w:tc>
+          <w:tcPr>
+            <w:tcW w:type="dxa" w:w="2471"/>
+            <w:tcBorders>
+              <w:top w:val="single" w:color="D9D4C5" w:sz="4"/>
+              <w:left w:val="single" w:color="D9D4C5" w:sz="4"/>
+              <w:bottom w:val="single" w:color="D9D4C5" w:sz="4"/>
+              <w:right w:val="single" w:color="D9D4C5" w:sz="4"/>
+            </w:tcBorders>
+            <w:tcMar>
+              <w:top w:type="dxa" w:w="70"/>
+              <w:left w:type="dxa" w:w="110"/>
+              <w:bottom w:type="dxa" w:w="70"/>
+              <w:right w:type="dxa" w:w="110"/>
+            </w:tcMar>
+            <w:vAlign w:val="center"/>
+          </w:tcPr>
+          <w:p>
+            <w:pPr>
+              <w:spacing w:after="0" w:before="0"/>
+            </w:pPr>
+            <w:r>
+              <w:rPr>
+                <w:rFonts w:ascii="Arial" w:cs="Arial" w:eastAsia="Arial" w:hAnsi="Arial"/>
+                <w:color w:val="1B2118"/>
+                <w:sz w:val="18"/>
+                <w:szCs w:val="18"/>
+              </w:rPr>
+              <w:t xml:space="preserve">18/10/2026 (sera, verificato sulla pagina /programma)</w:t>
             </w:r>
           </w:p>
         </w:tc>
@@ -20896,6 +21015,72 @@
           <w:sz w:val="21"/>
           <w:szCs w:val="21"/>
         </w:rPr>
+        <w:t xml:space="preserve">Pagina pubblica popolata (sera)</w:t>
+      </w:r>
+      <w:r>
+        <w:rPr>
+          <w:rFonts w:ascii="Arial" w:cs="Arial" w:eastAsia="Arial" w:hAnsi="Arial"/>
+          <w:color w:val="1B2118"/>
+          <w:sz w:val="21"/>
+          <w:szCs w:val="21"/>
+        </w:rPr>
+        <w:t xml:space="preserve"> — caricati dalla dashboard (Storage → </w:t>
+      </w:r>
+      <w:r>
+        <w:rPr>
+          <w:rFonts w:ascii="Consolas" w:cs="Consolas" w:eastAsia="Consolas" w:hAnsi="Consolas"/>
+          <w:color w:val="2F5D3A"/>
+          <w:sz w:val="21"/>
+          <w:szCs w:val="21"/>
+        </w:rPr>
+        <w:t xml:space="preserve">modelli</w:t>
+      </w:r>
+      <w:r>
+        <w:rPr>
+          <w:rFonts w:ascii="Arial" w:cs="Arial" w:eastAsia="Arial" w:hAnsi="Arial"/>
+          <w:color w:val="1B2118"/>
+          <w:sz w:val="21"/>
+          <w:szCs w:val="21"/>
+        </w:rPr>
+        <w:t xml:space="preserve">) gli otto PDF ufficiali del Programma e registrati con lo script </w:t>
+      </w:r>
+      <w:r>
+        <w:rPr>
+          <w:rFonts w:ascii="Consolas" w:cs="Consolas" w:eastAsia="Consolas" w:hAnsi="Consolas"/>
+          <w:color w:val="2F5D3A"/>
+          <w:sz w:val="21"/>
+          <w:szCs w:val="21"/>
+        </w:rPr>
+        <w:t xml:space="preserve">25_documenti_programma.sql</w:t>
+      </w:r>
+      <w:r>
+        <w:rPr>
+          <w:rFonts w:ascii="Arial" w:cs="Arial" w:eastAsia="Arial" w:hAnsi="Arial"/>
+          <w:color w:val="1B2118"/>
+          <w:sz w:val="21"/>
+          <w:szCs w:val="21"/>
+        </w:rPr>
+        <w:t xml:space="preserve">; script 24 rieseguito per l'ordine dei documenti come nella Guida. Verificati elenco e download dalla pagina /programma. Restano da inserire, perché servono dati della Fondazione: PEC del Programma, enti di validazione e verifica e registri riconosciuti, modulistica (i moduli non sono ancora disponibili).</w:t>
+      </w:r>
+    </w:p>
+    <w:p>
+      <w:pPr>
+        <w:pStyle w:val="ListParagraph"/>
+        <w:numPr>
+          <w:ilvl w:val="0"/>
+          <w:numId w:val="3"/>
+        </w:numPr>
+        <w:spacing w:after="70" w:line="290"/>
+      </w:pPr>
+      <w:r>
+        <w:rPr>
+          <w:rFonts w:ascii="Arial" w:cs="Arial" w:eastAsia="Arial" w:hAnsi="Arial"/>
+          <w:b/>
+          <w:bCs/>
+          <w:color w:val="1B2118"/>
+          <w:sz w:val="21"/>
+          <w:szCs w:val="21"/>
+        </w:rPr>
         <w:t xml:space="preserve">Allineamento ai documenti ufficiali del Programma (punto 35, sera)</w:t>
       </w:r>
       <w:r>
@@ -24809,7 +24994,7 @@
               </w:rPr>
               <w:t xml:space="preserve">Claude Doc: </w:t>
             </w:r>
-            <w:hyperlink w:history="1" r:id="rIdol0-ck1_xpsrbpmkcqs1t">
+            <w:hyperlink w:history="1" r:id="rIdx6xoi2bw7s4dpbrumyrg1">
               <w:r>
                 <w:rPr>
                   <w:rFonts w:ascii="Arial" w:cs="Arial" w:eastAsia="Arial" w:hAnsi="Arial"/>
@@ -25156,7 +25341,7 @@
               </w:rPr>
               <w:t xml:space="preserve">Claude Doc: </w:t>
             </w:r>
-            <w:hyperlink w:history="1" r:id="rIde2wjz0zxpvkuc3eifsz-z">
+            <w:hyperlink w:history="1" r:id="rIdwzk3svqskjitmpyaaieqw">
               <w:r>
                 <w:rPr>
                   <w:rFonts w:ascii="Arial" w:cs="Arial" w:eastAsia="Arial" w:hAnsi="Arial"/>
@@ -25760,7 +25945,7 @@
               </w:rPr>
               <w:t xml:space="preserve">Claude Doc: </w:t>
             </w:r>
-            <w:hyperlink w:history="1" r:id="rId7k569zcruu2gcekkfvzjj">
+            <w:hyperlink w:history="1" r:id="rIdvdrge5hrkp-jty2avsaax">
               <w:r>
                 <w:rPr>
                   <w:rFonts w:ascii="Arial" w:cs="Arial" w:eastAsia="Arial" w:hAnsi="Arial"/>
@@ -26331,7 +26516,7 @@
             <w:pPr>
               <w:spacing w:after="0" w:before="0"/>
             </w:pPr>
-            <w:hyperlink w:history="1" r:id="rIdrldsyaublxem_fghmhqyo">
+            <w:hyperlink w:history="1" r:id="rIdzmw2wnyj8o-ddfxvkfs8y">
               <w:r>
                 <w:rPr>
                   <w:rFonts w:ascii="Arial" w:cs="Arial" w:eastAsia="Arial" w:hAnsi="Arial"/>
@@ -36803,7 +36988,7 @@
           <w:sz w:val="21"/>
           <w:szCs w:val="21"/>
         </w:rPr>
-        <w:t xml:space="preserve">: 104 file, 24.671 righe in tutto.</w:t>
+        <w:t xml:space="preserve">: 105 file, 24.706 righe in tutto.</w:t>
       </w:r>
     </w:p>
     <w:p>
@@ -43788,9 +43973,9 @@
         <w:tblLayout w:type="fixed"/>
       </w:tblPr>
       <w:tblGrid>
-        <w:gridCol w:w="3514"/>
-        <w:gridCol w:w="949"/>
-        <w:gridCol w:w="5175"/>
+        <w:gridCol w:w="3518"/>
+        <w:gridCol w:w="948"/>
+        <w:gridCol w:w="5172"/>
       </w:tblGrid>
       <w:tr>
         <w:trPr>
@@ -43798,7 +43983,7 @@
         </w:trPr>
         <w:tc>
           <w:tcPr>
-            <w:tcW w:type="dxa" w:w="3514"/>
+            <w:tcW w:type="dxa" w:w="3518"/>
             <w:tcBorders>
               <w:top w:val="single" w:color="D9D4C5" w:sz="4"/>
               <w:left w:val="single" w:color="D9D4C5" w:sz="4"/>
@@ -43833,7 +44018,7 @@
         </w:tc>
         <w:tc>
           <w:tcPr>
-            <w:tcW w:type="dxa" w:w="949"/>
+            <w:tcW w:type="dxa" w:w="948"/>
             <w:tcBorders>
               <w:top w:val="single" w:color="D9D4C5" w:sz="4"/>
               <w:left w:val="single" w:color="D9D4C5" w:sz="4"/>
@@ -43868,7 +44053,7 @@
         </w:tc>
         <w:tc>
           <w:tcPr>
-            <w:tcW w:type="dxa" w:w="5175"/>
+            <w:tcW w:type="dxa" w:w="5172"/>
             <w:tcBorders>
               <w:top w:val="single" w:color="D9D4C5" w:sz="4"/>
               <w:left w:val="single" w:color="D9D4C5" w:sz="4"/>
@@ -43908,7 +44093,7 @@
         </w:trPr>
         <w:tc>
           <w:tcPr>
-            <w:tcW w:type="dxa" w:w="3514"/>
+            <w:tcW w:type="dxa" w:w="3518"/>
             <w:tcBorders>
               <w:top w:val="single" w:color="D9D4C5" w:sz="4"/>
               <w:left w:val="single" w:color="D9D4C5" w:sz="4"/>
@@ -43940,7 +44125,7 @@
         </w:tc>
         <w:tc>
           <w:tcPr>
-            <w:tcW w:type="dxa" w:w="949"/>
+            <w:tcW w:type="dxa" w:w="948"/>
             <w:tcBorders>
               <w:top w:val="single" w:color="D9D4C5" w:sz="4"/>
               <w:left w:val="single" w:color="D9D4C5" w:sz="4"/>
@@ -43972,7 +44157,7 @@
         </w:tc>
         <w:tc>
           <w:tcPr>
-            <w:tcW w:type="dxa" w:w="5175"/>
+            <w:tcW w:type="dxa" w:w="5172"/>
             <w:tcBorders>
               <w:top w:val="single" w:color="D9D4C5" w:sz="4"/>
               <w:left w:val="single" w:color="D9D4C5" w:sz="4"/>
@@ -44009,7 +44194,7 @@
         </w:trPr>
         <w:tc>
           <w:tcPr>
-            <w:tcW w:type="dxa" w:w="3514"/>
+            <w:tcW w:type="dxa" w:w="3518"/>
             <w:tcBorders>
               <w:top w:val="single" w:color="D9D4C5" w:sz="4"/>
               <w:left w:val="single" w:color="D9D4C5" w:sz="4"/>
@@ -44042,7 +44227,7 @@
         </w:tc>
         <w:tc>
           <w:tcPr>
-            <w:tcW w:type="dxa" w:w="949"/>
+            <w:tcW w:type="dxa" w:w="948"/>
             <w:tcBorders>
               <w:top w:val="single" w:color="D9D4C5" w:sz="4"/>
               <w:left w:val="single" w:color="D9D4C5" w:sz="4"/>
@@ -44075,7 +44260,7 @@
         </w:tc>
         <w:tc>
           <w:tcPr>
-            <w:tcW w:type="dxa" w:w="5175"/>
+            <w:tcW w:type="dxa" w:w="5172"/>
             <w:tcBorders>
               <w:top w:val="single" w:color="D9D4C5" w:sz="4"/>
               <w:left w:val="single" w:color="D9D4C5" w:sz="4"/>
@@ -44113,7 +44298,7 @@
         </w:trPr>
         <w:tc>
           <w:tcPr>
-            <w:tcW w:type="dxa" w:w="3514"/>
+            <w:tcW w:type="dxa" w:w="3518"/>
             <w:tcBorders>
               <w:top w:val="single" w:color="D9D4C5" w:sz="4"/>
               <w:left w:val="single" w:color="D9D4C5" w:sz="4"/>
@@ -44145,7 +44330,7 @@
         </w:tc>
         <w:tc>
           <w:tcPr>
-            <w:tcW w:type="dxa" w:w="949"/>
+            <w:tcW w:type="dxa" w:w="948"/>
             <w:tcBorders>
               <w:top w:val="single" w:color="D9D4C5" w:sz="4"/>
               <w:left w:val="single" w:color="D9D4C5" w:sz="4"/>
@@ -44177,7 +44362,7 @@
         </w:tc>
         <w:tc>
           <w:tcPr>
-            <w:tcW w:type="dxa" w:w="5175"/>
+            <w:tcW w:type="dxa" w:w="5172"/>
             <w:tcBorders>
               <w:top w:val="single" w:color="D9D4C5" w:sz="4"/>
               <w:left w:val="single" w:color="D9D4C5" w:sz="4"/>
@@ -44214,7 +44399,7 @@
         </w:trPr>
         <w:tc>
           <w:tcPr>
-            <w:tcW w:type="dxa" w:w="3514"/>
+            <w:tcW w:type="dxa" w:w="3518"/>
             <w:tcBorders>
               <w:top w:val="single" w:color="D9D4C5" w:sz="4"/>
               <w:left w:val="single" w:color="D9D4C5" w:sz="4"/>
@@ -44247,7 +44432,7 @@
         </w:tc>
         <w:tc>
           <w:tcPr>
-            <w:tcW w:type="dxa" w:w="949"/>
+            <w:tcW w:type="dxa" w:w="948"/>
             <w:tcBorders>
               <w:top w:val="single" w:color="D9D4C5" w:sz="4"/>
               <w:left w:val="single" w:color="D9D4C5" w:sz="4"/>
@@ -44280,7 +44465,7 @@
         </w:tc>
         <w:tc>
           <w:tcPr>
-            <w:tcW w:type="dxa" w:w="5175"/>
+            <w:tcW w:type="dxa" w:w="5172"/>
             <w:tcBorders>
               <w:top w:val="single" w:color="D9D4C5" w:sz="4"/>
               <w:left w:val="single" w:color="D9D4C5" w:sz="4"/>
@@ -44318,7 +44503,7 @@
         </w:trPr>
         <w:tc>
           <w:tcPr>
-            <w:tcW w:type="dxa" w:w="3514"/>
+            <w:tcW w:type="dxa" w:w="3518"/>
             <w:tcBorders>
               <w:top w:val="single" w:color="D9D4C5" w:sz="4"/>
               <w:left w:val="single" w:color="D9D4C5" w:sz="4"/>
@@ -44350,7 +44535,7 @@
         </w:tc>
         <w:tc>
           <w:tcPr>
-            <w:tcW w:type="dxa" w:w="949"/>
+            <w:tcW w:type="dxa" w:w="948"/>
             <w:tcBorders>
               <w:top w:val="single" w:color="D9D4C5" w:sz="4"/>
               <w:left w:val="single" w:color="D9D4C5" w:sz="4"/>
@@ -44382,7 +44567,7 @@
         </w:tc>
         <w:tc>
           <w:tcPr>
-            <w:tcW w:type="dxa" w:w="5175"/>
+            <w:tcW w:type="dxa" w:w="5172"/>
             <w:tcBorders>
               <w:top w:val="single" w:color="D9D4C5" w:sz="4"/>
               <w:left w:val="single" w:color="D9D4C5" w:sz="4"/>
@@ -44419,7 +44604,7 @@
         </w:trPr>
         <w:tc>
           <w:tcPr>
-            <w:tcW w:type="dxa" w:w="3514"/>
+            <w:tcW w:type="dxa" w:w="3518"/>
             <w:tcBorders>
               <w:top w:val="single" w:color="D9D4C5" w:sz="4"/>
               <w:left w:val="single" w:color="D9D4C5" w:sz="4"/>
@@ -44452,7 +44637,7 @@
         </w:tc>
         <w:tc>
           <w:tcPr>
-            <w:tcW w:type="dxa" w:w="949"/>
+            <w:tcW w:type="dxa" w:w="948"/>
             <w:tcBorders>
               <w:top w:val="single" w:color="D9D4C5" w:sz="4"/>
               <w:left w:val="single" w:color="D9D4C5" w:sz="4"/>
@@ -44485,7 +44670,7 @@
         </w:tc>
         <w:tc>
           <w:tcPr>
-            <w:tcW w:type="dxa" w:w="5175"/>
+            <w:tcW w:type="dxa" w:w="5172"/>
             <w:tcBorders>
               <w:top w:val="single" w:color="D9D4C5" w:sz="4"/>
               <w:left w:val="single" w:color="D9D4C5" w:sz="4"/>
@@ -44523,7 +44708,7 @@
         </w:trPr>
         <w:tc>
           <w:tcPr>
-            <w:tcW w:type="dxa" w:w="3514"/>
+            <w:tcW w:type="dxa" w:w="3518"/>
             <w:tcBorders>
               <w:top w:val="single" w:color="D9D4C5" w:sz="4"/>
               <w:left w:val="single" w:color="D9D4C5" w:sz="4"/>
@@ -44555,7 +44740,7 @@
         </w:tc>
         <w:tc>
           <w:tcPr>
-            <w:tcW w:type="dxa" w:w="949"/>
+            <w:tcW w:type="dxa" w:w="948"/>
             <w:tcBorders>
               <w:top w:val="single" w:color="D9D4C5" w:sz="4"/>
               <w:left w:val="single" w:color="D9D4C5" w:sz="4"/>
@@ -44587,7 +44772,7 @@
         </w:tc>
         <w:tc>
           <w:tcPr>
-            <w:tcW w:type="dxa" w:w="5175"/>
+            <w:tcW w:type="dxa" w:w="5172"/>
             <w:tcBorders>
               <w:top w:val="single" w:color="D9D4C5" w:sz="4"/>
               <w:left w:val="single" w:color="D9D4C5" w:sz="4"/>
@@ -44624,7 +44809,7 @@
         </w:trPr>
         <w:tc>
           <w:tcPr>
-            <w:tcW w:type="dxa" w:w="3514"/>
+            <w:tcW w:type="dxa" w:w="3518"/>
             <w:tcBorders>
               <w:top w:val="single" w:color="D9D4C5" w:sz="4"/>
               <w:left w:val="single" w:color="D9D4C5" w:sz="4"/>
@@ -44657,7 +44842,7 @@
         </w:tc>
         <w:tc>
           <w:tcPr>
-            <w:tcW w:type="dxa" w:w="949"/>
+            <w:tcW w:type="dxa" w:w="948"/>
             <w:tcBorders>
               <w:top w:val="single" w:color="D9D4C5" w:sz="4"/>
               <w:left w:val="single" w:color="D9D4C5" w:sz="4"/>
@@ -44690,7 +44875,7 @@
         </w:tc>
         <w:tc>
           <w:tcPr>
-            <w:tcW w:type="dxa" w:w="5175"/>
+            <w:tcW w:type="dxa" w:w="5172"/>
             <w:tcBorders>
               <w:top w:val="single" w:color="D9D4C5" w:sz="4"/>
               <w:left w:val="single" w:color="D9D4C5" w:sz="4"/>
@@ -44728,7 +44913,7 @@
         </w:trPr>
         <w:tc>
           <w:tcPr>
-            <w:tcW w:type="dxa" w:w="3514"/>
+            <w:tcW w:type="dxa" w:w="3518"/>
             <w:tcBorders>
               <w:top w:val="single" w:color="D9D4C5" w:sz="4"/>
               <w:left w:val="single" w:color="D9D4C5" w:sz="4"/>
@@ -44760,7 +44945,7 @@
         </w:tc>
         <w:tc>
           <w:tcPr>
-            <w:tcW w:type="dxa" w:w="949"/>
+            <w:tcW w:type="dxa" w:w="948"/>
             <w:tcBorders>
               <w:top w:val="single" w:color="D9D4C5" w:sz="4"/>
               <w:left w:val="single" w:color="D9D4C5" w:sz="4"/>
@@ -44792,7 +44977,7 @@
         </w:tc>
         <w:tc>
           <w:tcPr>
-            <w:tcW w:type="dxa" w:w="5175"/>
+            <w:tcW w:type="dxa" w:w="5172"/>
             <w:tcBorders>
               <w:top w:val="single" w:color="D9D4C5" w:sz="4"/>
               <w:left w:val="single" w:color="D9D4C5" w:sz="4"/>
@@ -44829,7 +45014,7 @@
         </w:trPr>
         <w:tc>
           <w:tcPr>
-            <w:tcW w:type="dxa" w:w="3514"/>
+            <w:tcW w:type="dxa" w:w="3518"/>
             <w:tcBorders>
               <w:top w:val="single" w:color="D9D4C5" w:sz="4"/>
               <w:left w:val="single" w:color="D9D4C5" w:sz="4"/>
@@ -44862,7 +45047,7 @@
         </w:tc>
         <w:tc>
           <w:tcPr>
-            <w:tcW w:type="dxa" w:w="949"/>
+            <w:tcW w:type="dxa" w:w="948"/>
             <w:tcBorders>
               <w:top w:val="single" w:color="D9D4C5" w:sz="4"/>
               <w:left w:val="single" w:color="D9D4C5" w:sz="4"/>
@@ -44895,7 +45080,7 @@
         </w:tc>
         <w:tc>
           <w:tcPr>
-            <w:tcW w:type="dxa" w:w="5175"/>
+            <w:tcW w:type="dxa" w:w="5172"/>
             <w:tcBorders>
               <w:top w:val="single" w:color="D9D4C5" w:sz="4"/>
               <w:left w:val="single" w:color="D9D4C5" w:sz="4"/>
@@ -44933,7 +45118,7 @@
         </w:trPr>
         <w:tc>
           <w:tcPr>
-            <w:tcW w:type="dxa" w:w="3514"/>
+            <w:tcW w:type="dxa" w:w="3518"/>
             <w:tcBorders>
               <w:top w:val="single" w:color="D9D4C5" w:sz="4"/>
               <w:left w:val="single" w:color="D9D4C5" w:sz="4"/>
@@ -44965,7 +45150,7 @@
         </w:tc>
         <w:tc>
           <w:tcPr>
-            <w:tcW w:type="dxa" w:w="949"/>
+            <w:tcW w:type="dxa" w:w="948"/>
             <w:tcBorders>
               <w:top w:val="single" w:color="D9D4C5" w:sz="4"/>
               <w:left w:val="single" w:color="D9D4C5" w:sz="4"/>
@@ -44997,7 +45182,7 @@
         </w:tc>
         <w:tc>
           <w:tcPr>
-            <w:tcW w:type="dxa" w:w="5175"/>
+            <w:tcW w:type="dxa" w:w="5172"/>
             <w:tcBorders>
               <w:top w:val="single" w:color="D9D4C5" w:sz="4"/>
               <w:left w:val="single" w:color="D9D4C5" w:sz="4"/>
@@ -45034,7 +45219,7 @@
         </w:trPr>
         <w:tc>
           <w:tcPr>
-            <w:tcW w:type="dxa" w:w="3514"/>
+            <w:tcW w:type="dxa" w:w="3518"/>
             <w:tcBorders>
               <w:top w:val="single" w:color="D9D4C5" w:sz="4"/>
               <w:left w:val="single" w:color="D9D4C5" w:sz="4"/>
@@ -45067,7 +45252,7 @@
         </w:tc>
         <w:tc>
           <w:tcPr>
-            <w:tcW w:type="dxa" w:w="949"/>
+            <w:tcW w:type="dxa" w:w="948"/>
             <w:tcBorders>
               <w:top w:val="single" w:color="D9D4C5" w:sz="4"/>
               <w:left w:val="single" w:color="D9D4C5" w:sz="4"/>
@@ -45100,7 +45285,7 @@
         </w:tc>
         <w:tc>
           <w:tcPr>
-            <w:tcW w:type="dxa" w:w="5175"/>
+            <w:tcW w:type="dxa" w:w="5172"/>
             <w:tcBorders>
               <w:top w:val="single" w:color="D9D4C5" w:sz="4"/>
               <w:left w:val="single" w:color="D9D4C5" w:sz="4"/>
@@ -45138,7 +45323,7 @@
         </w:trPr>
         <w:tc>
           <w:tcPr>
-            <w:tcW w:type="dxa" w:w="3514"/>
+            <w:tcW w:type="dxa" w:w="3518"/>
             <w:tcBorders>
               <w:top w:val="single" w:color="D9D4C5" w:sz="4"/>
               <w:left w:val="single" w:color="D9D4C5" w:sz="4"/>
@@ -45170,7 +45355,7 @@
         </w:tc>
         <w:tc>
           <w:tcPr>
-            <w:tcW w:type="dxa" w:w="949"/>
+            <w:tcW w:type="dxa" w:w="948"/>
             <w:tcBorders>
               <w:top w:val="single" w:color="D9D4C5" w:sz="4"/>
               <w:left w:val="single" w:color="D9D4C5" w:sz="4"/>
@@ -45202,7 +45387,7 @@
         </w:tc>
         <w:tc>
           <w:tcPr>
-            <w:tcW w:type="dxa" w:w="5175"/>
+            <w:tcW w:type="dxa" w:w="5172"/>
             <w:tcBorders>
               <w:top w:val="single" w:color="D9D4C5" w:sz="4"/>
               <w:left w:val="single" w:color="D9D4C5" w:sz="4"/>
@@ -45239,7 +45424,7 @@
         </w:trPr>
         <w:tc>
           <w:tcPr>
-            <w:tcW w:type="dxa" w:w="3514"/>
+            <w:tcW w:type="dxa" w:w="3518"/>
             <w:tcBorders>
               <w:top w:val="single" w:color="D9D4C5" w:sz="4"/>
               <w:left w:val="single" w:color="D9D4C5" w:sz="4"/>
@@ -45272,7 +45457,7 @@
         </w:tc>
         <w:tc>
           <w:tcPr>
-            <w:tcW w:type="dxa" w:w="949"/>
+            <w:tcW w:type="dxa" w:w="948"/>
             <w:tcBorders>
               <w:top w:val="single" w:color="D9D4C5" w:sz="4"/>
               <w:left w:val="single" w:color="D9D4C5" w:sz="4"/>
@@ -45305,7 +45490,7 @@
         </w:tc>
         <w:tc>
           <w:tcPr>
-            <w:tcW w:type="dxa" w:w="5175"/>
+            <w:tcW w:type="dxa" w:w="5172"/>
             <w:tcBorders>
               <w:top w:val="single" w:color="D9D4C5" w:sz="4"/>
               <w:left w:val="single" w:color="D9D4C5" w:sz="4"/>
@@ -45343,7 +45528,7 @@
         </w:trPr>
         <w:tc>
           <w:tcPr>
-            <w:tcW w:type="dxa" w:w="3514"/>
+            <w:tcW w:type="dxa" w:w="3518"/>
             <w:tcBorders>
               <w:top w:val="single" w:color="D9D4C5" w:sz="4"/>
               <w:left w:val="single" w:color="D9D4C5" w:sz="4"/>
@@ -45375,7 +45560,7 @@
         </w:tc>
         <w:tc>
           <w:tcPr>
-            <w:tcW w:type="dxa" w:w="949"/>
+            <w:tcW w:type="dxa" w:w="948"/>
             <w:tcBorders>
               <w:top w:val="single" w:color="D9D4C5" w:sz="4"/>
               <w:left w:val="single" w:color="D9D4C5" w:sz="4"/>
@@ -45407,7 +45592,7 @@
         </w:tc>
         <w:tc>
           <w:tcPr>
-            <w:tcW w:type="dxa" w:w="5175"/>
+            <w:tcW w:type="dxa" w:w="5172"/>
             <w:tcBorders>
               <w:top w:val="single" w:color="D9D4C5" w:sz="4"/>
               <w:left w:val="single" w:color="D9D4C5" w:sz="4"/>
@@ -45444,7 +45629,7 @@
         </w:trPr>
         <w:tc>
           <w:tcPr>
-            <w:tcW w:type="dxa" w:w="3514"/>
+            <w:tcW w:type="dxa" w:w="3518"/>
             <w:tcBorders>
               <w:top w:val="single" w:color="D9D4C5" w:sz="4"/>
               <w:left w:val="single" w:color="D9D4C5" w:sz="4"/>
@@ -45477,7 +45662,7 @@
         </w:tc>
         <w:tc>
           <w:tcPr>
-            <w:tcW w:type="dxa" w:w="949"/>
+            <w:tcW w:type="dxa" w:w="948"/>
             <w:tcBorders>
               <w:top w:val="single" w:color="D9D4C5" w:sz="4"/>
               <w:left w:val="single" w:color="D9D4C5" w:sz="4"/>
@@ -45510,7 +45695,7 @@
         </w:tc>
         <w:tc>
           <w:tcPr>
-            <w:tcW w:type="dxa" w:w="5175"/>
+            <w:tcW w:type="dxa" w:w="5172"/>
             <w:tcBorders>
               <w:top w:val="single" w:color="D9D4C5" w:sz="4"/>
               <w:left w:val="single" w:color="D9D4C5" w:sz="4"/>
@@ -45548,7 +45733,7 @@
         </w:trPr>
         <w:tc>
           <w:tcPr>
-            <w:tcW w:type="dxa" w:w="3514"/>
+            <w:tcW w:type="dxa" w:w="3518"/>
             <w:tcBorders>
               <w:top w:val="single" w:color="D9D4C5" w:sz="4"/>
               <w:left w:val="single" w:color="D9D4C5" w:sz="4"/>
@@ -45580,7 +45765,7 @@
         </w:tc>
         <w:tc>
           <w:tcPr>
-            <w:tcW w:type="dxa" w:w="949"/>
+            <w:tcW w:type="dxa" w:w="948"/>
             <w:tcBorders>
               <w:top w:val="single" w:color="D9D4C5" w:sz="4"/>
               <w:left w:val="single" w:color="D9D4C5" w:sz="4"/>
@@ -45612,7 +45797,7 @@
         </w:tc>
         <w:tc>
           <w:tcPr>
-            <w:tcW w:type="dxa" w:w="5175"/>
+            <w:tcW w:type="dxa" w:w="5172"/>
             <w:tcBorders>
               <w:top w:val="single" w:color="D9D4C5" w:sz="4"/>
               <w:left w:val="single" w:color="D9D4C5" w:sz="4"/>
@@ -45649,7 +45834,7 @@
         </w:trPr>
         <w:tc>
           <w:tcPr>
-            <w:tcW w:type="dxa" w:w="3514"/>
+            <w:tcW w:type="dxa" w:w="3518"/>
             <w:tcBorders>
               <w:top w:val="single" w:color="D9D4C5" w:sz="4"/>
               <w:left w:val="single" w:color="D9D4C5" w:sz="4"/>
@@ -45682,7 +45867,7 @@
         </w:tc>
         <w:tc>
           <w:tcPr>
-            <w:tcW w:type="dxa" w:w="949"/>
+            <w:tcW w:type="dxa" w:w="948"/>
             <w:tcBorders>
               <w:top w:val="single" w:color="D9D4C5" w:sz="4"/>
               <w:left w:val="single" w:color="D9D4C5" w:sz="4"/>
@@ -45715,7 +45900,7 @@
         </w:tc>
         <w:tc>
           <w:tcPr>
-            <w:tcW w:type="dxa" w:w="5175"/>
+            <w:tcW w:type="dxa" w:w="5172"/>
             <w:tcBorders>
               <w:top w:val="single" w:color="D9D4C5" w:sz="4"/>
               <w:left w:val="single" w:color="D9D4C5" w:sz="4"/>
@@ -45753,7 +45938,7 @@
         </w:trPr>
         <w:tc>
           <w:tcPr>
-            <w:tcW w:type="dxa" w:w="3514"/>
+            <w:tcW w:type="dxa" w:w="3518"/>
             <w:tcBorders>
               <w:top w:val="single" w:color="D9D4C5" w:sz="4"/>
               <w:left w:val="single" w:color="D9D4C5" w:sz="4"/>
@@ -45785,7 +45970,7 @@
         </w:tc>
         <w:tc>
           <w:tcPr>
-            <w:tcW w:type="dxa" w:w="949"/>
+            <w:tcW w:type="dxa" w:w="948"/>
             <w:tcBorders>
               <w:top w:val="single" w:color="D9D4C5" w:sz="4"/>
               <w:left w:val="single" w:color="D9D4C5" w:sz="4"/>
@@ -45817,7 +46002,7 @@
         </w:tc>
         <w:tc>
           <w:tcPr>
-            <w:tcW w:type="dxa" w:w="5175"/>
+            <w:tcW w:type="dxa" w:w="5172"/>
             <w:tcBorders>
               <w:top w:val="single" w:color="D9D4C5" w:sz="4"/>
               <w:left w:val="single" w:color="D9D4C5" w:sz="4"/>
@@ -45854,7 +46039,7 @@
         </w:trPr>
         <w:tc>
           <w:tcPr>
-            <w:tcW w:type="dxa" w:w="3514"/>
+            <w:tcW w:type="dxa" w:w="3518"/>
             <w:tcBorders>
               <w:top w:val="single" w:color="D9D4C5" w:sz="4"/>
               <w:left w:val="single" w:color="D9D4C5" w:sz="4"/>
@@ -45887,7 +46072,7 @@
         </w:tc>
         <w:tc>
           <w:tcPr>
-            <w:tcW w:type="dxa" w:w="949"/>
+            <w:tcW w:type="dxa" w:w="948"/>
             <w:tcBorders>
               <w:top w:val="single" w:color="D9D4C5" w:sz="4"/>
               <w:left w:val="single" w:color="D9D4C5" w:sz="4"/>
@@ -45920,7 +46105,7 @@
         </w:tc>
         <w:tc>
           <w:tcPr>
-            <w:tcW w:type="dxa" w:w="5175"/>
+            <w:tcW w:type="dxa" w:w="5172"/>
             <w:tcBorders>
               <w:top w:val="single" w:color="D9D4C5" w:sz="4"/>
               <w:left w:val="single" w:color="D9D4C5" w:sz="4"/>
@@ -45958,7 +46143,7 @@
         </w:trPr>
         <w:tc>
           <w:tcPr>
-            <w:tcW w:type="dxa" w:w="3514"/>
+            <w:tcW w:type="dxa" w:w="3518"/>
             <w:tcBorders>
               <w:top w:val="single" w:color="D9D4C5" w:sz="4"/>
               <w:left w:val="single" w:color="D9D4C5" w:sz="4"/>
@@ -45990,7 +46175,7 @@
         </w:tc>
         <w:tc>
           <w:tcPr>
-            <w:tcW w:type="dxa" w:w="949"/>
+            <w:tcW w:type="dxa" w:w="948"/>
             <w:tcBorders>
               <w:top w:val="single" w:color="D9D4C5" w:sz="4"/>
               <w:left w:val="single" w:color="D9D4C5" w:sz="4"/>
@@ -46022,7 +46207,7 @@
         </w:tc>
         <w:tc>
           <w:tcPr>
-            <w:tcW w:type="dxa" w:w="5175"/>
+            <w:tcW w:type="dxa" w:w="5172"/>
             <w:tcBorders>
               <w:top w:val="single" w:color="D9D4C5" w:sz="4"/>
               <w:left w:val="single" w:color="D9D4C5" w:sz="4"/>
@@ -46059,7 +46244,7 @@
         </w:trPr>
         <w:tc>
           <w:tcPr>
-            <w:tcW w:type="dxa" w:w="3514"/>
+            <w:tcW w:type="dxa" w:w="3518"/>
             <w:tcBorders>
               <w:top w:val="single" w:color="D9D4C5" w:sz="4"/>
               <w:left w:val="single" w:color="D9D4C5" w:sz="4"/>
@@ -46092,7 +46277,7 @@
         </w:tc>
         <w:tc>
           <w:tcPr>
-            <w:tcW w:type="dxa" w:w="949"/>
+            <w:tcW w:type="dxa" w:w="948"/>
             <w:tcBorders>
               <w:top w:val="single" w:color="D9D4C5" w:sz="4"/>
               <w:left w:val="single" w:color="D9D4C5" w:sz="4"/>
@@ -46125,7 +46310,7 @@
         </w:tc>
         <w:tc>
           <w:tcPr>
-            <w:tcW w:type="dxa" w:w="5175"/>
+            <w:tcW w:type="dxa" w:w="5172"/>
             <w:tcBorders>
               <w:top w:val="single" w:color="D9D4C5" w:sz="4"/>
               <w:left w:val="single" w:color="D9D4C5" w:sz="4"/>
@@ -46163,7 +46348,7 @@
         </w:trPr>
         <w:tc>
           <w:tcPr>
-            <w:tcW w:type="dxa" w:w="3514"/>
+            <w:tcW w:type="dxa" w:w="3518"/>
             <w:tcBorders>
               <w:top w:val="single" w:color="D9D4C5" w:sz="4"/>
               <w:left w:val="single" w:color="D9D4C5" w:sz="4"/>
@@ -46195,7 +46380,7 @@
         </w:tc>
         <w:tc>
           <w:tcPr>
-            <w:tcW w:type="dxa" w:w="949"/>
+            <w:tcW w:type="dxa" w:w="948"/>
             <w:tcBorders>
               <w:top w:val="single" w:color="D9D4C5" w:sz="4"/>
               <w:left w:val="single" w:color="D9D4C5" w:sz="4"/>
@@ -46227,7 +46412,7 @@
         </w:tc>
         <w:tc>
           <w:tcPr>
-            <w:tcW w:type="dxa" w:w="5175"/>
+            <w:tcW w:type="dxa" w:w="5172"/>
             <w:tcBorders>
               <w:top w:val="single" w:color="D9D4C5" w:sz="4"/>
               <w:left w:val="single" w:color="D9D4C5" w:sz="4"/>
@@ -46264,7 +46449,7 @@
         </w:trPr>
         <w:tc>
           <w:tcPr>
-            <w:tcW w:type="dxa" w:w="3514"/>
+            <w:tcW w:type="dxa" w:w="3518"/>
             <w:tcBorders>
               <w:top w:val="single" w:color="D9D4C5" w:sz="4"/>
               <w:left w:val="single" w:color="D9D4C5" w:sz="4"/>
@@ -46297,7 +46482,7 @@
         </w:tc>
         <w:tc>
           <w:tcPr>
-            <w:tcW w:type="dxa" w:w="949"/>
+            <w:tcW w:type="dxa" w:w="948"/>
             <w:tcBorders>
               <w:top w:val="single" w:color="D9D4C5" w:sz="4"/>
               <w:left w:val="single" w:color="D9D4C5" w:sz="4"/>
@@ -46330,7 +46515,7 @@
         </w:tc>
         <w:tc>
           <w:tcPr>
-            <w:tcW w:type="dxa" w:w="5175"/>
+            <w:tcW w:type="dxa" w:w="5172"/>
             <w:tcBorders>
               <w:top w:val="single" w:color="D9D4C5" w:sz="4"/>
               <w:left w:val="single" w:color="D9D4C5" w:sz="4"/>
@@ -46368,7 +46553,7 @@
         </w:trPr>
         <w:tc>
           <w:tcPr>
-            <w:tcW w:type="dxa" w:w="3514"/>
+            <w:tcW w:type="dxa" w:w="3518"/>
             <w:tcBorders>
               <w:top w:val="single" w:color="D9D4C5" w:sz="4"/>
               <w:left w:val="single" w:color="D9D4C5" w:sz="4"/>
@@ -46394,19 +46579,122 @@
                 <w:sz w:val="18"/>
                 <w:szCs w:val="18"/>
               </w:rPr>
+              <w:t xml:space="preserve">supabase/25_documenti_programma.sql</w:t>
+            </w:r>
+          </w:p>
+        </w:tc>
+        <w:tc>
+          <w:tcPr>
+            <w:tcW w:type="dxa" w:w="948"/>
+            <w:tcBorders>
+              <w:top w:val="single" w:color="D9D4C5" w:sz="4"/>
+              <w:left w:val="single" w:color="D9D4C5" w:sz="4"/>
+              <w:bottom w:val="single" w:color="D9D4C5" w:sz="4"/>
+              <w:right w:val="single" w:color="D9D4C5" w:sz="4"/>
+            </w:tcBorders>
+            <w:tcMar>
+              <w:top w:type="dxa" w:w="70"/>
+              <w:left w:type="dxa" w:w="110"/>
+              <w:bottom w:type="dxa" w:w="70"/>
+              <w:right w:type="dxa" w:w="110"/>
+            </w:tcMar>
+            <w:vAlign w:val="center"/>
+          </w:tcPr>
+          <w:p>
+            <w:pPr>
+              <w:spacing w:after="0" w:before="0"/>
+            </w:pPr>
+            <w:r>
+              <w:rPr>
+                <w:rFonts w:ascii="Arial" w:cs="Arial" w:eastAsia="Arial" w:hAnsi="Arial"/>
+                <w:color w:val="1B2118"/>
+                <w:sz w:val="18"/>
+                <w:szCs w:val="18"/>
+              </w:rPr>
+              <w:t xml:space="preserve">35</w:t>
+            </w:r>
+          </w:p>
+        </w:tc>
+        <w:tc>
+          <w:tcPr>
+            <w:tcW w:type="dxa" w:w="5172"/>
+            <w:tcBorders>
+              <w:top w:val="single" w:color="D9D4C5" w:sz="4"/>
+              <w:left w:val="single" w:color="D9D4C5" w:sz="4"/>
+              <w:bottom w:val="single" w:color="D9D4C5" w:sz="4"/>
+              <w:right w:val="single" w:color="D9D4C5" w:sz="4"/>
+            </w:tcBorders>
+            <w:tcMar>
+              <w:top w:type="dxa" w:w="70"/>
+              <w:left w:type="dxa" w:w="110"/>
+              <w:bottom w:type="dxa" w:w="70"/>
+              <w:right w:type="dxa" w:w="110"/>
+            </w:tcMar>
+            <w:vAlign w:val="center"/>
+          </w:tcPr>
+          <w:p>
+            <w:pPr>
+              <w:spacing w:after="0" w:before="0"/>
+            </w:pPr>
+            <w:r>
+              <w:rPr>
+                <w:rFonts w:ascii="Arial" w:cs="Arial" w:eastAsia="Arial" w:hAnsi="Arial"/>
+                <w:color w:val="1B2118"/>
+                <w:sz w:val="18"/>
+                <w:szCs w:val="18"/>
+              </w:rPr>
+              <w:t xml:space="preserve">DOCUMENTI UFFICIALI DEL PROGRAMMA SULLA PAGINA PUBBLICA (18/10/2026)</w:t>
+            </w:r>
+          </w:p>
+        </w:tc>
+      </w:tr>
+      <w:tr>
+        <w:trPr>
+          <w:cantSplit/>
+        </w:trPr>
+        <w:tc>
+          <w:tcPr>
+            <w:tcW w:type="dxa" w:w="3518"/>
+            <w:tcBorders>
+              <w:top w:val="single" w:color="D9D4C5" w:sz="4"/>
+              <w:left w:val="single" w:color="D9D4C5" w:sz="4"/>
+              <w:bottom w:val="single" w:color="D9D4C5" w:sz="4"/>
+              <w:right w:val="single" w:color="D9D4C5" w:sz="4"/>
+            </w:tcBorders>
+            <w:shd w:fill="F6F4EE" w:color="auto" w:val="clear"/>
+            <w:tcMar>
+              <w:top w:type="dxa" w:w="70"/>
+              <w:left w:type="dxa" w:w="110"/>
+              <w:bottom w:type="dxa" w:w="70"/>
+              <w:right w:type="dxa" w:w="110"/>
+            </w:tcMar>
+            <w:vAlign w:val="center"/>
+          </w:tcPr>
+          <w:p>
+            <w:pPr>
+              <w:spacing w:after="0" w:before="0"/>
+            </w:pPr>
+            <w:r>
+              <w:rPr>
+                <w:rFonts w:ascii="Consolas" w:cs="Consolas" w:eastAsia="Consolas" w:hAnsi="Consolas"/>
+                <w:color w:val="2F5D3A"/>
+                <w:sz w:val="18"/>
+                <w:szCs w:val="18"/>
+              </w:rPr>
               <w:t xml:space="preserve">supabase/schema_completo.sql</w:t>
             </w:r>
           </w:p>
         </w:tc>
         <w:tc>
           <w:tcPr>
-            <w:tcW w:type="dxa" w:w="949"/>
-            <w:tcBorders>
-              <w:top w:val="single" w:color="D9D4C5" w:sz="4"/>
-              <w:left w:val="single" w:color="D9D4C5" w:sz="4"/>
-              <w:bottom w:val="single" w:color="D9D4C5" w:sz="4"/>
-              <w:right w:val="single" w:color="D9D4C5" w:sz="4"/>
-            </w:tcBorders>
+            <w:tcW w:type="dxa" w:w="948"/>
+            <w:tcBorders>
+              <w:top w:val="single" w:color="D9D4C5" w:sz="4"/>
+              <w:left w:val="single" w:color="D9D4C5" w:sz="4"/>
+              <w:bottom w:val="single" w:color="D9D4C5" w:sz="4"/>
+              <w:right w:val="single" w:color="D9D4C5" w:sz="4"/>
+            </w:tcBorders>
+            <w:shd w:fill="F6F4EE" w:color="auto" w:val="clear"/>
             <w:tcMar>
               <w:top w:type="dxa" w:w="70"/>
               <w:left w:type="dxa" w:w="110"/>
@@ -46432,13 +46720,14 @@
         </w:tc>
         <w:tc>
           <w:tcPr>
-            <w:tcW w:type="dxa" w:w="5175"/>
-            <w:tcBorders>
-              <w:top w:val="single" w:color="D9D4C5" w:sz="4"/>
-              <w:left w:val="single" w:color="D9D4C5" w:sz="4"/>
-              <w:bottom w:val="single" w:color="D9D4C5" w:sz="4"/>
-              <w:right w:val="single" w:color="D9D4C5" w:sz="4"/>
-            </w:tcBorders>
+            <w:tcW w:type="dxa" w:w="5172"/>
+            <w:tcBorders>
+              <w:top w:val="single" w:color="D9D4C5" w:sz="4"/>
+              <w:left w:val="single" w:color="D9D4C5" w:sz="4"/>
+              <w:bottom w:val="single" w:color="D9D4C5" w:sz="4"/>
+              <w:right w:val="single" w:color="D9D4C5" w:sz="4"/>
+            </w:tcBorders>
+            <w:shd w:fill="F6F4EE" w:color="auto" w:val="clear"/>
             <w:tcMar>
               <w:top w:type="dxa" w:w="70"/>
               <w:left w:type="dxa" w:w="110"/>

</xml_diff>

<commit_message>
Registro: script 26 eseguito, PEC del Programma pubblicata
Co-Authored-By: Claude Opus 5.5 <noreply@anthropic.com>
Claude-Session: https://claude.ai/code/session_01E8XCbEeVHWVP3hntUZ6kZ1
</commit_message>
<xml_diff>
--- a/public/documentazione/Registro_Dev_Deploy_Portale_CWP.docx
+++ b/public/documentazione/Registro_Dev_Deploy_Portale_CWP.docx
@@ -12384,6 +12384,128 @@
           </w:p>
         </w:tc>
       </w:tr>
+      <w:tr>
+        <w:trPr>
+          <w:cantSplit/>
+        </w:trPr>
+        <w:tc>
+          <w:tcPr>
+            <w:tcW w:type="dxa" w:w="3213"/>
+            <w:tcBorders>
+              <w:top w:val="single" w:color="D9D4C5" w:sz="4"/>
+              <w:left w:val="single" w:color="D9D4C5" w:sz="4"/>
+              <w:bottom w:val="single" w:color="D9D4C5" w:sz="4"/>
+              <w:right w:val="single" w:color="D9D4C5" w:sz="4"/>
+            </w:tcBorders>
+            <w:shd w:fill="F6F4EE" w:color="auto" w:val="clear"/>
+            <w:tcMar>
+              <w:top w:type="dxa" w:w="70"/>
+              <w:left w:type="dxa" w:w="110"/>
+              <w:bottom w:type="dxa" w:w="70"/>
+              <w:right w:type="dxa" w:w="110"/>
+            </w:tcMar>
+            <w:vAlign w:val="center"/>
+          </w:tcPr>
+          <w:p>
+            <w:pPr>
+              <w:spacing w:after="0" w:before="0"/>
+            </w:pPr>
+            <w:r>
+              <w:rPr>
+                <w:rFonts w:ascii="Consolas" w:cs="Consolas" w:eastAsia="Consolas" w:hAnsi="Consolas"/>
+                <w:color w:val="2F5D3A"/>
+                <w:sz w:val="18"/>
+                <w:szCs w:val="18"/>
+              </w:rPr>
+              <w:t xml:space="preserve">26_pec_programma.sql</w:t>
+            </w:r>
+          </w:p>
+        </w:tc>
+        <w:tc>
+          <w:tcPr>
+            <w:tcW w:type="dxa" w:w="3954"/>
+            <w:tcBorders>
+              <w:top w:val="single" w:color="D9D4C5" w:sz="4"/>
+              <w:left w:val="single" w:color="D9D4C5" w:sz="4"/>
+              <w:bottom w:val="single" w:color="D9D4C5" w:sz="4"/>
+              <w:right w:val="single" w:color="D9D4C5" w:sz="4"/>
+            </w:tcBorders>
+            <w:shd w:fill="F6F4EE" w:color="auto" w:val="clear"/>
+            <w:tcMar>
+              <w:top w:type="dxa" w:w="70"/>
+              <w:left w:type="dxa" w:w="110"/>
+              <w:bottom w:type="dxa" w:w="70"/>
+              <w:right w:type="dxa" w:w="110"/>
+            </w:tcMar>
+            <w:vAlign w:val="center"/>
+          </w:tcPr>
+          <w:p>
+            <w:pPr>
+              <w:spacing w:after="0" w:before="0"/>
+            </w:pPr>
+            <w:r>
+              <w:rPr>
+                <w:rFonts w:ascii="Arial" w:cs="Arial" w:eastAsia="Arial" w:hAnsi="Arial"/>
+                <w:color w:val="1B2118"/>
+                <w:sz w:val="18"/>
+                <w:szCs w:val="18"/>
+              </w:rPr>
+              <w:t xml:space="preserve">PEC del Programma </w:t>
+            </w:r>
+            <w:r>
+              <w:rPr>
+                <w:rFonts w:ascii="Consolas" w:cs="Consolas" w:eastAsia="Consolas" w:hAnsi="Consolas"/>
+                <w:color w:val="2F5D3A"/>
+                <w:sz w:val="18"/>
+                <w:szCs w:val="18"/>
+              </w:rPr>
+              <w:t xml:space="preserve">operate@pec.it</w:t>
+            </w:r>
+            <w:r>
+              <w:rPr>
+                <w:rFonts w:ascii="Arial" w:cs="Arial" w:eastAsia="Arial" w:hAnsi="Arial"/>
+                <w:color w:val="1B2118"/>
+                <w:sz w:val="18"/>
+                <w:szCs w:val="18"/>
+              </w:rPr>
+              <w:t xml:space="preserve"> (comunicata da Luca), mostrata sulla pagina pubblica nelle informazioni del Programma e per i reclami; modificabile poi da Impostazioni</w:t>
+            </w:r>
+          </w:p>
+        </w:tc>
+        <w:tc>
+          <w:tcPr>
+            <w:tcW w:type="dxa" w:w="2471"/>
+            <w:tcBorders>
+              <w:top w:val="single" w:color="D9D4C5" w:sz="4"/>
+              <w:left w:val="single" w:color="D9D4C5" w:sz="4"/>
+              <w:bottom w:val="single" w:color="D9D4C5" w:sz="4"/>
+              <w:right w:val="single" w:color="D9D4C5" w:sz="4"/>
+            </w:tcBorders>
+            <w:shd w:fill="F6F4EE" w:color="auto" w:val="clear"/>
+            <w:tcMar>
+              <w:top w:type="dxa" w:w="70"/>
+              <w:left w:type="dxa" w:w="110"/>
+              <w:bottom w:type="dxa" w:w="70"/>
+              <w:right w:type="dxa" w:w="110"/>
+            </w:tcMar>
+            <w:vAlign w:val="center"/>
+          </w:tcPr>
+          <w:p>
+            <w:pPr>
+              <w:spacing w:after="0" w:before="0"/>
+            </w:pPr>
+            <w:r>
+              <w:rPr>
+                <w:rFonts w:ascii="Arial" w:cs="Arial" w:eastAsia="Arial" w:hAnsi="Arial"/>
+                <w:color w:val="1B2118"/>
+                <w:sz w:val="18"/>
+                <w:szCs w:val="18"/>
+              </w:rPr>
+              <w:t xml:space="preserve">19/10/2026 (verificato sulla pagina /programma)</w:t>
+            </w:r>
+          </w:p>
+        </w:tc>
+      </w:tr>
     </w:tbl>
     <w:p>
       <w:pPr>
@@ -20994,7 +21116,7 @@
           <w:sz w:val="25"/>
           <w:szCs w:val="25"/>
         </w:rPr>
-        <w:t xml:space="preserve">18 ottobre 2026</w:t>
+        <w:t xml:space="preserve">19 ottobre 2026</w:t>
       </w:r>
     </w:p>
     <w:p>
@@ -21015,16 +21137,16 @@
           <w:sz w:val="21"/>
           <w:szCs w:val="21"/>
         </w:rPr>
-        <w:t xml:space="preserve">Pagina pubblica popolata (sera)</w:t>
-      </w:r>
-      <w:r>
-        <w:rPr>
-          <w:rFonts w:ascii="Arial" w:cs="Arial" w:eastAsia="Arial" w:hAnsi="Arial"/>
-          <w:color w:val="1B2118"/>
-          <w:sz w:val="21"/>
-          <w:szCs w:val="21"/>
-        </w:rPr>
-        <w:t xml:space="preserve"> — caricati dalla dashboard (Storage → </w:t>
+        <w:t xml:space="preserve">PEC del Programma</w:t>
+      </w:r>
+      <w:r>
+        <w:rPr>
+          <w:rFonts w:ascii="Arial" w:cs="Arial" w:eastAsia="Arial" w:hAnsi="Arial"/>
+          <w:color w:val="1B2118"/>
+          <w:sz w:val="21"/>
+          <w:szCs w:val="21"/>
+        </w:rPr>
+        <w:t xml:space="preserve"> — script </w:t>
       </w:r>
       <w:r>
         <w:rPr>
@@ -21033,16 +21155,16 @@
           <w:sz w:val="21"/>
           <w:szCs w:val="21"/>
         </w:rPr>
-        <w:t xml:space="preserve">modelli</w:t>
-      </w:r>
-      <w:r>
-        <w:rPr>
-          <w:rFonts w:ascii="Arial" w:cs="Arial" w:eastAsia="Arial" w:hAnsi="Arial"/>
-          <w:color w:val="1B2118"/>
-          <w:sz w:val="21"/>
-          <w:szCs w:val="21"/>
-        </w:rPr>
-        <w:t xml:space="preserve">) gli otto PDF ufficiali del Programma e registrati con lo script </w:t>
+        <w:t xml:space="preserve">26_pec_programma.sql</w:t>
+      </w:r>
+      <w:r>
+        <w:rPr>
+          <w:rFonts w:ascii="Arial" w:cs="Arial" w:eastAsia="Arial" w:hAnsi="Arial"/>
+          <w:color w:val="1B2118"/>
+          <w:sz w:val="21"/>
+          <w:szCs w:val="21"/>
+        </w:rPr>
+        <w:t xml:space="preserve"> eseguito in produzione alle 7:00: </w:t>
       </w:r>
       <w:r>
         <w:rPr>
@@ -21051,6 +21173,90 @@
           <w:sz w:val="21"/>
           <w:szCs w:val="21"/>
         </w:rPr>
+        <w:t xml:space="preserve">operate@pec.it</w:t>
+      </w:r>
+      <w:r>
+        <w:rPr>
+          <w:rFonts w:ascii="Arial" w:cs="Arial" w:eastAsia="Arial" w:hAnsi="Arial"/>
+          <w:color w:val="1B2118"/>
+          <w:sz w:val="21"/>
+          <w:szCs w:val="21"/>
+        </w:rPr>
+        <w:t xml:space="preserve"> compare sulla pagina pubblica /programma (informazioni del Programma e reclami).</w:t>
+      </w:r>
+    </w:p>
+    <w:p>
+      <w:pPr>
+        <w:pStyle w:val="Heading2"/>
+        <w:keepNext/>
+        <w:spacing w:after="120" w:before="240"/>
+      </w:pPr>
+      <w:r>
+        <w:rPr>
+          <w:rFonts w:ascii="Arial" w:cs="Arial" w:eastAsia="Arial" w:hAnsi="Arial"/>
+          <w:b/>
+          <w:bCs/>
+          <w:color w:val="2F5D3A"/>
+          <w:sz w:val="25"/>
+          <w:szCs w:val="25"/>
+        </w:rPr>
+        <w:t xml:space="preserve">18 ottobre 2026</w:t>
+      </w:r>
+    </w:p>
+    <w:p>
+      <w:pPr>
+        <w:pStyle w:val="ListParagraph"/>
+        <w:numPr>
+          <w:ilvl w:val="0"/>
+          <w:numId w:val="3"/>
+        </w:numPr>
+        <w:spacing w:after="70" w:line="290"/>
+      </w:pPr>
+      <w:r>
+        <w:rPr>
+          <w:rFonts w:ascii="Arial" w:cs="Arial" w:eastAsia="Arial" w:hAnsi="Arial"/>
+          <w:b/>
+          <w:bCs/>
+          <w:color w:val="1B2118"/>
+          <w:sz w:val="21"/>
+          <w:szCs w:val="21"/>
+        </w:rPr>
+        <w:t xml:space="preserve">Pagina pubblica popolata (sera)</w:t>
+      </w:r>
+      <w:r>
+        <w:rPr>
+          <w:rFonts w:ascii="Arial" w:cs="Arial" w:eastAsia="Arial" w:hAnsi="Arial"/>
+          <w:color w:val="1B2118"/>
+          <w:sz w:val="21"/>
+          <w:szCs w:val="21"/>
+        </w:rPr>
+        <w:t xml:space="preserve"> — caricati dalla dashboard (Storage → </w:t>
+      </w:r>
+      <w:r>
+        <w:rPr>
+          <w:rFonts w:ascii="Consolas" w:cs="Consolas" w:eastAsia="Consolas" w:hAnsi="Consolas"/>
+          <w:color w:val="2F5D3A"/>
+          <w:sz w:val="21"/>
+          <w:szCs w:val="21"/>
+        </w:rPr>
+        <w:t xml:space="preserve">modelli</w:t>
+      </w:r>
+      <w:r>
+        <w:rPr>
+          <w:rFonts w:ascii="Arial" w:cs="Arial" w:eastAsia="Arial" w:hAnsi="Arial"/>
+          <w:color w:val="1B2118"/>
+          <w:sz w:val="21"/>
+          <w:szCs w:val="21"/>
+        </w:rPr>
+        <w:t xml:space="preserve">) gli otto PDF ufficiali del Programma e registrati con lo script </w:t>
+      </w:r>
+      <w:r>
+        <w:rPr>
+          <w:rFonts w:ascii="Consolas" w:cs="Consolas" w:eastAsia="Consolas" w:hAnsi="Consolas"/>
+          <w:color w:val="2F5D3A"/>
+          <w:sz w:val="21"/>
+          <w:szCs w:val="21"/>
+        </w:rPr>
         <w:t xml:space="preserve">25_documenti_programma.sql</w:t>
       </w:r>
       <w:r>
@@ -21060,7 +21266,7 @@
           <w:sz w:val="21"/>
           <w:szCs w:val="21"/>
         </w:rPr>
-        <w:t xml:space="preserve">; script 24 rieseguito per l'ordine dei documenti come nella Guida. Verificati elenco e download dalla pagina /programma. Restano da inserire, perché servono dati della Fondazione: PEC del Programma, enti di validazione e verifica e registri riconosciuti, modulistica (i moduli non sono ancora disponibili).</w:t>
+        <w:t xml:space="preserve">; script 24 rieseguito per l'ordine dei documenti come nella Guida. Verificati elenco e download dalla pagina /programma. Restano da inserire, perché servono dati della Fondazione: enti di validazione e verifica e registri riconosciuti, modulistica (i moduli non sono ancora disponibili).</w:t>
       </w:r>
     </w:p>
     <w:p>
@@ -24994,7 +25200,7 @@
               </w:rPr>
               <w:t xml:space="preserve">Claude Doc: </w:t>
             </w:r>
-            <w:hyperlink w:history="1" r:id="rIdx6xoi2bw7s4dpbrumyrg1">
+            <w:hyperlink w:history="1" r:id="rIdl2bgrmdkibat_jcz7vj5g">
               <w:r>
                 <w:rPr>
                   <w:rFonts w:ascii="Arial" w:cs="Arial" w:eastAsia="Arial" w:hAnsi="Arial"/>
@@ -25341,7 +25547,7 @@
               </w:rPr>
               <w:t xml:space="preserve">Claude Doc: </w:t>
             </w:r>
-            <w:hyperlink w:history="1" r:id="rIdwzk3svqskjitmpyaaieqw">
+            <w:hyperlink w:history="1" r:id="rIdskrgamr8ps-ur07tt1qpd">
               <w:r>
                 <w:rPr>
                   <w:rFonts w:ascii="Arial" w:cs="Arial" w:eastAsia="Arial" w:hAnsi="Arial"/>
@@ -25945,7 +26151,7 @@
               </w:rPr>
               <w:t xml:space="preserve">Claude Doc: </w:t>
             </w:r>
-            <w:hyperlink w:history="1" r:id="rIdvdrge5hrkp-jty2avsaax">
+            <w:hyperlink w:history="1" r:id="rIdfjhv--dmejlvxxow3j_az">
               <w:r>
                 <w:rPr>
                   <w:rFonts w:ascii="Arial" w:cs="Arial" w:eastAsia="Arial" w:hAnsi="Arial"/>
@@ -26516,7 +26722,7 @@
             <w:pPr>
               <w:spacing w:after="0" w:before="0"/>
             </w:pPr>
-            <w:hyperlink w:history="1" r:id="rIdzmw2wnyj8o-ddfxvkfs8y">
+            <w:hyperlink w:history="1" r:id="rIdmg7qzbeamw3aeovqr2yvt">
               <w:r>
                 <w:rPr>
                   <w:rFonts w:ascii="Arial" w:cs="Arial" w:eastAsia="Arial" w:hAnsi="Arial"/>
@@ -36988,7 +37194,7 @@
           <w:sz w:val="21"/>
           <w:szCs w:val="21"/>
         </w:rPr>
-        <w:t xml:space="preserve">: 105 file, 24.706 righe in tutto.</w:t>
+        <w:t xml:space="preserve">: 106 file, 24.725 righe in tutto.</w:t>
       </w:r>
     </w:p>
     <w:p>
@@ -43973,9 +44179,9 @@
         <w:tblLayout w:type="fixed"/>
       </w:tblPr>
       <w:tblGrid>
-        <w:gridCol w:w="3518"/>
-        <w:gridCol w:w="948"/>
-        <w:gridCol w:w="5172"/>
+        <w:gridCol w:w="3515"/>
+        <w:gridCol w:w="949"/>
+        <w:gridCol w:w="5174"/>
       </w:tblGrid>
       <w:tr>
         <w:trPr>
@@ -43983,7 +44189,7 @@
         </w:trPr>
         <w:tc>
           <w:tcPr>
-            <w:tcW w:type="dxa" w:w="3518"/>
+            <w:tcW w:type="dxa" w:w="3515"/>
             <w:tcBorders>
               <w:top w:val="single" w:color="D9D4C5" w:sz="4"/>
               <w:left w:val="single" w:color="D9D4C5" w:sz="4"/>
@@ -44018,7 +44224,7 @@
         </w:tc>
         <w:tc>
           <w:tcPr>
-            <w:tcW w:type="dxa" w:w="948"/>
+            <w:tcW w:type="dxa" w:w="949"/>
             <w:tcBorders>
               <w:top w:val="single" w:color="D9D4C5" w:sz="4"/>
               <w:left w:val="single" w:color="D9D4C5" w:sz="4"/>
@@ -44053,7 +44259,7 @@
         </w:tc>
         <w:tc>
           <w:tcPr>
-            <w:tcW w:type="dxa" w:w="5172"/>
+            <w:tcW w:type="dxa" w:w="5174"/>
             <w:tcBorders>
               <w:top w:val="single" w:color="D9D4C5" w:sz="4"/>
               <w:left w:val="single" w:color="D9D4C5" w:sz="4"/>
@@ -44093,7 +44299,7 @@
         </w:trPr>
         <w:tc>
           <w:tcPr>
-            <w:tcW w:type="dxa" w:w="3518"/>
+            <w:tcW w:type="dxa" w:w="3515"/>
             <w:tcBorders>
               <w:top w:val="single" w:color="D9D4C5" w:sz="4"/>
               <w:left w:val="single" w:color="D9D4C5" w:sz="4"/>
@@ -44125,7 +44331,7 @@
         </w:tc>
         <w:tc>
           <w:tcPr>
-            <w:tcW w:type="dxa" w:w="948"/>
+            <w:tcW w:type="dxa" w:w="949"/>
             <w:tcBorders>
               <w:top w:val="single" w:color="D9D4C5" w:sz="4"/>
               <w:left w:val="single" w:color="D9D4C5" w:sz="4"/>
@@ -44157,7 +44363,7 @@
         </w:tc>
         <w:tc>
           <w:tcPr>
-            <w:tcW w:type="dxa" w:w="5172"/>
+            <w:tcW w:type="dxa" w:w="5174"/>
             <w:tcBorders>
               <w:top w:val="single" w:color="D9D4C5" w:sz="4"/>
               <w:left w:val="single" w:color="D9D4C5" w:sz="4"/>
@@ -44194,7 +44400,7 @@
         </w:trPr>
         <w:tc>
           <w:tcPr>
-            <w:tcW w:type="dxa" w:w="3518"/>
+            <w:tcW w:type="dxa" w:w="3515"/>
             <w:tcBorders>
               <w:top w:val="single" w:color="D9D4C5" w:sz="4"/>
               <w:left w:val="single" w:color="D9D4C5" w:sz="4"/>
@@ -44227,7 +44433,7 @@
         </w:tc>
         <w:tc>
           <w:tcPr>
-            <w:tcW w:type="dxa" w:w="948"/>
+            <w:tcW w:type="dxa" w:w="949"/>
             <w:tcBorders>
               <w:top w:val="single" w:color="D9D4C5" w:sz="4"/>
               <w:left w:val="single" w:color="D9D4C5" w:sz="4"/>
@@ -44260,7 +44466,7 @@
         </w:tc>
         <w:tc>
           <w:tcPr>
-            <w:tcW w:type="dxa" w:w="5172"/>
+            <w:tcW w:type="dxa" w:w="5174"/>
             <w:tcBorders>
               <w:top w:val="single" w:color="D9D4C5" w:sz="4"/>
               <w:left w:val="single" w:color="D9D4C5" w:sz="4"/>
@@ -44298,7 +44504,7 @@
         </w:trPr>
         <w:tc>
           <w:tcPr>
-            <w:tcW w:type="dxa" w:w="3518"/>
+            <w:tcW w:type="dxa" w:w="3515"/>
             <w:tcBorders>
               <w:top w:val="single" w:color="D9D4C5" w:sz="4"/>
               <w:left w:val="single" w:color="D9D4C5" w:sz="4"/>
@@ -44330,7 +44536,7 @@
         </w:tc>
         <w:tc>
           <w:tcPr>
-            <w:tcW w:type="dxa" w:w="948"/>
+            <w:tcW w:type="dxa" w:w="949"/>
             <w:tcBorders>
               <w:top w:val="single" w:color="D9D4C5" w:sz="4"/>
               <w:left w:val="single" w:color="D9D4C5" w:sz="4"/>
@@ -44362,7 +44568,7 @@
         </w:tc>
         <w:tc>
           <w:tcPr>
-            <w:tcW w:type="dxa" w:w="5172"/>
+            <w:tcW w:type="dxa" w:w="5174"/>
             <w:tcBorders>
               <w:top w:val="single" w:color="D9D4C5" w:sz="4"/>
               <w:left w:val="single" w:color="D9D4C5" w:sz="4"/>
@@ -44399,7 +44605,7 @@
         </w:trPr>
         <w:tc>
           <w:tcPr>
-            <w:tcW w:type="dxa" w:w="3518"/>
+            <w:tcW w:type="dxa" w:w="3515"/>
             <w:tcBorders>
               <w:top w:val="single" w:color="D9D4C5" w:sz="4"/>
               <w:left w:val="single" w:color="D9D4C5" w:sz="4"/>
@@ -44432,7 +44638,7 @@
         </w:tc>
         <w:tc>
           <w:tcPr>
-            <w:tcW w:type="dxa" w:w="948"/>
+            <w:tcW w:type="dxa" w:w="949"/>
             <w:tcBorders>
               <w:top w:val="single" w:color="D9D4C5" w:sz="4"/>
               <w:left w:val="single" w:color="D9D4C5" w:sz="4"/>
@@ -44465,7 +44671,7 @@
         </w:tc>
         <w:tc>
           <w:tcPr>
-            <w:tcW w:type="dxa" w:w="5172"/>
+            <w:tcW w:type="dxa" w:w="5174"/>
             <w:tcBorders>
               <w:top w:val="single" w:color="D9D4C5" w:sz="4"/>
               <w:left w:val="single" w:color="D9D4C5" w:sz="4"/>
@@ -44503,7 +44709,7 @@
         </w:trPr>
         <w:tc>
           <w:tcPr>
-            <w:tcW w:type="dxa" w:w="3518"/>
+            <w:tcW w:type="dxa" w:w="3515"/>
             <w:tcBorders>
               <w:top w:val="single" w:color="D9D4C5" w:sz="4"/>
               <w:left w:val="single" w:color="D9D4C5" w:sz="4"/>
@@ -44535,7 +44741,7 @@
         </w:tc>
         <w:tc>
           <w:tcPr>
-            <w:tcW w:type="dxa" w:w="948"/>
+            <w:tcW w:type="dxa" w:w="949"/>
             <w:tcBorders>
               <w:top w:val="single" w:color="D9D4C5" w:sz="4"/>
               <w:left w:val="single" w:color="D9D4C5" w:sz="4"/>
@@ -44567,7 +44773,7 @@
         </w:tc>
         <w:tc>
           <w:tcPr>
-            <w:tcW w:type="dxa" w:w="5172"/>
+            <w:tcW w:type="dxa" w:w="5174"/>
             <w:tcBorders>
               <w:top w:val="single" w:color="D9D4C5" w:sz="4"/>
               <w:left w:val="single" w:color="D9D4C5" w:sz="4"/>
@@ -44604,7 +44810,7 @@
         </w:trPr>
         <w:tc>
           <w:tcPr>
-            <w:tcW w:type="dxa" w:w="3518"/>
+            <w:tcW w:type="dxa" w:w="3515"/>
             <w:tcBorders>
               <w:top w:val="single" w:color="D9D4C5" w:sz="4"/>
               <w:left w:val="single" w:color="D9D4C5" w:sz="4"/>
@@ -44637,7 +44843,7 @@
         </w:tc>
         <w:tc>
           <w:tcPr>
-            <w:tcW w:type="dxa" w:w="948"/>
+            <w:tcW w:type="dxa" w:w="949"/>
             <w:tcBorders>
               <w:top w:val="single" w:color="D9D4C5" w:sz="4"/>
               <w:left w:val="single" w:color="D9D4C5" w:sz="4"/>
@@ -44670,7 +44876,7 @@
         </w:tc>
         <w:tc>
           <w:tcPr>
-            <w:tcW w:type="dxa" w:w="5172"/>
+            <w:tcW w:type="dxa" w:w="5174"/>
             <w:tcBorders>
               <w:top w:val="single" w:color="D9D4C5" w:sz="4"/>
               <w:left w:val="single" w:color="D9D4C5" w:sz="4"/>
@@ -44708,7 +44914,7 @@
         </w:trPr>
         <w:tc>
           <w:tcPr>
-            <w:tcW w:type="dxa" w:w="3518"/>
+            <w:tcW w:type="dxa" w:w="3515"/>
             <w:tcBorders>
               <w:top w:val="single" w:color="D9D4C5" w:sz="4"/>
               <w:left w:val="single" w:color="D9D4C5" w:sz="4"/>
@@ -44740,7 +44946,7 @@
         </w:tc>
         <w:tc>
           <w:tcPr>
-            <w:tcW w:type="dxa" w:w="948"/>
+            <w:tcW w:type="dxa" w:w="949"/>
             <w:tcBorders>
               <w:top w:val="single" w:color="D9D4C5" w:sz="4"/>
               <w:left w:val="single" w:color="D9D4C5" w:sz="4"/>
@@ -44772,7 +44978,7 @@
         </w:tc>
         <w:tc>
           <w:tcPr>
-            <w:tcW w:type="dxa" w:w="5172"/>
+            <w:tcW w:type="dxa" w:w="5174"/>
             <w:tcBorders>
               <w:top w:val="single" w:color="D9D4C5" w:sz="4"/>
               <w:left w:val="single" w:color="D9D4C5" w:sz="4"/>
@@ -44809,7 +45015,7 @@
         </w:trPr>
         <w:tc>
           <w:tcPr>
-            <w:tcW w:type="dxa" w:w="3518"/>
+            <w:tcW w:type="dxa" w:w="3515"/>
             <w:tcBorders>
               <w:top w:val="single" w:color="D9D4C5" w:sz="4"/>
               <w:left w:val="single" w:color="D9D4C5" w:sz="4"/>
@@ -44842,7 +45048,7 @@
         </w:tc>
         <w:tc>
           <w:tcPr>
-            <w:tcW w:type="dxa" w:w="948"/>
+            <w:tcW w:type="dxa" w:w="949"/>
             <w:tcBorders>
               <w:top w:val="single" w:color="D9D4C5" w:sz="4"/>
               <w:left w:val="single" w:color="D9D4C5" w:sz="4"/>
@@ -44875,7 +45081,7 @@
         </w:tc>
         <w:tc>
           <w:tcPr>
-            <w:tcW w:type="dxa" w:w="5172"/>
+            <w:tcW w:type="dxa" w:w="5174"/>
             <w:tcBorders>
               <w:top w:val="single" w:color="D9D4C5" w:sz="4"/>
               <w:left w:val="single" w:color="D9D4C5" w:sz="4"/>
@@ -44913,7 +45119,7 @@
         </w:trPr>
         <w:tc>
           <w:tcPr>
-            <w:tcW w:type="dxa" w:w="3518"/>
+            <w:tcW w:type="dxa" w:w="3515"/>
             <w:tcBorders>
               <w:top w:val="single" w:color="D9D4C5" w:sz="4"/>
               <w:left w:val="single" w:color="D9D4C5" w:sz="4"/>
@@ -44945,7 +45151,7 @@
         </w:tc>
         <w:tc>
           <w:tcPr>
-            <w:tcW w:type="dxa" w:w="948"/>
+            <w:tcW w:type="dxa" w:w="949"/>
             <w:tcBorders>
               <w:top w:val="single" w:color="D9D4C5" w:sz="4"/>
               <w:left w:val="single" w:color="D9D4C5" w:sz="4"/>
@@ -44977,7 +45183,7 @@
         </w:tc>
         <w:tc>
           <w:tcPr>
-            <w:tcW w:type="dxa" w:w="5172"/>
+            <w:tcW w:type="dxa" w:w="5174"/>
             <w:tcBorders>
               <w:top w:val="single" w:color="D9D4C5" w:sz="4"/>
               <w:left w:val="single" w:color="D9D4C5" w:sz="4"/>
@@ -45014,7 +45220,7 @@
         </w:trPr>
         <w:tc>
           <w:tcPr>
-            <w:tcW w:type="dxa" w:w="3518"/>
+            <w:tcW w:type="dxa" w:w="3515"/>
             <w:tcBorders>
               <w:top w:val="single" w:color="D9D4C5" w:sz="4"/>
               <w:left w:val="single" w:color="D9D4C5" w:sz="4"/>
@@ -45047,7 +45253,7 @@
         </w:tc>
         <w:tc>
           <w:tcPr>
-            <w:tcW w:type="dxa" w:w="948"/>
+            <w:tcW w:type="dxa" w:w="949"/>
             <w:tcBorders>
               <w:top w:val="single" w:color="D9D4C5" w:sz="4"/>
               <w:left w:val="single" w:color="D9D4C5" w:sz="4"/>
@@ -45080,7 +45286,7 @@
         </w:tc>
         <w:tc>
           <w:tcPr>
-            <w:tcW w:type="dxa" w:w="5172"/>
+            <w:tcW w:type="dxa" w:w="5174"/>
             <w:tcBorders>
               <w:top w:val="single" w:color="D9D4C5" w:sz="4"/>
               <w:left w:val="single" w:color="D9D4C5" w:sz="4"/>
@@ -45118,7 +45324,7 @@
         </w:trPr>
         <w:tc>
           <w:tcPr>
-            <w:tcW w:type="dxa" w:w="3518"/>
+            <w:tcW w:type="dxa" w:w="3515"/>
             <w:tcBorders>
               <w:top w:val="single" w:color="D9D4C5" w:sz="4"/>
               <w:left w:val="single" w:color="D9D4C5" w:sz="4"/>
@@ -45150,7 +45356,7 @@
         </w:tc>
         <w:tc>
           <w:tcPr>
-            <w:tcW w:type="dxa" w:w="948"/>
+            <w:tcW w:type="dxa" w:w="949"/>
             <w:tcBorders>
               <w:top w:val="single" w:color="D9D4C5" w:sz="4"/>
               <w:left w:val="single" w:color="D9D4C5" w:sz="4"/>
@@ -45182,7 +45388,7 @@
         </w:tc>
         <w:tc>
           <w:tcPr>
-            <w:tcW w:type="dxa" w:w="5172"/>
+            <w:tcW w:type="dxa" w:w="5174"/>
             <w:tcBorders>
               <w:top w:val="single" w:color="D9D4C5" w:sz="4"/>
               <w:left w:val="single" w:color="D9D4C5" w:sz="4"/>
@@ -45219,7 +45425,7 @@
         </w:trPr>
         <w:tc>
           <w:tcPr>
-            <w:tcW w:type="dxa" w:w="3518"/>
+            <w:tcW w:type="dxa" w:w="3515"/>
             <w:tcBorders>
               <w:top w:val="single" w:color="D9D4C5" w:sz="4"/>
               <w:left w:val="single" w:color="D9D4C5" w:sz="4"/>
@@ -45252,7 +45458,7 @@
         </w:tc>
         <w:tc>
           <w:tcPr>
-            <w:tcW w:type="dxa" w:w="948"/>
+            <w:tcW w:type="dxa" w:w="949"/>
             <w:tcBorders>
               <w:top w:val="single" w:color="D9D4C5" w:sz="4"/>
               <w:left w:val="single" w:color="D9D4C5" w:sz="4"/>
@@ -45285,7 +45491,7 @@
         </w:tc>
         <w:tc>
           <w:tcPr>
-            <w:tcW w:type="dxa" w:w="5172"/>
+            <w:tcW w:type="dxa" w:w="5174"/>
             <w:tcBorders>
               <w:top w:val="single" w:color="D9D4C5" w:sz="4"/>
               <w:left w:val="single" w:color="D9D4C5" w:sz="4"/>
@@ -45323,7 +45529,7 @@
         </w:trPr>
         <w:tc>
           <w:tcPr>
-            <w:tcW w:type="dxa" w:w="3518"/>
+            <w:tcW w:type="dxa" w:w="3515"/>
             <w:tcBorders>
               <w:top w:val="single" w:color="D9D4C5" w:sz="4"/>
               <w:left w:val="single" w:color="D9D4C5" w:sz="4"/>
@@ -45355,7 +45561,7 @@
         </w:tc>
         <w:tc>
           <w:tcPr>
-            <w:tcW w:type="dxa" w:w="948"/>
+            <w:tcW w:type="dxa" w:w="949"/>
             <w:tcBorders>
               <w:top w:val="single" w:color="D9D4C5" w:sz="4"/>
               <w:left w:val="single" w:color="D9D4C5" w:sz="4"/>
@@ -45387,7 +45593,7 @@
         </w:tc>
         <w:tc>
           <w:tcPr>
-            <w:tcW w:type="dxa" w:w="5172"/>
+            <w:tcW w:type="dxa" w:w="5174"/>
             <w:tcBorders>
               <w:top w:val="single" w:color="D9D4C5" w:sz="4"/>
               <w:left w:val="single" w:color="D9D4C5" w:sz="4"/>
@@ -45424,7 +45630,7 @@
         </w:trPr>
         <w:tc>
           <w:tcPr>
-            <w:tcW w:type="dxa" w:w="3518"/>
+            <w:tcW w:type="dxa" w:w="3515"/>
             <w:tcBorders>
               <w:top w:val="single" w:color="D9D4C5" w:sz="4"/>
               <w:left w:val="single" w:color="D9D4C5" w:sz="4"/>
@@ -45457,7 +45663,7 @@
         </w:tc>
         <w:tc>
           <w:tcPr>
-            <w:tcW w:type="dxa" w:w="948"/>
+            <w:tcW w:type="dxa" w:w="949"/>
             <w:tcBorders>
               <w:top w:val="single" w:color="D9D4C5" w:sz="4"/>
               <w:left w:val="single" w:color="D9D4C5" w:sz="4"/>
@@ -45490,7 +45696,7 @@
         </w:tc>
         <w:tc>
           <w:tcPr>
-            <w:tcW w:type="dxa" w:w="5172"/>
+            <w:tcW w:type="dxa" w:w="5174"/>
             <w:tcBorders>
               <w:top w:val="single" w:color="D9D4C5" w:sz="4"/>
               <w:left w:val="single" w:color="D9D4C5" w:sz="4"/>
@@ -45528,7 +45734,7 @@
         </w:trPr>
         <w:tc>
           <w:tcPr>
-            <w:tcW w:type="dxa" w:w="3518"/>
+            <w:tcW w:type="dxa" w:w="3515"/>
             <w:tcBorders>
               <w:top w:val="single" w:color="D9D4C5" w:sz="4"/>
               <w:left w:val="single" w:color="D9D4C5" w:sz="4"/>
@@ -45560,7 +45766,7 @@
         </w:tc>
         <w:tc>
           <w:tcPr>
-            <w:tcW w:type="dxa" w:w="948"/>
+            <w:tcW w:type="dxa" w:w="949"/>
             <w:tcBorders>
               <w:top w:val="single" w:color="D9D4C5" w:sz="4"/>
               <w:left w:val="single" w:color="D9D4C5" w:sz="4"/>
@@ -45592,7 +45798,7 @@
         </w:tc>
         <w:tc>
           <w:tcPr>
-            <w:tcW w:type="dxa" w:w="5172"/>
+            <w:tcW w:type="dxa" w:w="5174"/>
             <w:tcBorders>
               <w:top w:val="single" w:color="D9D4C5" w:sz="4"/>
               <w:left w:val="single" w:color="D9D4C5" w:sz="4"/>
@@ -45629,7 +45835,7 @@
         </w:trPr>
         <w:tc>
           <w:tcPr>
-            <w:tcW w:type="dxa" w:w="3518"/>
+            <w:tcW w:type="dxa" w:w="3515"/>
             <w:tcBorders>
               <w:top w:val="single" w:color="D9D4C5" w:sz="4"/>
               <w:left w:val="single" w:color="D9D4C5" w:sz="4"/>
@@ -45662,7 +45868,7 @@
         </w:tc>
         <w:tc>
           <w:tcPr>
-            <w:tcW w:type="dxa" w:w="948"/>
+            <w:tcW w:type="dxa" w:w="949"/>
             <w:tcBorders>
               <w:top w:val="single" w:color="D9D4C5" w:sz="4"/>
               <w:left w:val="single" w:color="D9D4C5" w:sz="4"/>
@@ -45695,7 +45901,7 @@
         </w:tc>
         <w:tc>
           <w:tcPr>
-            <w:tcW w:type="dxa" w:w="5172"/>
+            <w:tcW w:type="dxa" w:w="5174"/>
             <w:tcBorders>
               <w:top w:val="single" w:color="D9D4C5" w:sz="4"/>
               <w:left w:val="single" w:color="D9D4C5" w:sz="4"/>
@@ -45733,7 +45939,7 @@
         </w:trPr>
         <w:tc>
           <w:tcPr>
-            <w:tcW w:type="dxa" w:w="3518"/>
+            <w:tcW w:type="dxa" w:w="3515"/>
             <w:tcBorders>
               <w:top w:val="single" w:color="D9D4C5" w:sz="4"/>
               <w:left w:val="single" w:color="D9D4C5" w:sz="4"/>
@@ -45765,7 +45971,7 @@
         </w:tc>
         <w:tc>
           <w:tcPr>
-            <w:tcW w:type="dxa" w:w="948"/>
+            <w:tcW w:type="dxa" w:w="949"/>
             <w:tcBorders>
               <w:top w:val="single" w:color="D9D4C5" w:sz="4"/>
               <w:left w:val="single" w:color="D9D4C5" w:sz="4"/>
@@ -45797,7 +46003,7 @@
         </w:tc>
         <w:tc>
           <w:tcPr>
-            <w:tcW w:type="dxa" w:w="5172"/>
+            <w:tcW w:type="dxa" w:w="5174"/>
             <w:tcBorders>
               <w:top w:val="single" w:color="D9D4C5" w:sz="4"/>
               <w:left w:val="single" w:color="D9D4C5" w:sz="4"/>
@@ -45834,7 +46040,7 @@
         </w:trPr>
         <w:tc>
           <w:tcPr>
-            <w:tcW w:type="dxa" w:w="3518"/>
+            <w:tcW w:type="dxa" w:w="3515"/>
             <w:tcBorders>
               <w:top w:val="single" w:color="D9D4C5" w:sz="4"/>
               <w:left w:val="single" w:color="D9D4C5" w:sz="4"/>
@@ -45867,7 +46073,7 @@
         </w:tc>
         <w:tc>
           <w:tcPr>
-            <w:tcW w:type="dxa" w:w="948"/>
+            <w:tcW w:type="dxa" w:w="949"/>
             <w:tcBorders>
               <w:top w:val="single" w:color="D9D4C5" w:sz="4"/>
               <w:left w:val="single" w:color="D9D4C5" w:sz="4"/>
@@ -45900,7 +46106,7 @@
         </w:tc>
         <w:tc>
           <w:tcPr>
-            <w:tcW w:type="dxa" w:w="5172"/>
+            <w:tcW w:type="dxa" w:w="5174"/>
             <w:tcBorders>
               <w:top w:val="single" w:color="D9D4C5" w:sz="4"/>
               <w:left w:val="single" w:color="D9D4C5" w:sz="4"/>
@@ -45938,7 +46144,7 @@
         </w:trPr>
         <w:tc>
           <w:tcPr>
-            <w:tcW w:type="dxa" w:w="3518"/>
+            <w:tcW w:type="dxa" w:w="3515"/>
             <w:tcBorders>
               <w:top w:val="single" w:color="D9D4C5" w:sz="4"/>
               <w:left w:val="single" w:color="D9D4C5" w:sz="4"/>
@@ -45970,7 +46176,7 @@
         </w:tc>
         <w:tc>
           <w:tcPr>
-            <w:tcW w:type="dxa" w:w="948"/>
+            <w:tcW w:type="dxa" w:w="949"/>
             <w:tcBorders>
               <w:top w:val="single" w:color="D9D4C5" w:sz="4"/>
               <w:left w:val="single" w:color="D9D4C5" w:sz="4"/>
@@ -46002,7 +46208,7 @@
         </w:tc>
         <w:tc>
           <w:tcPr>
-            <w:tcW w:type="dxa" w:w="5172"/>
+            <w:tcW w:type="dxa" w:w="5174"/>
             <w:tcBorders>
               <w:top w:val="single" w:color="D9D4C5" w:sz="4"/>
               <w:left w:val="single" w:color="D9D4C5" w:sz="4"/>
@@ -46039,7 +46245,7 @@
         </w:trPr>
         <w:tc>
           <w:tcPr>
-            <w:tcW w:type="dxa" w:w="3518"/>
+            <w:tcW w:type="dxa" w:w="3515"/>
             <w:tcBorders>
               <w:top w:val="single" w:color="D9D4C5" w:sz="4"/>
               <w:left w:val="single" w:color="D9D4C5" w:sz="4"/>
@@ -46072,7 +46278,7 @@
         </w:tc>
         <w:tc>
           <w:tcPr>
-            <w:tcW w:type="dxa" w:w="948"/>
+            <w:tcW w:type="dxa" w:w="949"/>
             <w:tcBorders>
               <w:top w:val="single" w:color="D9D4C5" w:sz="4"/>
               <w:left w:val="single" w:color="D9D4C5" w:sz="4"/>
@@ -46105,7 +46311,7 @@
         </w:tc>
         <w:tc>
           <w:tcPr>
-            <w:tcW w:type="dxa" w:w="5172"/>
+            <w:tcW w:type="dxa" w:w="5174"/>
             <w:tcBorders>
               <w:top w:val="single" w:color="D9D4C5" w:sz="4"/>
               <w:left w:val="single" w:color="D9D4C5" w:sz="4"/>
@@ -46143,7 +46349,7 @@
         </w:trPr>
         <w:tc>
           <w:tcPr>
-            <w:tcW w:type="dxa" w:w="3518"/>
+            <w:tcW w:type="dxa" w:w="3515"/>
             <w:tcBorders>
               <w:top w:val="single" w:color="D9D4C5" w:sz="4"/>
               <w:left w:val="single" w:color="D9D4C5" w:sz="4"/>
@@ -46175,7 +46381,7 @@
         </w:tc>
         <w:tc>
           <w:tcPr>
-            <w:tcW w:type="dxa" w:w="948"/>
+            <w:tcW w:type="dxa" w:w="949"/>
             <w:tcBorders>
               <w:top w:val="single" w:color="D9D4C5" w:sz="4"/>
               <w:left w:val="single" w:color="D9D4C5" w:sz="4"/>
@@ -46207,7 +46413,7 @@
         </w:tc>
         <w:tc>
           <w:tcPr>
-            <w:tcW w:type="dxa" w:w="5172"/>
+            <w:tcW w:type="dxa" w:w="5174"/>
             <w:tcBorders>
               <w:top w:val="single" w:color="D9D4C5" w:sz="4"/>
               <w:left w:val="single" w:color="D9D4C5" w:sz="4"/>
@@ -46244,7 +46450,7 @@
         </w:trPr>
         <w:tc>
           <w:tcPr>
-            <w:tcW w:type="dxa" w:w="3518"/>
+            <w:tcW w:type="dxa" w:w="3515"/>
             <w:tcBorders>
               <w:top w:val="single" w:color="D9D4C5" w:sz="4"/>
               <w:left w:val="single" w:color="D9D4C5" w:sz="4"/>
@@ -46277,7 +46483,7 @@
         </w:tc>
         <w:tc>
           <w:tcPr>
-            <w:tcW w:type="dxa" w:w="948"/>
+            <w:tcW w:type="dxa" w:w="949"/>
             <w:tcBorders>
               <w:top w:val="single" w:color="D9D4C5" w:sz="4"/>
               <w:left w:val="single" w:color="D9D4C5" w:sz="4"/>
@@ -46310,7 +46516,7 @@
         </w:tc>
         <w:tc>
           <w:tcPr>
-            <w:tcW w:type="dxa" w:w="5172"/>
+            <w:tcW w:type="dxa" w:w="5174"/>
             <w:tcBorders>
               <w:top w:val="single" w:color="D9D4C5" w:sz="4"/>
               <w:left w:val="single" w:color="D9D4C5" w:sz="4"/>
@@ -46348,7 +46554,7 @@
         </w:trPr>
         <w:tc>
           <w:tcPr>
-            <w:tcW w:type="dxa" w:w="3518"/>
+            <w:tcW w:type="dxa" w:w="3515"/>
             <w:tcBorders>
               <w:top w:val="single" w:color="D9D4C5" w:sz="4"/>
               <w:left w:val="single" w:color="D9D4C5" w:sz="4"/>
@@ -46380,7 +46586,7 @@
         </w:tc>
         <w:tc>
           <w:tcPr>
-            <w:tcW w:type="dxa" w:w="948"/>
+            <w:tcW w:type="dxa" w:w="949"/>
             <w:tcBorders>
               <w:top w:val="single" w:color="D9D4C5" w:sz="4"/>
               <w:left w:val="single" w:color="D9D4C5" w:sz="4"/>
@@ -46412,7 +46618,7 @@
         </w:tc>
         <w:tc>
           <w:tcPr>
-            <w:tcW w:type="dxa" w:w="5172"/>
+            <w:tcW w:type="dxa" w:w="5174"/>
             <w:tcBorders>
               <w:top w:val="single" w:color="D9D4C5" w:sz="4"/>
               <w:left w:val="single" w:color="D9D4C5" w:sz="4"/>
@@ -46449,7 +46655,7 @@
         </w:trPr>
         <w:tc>
           <w:tcPr>
-            <w:tcW w:type="dxa" w:w="3518"/>
+            <w:tcW w:type="dxa" w:w="3515"/>
             <w:tcBorders>
               <w:top w:val="single" w:color="D9D4C5" w:sz="4"/>
               <w:left w:val="single" w:color="D9D4C5" w:sz="4"/>
@@ -46482,7 +46688,7 @@
         </w:tc>
         <w:tc>
           <w:tcPr>
-            <w:tcW w:type="dxa" w:w="948"/>
+            <w:tcW w:type="dxa" w:w="949"/>
             <w:tcBorders>
               <w:top w:val="single" w:color="D9D4C5" w:sz="4"/>
               <w:left w:val="single" w:color="D9D4C5" w:sz="4"/>
@@ -46515,7 +46721,7 @@
         </w:tc>
         <w:tc>
           <w:tcPr>
-            <w:tcW w:type="dxa" w:w="5172"/>
+            <w:tcW w:type="dxa" w:w="5174"/>
             <w:tcBorders>
               <w:top w:val="single" w:color="D9D4C5" w:sz="4"/>
               <w:left w:val="single" w:color="D9D4C5" w:sz="4"/>
@@ -46553,7 +46759,7 @@
         </w:trPr>
         <w:tc>
           <w:tcPr>
-            <w:tcW w:type="dxa" w:w="3518"/>
+            <w:tcW w:type="dxa" w:w="3515"/>
             <w:tcBorders>
               <w:top w:val="single" w:color="D9D4C5" w:sz="4"/>
               <w:left w:val="single" w:color="D9D4C5" w:sz="4"/>
@@ -46585,7 +46791,7 @@
         </w:tc>
         <w:tc>
           <w:tcPr>
-            <w:tcW w:type="dxa" w:w="948"/>
+            <w:tcW w:type="dxa" w:w="949"/>
             <w:tcBorders>
               <w:top w:val="single" w:color="D9D4C5" w:sz="4"/>
               <w:left w:val="single" w:color="D9D4C5" w:sz="4"/>
@@ -46617,7 +46823,7 @@
         </w:tc>
         <w:tc>
           <w:tcPr>
-            <w:tcW w:type="dxa" w:w="5172"/>
+            <w:tcW w:type="dxa" w:w="5174"/>
             <w:tcBorders>
               <w:top w:val="single" w:color="D9D4C5" w:sz="4"/>
               <w:left w:val="single" w:color="D9D4C5" w:sz="4"/>
@@ -46654,7 +46860,7 @@
         </w:trPr>
         <w:tc>
           <w:tcPr>
-            <w:tcW w:type="dxa" w:w="3518"/>
+            <w:tcW w:type="dxa" w:w="3515"/>
             <w:tcBorders>
               <w:top w:val="single" w:color="D9D4C5" w:sz="4"/>
               <w:left w:val="single" w:color="D9D4C5" w:sz="4"/>
@@ -46681,20 +46887,122 @@
                 <w:sz w:val="18"/>
                 <w:szCs w:val="18"/>
               </w:rPr>
+              <w:t xml:space="preserve">supabase/26_pec_programma.sql</w:t>
+            </w:r>
+          </w:p>
+        </w:tc>
+        <w:tc>
+          <w:tcPr>
+            <w:tcW w:type="dxa" w:w="949"/>
+            <w:tcBorders>
+              <w:top w:val="single" w:color="D9D4C5" w:sz="4"/>
+              <w:left w:val="single" w:color="D9D4C5" w:sz="4"/>
+              <w:bottom w:val="single" w:color="D9D4C5" w:sz="4"/>
+              <w:right w:val="single" w:color="D9D4C5" w:sz="4"/>
+            </w:tcBorders>
+            <w:shd w:fill="F6F4EE" w:color="auto" w:val="clear"/>
+            <w:tcMar>
+              <w:top w:type="dxa" w:w="70"/>
+              <w:left w:type="dxa" w:w="110"/>
+              <w:bottom w:type="dxa" w:w="70"/>
+              <w:right w:type="dxa" w:w="110"/>
+            </w:tcMar>
+            <w:vAlign w:val="center"/>
+          </w:tcPr>
+          <w:p>
+            <w:pPr>
+              <w:spacing w:after="0" w:before="0"/>
+            </w:pPr>
+            <w:r>
+              <w:rPr>
+                <w:rFonts w:ascii="Arial" w:cs="Arial" w:eastAsia="Arial" w:hAnsi="Arial"/>
+                <w:color w:val="1B2118"/>
+                <w:sz w:val="18"/>
+                <w:szCs w:val="18"/>
+              </w:rPr>
+              <w:t xml:space="preserve">19</w:t>
+            </w:r>
+          </w:p>
+        </w:tc>
+        <w:tc>
+          <w:tcPr>
+            <w:tcW w:type="dxa" w:w="5174"/>
+            <w:tcBorders>
+              <w:top w:val="single" w:color="D9D4C5" w:sz="4"/>
+              <w:left w:val="single" w:color="D9D4C5" w:sz="4"/>
+              <w:bottom w:val="single" w:color="D9D4C5" w:sz="4"/>
+              <w:right w:val="single" w:color="D9D4C5" w:sz="4"/>
+            </w:tcBorders>
+            <w:shd w:fill="F6F4EE" w:color="auto" w:val="clear"/>
+            <w:tcMar>
+              <w:top w:type="dxa" w:w="70"/>
+              <w:left w:type="dxa" w:w="110"/>
+              <w:bottom w:type="dxa" w:w="70"/>
+              <w:right w:type="dxa" w:w="110"/>
+            </w:tcMar>
+            <w:vAlign w:val="center"/>
+          </w:tcPr>
+          <w:p>
+            <w:pPr>
+              <w:spacing w:after="0" w:before="0"/>
+            </w:pPr>
+            <w:r>
+              <w:rPr>
+                <w:rFonts w:ascii="Arial" w:cs="Arial" w:eastAsia="Arial" w:hAnsi="Arial"/>
+                <w:color w:val="1B2118"/>
+                <w:sz w:val="18"/>
+                <w:szCs w:val="18"/>
+              </w:rPr>
+              <w:t xml:space="preserve">PEC DEL PROGRAMMA (19/10/2026)</w:t>
+            </w:r>
+          </w:p>
+        </w:tc>
+      </w:tr>
+      <w:tr>
+        <w:trPr>
+          <w:cantSplit/>
+        </w:trPr>
+        <w:tc>
+          <w:tcPr>
+            <w:tcW w:type="dxa" w:w="3515"/>
+            <w:tcBorders>
+              <w:top w:val="single" w:color="D9D4C5" w:sz="4"/>
+              <w:left w:val="single" w:color="D9D4C5" w:sz="4"/>
+              <w:bottom w:val="single" w:color="D9D4C5" w:sz="4"/>
+              <w:right w:val="single" w:color="D9D4C5" w:sz="4"/>
+            </w:tcBorders>
+            <w:tcMar>
+              <w:top w:type="dxa" w:w="70"/>
+              <w:left w:type="dxa" w:w="110"/>
+              <w:bottom w:type="dxa" w:w="70"/>
+              <w:right w:type="dxa" w:w="110"/>
+            </w:tcMar>
+            <w:vAlign w:val="center"/>
+          </w:tcPr>
+          <w:p>
+            <w:pPr>
+              <w:spacing w:after="0" w:before="0"/>
+            </w:pPr>
+            <w:r>
+              <w:rPr>
+                <w:rFonts w:ascii="Consolas" w:cs="Consolas" w:eastAsia="Consolas" w:hAnsi="Consolas"/>
+                <w:color w:val="2F5D3A"/>
+                <w:sz w:val="18"/>
+                <w:szCs w:val="18"/>
+              </w:rPr>
               <w:t xml:space="preserve">supabase/schema_completo.sql</w:t>
             </w:r>
           </w:p>
         </w:tc>
         <w:tc>
           <w:tcPr>
-            <w:tcW w:type="dxa" w:w="948"/>
-            <w:tcBorders>
-              <w:top w:val="single" w:color="D9D4C5" w:sz="4"/>
-              <w:left w:val="single" w:color="D9D4C5" w:sz="4"/>
-              <w:bottom w:val="single" w:color="D9D4C5" w:sz="4"/>
-              <w:right w:val="single" w:color="D9D4C5" w:sz="4"/>
-            </w:tcBorders>
-            <w:shd w:fill="F6F4EE" w:color="auto" w:val="clear"/>
+            <w:tcW w:type="dxa" w:w="949"/>
+            <w:tcBorders>
+              <w:top w:val="single" w:color="D9D4C5" w:sz="4"/>
+              <w:left w:val="single" w:color="D9D4C5" w:sz="4"/>
+              <w:bottom w:val="single" w:color="D9D4C5" w:sz="4"/>
+              <w:right w:val="single" w:color="D9D4C5" w:sz="4"/>
+            </w:tcBorders>
             <w:tcMar>
               <w:top w:type="dxa" w:w="70"/>
               <w:left w:type="dxa" w:w="110"/>
@@ -46720,14 +47028,13 @@
         </w:tc>
         <w:tc>
           <w:tcPr>
-            <w:tcW w:type="dxa" w:w="5172"/>
-            <w:tcBorders>
-              <w:top w:val="single" w:color="D9D4C5" w:sz="4"/>
-              <w:left w:val="single" w:color="D9D4C5" w:sz="4"/>
-              <w:bottom w:val="single" w:color="D9D4C5" w:sz="4"/>
-              <w:right w:val="single" w:color="D9D4C5" w:sz="4"/>
-            </w:tcBorders>
-            <w:shd w:fill="F6F4EE" w:color="auto" w:val="clear"/>
+            <w:tcW w:type="dxa" w:w="5174"/>
+            <w:tcBorders>
+              <w:top w:val="single" w:color="D9D4C5" w:sz="4"/>
+              <w:left w:val="single" w:color="D9D4C5" w:sz="4"/>
+              <w:bottom w:val="single" w:color="D9D4C5" w:sz="4"/>
+              <w:right w:val="single" w:color="D9D4C5" w:sz="4"/>
+            </w:tcBorders>
             <w:tcMar>
               <w:top w:type="dxa" w:w="70"/>
               <w:left w:type="dxa" w:w="110"/>

</xml_diff>

<commit_message>
Registro 2.7: script 28 del simulatore eseguito in produzione
Co-Authored-By: Claude Opus 5.5 <noreply@anthropic.com>
Claude-Session: https://claude.ai/code/session_01E8XCbEeVHWVP3hntUZ6kZ1
</commit_message>
<xml_diff>
--- a/public/documentazione/Registro_Dev_Deploy_Portale_CWP.docx
+++ b/public/documentazione/Registro_Dev_Deploy_Portale_CWP.docx
@@ -302,7 +302,7 @@
                 <w:sz w:val="20"/>
                 <w:szCs w:val="20"/>
               </w:rPr>
-              <w:t xml:space="preserve">Rev. 2.6</w:t>
+              <w:t xml:space="preserve">Rev. 2.7</w:t>
             </w:r>
           </w:p>
         </w:tc>
@@ -719,7 +719,7 @@
                 <w:sz w:val="18"/>
                 <w:szCs w:val="18"/>
               </w:rPr>
-              <w:t xml:space="preserve">2.6</w:t>
+              <w:t xml:space="preserve">2.7</w:t>
             </w:r>
           </w:p>
         </w:tc>
@@ -783,7 +783,7 @@
                 <w:sz w:val="18"/>
                 <w:szCs w:val="18"/>
               </w:rPr>
-              <w:t xml:space="preserve">Simulatore di scenari, prima versione: script 28, pagina /simulatore, motore e prove; decisioni aperte e cronologia.</w:t>
+              <w:t xml:space="preserve">Script 28 del simulatore eseguito in produzione.</w:t>
             </w:r>
           </w:p>
         </w:tc>
@@ -853,7 +853,7 @@
                 <w:sz w:val="18"/>
                 <w:szCs w:val="18"/>
               </w:rPr>
-              <w:t xml:space="preserve">2.5</w:t>
+              <w:t xml:space="preserve">2.6</w:t>
             </w:r>
           </w:p>
         </w:tc>
@@ -919,7 +919,7 @@
                 <w:sz w:val="18"/>
                 <w:szCs w:val="18"/>
               </w:rPr>
-              <w:t xml:space="preserve">Backlog punto 37 (simulatore di scenari), assistente virtuale in evidenza (punto 21), decisioni aperte e cronologia.</w:t>
+              <w:t xml:space="preserve">Simulatore di scenari, prima versione: script 28, pagina /simulatore, motore e prove; decisioni aperte e cronologia.</w:t>
             </w:r>
           </w:p>
         </w:tc>
@@ -989,7 +989,7 @@
                 <w:sz w:val="18"/>
                 <w:szCs w:val="18"/>
               </w:rPr>
-              <w:t xml:space="preserve">2.4</w:t>
+              <w:t xml:space="preserve">2.5</w:t>
             </w:r>
           </w:p>
         </w:tc>
@@ -1053,7 +1053,7 @@
                 <w:sz w:val="18"/>
                 <w:szCs w:val="18"/>
               </w:rPr>
-              <w:t xml:space="preserve">Archivio di backup, ramo snapshot su GitHub e nuovo documento Istruzioni di ripristino (procedure di rilascio e cronologia).</w:t>
+              <w:t xml:space="preserve">Backlog punto 37 (simulatore di scenari), assistente virtuale in evidenza (punto 21), decisioni aperte e cronologia.</w:t>
             </w:r>
           </w:p>
         </w:tc>
@@ -1123,7 +1123,7 @@
                 <w:sz w:val="18"/>
                 <w:szCs w:val="18"/>
               </w:rPr>
-              <w:t xml:space="preserve">2.3</w:t>
+              <w:t xml:space="preserve">2.4</w:t>
             </w:r>
           </w:p>
         </w:tc>
@@ -1189,7 +1189,7 @@
                 <w:sz w:val="18"/>
                 <w:szCs w:val="18"/>
               </w:rPr>
-              <w:t xml:space="preserve">Script 25-27 (documenti del Programma, PEC, soggetto promotore), decisione del 19/10 e presentazione aggiornata.</w:t>
+              <w:t xml:space="preserve">Archivio di backup, ramo snapshot su GitHub e nuovo documento Istruzioni di ripristino (procedure di rilascio e cronologia).</w:t>
             </w:r>
           </w:p>
         </w:tc>
@@ -1259,7 +1259,7 @@
                 <w:sz w:val="18"/>
                 <w:szCs w:val="18"/>
               </w:rPr>
-              <w:t xml:space="preserve">2.2</w:t>
+              <w:t xml:space="preserve">2.3</w:t>
             </w:r>
           </w:p>
         </w:tc>
@@ -1291,7 +1291,7 @@
                 <w:sz w:val="18"/>
                 <w:szCs w:val="18"/>
               </w:rPr>
-              <w:t xml:space="preserve">18/10/2026</w:t>
+              <w:t xml:space="preserve">19/10/2026</w:t>
             </w:r>
           </w:p>
         </w:tc>
@@ -1323,7 +1323,7 @@
                 <w:sz w:val="18"/>
                 <w:szCs w:val="18"/>
               </w:rPr>
-              <w:t xml:space="preserve">Script 22-24, allineamento ai documenti ufficiali del Programma (punto 35), nuove pagine e funzioni, decisioni aggiornate, punto 36 (SPID/CIE/CNS).</w:t>
+              <w:t xml:space="preserve">Script 25-27 (documenti del Programma, PEC, soggetto promotore), decisione del 19/10 e presentazione aggiornata.</w:t>
             </w:r>
           </w:p>
         </w:tc>
@@ -1393,7 +1393,7 @@
                 <w:sz w:val="18"/>
                 <w:szCs w:val="18"/>
               </w:rPr>
-              <w:t xml:space="preserve">2.1</w:t>
+              <w:t xml:space="preserve">2.2</w:t>
             </w:r>
           </w:p>
         </w:tc>
@@ -1459,7 +1459,7 @@
                 <w:sz w:val="18"/>
                 <w:szCs w:val="18"/>
               </w:rPr>
-              <w:t xml:space="preserve">Rilettura dei documenti ufficiali del Programma: differenze con il portale tra le decisioni aperte; correzione del buffer nei manuali.</w:t>
+              <w:t xml:space="preserve">Script 22-24, allineamento ai documenti ufficiali del Programma (punto 35), nuove pagine e funzioni, decisioni aggiornate, punto 36 (SPID/CIE/CNS).</w:t>
             </w:r>
           </w:p>
         </w:tc>
@@ -1529,7 +1529,7 @@
                 <w:sz w:val="18"/>
                 <w:szCs w:val="18"/>
               </w:rPr>
-              <w:t xml:space="preserve">2.0</w:t>
+              <w:t xml:space="preserve">2.1</w:t>
             </w:r>
           </w:p>
         </w:tc>
@@ -1593,7 +1593,7 @@
                 <w:sz w:val="18"/>
                 <w:szCs w:val="18"/>
               </w:rPr>
-              <w:t xml:space="preserve">Completamento funzionale dai requisiti (script 21): Rapporti a 4 fasi, documenti richiesti, anagrafiche per lo staff, consultazione bloccata e numerata, conservazione 10 anni, fascicolo completo; funzione consultazione-pubblica ripubblicata.</w:t>
+              <w:t xml:space="preserve">Rilettura dei documenti ufficiali del Programma: differenze con il portale tra le decisioni aperte; correzione del buffer nei manuali.</w:t>
             </w:r>
           </w:p>
         </w:tc>
@@ -1663,7 +1663,7 @@
                 <w:sz w:val="18"/>
                 <w:szCs w:val="18"/>
               </w:rPr>
-              <w:t xml:space="preserve">1.9</w:t>
+              <w:t xml:space="preserve">2.0</w:t>
             </w:r>
           </w:p>
         </w:tc>
@@ -1729,7 +1729,7 @@
                 <w:sz w:val="18"/>
                 <w:szCs w:val="18"/>
               </w:rPr>
-              <w:t xml:space="preserve">Script 20 (rinforzi di integrità, ora italiana nel database), funzioni crea-utente e consultazione-pubblica ripubblicate, punto 33 completato; decisione sull'audit.</w:t>
+              <w:t xml:space="preserve">Completamento funzionale dai requisiti (script 21): Rapporti a 4 fasi, documenti richiesti, anagrafiche per lo staff, consultazione bloccata e numerata, conservazione 10 anni, fascicolo completo; funzione consultazione-pubblica ripubblicata.</w:t>
             </w:r>
           </w:p>
         </w:tc>
@@ -1799,7 +1799,7 @@
                 <w:sz w:val="18"/>
                 <w:szCs w:val="18"/>
               </w:rPr>
-              <w:t xml:space="preserve">1.8</w:t>
+              <w:t xml:space="preserve">1.9</w:t>
             </w:r>
           </w:p>
         </w:tc>
@@ -1863,7 +1863,7 @@
                 <w:sz w:val="18"/>
                 <w:szCs w:val="18"/>
               </w:rPr>
-              <w:t xml:space="preserve">Codice sorgente interamente commentato (punto 31 completato); nuovi rinforzi nel punto 33; intestazione aggiornata alla versione 0.19.</w:t>
+              <w:t xml:space="preserve">Script 20 (rinforzi di integrità, ora italiana nel database), funzioni crea-utente e consultazione-pubblica ripubblicate, punto 33 completato; decisione sull'audit.</w:t>
             </w:r>
           </w:p>
         </w:tc>
@@ -1933,7 +1933,7 @@
                 <w:sz w:val="18"/>
                 <w:szCs w:val="18"/>
               </w:rPr>
-              <w:t xml:space="preserve">1.7</w:t>
+              <w:t xml:space="preserve">1.8</w:t>
             </w:r>
           </w:p>
         </w:tc>
@@ -1999,7 +1999,7 @@
                 <w:sz w:val="18"/>
                 <w:szCs w:val="18"/>
               </w:rPr>
-              <w:t xml:space="preserve">Crediti: rapporto di calcolo in PDF, numero di registro (script 18) e registro dei crediti; avvisi di npm audit nel punto 30.</w:t>
+              <w:t xml:space="preserve">Codice sorgente interamente commentato (punto 31 completato); nuovi rinforzi nel punto 33; intestazione aggiornata alla versione 0.19.</w:t>
             </w:r>
           </w:p>
         </w:tc>
@@ -2069,7 +2069,7 @@
                 <w:sz w:val="18"/>
                 <w:szCs w:val="18"/>
               </w:rPr>
-              <w:t xml:space="preserve">1.6</w:t>
+              <w:t xml:space="preserve">1.7</w:t>
             </w:r>
           </w:p>
         </w:tc>
@@ -2133,7 +2133,7 @@
                 <w:sz w:val="18"/>
                 <w:szCs w:val="18"/>
               </w:rPr>
-              <w:t xml:space="preserve">Crediti: import diretto del tracciato, aggregazione delle letture, blocco dei dati personali, controlli di coerenza (backlog 1-5).</w:t>
+              <w:t xml:space="preserve">Crediti: rapporto di calcolo in PDF, numero di registro (script 18) e registro dei crediti; avvisi di npm audit nel punto 30.</w:t>
             </w:r>
           </w:p>
         </w:tc>
@@ -2203,7 +2203,7 @@
                 <w:sz w:val="18"/>
                 <w:szCs w:val="18"/>
               </w:rPr>
-              <w:t xml:space="preserve">1.5</w:t>
+              <w:t xml:space="preserve">1.6</w:t>
             </w:r>
           </w:p>
         </w:tc>
@@ -2269,7 +2269,7 @@
                 <w:sz w:val="18"/>
                 <w:szCs w:val="18"/>
               </w:rPr>
-              <w:t xml:space="preserve">Capitolo pratiche: script 17, funzione consultazione-pubblica, note di fase, Enti di Validazione, modelli, messaggi, pagamenti al Comune, consultazione pubblica con email confermata ed errata corrige; decisioni A, B, D.</w:t>
+              <w:t xml:space="preserve">Crediti: import diretto del tracciato, aggregazione delle letture, blocco dei dati personali, controlli di coerenza (backlog 1-5).</w:t>
             </w:r>
           </w:p>
         </w:tc>
@@ -2339,7 +2339,7 @@
                 <w:sz w:val="18"/>
                 <w:szCs w:val="18"/>
               </w:rPr>
-              <w:t xml:space="preserve">1.4</w:t>
+              <w:t xml:space="preserve">1.5</w:t>
             </w:r>
           </w:p>
         </w:tc>
@@ -2403,7 +2403,7 @@
                 <w:sz w:val="18"/>
                 <w:szCs w:val="18"/>
               </w:rPr>
-              <w:t xml:space="preserve">Manuale Test; regole di lavoro (quattro documenti aggiornati insieme, codice commentato); backlog 31 e 32.</w:t>
+              <w:t xml:space="preserve">Capitolo pratiche: script 17, funzione consultazione-pubblica, note di fase, Enti di Validazione, modelli, messaggi, pagamenti al Comune, consultazione pubblica con email confermata ed errata corrige; decisioni A, B, D.</w:t>
             </w:r>
           </w:p>
         </w:tc>
@@ -2473,7 +2473,7 @@
                 <w:sz w:val="18"/>
                 <w:szCs w:val="18"/>
               </w:rPr>
-              <w:t xml:space="preserve">1.3</w:t>
+              <w:t xml:space="preserve">1.4</w:t>
             </w:r>
           </w:p>
         </w:tc>
@@ -2539,7 +2539,7 @@
                 <w:sz w:val="18"/>
                 <w:szCs w:val="18"/>
               </w:rPr>
-              <w:t xml:space="preserve">Manuale Amministratore in Word/PDF; Manuale Utente solo in PDF per gli utenti e anche in «I tuoi documenti».</w:t>
+              <w:t xml:space="preserve">Manuale Test; regole di lavoro (quattro documenti aggiornati insieme, codice commentato); backlog 31 e 32.</w:t>
             </w:r>
           </w:p>
         </w:tc>
@@ -2609,7 +2609,7 @@
                 <w:sz w:val="18"/>
                 <w:szCs w:val="18"/>
               </w:rPr>
-              <w:t xml:space="preserve">1.2</w:t>
+              <w:t xml:space="preserve">1.3</w:t>
             </w:r>
           </w:p>
         </w:tc>
@@ -2673,7 +2673,7 @@
                 <w:sz w:val="18"/>
                 <w:szCs w:val="18"/>
               </w:rPr>
-              <w:t xml:space="preserve">Pagina «Il mio profilo»; password (script 15 e 16, Edge Functions reimposta-password e recupera-password); SMTP Resend; email di recupero in italiano spedita dal portale.</w:t>
+              <w:t xml:space="preserve">Manuale Amministratore in Word/PDF; Manuale Utente solo in PDF per gli utenti e anche in «I tuoi documenti».</w:t>
             </w:r>
           </w:p>
         </w:tc>
@@ -2743,7 +2743,7 @@
                 <w:sz w:val="18"/>
                 <w:szCs w:val="18"/>
               </w:rPr>
-              <w:t xml:space="preserve">1.1</w:t>
+              <w:t xml:space="preserve">1.2</w:t>
             </w:r>
           </w:p>
         </w:tc>
@@ -2809,7 +2809,7 @@
                 <w:sz w:val="18"/>
                 <w:szCs w:val="18"/>
               </w:rPr>
-              <w:t xml:space="preserve">Pagina Documentazione; backlog riordinato; decisione di passare Vercel e Supabase a piani a pagamento (punto 29); riservatezza della documentazione (punto 28).</w:t>
+              <w:t xml:space="preserve">Pagina «Il mio profilo»; password (script 15 e 16, Edge Functions reimposta-password e recupera-password); SMTP Resend; email di recupero in italiano spedita dal portale.</w:t>
             </w:r>
           </w:p>
         </w:tc>
@@ -2879,6 +2879,140 @@
                 <w:sz w:val="18"/>
                 <w:szCs w:val="18"/>
               </w:rPr>
+              <w:t xml:space="preserve">1.1</w:t>
+            </w:r>
+          </w:p>
+        </w:tc>
+        <w:tc>
+          <w:tcPr>
+            <w:tcW w:type="dxa" w:w="1300"/>
+            <w:tcBorders>
+              <w:top w:val="single" w:color="D9D4C5" w:sz="4"/>
+              <w:left w:val="single" w:color="D9D4C5" w:sz="4"/>
+              <w:bottom w:val="single" w:color="D9D4C5" w:sz="4"/>
+              <w:right w:val="single" w:color="D9D4C5" w:sz="4"/>
+            </w:tcBorders>
+            <w:tcMar>
+              <w:top w:type="dxa" w:w="70"/>
+              <w:left w:type="dxa" w:w="110"/>
+              <w:bottom w:type="dxa" w:w="70"/>
+              <w:right w:type="dxa" w:w="110"/>
+            </w:tcMar>
+            <w:vAlign w:val="center"/>
+          </w:tcPr>
+          <w:p>
+            <w:pPr>
+              <w:spacing w:after="0" w:before="0"/>
+            </w:pPr>
+            <w:r>
+              <w:rPr>
+                <w:rFonts w:ascii="Arial" w:cs="Arial" w:eastAsia="Arial" w:hAnsi="Arial"/>
+                <w:color w:val="1B2118"/>
+                <w:sz w:val="18"/>
+                <w:szCs w:val="18"/>
+              </w:rPr>
+              <w:t xml:space="preserve">18/10/2026</w:t>
+            </w:r>
+          </w:p>
+        </w:tc>
+        <w:tc>
+          <w:tcPr>
+            <w:tcW w:type="dxa" w:w="5538"/>
+            <w:tcBorders>
+              <w:top w:val="single" w:color="D9D4C5" w:sz="4"/>
+              <w:left w:val="single" w:color="D9D4C5" w:sz="4"/>
+              <w:bottom w:val="single" w:color="D9D4C5" w:sz="4"/>
+              <w:right w:val="single" w:color="D9D4C5" w:sz="4"/>
+            </w:tcBorders>
+            <w:tcMar>
+              <w:top w:type="dxa" w:w="70"/>
+              <w:left w:type="dxa" w:w="110"/>
+              <w:bottom w:type="dxa" w:w="70"/>
+              <w:right w:type="dxa" w:w="110"/>
+            </w:tcMar>
+            <w:vAlign w:val="center"/>
+          </w:tcPr>
+          <w:p>
+            <w:pPr>
+              <w:spacing w:after="0" w:before="0"/>
+            </w:pPr>
+            <w:r>
+              <w:rPr>
+                <w:rFonts w:ascii="Arial" w:cs="Arial" w:eastAsia="Arial" w:hAnsi="Arial"/>
+                <w:color w:val="1B2118"/>
+                <w:sz w:val="18"/>
+                <w:szCs w:val="18"/>
+              </w:rPr>
+              <w:t xml:space="preserve">Pagina Documentazione; backlog riordinato; decisione di passare Vercel e Supabase a piani a pagamento (punto 29); riservatezza della documentazione (punto 28).</w:t>
+            </w:r>
+          </w:p>
+        </w:tc>
+        <w:tc>
+          <w:tcPr>
+            <w:tcW w:type="dxa" w:w="2000"/>
+            <w:tcBorders>
+              <w:top w:val="single" w:color="D9D4C5" w:sz="4"/>
+              <w:left w:val="single" w:color="D9D4C5" w:sz="4"/>
+              <w:bottom w:val="single" w:color="D9D4C5" w:sz="4"/>
+              <w:right w:val="single" w:color="D9D4C5" w:sz="4"/>
+            </w:tcBorders>
+            <w:tcMar>
+              <w:top w:type="dxa" w:w="70"/>
+              <w:left w:type="dxa" w:w="110"/>
+              <w:bottom w:type="dxa" w:w="70"/>
+              <w:right w:type="dxa" w:w="110"/>
+            </w:tcMar>
+            <w:vAlign w:val="center"/>
+          </w:tcPr>
+          <w:p>
+            <w:pPr>
+              <w:spacing w:after="0" w:before="0"/>
+            </w:pPr>
+            <w:r>
+              <w:rPr>
+                <w:rFonts w:ascii="Arial" w:cs="Arial" w:eastAsia="Arial" w:hAnsi="Arial"/>
+                <w:color w:val="1B2118"/>
+                <w:sz w:val="18"/>
+                <w:szCs w:val="18"/>
+              </w:rPr>
+              <w:t xml:space="preserve">Fondazione Operate</w:t>
+            </w:r>
+          </w:p>
+        </w:tc>
+      </w:tr>
+      <w:tr>
+        <w:trPr>
+          <w:cantSplit/>
+        </w:trPr>
+        <w:tc>
+          <w:tcPr>
+            <w:tcW w:type="dxa" w:w="800"/>
+            <w:tcBorders>
+              <w:top w:val="single" w:color="D9D4C5" w:sz="4"/>
+              <w:left w:val="single" w:color="D9D4C5" w:sz="4"/>
+              <w:bottom w:val="single" w:color="D9D4C5" w:sz="4"/>
+              <w:right w:val="single" w:color="D9D4C5" w:sz="4"/>
+            </w:tcBorders>
+            <w:shd w:fill="F6F4EE" w:color="auto" w:val="clear"/>
+            <w:tcMar>
+              <w:top w:type="dxa" w:w="70"/>
+              <w:left w:type="dxa" w:w="110"/>
+              <w:bottom w:type="dxa" w:w="70"/>
+              <w:right w:type="dxa" w:w="110"/>
+            </w:tcMar>
+            <w:vAlign w:val="center"/>
+          </w:tcPr>
+          <w:p>
+            <w:pPr>
+              <w:spacing w:after="0" w:before="0"/>
+            </w:pPr>
+            <w:r>
+              <w:rPr>
+                <w:rFonts w:ascii="Arial" w:cs="Arial" w:eastAsia="Arial" w:hAnsi="Arial"/>
+                <w:color w:val="1B2118"/>
+                <w:sz w:val="18"/>
+                <w:szCs w:val="18"/>
+              </w:rPr>
               <w:t xml:space="preserve">1.0</w:t>
             </w:r>
           </w:p>
@@ -2892,6 +3026,7 @@
               <w:bottom w:val="single" w:color="D9D4C5" w:sz="4"/>
               <w:right w:val="single" w:color="D9D4C5" w:sz="4"/>
             </w:tcBorders>
+            <w:shd w:fill="F6F4EE" w:color="auto" w:val="clear"/>
             <w:tcMar>
               <w:top w:type="dxa" w:w="70"/>
               <w:left w:type="dxa" w:w="110"/>
@@ -2924,6 +3059,7 @@
               <w:bottom w:val="single" w:color="D9D4C5" w:sz="4"/>
               <w:right w:val="single" w:color="D9D4C5" w:sz="4"/>
             </w:tcBorders>
+            <w:shd w:fill="F6F4EE" w:color="auto" w:val="clear"/>
             <w:tcMar>
               <w:top w:type="dxa" w:w="70"/>
               <w:left w:type="dxa" w:w="110"/>
@@ -2956,6 +3092,7 @@
               <w:bottom w:val="single" w:color="D9D4C5" w:sz="4"/>
               <w:right w:val="single" w:color="D9D4C5" w:sz="4"/>
             </w:tcBorders>
+            <w:shd w:fill="F6F4EE" w:color="auto" w:val="clear"/>
             <w:tcMar>
               <w:top w:type="dxa" w:w="70"/>
               <w:left w:type="dxa" w:w="110"/>
@@ -2997,7 +3134,7 @@
           <w:sz w:val="20"/>
           <w:szCs w:val="20"/>
         </w:rPr>
-        <w:t xml:space="preserve">Fotografia del registro alla revisione 2.6 del 19/10/2026. Il registro è aggiornato a ogni nuova funzione, servizio o rilascio; la versione corrente si scarica dall'area Documentazione del portale (solo Amministratori).</w:t>
+        <w:t xml:space="preserve">Fotografia del registro alla revisione 2.7 del 19/10/2026. Il registro è aggiornato a ogni nuova funzione, servizio o rilascio; la versione corrente si scarica dall'area Documentazione del portale (solo Amministratori).</w:t>
       </w:r>
     </w:p>
     <w:p>
@@ -8702,8 +8839,8 @@
       </w:tblPr>
       <w:tblGrid>
         <w:gridCol w:w="3213"/>
-        <w:gridCol w:w="3570"/>
-        <w:gridCol w:w="2855"/>
+        <w:gridCol w:w="3213"/>
+        <w:gridCol w:w="3212"/>
       </w:tblGrid>
       <w:tr>
         <w:trPr>
@@ -8746,7 +8883,7 @@
         </w:tc>
         <w:tc>
           <w:tcPr>
-            <w:tcW w:type="dxa" w:w="3570"/>
+            <w:tcW w:type="dxa" w:w="3213"/>
             <w:tcBorders>
               <w:top w:val="single" w:color="D9D4C5" w:sz="4"/>
               <w:left w:val="single" w:color="D9D4C5" w:sz="4"/>
@@ -8781,7 +8918,7 @@
         </w:tc>
         <w:tc>
           <w:tcPr>
-            <w:tcW w:type="dxa" w:w="2855"/>
+            <w:tcW w:type="dxa" w:w="3212"/>
             <w:tcBorders>
               <w:top w:val="single" w:color="D9D4C5" w:sz="4"/>
               <w:left w:val="single" w:color="D9D4C5" w:sz="4"/>
@@ -8853,7 +8990,7 @@
         </w:tc>
         <w:tc>
           <w:tcPr>
-            <w:tcW w:type="dxa" w:w="3570"/>
+            <w:tcW w:type="dxa" w:w="3213"/>
             <w:tcBorders>
               <w:top w:val="single" w:color="D9D4C5" w:sz="4"/>
               <w:left w:val="single" w:color="D9D4C5" w:sz="4"/>
@@ -8885,7 +9022,7 @@
         </w:tc>
         <w:tc>
           <w:tcPr>
-            <w:tcW w:type="dxa" w:w="2855"/>
+            <w:tcW w:type="dxa" w:w="3212"/>
             <w:tcBorders>
               <w:top w:val="single" w:color="D9D4C5" w:sz="4"/>
               <w:left w:val="single" w:color="D9D4C5" w:sz="4"/>
@@ -8955,7 +9092,7 @@
         </w:tc>
         <w:tc>
           <w:tcPr>
-            <w:tcW w:type="dxa" w:w="3570"/>
+            <w:tcW w:type="dxa" w:w="3213"/>
             <w:tcBorders>
               <w:top w:val="single" w:color="D9D4C5" w:sz="4"/>
               <w:left w:val="single" w:color="D9D4C5" w:sz="4"/>
@@ -8988,7 +9125,7 @@
         </w:tc>
         <w:tc>
           <w:tcPr>
-            <w:tcW w:type="dxa" w:w="2855"/>
+            <w:tcW w:type="dxa" w:w="3212"/>
             <w:tcBorders>
               <w:top w:val="single" w:color="D9D4C5" w:sz="4"/>
               <w:left w:val="single" w:color="D9D4C5" w:sz="4"/>
@@ -9058,7 +9195,7 @@
         </w:tc>
         <w:tc>
           <w:tcPr>
-            <w:tcW w:type="dxa" w:w="3570"/>
+            <w:tcW w:type="dxa" w:w="3213"/>
             <w:tcBorders>
               <w:top w:val="single" w:color="D9D4C5" w:sz="4"/>
               <w:left w:val="single" w:color="D9D4C5" w:sz="4"/>
@@ -9090,7 +9227,7 @@
         </w:tc>
         <w:tc>
           <w:tcPr>
-            <w:tcW w:type="dxa" w:w="2855"/>
+            <w:tcW w:type="dxa" w:w="3212"/>
             <w:tcBorders>
               <w:top w:val="single" w:color="D9D4C5" w:sz="4"/>
               <w:left w:val="single" w:color="D9D4C5" w:sz="4"/>
@@ -9160,7 +9297,7 @@
         </w:tc>
         <w:tc>
           <w:tcPr>
-            <w:tcW w:type="dxa" w:w="3570"/>
+            <w:tcW w:type="dxa" w:w="3213"/>
             <w:tcBorders>
               <w:top w:val="single" w:color="D9D4C5" w:sz="4"/>
               <w:left w:val="single" w:color="D9D4C5" w:sz="4"/>
@@ -9211,7 +9348,7 @@
         </w:tc>
         <w:tc>
           <w:tcPr>
-            <w:tcW w:type="dxa" w:w="2855"/>
+            <w:tcW w:type="dxa" w:w="3212"/>
             <w:tcBorders>
               <w:top w:val="single" w:color="D9D4C5" w:sz="4"/>
               <w:left w:val="single" w:color="D9D4C5" w:sz="4"/>
@@ -9281,7 +9418,7 @@
         </w:tc>
         <w:tc>
           <w:tcPr>
-            <w:tcW w:type="dxa" w:w="3570"/>
+            <w:tcW w:type="dxa" w:w="3213"/>
             <w:tcBorders>
               <w:top w:val="single" w:color="D9D4C5" w:sz="4"/>
               <w:left w:val="single" w:color="D9D4C5" w:sz="4"/>
@@ -9313,7 +9450,7 @@
         </w:tc>
         <w:tc>
           <w:tcPr>
-            <w:tcW w:type="dxa" w:w="2855"/>
+            <w:tcW w:type="dxa" w:w="3212"/>
             <w:tcBorders>
               <w:top w:val="single" w:color="D9D4C5" w:sz="4"/>
               <w:left w:val="single" w:color="D9D4C5" w:sz="4"/>
@@ -9383,7 +9520,7 @@
         </w:tc>
         <w:tc>
           <w:tcPr>
-            <w:tcW w:type="dxa" w:w="3570"/>
+            <w:tcW w:type="dxa" w:w="3213"/>
             <w:tcBorders>
               <w:top w:val="single" w:color="D9D4C5" w:sz="4"/>
               <w:left w:val="single" w:color="D9D4C5" w:sz="4"/>
@@ -9416,7 +9553,7 @@
         </w:tc>
         <w:tc>
           <w:tcPr>
-            <w:tcW w:type="dxa" w:w="2855"/>
+            <w:tcW w:type="dxa" w:w="3212"/>
             <w:tcBorders>
               <w:top w:val="single" w:color="D9D4C5" w:sz="4"/>
               <w:left w:val="single" w:color="D9D4C5" w:sz="4"/>
@@ -9486,7 +9623,7 @@
         </w:tc>
         <w:tc>
           <w:tcPr>
-            <w:tcW w:type="dxa" w:w="3570"/>
+            <w:tcW w:type="dxa" w:w="3213"/>
             <w:tcBorders>
               <w:top w:val="single" w:color="D9D4C5" w:sz="4"/>
               <w:left w:val="single" w:color="D9D4C5" w:sz="4"/>
@@ -9518,7 +9655,7 @@
         </w:tc>
         <w:tc>
           <w:tcPr>
-            <w:tcW w:type="dxa" w:w="2855"/>
+            <w:tcW w:type="dxa" w:w="3212"/>
             <w:tcBorders>
               <w:top w:val="single" w:color="D9D4C5" w:sz="4"/>
               <w:left w:val="single" w:color="D9D4C5" w:sz="4"/>
@@ -9588,7 +9725,7 @@
         </w:tc>
         <w:tc>
           <w:tcPr>
-            <w:tcW w:type="dxa" w:w="3570"/>
+            <w:tcW w:type="dxa" w:w="3213"/>
             <w:tcBorders>
               <w:top w:val="single" w:color="D9D4C5" w:sz="4"/>
               <w:left w:val="single" w:color="D9D4C5" w:sz="4"/>
@@ -9621,7 +9758,7 @@
         </w:tc>
         <w:tc>
           <w:tcPr>
-            <w:tcW w:type="dxa" w:w="2855"/>
+            <w:tcW w:type="dxa" w:w="3212"/>
             <w:tcBorders>
               <w:top w:val="single" w:color="D9D4C5" w:sz="4"/>
               <w:left w:val="single" w:color="D9D4C5" w:sz="4"/>
@@ -9691,7 +9828,7 @@
         </w:tc>
         <w:tc>
           <w:tcPr>
-            <w:tcW w:type="dxa" w:w="3570"/>
+            <w:tcW w:type="dxa" w:w="3213"/>
             <w:tcBorders>
               <w:top w:val="single" w:color="D9D4C5" w:sz="4"/>
               <w:left w:val="single" w:color="D9D4C5" w:sz="4"/>
@@ -9723,7 +9860,7 @@
         </w:tc>
         <w:tc>
           <w:tcPr>
-            <w:tcW w:type="dxa" w:w="2855"/>
+            <w:tcW w:type="dxa" w:w="3212"/>
             <w:tcBorders>
               <w:top w:val="single" w:color="D9D4C5" w:sz="4"/>
               <w:left w:val="single" w:color="D9D4C5" w:sz="4"/>
@@ -9793,7 +9930,7 @@
         </w:tc>
         <w:tc>
           <w:tcPr>
-            <w:tcW w:type="dxa" w:w="3570"/>
+            <w:tcW w:type="dxa" w:w="3213"/>
             <w:tcBorders>
               <w:top w:val="single" w:color="D9D4C5" w:sz="4"/>
               <w:left w:val="single" w:color="D9D4C5" w:sz="4"/>
@@ -9862,7 +9999,7 @@
         </w:tc>
         <w:tc>
           <w:tcPr>
-            <w:tcW w:type="dxa" w:w="2855"/>
+            <w:tcW w:type="dxa" w:w="3212"/>
             <w:tcBorders>
               <w:top w:val="single" w:color="D9D4C5" w:sz="4"/>
               <w:left w:val="single" w:color="D9D4C5" w:sz="4"/>
@@ -9932,7 +10069,7 @@
         </w:tc>
         <w:tc>
           <w:tcPr>
-            <w:tcW w:type="dxa" w:w="3570"/>
+            <w:tcW w:type="dxa" w:w="3213"/>
             <w:tcBorders>
               <w:top w:val="single" w:color="D9D4C5" w:sz="4"/>
               <w:left w:val="single" w:color="D9D4C5" w:sz="4"/>
@@ -9964,7 +10101,7 @@
         </w:tc>
         <w:tc>
           <w:tcPr>
-            <w:tcW w:type="dxa" w:w="2855"/>
+            <w:tcW w:type="dxa" w:w="3212"/>
             <w:tcBorders>
               <w:top w:val="single" w:color="D9D4C5" w:sz="4"/>
               <w:left w:val="single" w:color="D9D4C5" w:sz="4"/>
@@ -10034,7 +10171,7 @@
         </w:tc>
         <w:tc>
           <w:tcPr>
-            <w:tcW w:type="dxa" w:w="3570"/>
+            <w:tcW w:type="dxa" w:w="3213"/>
             <w:tcBorders>
               <w:top w:val="single" w:color="D9D4C5" w:sz="4"/>
               <w:left w:val="single" w:color="D9D4C5" w:sz="4"/>
@@ -10067,7 +10204,7 @@
         </w:tc>
         <w:tc>
           <w:tcPr>
-            <w:tcW w:type="dxa" w:w="2855"/>
+            <w:tcW w:type="dxa" w:w="3212"/>
             <w:tcBorders>
               <w:top w:val="single" w:color="D9D4C5" w:sz="4"/>
               <w:left w:val="single" w:color="D9D4C5" w:sz="4"/>
@@ -10137,7 +10274,7 @@
         </w:tc>
         <w:tc>
           <w:tcPr>
-            <w:tcW w:type="dxa" w:w="3570"/>
+            <w:tcW w:type="dxa" w:w="3213"/>
             <w:tcBorders>
               <w:top w:val="single" w:color="D9D4C5" w:sz="4"/>
               <w:left w:val="single" w:color="D9D4C5" w:sz="4"/>
@@ -10169,7 +10306,7 @@
         </w:tc>
         <w:tc>
           <w:tcPr>
-            <w:tcW w:type="dxa" w:w="2855"/>
+            <w:tcW w:type="dxa" w:w="3212"/>
             <w:tcBorders>
               <w:top w:val="single" w:color="D9D4C5" w:sz="4"/>
               <w:left w:val="single" w:color="D9D4C5" w:sz="4"/>
@@ -10239,7 +10376,7 @@
         </w:tc>
         <w:tc>
           <w:tcPr>
-            <w:tcW w:type="dxa" w:w="3570"/>
+            <w:tcW w:type="dxa" w:w="3213"/>
             <w:tcBorders>
               <w:top w:val="single" w:color="D9D4C5" w:sz="4"/>
               <w:left w:val="single" w:color="D9D4C5" w:sz="4"/>
@@ -10272,7 +10409,7 @@
         </w:tc>
         <w:tc>
           <w:tcPr>
-            <w:tcW w:type="dxa" w:w="2855"/>
+            <w:tcW w:type="dxa" w:w="3212"/>
             <w:tcBorders>
               <w:top w:val="single" w:color="D9D4C5" w:sz="4"/>
               <w:left w:val="single" w:color="D9D4C5" w:sz="4"/>
@@ -10342,7 +10479,7 @@
         </w:tc>
         <w:tc>
           <w:tcPr>
-            <w:tcW w:type="dxa" w:w="3570"/>
+            <w:tcW w:type="dxa" w:w="3213"/>
             <w:tcBorders>
               <w:top w:val="single" w:color="D9D4C5" w:sz="4"/>
               <w:left w:val="single" w:color="D9D4C5" w:sz="4"/>
@@ -10410,7 +10547,7 @@
         </w:tc>
         <w:tc>
           <w:tcPr>
-            <w:tcW w:type="dxa" w:w="2855"/>
+            <w:tcW w:type="dxa" w:w="3212"/>
             <w:tcBorders>
               <w:top w:val="single" w:color="D9D4C5" w:sz="4"/>
               <w:left w:val="single" w:color="D9D4C5" w:sz="4"/>
@@ -10480,7 +10617,7 @@
         </w:tc>
         <w:tc>
           <w:tcPr>
-            <w:tcW w:type="dxa" w:w="3570"/>
+            <w:tcW w:type="dxa" w:w="3213"/>
             <w:tcBorders>
               <w:top w:val="single" w:color="D9D4C5" w:sz="4"/>
               <w:left w:val="single" w:color="D9D4C5" w:sz="4"/>
@@ -10549,7 +10686,7 @@
         </w:tc>
         <w:tc>
           <w:tcPr>
-            <w:tcW w:type="dxa" w:w="2855"/>
+            <w:tcW w:type="dxa" w:w="3212"/>
             <w:tcBorders>
               <w:top w:val="single" w:color="D9D4C5" w:sz="4"/>
               <w:left w:val="single" w:color="D9D4C5" w:sz="4"/>
@@ -10619,7 +10756,7 @@
         </w:tc>
         <w:tc>
           <w:tcPr>
-            <w:tcW w:type="dxa" w:w="3570"/>
+            <w:tcW w:type="dxa" w:w="3213"/>
             <w:tcBorders>
               <w:top w:val="single" w:color="D9D4C5" w:sz="4"/>
               <w:left w:val="single" w:color="D9D4C5" w:sz="4"/>
@@ -10831,7 +10968,7 @@
         </w:tc>
         <w:tc>
           <w:tcPr>
-            <w:tcW w:type="dxa" w:w="2855"/>
+            <w:tcW w:type="dxa" w:w="3212"/>
             <w:tcBorders>
               <w:top w:val="single" w:color="D9D4C5" w:sz="4"/>
               <w:left w:val="single" w:color="D9D4C5" w:sz="4"/>
@@ -10901,7 +11038,7 @@
         </w:tc>
         <w:tc>
           <w:tcPr>
-            <w:tcW w:type="dxa" w:w="3570"/>
+            <w:tcW w:type="dxa" w:w="3213"/>
             <w:tcBorders>
               <w:top w:val="single" w:color="D9D4C5" w:sz="4"/>
               <w:left w:val="single" w:color="D9D4C5" w:sz="4"/>
@@ -11024,7 +11161,7 @@
         </w:tc>
         <w:tc>
           <w:tcPr>
-            <w:tcW w:type="dxa" w:w="2855"/>
+            <w:tcW w:type="dxa" w:w="3212"/>
             <w:tcBorders>
               <w:top w:val="single" w:color="D9D4C5" w:sz="4"/>
               <w:left w:val="single" w:color="D9D4C5" w:sz="4"/>
@@ -11094,7 +11231,7 @@
         </w:tc>
         <w:tc>
           <w:tcPr>
-            <w:tcW w:type="dxa" w:w="3570"/>
+            <w:tcW w:type="dxa" w:w="3213"/>
             <w:tcBorders>
               <w:top w:val="single" w:color="D9D4C5" w:sz="4"/>
               <w:left w:val="single" w:color="D9D4C5" w:sz="4"/>
@@ -11162,7 +11299,7 @@
         </w:tc>
         <w:tc>
           <w:tcPr>
-            <w:tcW w:type="dxa" w:w="2855"/>
+            <w:tcW w:type="dxa" w:w="3212"/>
             <w:tcBorders>
               <w:top w:val="single" w:color="D9D4C5" w:sz="4"/>
               <w:left w:val="single" w:color="D9D4C5" w:sz="4"/>
@@ -11232,7 +11369,7 @@
         </w:tc>
         <w:tc>
           <w:tcPr>
-            <w:tcW w:type="dxa" w:w="3570"/>
+            <w:tcW w:type="dxa" w:w="3213"/>
             <w:tcBorders>
               <w:top w:val="single" w:color="D9D4C5" w:sz="4"/>
               <w:left w:val="single" w:color="D9D4C5" w:sz="4"/>
@@ -11427,7 +11564,7 @@
         </w:tc>
         <w:tc>
           <w:tcPr>
-            <w:tcW w:type="dxa" w:w="2855"/>
+            <w:tcW w:type="dxa" w:w="3212"/>
             <w:tcBorders>
               <w:top w:val="single" w:color="D9D4C5" w:sz="4"/>
               <w:left w:val="single" w:color="D9D4C5" w:sz="4"/>
@@ -11497,7 +11634,7 @@
         </w:tc>
         <w:tc>
           <w:tcPr>
-            <w:tcW w:type="dxa" w:w="3570"/>
+            <w:tcW w:type="dxa" w:w="3213"/>
             <w:tcBorders>
               <w:top w:val="single" w:color="D9D4C5" w:sz="4"/>
               <w:left w:val="single" w:color="D9D4C5" w:sz="4"/>
@@ -11799,7 +11936,7 @@
         </w:tc>
         <w:tc>
           <w:tcPr>
-            <w:tcW w:type="dxa" w:w="2855"/>
+            <w:tcW w:type="dxa" w:w="3212"/>
             <w:tcBorders>
               <w:top w:val="single" w:color="D9D4C5" w:sz="4"/>
               <w:left w:val="single" w:color="D9D4C5" w:sz="4"/>
@@ -11869,7 +12006,7 @@
         </w:tc>
         <w:tc>
           <w:tcPr>
-            <w:tcW w:type="dxa" w:w="3570"/>
+            <w:tcW w:type="dxa" w:w="3213"/>
             <w:tcBorders>
               <w:top w:val="single" w:color="D9D4C5" w:sz="4"/>
               <w:left w:val="single" w:color="D9D4C5" w:sz="4"/>
@@ -11920,7 +12057,7 @@
         </w:tc>
         <w:tc>
           <w:tcPr>
-            <w:tcW w:type="dxa" w:w="2855"/>
+            <w:tcW w:type="dxa" w:w="3212"/>
             <w:tcBorders>
               <w:top w:val="single" w:color="D9D4C5" w:sz="4"/>
               <w:left w:val="single" w:color="D9D4C5" w:sz="4"/>
@@ -11990,7 +12127,7 @@
         </w:tc>
         <w:tc>
           <w:tcPr>
-            <w:tcW w:type="dxa" w:w="3570"/>
+            <w:tcW w:type="dxa" w:w="3213"/>
             <w:tcBorders>
               <w:top w:val="single" w:color="D9D4C5" w:sz="4"/>
               <w:left w:val="single" w:color="D9D4C5" w:sz="4"/>
@@ -12310,7 +12447,7 @@
         </w:tc>
         <w:tc>
           <w:tcPr>
-            <w:tcW w:type="dxa" w:w="2855"/>
+            <w:tcW w:type="dxa" w:w="3212"/>
             <w:tcBorders>
               <w:top w:val="single" w:color="D9D4C5" w:sz="4"/>
               <w:left w:val="single" w:color="D9D4C5" w:sz="4"/>
@@ -12380,7 +12517,7 @@
         </w:tc>
         <w:tc>
           <w:tcPr>
-            <w:tcW w:type="dxa" w:w="3570"/>
+            <w:tcW w:type="dxa" w:w="3213"/>
             <w:tcBorders>
               <w:top w:val="single" w:color="D9D4C5" w:sz="4"/>
               <w:left w:val="single" w:color="D9D4C5" w:sz="4"/>
@@ -12773,7 +12910,7 @@
         </w:tc>
         <w:tc>
           <w:tcPr>
-            <w:tcW w:type="dxa" w:w="2855"/>
+            <w:tcW w:type="dxa" w:w="3212"/>
             <w:tcBorders>
               <w:top w:val="single" w:color="D9D4C5" w:sz="4"/>
               <w:left w:val="single" w:color="D9D4C5" w:sz="4"/>
@@ -12843,7 +12980,7 @@
         </w:tc>
         <w:tc>
           <w:tcPr>
-            <w:tcW w:type="dxa" w:w="3570"/>
+            <w:tcW w:type="dxa" w:w="3213"/>
             <w:tcBorders>
               <w:top w:val="single" w:color="D9D4C5" w:sz="4"/>
               <w:left w:val="single" w:color="D9D4C5" w:sz="4"/>
@@ -12893,7 +13030,7 @@
         </w:tc>
         <w:tc>
           <w:tcPr>
-            <w:tcW w:type="dxa" w:w="2855"/>
+            <w:tcW w:type="dxa" w:w="3212"/>
             <w:tcBorders>
               <w:top w:val="single" w:color="D9D4C5" w:sz="4"/>
               <w:left w:val="single" w:color="D9D4C5" w:sz="4"/>
@@ -12963,7 +13100,7 @@
         </w:tc>
         <w:tc>
           <w:tcPr>
-            <w:tcW w:type="dxa" w:w="3570"/>
+            <w:tcW w:type="dxa" w:w="3213"/>
             <w:tcBorders>
               <w:top w:val="single" w:color="D9D4C5" w:sz="4"/>
               <w:left w:val="single" w:color="D9D4C5" w:sz="4"/>
@@ -13014,7 +13151,7 @@
         </w:tc>
         <w:tc>
           <w:tcPr>
-            <w:tcW w:type="dxa" w:w="2855"/>
+            <w:tcW w:type="dxa" w:w="3212"/>
             <w:tcBorders>
               <w:top w:val="single" w:color="D9D4C5" w:sz="4"/>
               <w:left w:val="single" w:color="D9D4C5" w:sz="4"/>
@@ -13084,7 +13221,7 @@
         </w:tc>
         <w:tc>
           <w:tcPr>
-            <w:tcW w:type="dxa" w:w="3570"/>
+            <w:tcW w:type="dxa" w:w="3213"/>
             <w:tcBorders>
               <w:top w:val="single" w:color="D9D4C5" w:sz="4"/>
               <w:left w:val="single" w:color="D9D4C5" w:sz="4"/>
@@ -13116,7 +13253,7 @@
         </w:tc>
         <w:tc>
           <w:tcPr>
-            <w:tcW w:type="dxa" w:w="2855"/>
+            <w:tcW w:type="dxa" w:w="3212"/>
             <w:tcBorders>
               <w:top w:val="single" w:color="D9D4C5" w:sz="4"/>
               <w:left w:val="single" w:color="D9D4C5" w:sz="4"/>
@@ -13186,7 +13323,7 @@
         </w:tc>
         <w:tc>
           <w:tcPr>
-            <w:tcW w:type="dxa" w:w="3570"/>
+            <w:tcW w:type="dxa" w:w="3213"/>
             <w:tcBorders>
               <w:top w:val="single" w:color="D9D4C5" w:sz="4"/>
               <w:left w:val="single" w:color="D9D4C5" w:sz="4"/>
@@ -13255,7 +13392,7 @@
         </w:tc>
         <w:tc>
           <w:tcPr>
-            <w:tcW w:type="dxa" w:w="2855"/>
+            <w:tcW w:type="dxa" w:w="3212"/>
             <w:tcBorders>
               <w:top w:val="single" w:color="D9D4C5" w:sz="4"/>
               <w:left w:val="single" w:color="D9D4C5" w:sz="4"/>
@@ -13300,18 +13437,7 @@
                 <w:sz w:val="18"/>
                 <w:szCs w:val="18"/>
               </w:rPr>
-              <w:t xml:space="preserve">); </w:t>
-            </w:r>
-            <w:r>
-              <w:rPr>
-                <w:rFonts w:ascii="Arial" w:cs="Arial" w:eastAsia="Arial" w:hAnsi="Arial"/>
-                <w:b/>
-                <w:bCs/>
-                <w:color w:val="1B2118"/>
-                <w:sz w:val="18"/>
-                <w:szCs w:val="18"/>
-              </w:rPr>
-              <w:t xml:space="preserve">da eseguire in produzione</w:t>
+              <w:t xml:space="preserve">); eseguito in produzione da Luca il 19/10 (testo senza commenti, stesso contenuto)</w:t>
             </w:r>
           </w:p>
         </w:tc>
@@ -22208,7 +22334,7 @@
           <w:sz w:val="21"/>
           <w:szCs w:val="21"/>
         </w:rPr>
-        <w:t xml:space="preserve"> con 9 prove automatiche. Durata da menu 7/10/21 anni, più scenari per Comune, anno base (a mano, cluster SOSE o calcolo esistente), obiettivi annui con traiettoria lineare, % di differenziata e crediti anno per anno, grafici, confronto, CSV e stampa. Lo script 28 va eseguito in produzione.</w:t>
+        <w:t xml:space="preserve"> con 9 prove automatiche. Durata da menu 7/10/21 anni, più scenari per Comune, anno base (a mano, cluster SOSE o calcolo esistente), obiettivi annui con traiettoria lineare, % di differenziata e crediti anno per anno, grafici, confronto, CSV e stampa. Script 28 eseguito in produzione da Luca nel SQL Editor (in questa sessione i clic nel browser erano bloccati da un controllo di sicurezza).</w:t>
       </w:r>
     </w:p>
     <w:p>
@@ -26436,7 +26562,7 @@
               </w:rPr>
               <w:t xml:space="preserve">Claude Doc: </w:t>
             </w:r>
-            <w:hyperlink w:history="1" r:id="rIdpae_pyqjafse8qtrpx9d9">
+            <w:hyperlink w:history="1" r:id="rIdqwo8oqqunwot1rcsuwoob">
               <w:r>
                 <w:rPr>
                   <w:rFonts w:ascii="Arial" w:cs="Arial" w:eastAsia="Arial" w:hAnsi="Arial"/>
@@ -26783,7 +26909,7 @@
               </w:rPr>
               <w:t xml:space="preserve">Claude Doc: </w:t>
             </w:r>
-            <w:hyperlink w:history="1" r:id="rId_ozsmnr03osxgbe3qncsi">
+            <w:hyperlink w:history="1" r:id="rId6uf0da2eme__08tld5tpl">
               <w:r>
                 <w:rPr>
                   <w:rFonts w:ascii="Arial" w:cs="Arial" w:eastAsia="Arial" w:hAnsi="Arial"/>
@@ -27387,7 +27513,7 @@
               </w:rPr>
               <w:t xml:space="preserve">Claude Doc: </w:t>
             </w:r>
-            <w:hyperlink w:history="1" r:id="rIdxhwd0fr6p2uyh4lgoalao">
+            <w:hyperlink w:history="1" r:id="rIdudtogutavmtvb83hcj7qu">
               <w:r>
                 <w:rPr>
                   <w:rFonts w:ascii="Arial" w:cs="Arial" w:eastAsia="Arial" w:hAnsi="Arial"/>
@@ -27958,7 +28084,7 @@
             <w:pPr>
               <w:spacing w:after="0" w:before="0"/>
             </w:pPr>
-            <w:hyperlink w:history="1" r:id="rIdoddo-bb69gj7azgpoypt0">
+            <w:hyperlink w:history="1" r:id="rIdgr_ngpqcxgnvoyz86xfem">
               <w:r>
                 <w:rPr>
                   <w:rFonts w:ascii="Arial" w:cs="Arial" w:eastAsia="Arial" w:hAnsi="Arial"/>
@@ -29618,7 +29744,7 @@
           <w:sz w:val="21"/>
           <w:szCs w:val="21"/>
         </w:rPr>
-        <w:t xml:space="preserve"> (script 28, pagina </w:t>
+        <w:t xml:space="preserve"> (script 28 eseguito in produzione, pagina </w:t>
       </w:r>
       <w:r>
         <w:rPr>
@@ -29654,7 +29780,7 @@
           <w:sz w:val="21"/>
           <w:szCs w:val="21"/>
         </w:rPr>
-        <w:t xml:space="preserve">; da eseguire lo script in produzione). Restano: stampa PDF impaginata, eventuale visione da parte del Comune, conferma del modello. Strumento previsionale (ex ante, non certificabile) per stimare quanti crediti un Comune potrebbe generare:</w:t>
+        <w:t xml:space="preserve">). Restano: stampa PDF impaginata, eventuale visione da parte del Comune, conferma del modello. Strumento previsionale (ex ante, non certificabile) per stimare quanti crediti un Comune potrebbe generare:</w:t>
       </w:r>
     </w:p>
     <w:p>
@@ -54273,7 +54399,7 @@
         <w:szCs w:val="16"/>
       </w:rPr>
       <w:tab/>
-      <w:t xml:space="preserve">Registro sviluppo e deploy · Rev. 2.6 · 19/10/2026</w:t>
+      <w:t xml:space="preserve">Registro sviluppo e deploy · Rev. 2.7 · 19/10/2026</w:t>
     </w:r>
   </w:p>
 </w:hdr>
@@ -54338,7 +54464,7 @@
         <w:szCs w:val="16"/>
       </w:rPr>
       <w:tab/>
-      <w:t xml:space="preserve">Registro sviluppo e deploy · Rev. 2.6 · 19/10/2026</w:t>
+      <w:t xml:space="preserve">Registro sviluppo e deploy · Rev. 2.7 · 19/10/2026</w:t>
     </w:r>
   </w:p>
 </w:hdr>

</xml_diff>